<commit_message>
added  Fundamentals of es to paper
</commit_message>
<xml_diff>
--- a/Elasticsearch_Paper.docx
+++ b/Elasticsearch_Paper.docx
@@ -374,6 +374,21 @@
         <w:spacing w:line="276" w:lineRule="auto"/>
         <w:jc w:val="both"/>
       </w:pPr>
+      <w:r>
+        <w:t xml:space="preserve">Elasticsearch is part of the Elastic Stack which consists of four components: Elasticsearch, Kibana, Logstash and </w:t>
+      </w:r>
+      <w:r>
+        <w:t>Beats</w:t>
+      </w:r>
+      <w:r>
+        <w:t xml:space="preserve">. Elasticserach itselfs is the storage and search product of this stack. Kibana </w:t>
+      </w:r>
+      <w:r>
+        <w:t xml:space="preserve">provides a web-based interface for visualizing data stored in Elasticsearch. With Kibana it is easy to create charts,  maps and dashbords. Logstash is a data processing pipeline that can ingest data from various sources, transform it and forward it to Elasticsearch. Beats are lightweight agents that run on servers and ship data suich as log files or system metrics directly to Elasticsearch or Logstash. </w:t>
+      </w:r>
+      <w:r>
+        <w:t>Elasticsearch and Kibana are particularly relevant to this paper, as they form the core of its functionality.</w:t>
+      </w:r>
     </w:p>
     <w:p>
       <w:pPr>
@@ -383,33 +398,80 @@
     </w:p>
     <w:p>
       <w:pPr>
+        <w:pStyle w:val="Heading1"/>
+        <w:numPr>
+          <w:ilvl w:val="1"/>
+          <w:numId w:val="4"/>
+        </w:numPr>
+        <w:ind w:left="567" w:hanging="573"/>
+        <w:rPr>
+          <w:sz w:val="32"/>
+          <w:szCs w:val="32"/>
+        </w:rPr>
+      </w:pPr>
+      <w:r>
+        <w:rPr>
+          <w:sz w:val="32"/>
+          <w:szCs w:val="32"/>
+        </w:rPr>
+        <w:t>The F1 Elasticsearch Project</w:t>
+      </w:r>
+    </w:p>
+    <w:p>
+      <w:pPr>
         <w:spacing w:line="276" w:lineRule="auto"/>
         <w:jc w:val="both"/>
       </w:pPr>
+      <w:r>
+        <w:rPr>
+          <w:highlight w:val="yellow"/>
+        </w:rPr>
+        <w:t>Move to Project section</w:t>
+      </w:r>
     </w:p>
     <w:p>
       <w:pPr>
         <w:spacing w:line="276" w:lineRule="auto"/>
         <w:jc w:val="both"/>
       </w:pPr>
+      <w:r>
+        <w:t xml:space="preserve">To demenstrate Elasticsearch and its core functionality in practice, I decided to develop the µ-Project using the Formula 1 World Championship dataset from </w:t>
+      </w:r>
+      <w:hyperlink r:id="rId7" w:history="1">
+        <w:r>
+          <w:rPr>
+            <w:rStyle w:val="Hyperlink"/>
+          </w:rPr>
+          <w:t>Kaggle</w:t>
+        </w:r>
+      </w:hyperlink>
+      <w:r>
+        <w:t xml:space="preserve"> </w:t>
+      </w:r>
+      <w:r>
+        <w:t>.</w:t>
+      </w:r>
+      <w:r>
+        <w:t xml:space="preserve"> This dataset covers races results from1950 to 2024. The dataset consists of many .csv Files containing information about races, results, drivers, consructors, cicuits and race statuses. These files are loaded and merged into a single flat structure using Python and pandas and then indexed into Elasticsearch as </w:t>
+      </w:r>
+      <w:r>
+        <w:t>26,759 individual documents</w:t>
+      </w:r>
+      <w:r>
+        <w:t>.</w:t>
+      </w:r>
+      <w:r>
+        <w:t xml:space="preserve"> A Python script demonstrates the core querying capabilities </w:t>
+      </w:r>
+      <w:r>
+        <w:lastRenderedPageBreak/>
+        <w:t>of Elasticsearch including full-text search, fuzzy search, boolean queries and aggregations. The data is additionally visualized through a Kibana dashboard. Both, Elasticsearch and Kibana, are running alongside in Docker containers.</w:t>
+      </w:r>
     </w:p>
     <w:p>
       <w:pPr>
         <w:spacing w:line="276" w:lineRule="auto"/>
         <w:jc w:val="both"/>
-      </w:pPr>
-    </w:p>
-    <w:p>
-      <w:pPr>
-        <w:spacing w:after="160" w:line="278" w:lineRule="auto"/>
-      </w:pPr>
-      <w:r>
-        <w:br w:type="page"/>
-      </w:r>
-    </w:p>
-    <w:p>
-      <w:pPr>
-        <w:spacing w:line="276" w:lineRule="auto"/>
       </w:pPr>
     </w:p>
     <w:p>
@@ -420,6 +482,1108 @@
           <w:numId w:val="4"/>
         </w:numPr>
       </w:pPr>
+      <w:r>
+        <w:t>Fundamentals of Elasticsearch</w:t>
+      </w:r>
+    </w:p>
+    <w:p>
+      <w:pPr>
+        <w:pStyle w:val="Heading1"/>
+        <w:numPr>
+          <w:ilvl w:val="1"/>
+          <w:numId w:val="4"/>
+        </w:numPr>
+        <w:ind w:left="567" w:hanging="573"/>
+        <w:rPr>
+          <w:sz w:val="32"/>
+          <w:szCs w:val="32"/>
+        </w:rPr>
+      </w:pPr>
+      <w:r>
+        <w:rPr>
+          <w:sz w:val="32"/>
+          <w:szCs w:val="32"/>
+        </w:rPr>
+        <w:t>NoSQL Document Store</w:t>
+      </w:r>
+      <w:r>
+        <w:rPr>
+          <w:sz w:val="32"/>
+          <w:szCs w:val="32"/>
+        </w:rPr>
+        <w:t xml:space="preserve"> and search engine</w:t>
+      </w:r>
+    </w:p>
+    <w:p>
+      <w:pPr>
+        <w:spacing w:line="276" w:lineRule="auto"/>
+        <w:jc w:val="both"/>
+      </w:pPr>
+      <w:r>
+        <w:t>As said before, Elasticsearch belongs to the category of NoSQL databases and more specifically to the subcategory of search engines. Unlike relational databases, which organize data into table with fiexed columns and rows, Elasticsearch stores data as JSON documents. Each doucment is a self-contained object that can have its own structure, and no two documents are required to have identical fields.</w:t>
+      </w:r>
+      <w:r>
+        <w:t xml:space="preserve"> </w:t>
+      </w:r>
+    </w:p>
+    <w:p>
+      <w:pPr>
+        <w:spacing w:line="276" w:lineRule="auto"/>
+        <w:jc w:val="both"/>
+      </w:pPr>
+      <w:r>
+        <w:t>Elasticsearch has no concept of joins. Instead, related data must be combined into a single document before indexing, a process known as denormalization. This means that data is intentionally duplicated across documents in exchange for faster query performance, since Elasticsearch never needs to look up data from multiple places to answer a query.</w:t>
+      </w:r>
+    </w:p>
+    <w:p>
+      <w:pPr>
+        <w:spacing w:line="276" w:lineRule="auto"/>
+        <w:jc w:val="both"/>
+      </w:pPr>
+      <w:r>
+        <w:t xml:space="preserve">Despite being a NoSQL document store, Elasticsearch is also a search engine which means it is </w:t>
+      </w:r>
+      <w:r>
+        <w:t>specifically optimized for search and analytics workloads.</w:t>
+      </w:r>
+      <w:r>
+        <w:t xml:space="preserve"> </w:t>
+      </w:r>
+      <w:r>
+        <w:t>he key difference to a general-purpose document database such as MongoDB is the underlying data structure. While MongoDB stores documents in a format optimized for retrieval by ID or field value, Elasticsearch builds an inverted index over the content of every document at indexing time. This inverted index maps every individual word to the documents that contain it, allowing Elasticsearch to answer full-text search queries in milliseconds regardless of the total number of documents. This makes Elasticsearch orders of magnitude faster for search-heavy workloads compared to a relational or document database that would need to scan through records sequentially to find matches.</w:t>
+      </w:r>
+    </w:p>
+    <w:p>
+      <w:pPr>
+        <w:spacing w:line="276" w:lineRule="auto"/>
+        <w:jc w:val="both"/>
+      </w:pPr>
+    </w:p>
+    <w:p>
+      <w:pPr>
+        <w:spacing w:line="276" w:lineRule="auto"/>
+        <w:jc w:val="both"/>
+      </w:pPr>
+      <w:r>
+        <mc:AlternateContent>
+          <mc:Choice Requires="wpg">
+            <w:drawing>
+              <wp:anchor distT="0" distB="0" distL="114300" distR="114300" simplePos="0" relativeHeight="251659264" behindDoc="0" locked="0" layoutInCell="1" allowOverlap="1" wp14:anchorId="0D7FF325" wp14:editId="1CD40A8C">
+                <wp:simplePos x="0" y="0"/>
+                <wp:positionH relativeFrom="column">
+                  <wp:posOffset>-200895</wp:posOffset>
+                </wp:positionH>
+                <wp:positionV relativeFrom="paragraph">
+                  <wp:posOffset>83885</wp:posOffset>
+                </wp:positionV>
+                <wp:extent cx="6088080" cy="982767"/>
+                <wp:effectExtent l="0" t="0" r="0" b="0"/>
+                <wp:wrapNone/>
+                <wp:docPr id="4" name="Group 3">
+                  <a:extLst xmlns:a="http://schemas.openxmlformats.org/drawingml/2006/main">
+                    <a:ext uri="{FF2B5EF4-FFF2-40B4-BE49-F238E27FC236}">
+                      <a16:creationId xmlns:a16="http://schemas.microsoft.com/office/drawing/2014/main" id="{2CF57503-E4A7-0613-CD66-AF3D371F4F0A}"/>
+                    </a:ext>
+                  </a:extLst>
+                </wp:docPr>
+                <wp:cNvGraphicFramePr/>
+                <a:graphic xmlns:a="http://schemas.openxmlformats.org/drawingml/2006/main">
+                  <a:graphicData uri="http://schemas.microsoft.com/office/word/2010/wordprocessingGroup">
+                    <wpg:wgp>
+                      <wpg:cNvGrpSpPr/>
+                      <wpg:grpSpPr>
+                        <a:xfrm>
+                          <a:off x="0" y="0"/>
+                          <a:ext cx="6088080" cy="982767"/>
+                          <a:chOff x="0" y="0"/>
+                          <a:chExt cx="9428893" cy="1522638"/>
+                        </a:xfrm>
+                      </wpg:grpSpPr>
+                      <wpg:grpSp>
+                        <wpg:cNvPr id="877948927" name="Group 877948927">
+                          <a:extLst>
+                            <a:ext uri="{FF2B5EF4-FFF2-40B4-BE49-F238E27FC236}">
+                              <a16:creationId xmlns:a16="http://schemas.microsoft.com/office/drawing/2014/main" id="{C2472689-7A41-A70C-5E9C-CDCB03381588}"/>
+                            </a:ext>
+                          </a:extLst>
+                        </wpg:cNvPr>
+                        <wpg:cNvGrpSpPr/>
+                        <wpg:grpSpPr>
+                          <a:xfrm>
+                            <a:off x="0" y="300965"/>
+                            <a:ext cx="3013046" cy="712381"/>
+                            <a:chOff x="0" y="300965"/>
+                            <a:chExt cx="3461657" cy="826735"/>
+                          </a:xfrm>
+                        </wpg:grpSpPr>
+                        <wps:wsp>
+                          <wps:cNvPr id="1058396828" name="Rectangle 1058396828">
+                            <a:extLst>
+                              <a:ext uri="{FF2B5EF4-FFF2-40B4-BE49-F238E27FC236}">
+                                <a16:creationId xmlns:a16="http://schemas.microsoft.com/office/drawing/2014/main" id="{7CDBC851-880E-EACC-7E51-2912EACCF5E0}"/>
+                              </a:ext>
+                            </a:extLst>
+                          </wps:cNvPr>
+                          <wps:cNvSpPr/>
+                          <wps:spPr>
+                            <a:xfrm>
+                              <a:off x="0" y="300965"/>
+                              <a:ext cx="3461657" cy="826735"/>
+                            </a:xfrm>
+                            <a:prstGeom prst="rect">
+                              <a:avLst/>
+                            </a:prstGeom>
+                            <a:solidFill>
+                              <a:srgbClr val="00BFB3"/>
+                            </a:solidFill>
+                            <a:ln>
+                              <a:noFill/>
+                            </a:ln>
+                          </wps:spPr>
+                          <wps:style>
+                            <a:lnRef idx="2">
+                              <a:schemeClr val="accent1">
+                                <a:shade val="15000"/>
+                              </a:schemeClr>
+                            </a:lnRef>
+                            <a:fillRef idx="1">
+                              <a:schemeClr val="accent1"/>
+                            </a:fillRef>
+                            <a:effectRef idx="0">
+                              <a:schemeClr val="accent1"/>
+                            </a:effectRef>
+                            <a:fontRef idx="minor">
+                              <a:schemeClr val="lt1"/>
+                            </a:fontRef>
+                          </wps:style>
+                          <wps:bodyPr rtlCol="0" anchor="ctr"/>
+                        </wps:wsp>
+                        <pic:pic xmlns:pic="http://schemas.openxmlformats.org/drawingml/2006/picture">
+                          <pic:nvPicPr>
+                            <pic:cNvPr id="1106066645" name="Picture 1106066645">
+                              <a:extLst>
+                                <a:ext uri="{FF2B5EF4-FFF2-40B4-BE49-F238E27FC236}">
+                                  <a16:creationId xmlns:a16="http://schemas.microsoft.com/office/drawing/2014/main" id="{E1D9A5AF-BA1F-16E8-8A10-17FCC7E07E7B}"/>
+                                </a:ext>
+                              </a:extLst>
+                            </pic:cNvPr>
+                            <pic:cNvPicPr>
+                              <a:picLocks noChangeAspect="1"/>
+                            </pic:cNvPicPr>
+                          </pic:nvPicPr>
+                          <pic:blipFill>
+                            <a:blip r:embed="rId8"/>
+                            <a:stretch>
+                              <a:fillRect/>
+                            </a:stretch>
+                          </pic:blipFill>
+                          <pic:spPr>
+                            <a:xfrm>
+                              <a:off x="83198" y="381547"/>
+                              <a:ext cx="3295260" cy="647945"/>
+                            </a:xfrm>
+                            <a:prstGeom prst="rect">
+                              <a:avLst/>
+                            </a:prstGeom>
+                          </pic:spPr>
+                        </pic:pic>
+                      </wpg:grpSp>
+                      <wpg:grpSp>
+                        <wpg:cNvPr id="620119743" name="Group 620119743">
+                          <a:extLst>
+                            <a:ext uri="{FF2B5EF4-FFF2-40B4-BE49-F238E27FC236}">
+                              <a16:creationId xmlns:a16="http://schemas.microsoft.com/office/drawing/2014/main" id="{0148D32B-4A90-32FA-64A2-C4B15016D615}"/>
+                            </a:ext>
+                          </a:extLst>
+                        </wpg:cNvPr>
+                        <wpg:cNvGrpSpPr/>
+                        <wpg:grpSpPr>
+                          <a:xfrm>
+                            <a:off x="3331535" y="300965"/>
+                            <a:ext cx="3013046" cy="712381"/>
+                            <a:chOff x="3331535" y="300965"/>
+                            <a:chExt cx="3013046" cy="712381"/>
+                          </a:xfrm>
+                        </wpg:grpSpPr>
+                        <wps:wsp>
+                          <wps:cNvPr id="1905632818" name="Rectangle 1905632818">
+                            <a:extLst>
+                              <a:ext uri="{FF2B5EF4-FFF2-40B4-BE49-F238E27FC236}">
+                                <a16:creationId xmlns:a16="http://schemas.microsoft.com/office/drawing/2014/main" id="{5704C072-59A8-AEFE-45B6-284B7BBD56D5}"/>
+                              </a:ext>
+                            </a:extLst>
+                          </wps:cNvPr>
+                          <wps:cNvSpPr/>
+                          <wps:spPr>
+                            <a:xfrm>
+                              <a:off x="3331535" y="300965"/>
+                              <a:ext cx="3013046" cy="712381"/>
+                            </a:xfrm>
+                            <a:prstGeom prst="rect">
+                              <a:avLst/>
+                            </a:prstGeom>
+                            <a:solidFill>
+                              <a:srgbClr val="00BFB3"/>
+                            </a:solidFill>
+                            <a:ln>
+                              <a:noFill/>
+                            </a:ln>
+                          </wps:spPr>
+                          <wps:style>
+                            <a:lnRef idx="2">
+                              <a:schemeClr val="accent1">
+                                <a:shade val="15000"/>
+                              </a:schemeClr>
+                            </a:lnRef>
+                            <a:fillRef idx="1">
+                              <a:schemeClr val="accent1"/>
+                            </a:fillRef>
+                            <a:effectRef idx="0">
+                              <a:schemeClr val="accent1"/>
+                            </a:effectRef>
+                            <a:fontRef idx="minor">
+                              <a:schemeClr val="lt1"/>
+                            </a:fontRef>
+                          </wps:style>
+                          <wps:bodyPr rtlCol="0" anchor="ctr"/>
+                        </wps:wsp>
+                        <pic:pic xmlns:pic="http://schemas.openxmlformats.org/drawingml/2006/picture">
+                          <pic:nvPicPr>
+                            <pic:cNvPr id="1391589729" name="Picture 1391589729">
+                              <a:extLst>
+                                <a:ext uri="{FF2B5EF4-FFF2-40B4-BE49-F238E27FC236}">
+                                  <a16:creationId xmlns:a16="http://schemas.microsoft.com/office/drawing/2014/main" id="{71152164-2EF5-EDD1-4262-7014902D7BD5}"/>
+                                </a:ext>
+                              </a:extLst>
+                            </pic:cNvPr>
+                            <pic:cNvPicPr>
+                              <a:picLocks noChangeAspect="1"/>
+                            </pic:cNvPicPr>
+                          </pic:nvPicPr>
+                          <pic:blipFill>
+                            <a:blip r:embed="rId9"/>
+                            <a:stretch>
+                              <a:fillRect/>
+                            </a:stretch>
+                          </pic:blipFill>
+                          <pic:spPr>
+                            <a:xfrm>
+                              <a:off x="3407735" y="395931"/>
+                              <a:ext cx="2860645" cy="513805"/>
+                            </a:xfrm>
+                            <a:prstGeom prst="rect">
+                              <a:avLst/>
+                            </a:prstGeom>
+                          </pic:spPr>
+                        </pic:pic>
+                      </wpg:grpSp>
+                      <wpg:grpSp>
+                        <wpg:cNvPr id="642552197" name="Group 642552197">
+                          <a:extLst>
+                            <a:ext uri="{FF2B5EF4-FFF2-40B4-BE49-F238E27FC236}">
+                              <a16:creationId xmlns:a16="http://schemas.microsoft.com/office/drawing/2014/main" id="{A92F3C1E-8B2D-79AD-95FA-84F25EBD56AD}"/>
+                            </a:ext>
+                          </a:extLst>
+                        </wpg:cNvPr>
+                        <wpg:cNvGrpSpPr/>
+                        <wpg:grpSpPr>
+                          <a:xfrm>
+                            <a:off x="6783014" y="0"/>
+                            <a:ext cx="2645879" cy="1522638"/>
+                            <a:chOff x="6783014" y="0"/>
+                            <a:chExt cx="2645879" cy="1522638"/>
+                          </a:xfrm>
+                        </wpg:grpSpPr>
+                        <wps:wsp>
+                          <wps:cNvPr id="1865568681" name="Rectangle 1865568681">
+                            <a:extLst>
+                              <a:ext uri="{FF2B5EF4-FFF2-40B4-BE49-F238E27FC236}">
+                                <a16:creationId xmlns:a16="http://schemas.microsoft.com/office/drawing/2014/main" id="{AD736C13-2413-9561-0668-08F3D0D24DEE}"/>
+                              </a:ext>
+                            </a:extLst>
+                          </wps:cNvPr>
+                          <wps:cNvSpPr/>
+                          <wps:spPr>
+                            <a:xfrm>
+                              <a:off x="6783014" y="0"/>
+                              <a:ext cx="2645879" cy="1522638"/>
+                            </a:xfrm>
+                            <a:prstGeom prst="rect">
+                              <a:avLst/>
+                            </a:prstGeom>
+                            <a:solidFill>
+                              <a:srgbClr val="00BFB3"/>
+                            </a:solidFill>
+                            <a:ln>
+                              <a:noFill/>
+                            </a:ln>
+                          </wps:spPr>
+                          <wps:style>
+                            <a:lnRef idx="2">
+                              <a:schemeClr val="accent1">
+                                <a:shade val="15000"/>
+                              </a:schemeClr>
+                            </a:lnRef>
+                            <a:fillRef idx="1">
+                              <a:schemeClr val="accent1"/>
+                            </a:fillRef>
+                            <a:effectRef idx="0">
+                              <a:schemeClr val="accent1"/>
+                            </a:effectRef>
+                            <a:fontRef idx="minor">
+                              <a:schemeClr val="lt1"/>
+                            </a:fontRef>
+                          </wps:style>
+                          <wps:bodyPr rtlCol="0" anchor="ctr"/>
+                        </wps:wsp>
+                        <pic:pic xmlns:pic="http://schemas.openxmlformats.org/drawingml/2006/picture">
+                          <pic:nvPicPr>
+                            <pic:cNvPr id="1666411749" name="Picture 1666411749">
+                              <a:extLst>
+                                <a:ext uri="{FF2B5EF4-FFF2-40B4-BE49-F238E27FC236}">
+                                  <a16:creationId xmlns:a16="http://schemas.microsoft.com/office/drawing/2014/main" id="{A0677A90-797C-7C1F-2BF1-82B5EEFFA5AA}"/>
+                                </a:ext>
+                              </a:extLst>
+                            </pic:cNvPr>
+                            <pic:cNvPicPr>
+                              <a:picLocks noChangeAspect="1"/>
+                            </pic:cNvPicPr>
+                          </pic:nvPicPr>
+                          <pic:blipFill>
+                            <a:blip r:embed="rId10"/>
+                            <a:stretch>
+                              <a:fillRect/>
+                            </a:stretch>
+                          </pic:blipFill>
+                          <pic:spPr>
+                            <a:xfrm>
+                              <a:off x="6829376" y="105300"/>
+                              <a:ext cx="2553153" cy="1312037"/>
+                            </a:xfrm>
+                            <a:prstGeom prst="rect">
+                              <a:avLst/>
+                            </a:prstGeom>
+                          </pic:spPr>
+                        </pic:pic>
+                      </wpg:grpSp>
+                    </wpg:wgp>
+                  </a:graphicData>
+                </a:graphic>
+                <wp14:sizeRelH relativeFrom="margin">
+                  <wp14:pctWidth>0</wp14:pctWidth>
+                </wp14:sizeRelH>
+                <wp14:sizeRelV relativeFrom="margin">
+                  <wp14:pctHeight>0</wp14:pctHeight>
+                </wp14:sizeRelV>
+              </wp:anchor>
+            </w:drawing>
+          </mc:Choice>
+          <mc:Fallback>
+            <w:pict>
+              <v:group w14:anchorId="1081E855" id="Group 3" o:spid="_x0000_s1026" style="position:absolute;margin-left:-15.8pt;margin-top:6.6pt;width:479.4pt;height:77.4pt;z-index:251659264;mso-width-relative:margin;mso-height-relative:margin" coordsize="94288,15226" o:gfxdata="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">
+                <v:group id="Group 877948927" o:spid="_x0000_s1027" style="position:absolute;top:3009;width:30130;height:7124" coordorigin=",3009" coordsize="34616,8267" o:gfxdata="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">
+                  <v:rect id="Rectangle 1058396828" o:spid="_x0000_s1028" style="position:absolute;top:3009;width:34616;height:8268;visibility:visible;mso-wrap-style:square;v-text-anchor:middle" o:gfxdata="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" fillcolor="#00bfb3" stroked="f" strokeweight="1pt"/>
+                  <v:shapetype id="_x0000_t75" coordsize="21600,21600" o:spt="75" o:preferrelative="t" path="m@4@5l@4@11@9@11@9@5xe" filled="f" stroked="f">
+                    <v:stroke joinstyle="miter"/>
+                    <v:formulas>
+                      <v:f eqn="if lineDrawn pixelLineWidth 0"/>
+                      <v:f eqn="sum @0 1 0"/>
+                      <v:f eqn="sum 0 0 @1"/>
+                      <v:f eqn="prod @2 1 2"/>
+                      <v:f eqn="prod @3 21600 pixelWidth"/>
+                      <v:f eqn="prod @3 21600 pixelHeight"/>
+                      <v:f eqn="sum @0 0 1"/>
+                      <v:f eqn="prod @6 1 2"/>
+                      <v:f eqn="prod @7 21600 pixelWidth"/>
+                      <v:f eqn="sum @8 21600 0"/>
+                      <v:f eqn="prod @7 21600 pixelHeight"/>
+                      <v:f eqn="sum @10 21600 0"/>
+                    </v:formulas>
+                    <v:path o:extrusionok="f" gradientshapeok="t" o:connecttype="rect"/>
+                    <o:lock v:ext="edit" aspectratio="t"/>
+                  </v:shapetype>
+                  <v:shape id="Picture 1106066645" o:spid="_x0000_s1029" type="#_x0000_t75" style="position:absolute;left:831;top:3815;width:32953;height:6479;visibility:visible;mso-wrap-style:square" o:gfxdata="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">
+                    <v:imagedata r:id="rId11" o:title=""/>
+                  </v:shape>
+                </v:group>
+                <v:group id="Group 620119743" o:spid="_x0000_s1030" style="position:absolute;left:33315;top:3009;width:30130;height:7124" coordorigin="33315,3009" coordsize="30130,7123" o:gfxdata="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">
+                  <v:rect id="Rectangle 1905632818" o:spid="_x0000_s1031" style="position:absolute;left:33315;top:3009;width:30130;height:7124;visibility:visible;mso-wrap-style:square;v-text-anchor:middle" o:gfxdata="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" fillcolor="#00bfb3" stroked="f" strokeweight="1pt"/>
+                  <v:shape id="Picture 1391589729" o:spid="_x0000_s1032" type="#_x0000_t75" style="position:absolute;left:34077;top:3959;width:28606;height:5138;visibility:visible;mso-wrap-style:square" o:gfxdata="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">
+                    <v:imagedata r:id="rId12" o:title=""/>
+                  </v:shape>
+                </v:group>
+                <v:group id="Group 642552197" o:spid="_x0000_s1033" style="position:absolute;left:67830;width:26458;height:15226" coordorigin="67830" coordsize="26458,15226" o:gfxdata="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">
+                  <v:rect id="Rectangle 1865568681" o:spid="_x0000_s1034" style="position:absolute;left:67830;width:26458;height:15226;visibility:visible;mso-wrap-style:square;v-text-anchor:middle" o:gfxdata="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" fillcolor="#00bfb3" stroked="f" strokeweight="1pt"/>
+                  <v:shape id="Picture 1666411749" o:spid="_x0000_s1035" type="#_x0000_t75" style="position:absolute;left:68293;top:1053;width:25532;height:13120;visibility:visible;mso-wrap-style:square" o:gfxdata="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">
+                    <v:imagedata r:id="rId13" o:title=""/>
+                  </v:shape>
+                </v:group>
+              </v:group>
+            </w:pict>
+          </mc:Fallback>
+        </mc:AlternateContent>
+      </w:r>
+    </w:p>
+    <w:p>
+      <w:pPr>
+        <w:spacing w:line="276" w:lineRule="auto"/>
+        <w:jc w:val="both"/>
+      </w:pPr>
+    </w:p>
+    <w:p>
+      <w:pPr>
+        <w:spacing w:line="276" w:lineRule="auto"/>
+        <w:jc w:val="both"/>
+      </w:pPr>
+    </w:p>
+    <w:p>
+      <w:pPr>
+        <w:spacing w:line="276" w:lineRule="auto"/>
+        <w:jc w:val="both"/>
+      </w:pPr>
+    </w:p>
+    <w:p>
+      <w:pPr>
+        <w:spacing w:line="276" w:lineRule="auto"/>
+        <w:jc w:val="both"/>
+      </w:pPr>
+    </w:p>
+    <w:p>
+      <w:pPr>
+        <w:spacing w:line="276" w:lineRule="auto"/>
+        <w:jc w:val="both"/>
+      </w:pPr>
+    </w:p>
+    <w:p>
+      <w:pPr>
+        <w:spacing w:line="276" w:lineRule="auto"/>
+        <w:jc w:val="both"/>
+      </w:pPr>
+    </w:p>
+    <w:p>
+      <w:pPr>
+        <w:spacing w:line="276" w:lineRule="auto"/>
+        <w:jc w:val="both"/>
+      </w:pPr>
+    </w:p>
+    <w:p>
+      <w:pPr>
+        <w:spacing w:line="276" w:lineRule="auto"/>
+        <w:jc w:val="both"/>
+      </w:pPr>
+    </w:p>
+    <w:p>
+      <w:pPr>
+        <w:spacing w:line="276" w:lineRule="auto"/>
+        <w:jc w:val="both"/>
+      </w:pPr>
+    </w:p>
+    <w:p>
+      <w:pPr>
+        <w:spacing w:line="276" w:lineRule="auto"/>
+        <w:jc w:val="both"/>
+      </w:pPr>
+    </w:p>
+    <w:p>
+      <w:pPr>
+        <w:spacing w:line="276" w:lineRule="auto"/>
+        <w:jc w:val="both"/>
+      </w:pPr>
+    </w:p>
+    <w:p>
+      <w:pPr>
+        <w:spacing w:line="276" w:lineRule="auto"/>
+        <w:jc w:val="both"/>
+      </w:pPr>
+    </w:p>
+    <w:p>
+      <w:pPr>
+        <w:spacing w:line="276" w:lineRule="auto"/>
+        <w:jc w:val="both"/>
+      </w:pPr>
+    </w:p>
+    <w:tbl>
+      <w:tblPr>
+        <w:tblStyle w:val="TableGrid"/>
+        <w:tblW w:w="0" w:type="auto"/>
+        <w:tblLook w:val="04A0" w:firstRow="1" w:lastRow="0" w:firstColumn="1" w:lastColumn="0" w:noHBand="0" w:noVBand="1"/>
+      </w:tblPr>
+      <w:tblGrid>
+        <w:gridCol w:w="3005"/>
+        <w:gridCol w:w="3005"/>
+        <w:gridCol w:w="3006"/>
+      </w:tblGrid>
+      <w:tr>
+        <w:tc>
+          <w:tcPr>
+            <w:tcW w:w="3005" w:type="dxa"/>
+          </w:tcPr>
+          <w:p>
+            <w:pPr>
+              <w:spacing w:line="276" w:lineRule="auto"/>
+              <w:jc w:val="center"/>
+              <w:rPr>
+                <w:b/>
+                <w:bCs/>
+              </w:rPr>
+            </w:pPr>
+            <w:r>
+              <w:rPr>
+                <w:b/>
+                <w:bCs/>
+              </w:rPr>
+              <w:lastRenderedPageBreak/>
+              <w:t>Asepect</w:t>
+            </w:r>
+          </w:p>
+        </w:tc>
+        <w:tc>
+          <w:tcPr>
+            <w:tcW w:w="3005" w:type="dxa"/>
+          </w:tcPr>
+          <w:p>
+            <w:pPr>
+              <w:spacing w:line="276" w:lineRule="auto"/>
+              <w:jc w:val="center"/>
+              <w:rPr>
+                <w:b/>
+                <w:bCs/>
+              </w:rPr>
+            </w:pPr>
+            <w:r>
+              <w:rPr>
+                <w:b/>
+                <w:bCs/>
+              </w:rPr>
+              <w:t>Elasticsearch</w:t>
+            </w:r>
+          </w:p>
+        </w:tc>
+        <w:tc>
+          <w:tcPr>
+            <w:tcW w:w="3006" w:type="dxa"/>
+          </w:tcPr>
+          <w:p>
+            <w:pPr>
+              <w:spacing w:line="276" w:lineRule="auto"/>
+              <w:jc w:val="center"/>
+              <w:rPr>
+                <w:b/>
+                <w:bCs/>
+              </w:rPr>
+            </w:pPr>
+            <w:r>
+              <w:rPr>
+                <w:b/>
+                <w:bCs/>
+              </w:rPr>
+              <w:t>Relational Database</w:t>
+            </w:r>
+          </w:p>
+        </w:tc>
+      </w:tr>
+      <w:tr>
+        <w:trPr>
+          <w:trHeight w:val="454"/>
+        </w:trPr>
+        <w:tc>
+          <w:tcPr>
+            <w:tcW w:w="3005" w:type="dxa"/>
+          </w:tcPr>
+          <w:p>
+            <w:pPr>
+              <w:spacing w:line="276" w:lineRule="auto"/>
+              <w:jc w:val="both"/>
+            </w:pPr>
+            <w:r>
+              <w:t>Data model</w:t>
+            </w:r>
+          </w:p>
+        </w:tc>
+        <w:tc>
+          <w:tcPr>
+            <w:tcW w:w="3005" w:type="dxa"/>
+          </w:tcPr>
+          <w:p>
+            <w:pPr>
+              <w:spacing w:line="276" w:lineRule="auto"/>
+              <w:jc w:val="both"/>
+            </w:pPr>
+            <w:r>
+              <w:t>Document-oriented, JSON</w:t>
+            </w:r>
+          </w:p>
+        </w:tc>
+        <w:tc>
+          <w:tcPr>
+            <w:tcW w:w="3006" w:type="dxa"/>
+          </w:tcPr>
+          <w:p>
+            <w:pPr>
+              <w:spacing w:line="276" w:lineRule="auto"/>
+              <w:jc w:val="both"/>
+            </w:pPr>
+            <w:r>
+              <w:t>Table-based, rows and columns</w:t>
+            </w:r>
+          </w:p>
+        </w:tc>
+      </w:tr>
+      <w:tr>
+        <w:trPr>
+          <w:trHeight w:val="454"/>
+        </w:trPr>
+        <w:tc>
+          <w:tcPr>
+            <w:tcW w:w="3005" w:type="dxa"/>
+          </w:tcPr>
+          <w:p>
+            <w:pPr>
+              <w:spacing w:line="276" w:lineRule="auto"/>
+              <w:jc w:val="both"/>
+            </w:pPr>
+            <w:r>
+              <w:t>Schema</w:t>
+            </w:r>
+          </w:p>
+        </w:tc>
+        <w:tc>
+          <w:tcPr>
+            <w:tcW w:w="3005" w:type="dxa"/>
+          </w:tcPr>
+          <w:p>
+            <w:pPr>
+              <w:spacing w:line="276" w:lineRule="auto"/>
+              <w:jc w:val="both"/>
+            </w:pPr>
+            <w:r>
+              <w:t>Flexible, optional</w:t>
+            </w:r>
+          </w:p>
+        </w:tc>
+        <w:tc>
+          <w:tcPr>
+            <w:tcW w:w="3006" w:type="dxa"/>
+          </w:tcPr>
+          <w:p>
+            <w:pPr>
+              <w:spacing w:line="276" w:lineRule="auto"/>
+              <w:jc w:val="both"/>
+            </w:pPr>
+            <w:r>
+              <w:t>Rigid, predefined</w:t>
+            </w:r>
+          </w:p>
+        </w:tc>
+      </w:tr>
+      <w:tr>
+        <w:trPr>
+          <w:trHeight w:val="454"/>
+        </w:trPr>
+        <w:tc>
+          <w:tcPr>
+            <w:tcW w:w="3005" w:type="dxa"/>
+          </w:tcPr>
+          <w:p>
+            <w:pPr>
+              <w:spacing w:line="276" w:lineRule="auto"/>
+              <w:jc w:val="both"/>
+            </w:pPr>
+            <w:r>
+              <w:t>Query language</w:t>
+            </w:r>
+          </w:p>
+        </w:tc>
+        <w:tc>
+          <w:tcPr>
+            <w:tcW w:w="3005" w:type="dxa"/>
+          </w:tcPr>
+          <w:p>
+            <w:pPr>
+              <w:spacing w:line="276" w:lineRule="auto"/>
+              <w:jc w:val="both"/>
+            </w:pPr>
+            <w:r>
+              <w:t>Query DSL</w:t>
+            </w:r>
+          </w:p>
+        </w:tc>
+        <w:tc>
+          <w:tcPr>
+            <w:tcW w:w="3006" w:type="dxa"/>
+          </w:tcPr>
+          <w:p>
+            <w:pPr>
+              <w:spacing w:line="276" w:lineRule="auto"/>
+              <w:jc w:val="both"/>
+            </w:pPr>
+            <w:r>
+              <w:t>SQL</w:t>
+            </w:r>
+          </w:p>
+        </w:tc>
+      </w:tr>
+      <w:tr>
+        <w:trPr>
+          <w:trHeight w:val="454"/>
+        </w:trPr>
+        <w:tc>
+          <w:tcPr>
+            <w:tcW w:w="3005" w:type="dxa"/>
+          </w:tcPr>
+          <w:p>
+            <w:pPr>
+              <w:spacing w:line="276" w:lineRule="auto"/>
+              <w:jc w:val="both"/>
+            </w:pPr>
+            <w:r>
+              <w:t>Joins</w:t>
+            </w:r>
+          </w:p>
+        </w:tc>
+        <w:tc>
+          <w:tcPr>
+            <w:tcW w:w="3005" w:type="dxa"/>
+          </w:tcPr>
+          <w:p>
+            <w:pPr>
+              <w:spacing w:line="276" w:lineRule="auto"/>
+              <w:jc w:val="both"/>
+            </w:pPr>
+            <w:r>
+              <w:t>Not supported</w:t>
+            </w:r>
+          </w:p>
+        </w:tc>
+        <w:tc>
+          <w:tcPr>
+            <w:tcW w:w="3006" w:type="dxa"/>
+          </w:tcPr>
+          <w:p>
+            <w:pPr>
+              <w:spacing w:line="276" w:lineRule="auto"/>
+              <w:jc w:val="both"/>
+            </w:pPr>
+            <w:r>
+              <w:t>Supported</w:t>
+            </w:r>
+          </w:p>
+        </w:tc>
+      </w:tr>
+      <w:tr>
+        <w:trPr>
+          <w:trHeight w:val="454"/>
+        </w:trPr>
+        <w:tc>
+          <w:tcPr>
+            <w:tcW w:w="3005" w:type="dxa"/>
+          </w:tcPr>
+          <w:p>
+            <w:pPr>
+              <w:spacing w:line="276" w:lineRule="auto"/>
+              <w:jc w:val="both"/>
+            </w:pPr>
+            <w:r>
+              <w:t>Scalability</w:t>
+            </w:r>
+          </w:p>
+        </w:tc>
+        <w:tc>
+          <w:tcPr>
+            <w:tcW w:w="3005" w:type="dxa"/>
+          </w:tcPr>
+          <w:p>
+            <w:pPr>
+              <w:spacing w:line="276" w:lineRule="auto"/>
+              <w:jc w:val="both"/>
+            </w:pPr>
+            <w:r>
+              <w:t>Horizontal</w:t>
+            </w:r>
+          </w:p>
+        </w:tc>
+        <w:tc>
+          <w:tcPr>
+            <w:tcW w:w="3006" w:type="dxa"/>
+          </w:tcPr>
+          <w:p>
+            <w:pPr>
+              <w:spacing w:line="276" w:lineRule="auto"/>
+              <w:jc w:val="both"/>
+            </w:pPr>
+            <w:r>
+              <w:t>Vertical</w:t>
+            </w:r>
+          </w:p>
+        </w:tc>
+      </w:tr>
+      <w:tr>
+        <w:trPr>
+          <w:trHeight w:val="454"/>
+        </w:trPr>
+        <w:tc>
+          <w:tcPr>
+            <w:tcW w:w="3005" w:type="dxa"/>
+          </w:tcPr>
+          <w:p>
+            <w:pPr>
+              <w:spacing w:line="276" w:lineRule="auto"/>
+              <w:jc w:val="both"/>
+            </w:pPr>
+            <w:r>
+              <w:t>Consistency</w:t>
+            </w:r>
+          </w:p>
+        </w:tc>
+        <w:tc>
+          <w:tcPr>
+            <w:tcW w:w="3005" w:type="dxa"/>
+          </w:tcPr>
+          <w:p>
+            <w:pPr>
+              <w:spacing w:line="276" w:lineRule="auto"/>
+              <w:jc w:val="both"/>
+            </w:pPr>
+            <w:r>
+              <w:t>Eventual</w:t>
+            </w:r>
+          </w:p>
+        </w:tc>
+        <w:tc>
+          <w:tcPr>
+            <w:tcW w:w="3006" w:type="dxa"/>
+          </w:tcPr>
+          <w:p>
+            <w:pPr>
+              <w:spacing w:line="276" w:lineRule="auto"/>
+              <w:jc w:val="both"/>
+            </w:pPr>
+            <w:r>
+              <w:t>Strong (ACID)</w:t>
+            </w:r>
+          </w:p>
+        </w:tc>
+      </w:tr>
+      <w:tr>
+        <w:trPr>
+          <w:trHeight w:val="454"/>
+        </w:trPr>
+        <w:tc>
+          <w:tcPr>
+            <w:tcW w:w="3005" w:type="dxa"/>
+          </w:tcPr>
+          <w:p>
+            <w:pPr>
+              <w:spacing w:line="276" w:lineRule="auto"/>
+              <w:jc w:val="both"/>
+            </w:pPr>
+            <w:r>
+              <w:t>Best suited for</w:t>
+            </w:r>
+          </w:p>
+        </w:tc>
+        <w:tc>
+          <w:tcPr>
+            <w:tcW w:w="3005" w:type="dxa"/>
+          </w:tcPr>
+          <w:p>
+            <w:pPr>
+              <w:spacing w:line="276" w:lineRule="auto"/>
+              <w:jc w:val="both"/>
+            </w:pPr>
+            <w:r>
+              <w:t>Search and analytics</w:t>
+            </w:r>
+          </w:p>
+        </w:tc>
+        <w:tc>
+          <w:tcPr>
+            <w:tcW w:w="3006" w:type="dxa"/>
+          </w:tcPr>
+          <w:p>
+            <w:pPr>
+              <w:spacing w:line="276" w:lineRule="auto"/>
+              <w:jc w:val="both"/>
+            </w:pPr>
+            <w:r>
+              <w:t>Transactions and integrity</w:t>
+            </w:r>
+          </w:p>
+        </w:tc>
+      </w:tr>
+    </w:tbl>
+    <w:p>
+      <w:pPr>
+        <w:spacing w:line="276" w:lineRule="auto"/>
+        <w:jc w:val="both"/>
+      </w:pPr>
+    </w:p>
+    <w:p>
+      <w:pPr>
+        <w:pStyle w:val="Heading1"/>
+        <w:numPr>
+          <w:ilvl w:val="1"/>
+          <w:numId w:val="4"/>
+        </w:numPr>
+        <w:ind w:left="567" w:hanging="573"/>
+        <w:rPr>
+          <w:sz w:val="32"/>
+          <w:szCs w:val="32"/>
+        </w:rPr>
+      </w:pPr>
+      <w:r>
+        <w:rPr>
+          <w:sz w:val="32"/>
+          <w:szCs w:val="32"/>
+        </w:rPr>
+        <w:t>When to use Elasticsearch</w:t>
+      </w:r>
+    </w:p>
+    <w:p>
+      <w:pPr>
+        <w:spacing w:line="276" w:lineRule="auto"/>
+        <w:jc w:val="both"/>
+      </w:pPr>
+      <w:r>
+        <w:t>Elasticsearch is not a general-purpose database and is not designed to replace relational systems in all scenarios. It is best suited for specific use cases where search speed, analytical flexibility or the ability to handle large volumes of unstructured data are the primary requirements.</w:t>
+      </w:r>
+    </w:p>
+    <w:p>
+      <w:pPr>
+        <w:spacing w:line="276" w:lineRule="auto"/>
+        <w:jc w:val="both"/>
+      </w:pPr>
+    </w:p>
+    <w:p>
+      <w:pPr>
+        <w:spacing w:line="276" w:lineRule="auto"/>
+        <w:jc w:val="both"/>
+      </w:pPr>
+      <w:r>
+        <w:rPr>
+          <w:b/>
+          <w:bCs/>
+        </w:rPr>
+        <w:t>Full-text search</w:t>
+      </w:r>
+      <w:r>
+        <w:rPr>
+          <w:b/>
+          <w:bCs/>
+        </w:rPr>
+        <w:t xml:space="preserve"> </w:t>
+      </w:r>
+      <w:r>
+        <w:t xml:space="preserve"> is the most common use case. Appications such as e-commerce platforms, news portals, or documentation system need to deliver fast and relevant search results across large collections of text.</w:t>
+      </w:r>
+    </w:p>
+    <w:p>
+      <w:pPr>
+        <w:spacing w:line="276" w:lineRule="auto"/>
+        <w:jc w:val="both"/>
+      </w:pPr>
+      <w:r>
+        <w:rPr>
+          <w:b/>
+          <w:bCs/>
+        </w:rPr>
+        <w:t>Log and event monitoring</w:t>
+      </w:r>
+      <w:r>
+        <w:t xml:space="preserve"> is another use case. Organizations running server insfrastructure typically generate enormous volumes of log data continuously. By streaming these logs into Elasticsearch, engineers can search for specific error messages, detect anomalies and monitor system health in near real time.</w:t>
+      </w:r>
+    </w:p>
+    <w:p>
+      <w:pPr>
+        <w:spacing w:line="276" w:lineRule="auto"/>
+        <w:jc w:val="both"/>
+      </w:pPr>
+      <w:r>
+        <w:rPr>
+          <w:b/>
+          <w:bCs/>
+        </w:rPr>
+        <w:t>Business analytics</w:t>
+      </w:r>
+      <w:r>
+        <w:t xml:space="preserve"> is also an area to use Elasticsearch. Its aggregation capabilities allow analysts to group, count, sum and average large datasets in miliseconds, </w:t>
+      </w:r>
+      <w:r>
+        <w:t>producing results that would require complex SQL queries and significant processing time in a relational system.</w:t>
+      </w:r>
+    </w:p>
+    <w:p>
+      <w:pPr>
+        <w:spacing w:line="276" w:lineRule="auto"/>
+        <w:jc w:val="both"/>
+      </w:pPr>
+      <w:r>
+        <w:t xml:space="preserve">Geospatial search is supported by Elasticsearch. The geo_point type stores latitude and longitude coordinates. </w:t>
+      </w:r>
+      <w:r>
+        <w:t>This enables proximity queries, radius-based filtering, and map visualizations</w:t>
+      </w:r>
+      <w:r>
+        <w:t>,</w:t>
+      </w:r>
+      <w:r>
+        <w:t xml:space="preserve"> </w:t>
+      </w:r>
+      <w:r>
+        <w:t>making Elasticsearch suitable for applications such as delivery tracking</w:t>
+      </w:r>
+      <w:r>
+        <w:t xml:space="preserve"> and </w:t>
+      </w:r>
+      <w:r>
+        <w:t>travel booking platforms</w:t>
+      </w:r>
+    </w:p>
+    <w:p>
+      <w:pPr>
+        <w:spacing w:line="276" w:lineRule="auto"/>
+        <w:jc w:val="both"/>
+      </w:pPr>
+    </w:p>
+    <w:p>
+      <w:pPr>
+        <w:spacing w:line="276" w:lineRule="auto"/>
+        <w:jc w:val="both"/>
+      </w:pPr>
+    </w:p>
+    <w:p>
+      <w:pPr>
+        <w:spacing w:line="276" w:lineRule="auto"/>
+        <w:jc w:val="both"/>
+      </w:pPr>
+    </w:p>
+    <w:p>
+      <w:pPr>
+        <w:spacing w:line="276" w:lineRule="auto"/>
+        <w:jc w:val="both"/>
+      </w:pPr>
+    </w:p>
+    <w:p>
+      <w:pPr>
+        <w:spacing w:after="160" w:line="278" w:lineRule="auto"/>
+      </w:pPr>
+      <w:r>
+        <w:br w:type="page"/>
+      </w:r>
+    </w:p>
+    <w:p>
+      <w:pPr>
+        <w:spacing w:line="276" w:lineRule="auto"/>
+      </w:pPr>
+    </w:p>
+    <w:p>
+      <w:pPr>
+        <w:pStyle w:val="Heading1"/>
+        <w:numPr>
+          <w:ilvl w:val="0"/>
+          <w:numId w:val="4"/>
+        </w:numPr>
+      </w:pPr>
       <w:bookmarkStart w:id="3" w:name="_Toc229380754"/>
       <w:r>
         <w:t>References</w:t>
@@ -428,13 +1592,18 @@
     </w:p>
     <w:p>
       <w:pPr>
+        <w:pStyle w:val="ListParagraph"/>
+        <w:numPr>
+          <w:ilvl w:val="0"/>
+          <w:numId w:val="9"/>
+        </w:numPr>
         <w:spacing w:line="276" w:lineRule="auto"/>
         <w:rPr>
           <w:sz w:val="21"/>
           <w:szCs w:val="21"/>
         </w:rPr>
       </w:pPr>
-      <w:hyperlink r:id="rId7" w:history="1">
+      <w:hyperlink r:id="rId14" w:history="1">
         <w:r>
           <w:rPr>
             <w:rStyle w:val="Hyperlink"/>
@@ -444,6 +1613,193 @@
           <w:t>https://www.geeksforgeeks.org/elasticsearch/what-is-elastic-search-and-why-is-it-used/</w:t>
         </w:r>
       </w:hyperlink>
+    </w:p>
+    <w:p>
+      <w:pPr>
+        <w:pStyle w:val="ListParagraph"/>
+        <w:numPr>
+          <w:ilvl w:val="0"/>
+          <w:numId w:val="9"/>
+        </w:numPr>
+        <w:spacing w:line="276" w:lineRule="auto"/>
+        <w:rPr>
+          <w:sz w:val="21"/>
+          <w:szCs w:val="21"/>
+        </w:rPr>
+      </w:pPr>
+      <w:hyperlink r:id="rId15" w:history="1">
+        <w:r>
+          <w:rPr>
+            <w:rStyle w:val="Hyperlink"/>
+            <w:sz w:val="21"/>
+            <w:szCs w:val="21"/>
+          </w:rPr>
+          <w:t>https://www.elastic.co/docs/get-started/the-stack#:~</w:t>
+        </w:r>
+        <w:r>
+          <w:rPr>
+            <w:rStyle w:val="Hyperlink"/>
+            <w:sz w:val="21"/>
+            <w:szCs w:val="21"/>
+          </w:rPr>
+          <w:t>:</w:t>
+        </w:r>
+        <w:r>
+          <w:rPr>
+            <w:rStyle w:val="Hyperlink"/>
+            <w:sz w:val="21"/>
+            <w:szCs w:val="21"/>
+          </w:rPr>
+          <w:t>text=The%20Elastic%20Stack%20is%20a,fit%20together%20across%20Elastic%20deployments</w:t>
+        </w:r>
+      </w:hyperlink>
+    </w:p>
+    <w:p>
+      <w:pPr>
+        <w:pStyle w:val="ListParagraph"/>
+        <w:numPr>
+          <w:ilvl w:val="0"/>
+          <w:numId w:val="9"/>
+        </w:numPr>
+        <w:spacing w:line="276" w:lineRule="auto"/>
+        <w:rPr>
+          <w:sz w:val="21"/>
+          <w:szCs w:val="21"/>
+          <w:u w:val="single"/>
+        </w:rPr>
+      </w:pPr>
+      <w:r>
+        <w:rPr>
+          <w:sz w:val="21"/>
+          <w:szCs w:val="21"/>
+          <w:u w:val="single"/>
+        </w:rPr>
+        <w:t xml:space="preserve">[Dataset]: </w:t>
+      </w:r>
+      <w:hyperlink r:id="rId16" w:history="1">
+        <w:r>
+          <w:rPr>
+            <w:rStyle w:val="Hyperlink"/>
+            <w:sz w:val="21"/>
+            <w:szCs w:val="21"/>
+          </w:rPr>
+          <w:t>https://www.kaggle.com/datasets/jtrotman/formula-1-race-data</w:t>
+        </w:r>
+      </w:hyperlink>
+    </w:p>
+    <w:p>
+      <w:pPr>
+        <w:pStyle w:val="ListParagraph"/>
+        <w:numPr>
+          <w:ilvl w:val="0"/>
+          <w:numId w:val="9"/>
+        </w:numPr>
+        <w:spacing w:line="276" w:lineRule="auto"/>
+        <w:rPr>
+          <w:sz w:val="21"/>
+          <w:szCs w:val="21"/>
+        </w:rPr>
+      </w:pPr>
+      <w:hyperlink r:id="rId17" w:history="1">
+        <w:r>
+          <w:rPr>
+            <w:rStyle w:val="Hyperlink"/>
+            <w:sz w:val="21"/>
+            <w:szCs w:val="21"/>
+          </w:rPr>
+          <w:t>https://www.geeksforgeeks.org/elasticsearch/what-is-elastic-search-and-why-is-it-used/</w:t>
+        </w:r>
+      </w:hyperlink>
+    </w:p>
+    <w:p>
+      <w:pPr>
+        <w:pStyle w:val="ListParagraph"/>
+        <w:numPr>
+          <w:ilvl w:val="0"/>
+          <w:numId w:val="9"/>
+        </w:numPr>
+        <w:spacing w:line="276" w:lineRule="auto"/>
+        <w:rPr>
+          <w:sz w:val="21"/>
+          <w:szCs w:val="21"/>
+        </w:rPr>
+      </w:pPr>
+      <w:hyperlink r:id="rId18" w:history="1">
+        <w:r>
+          <w:rPr>
+            <w:rStyle w:val="Hyperlink"/>
+            <w:sz w:val="21"/>
+            <w:szCs w:val="21"/>
+          </w:rPr>
+          <w:t>https://www.geeksforgeeks.org/elasticsearch/elasticsearch-architecture/</w:t>
+        </w:r>
+      </w:hyperlink>
+    </w:p>
+    <w:p>
+      <w:pPr>
+        <w:pStyle w:val="ListParagraph"/>
+        <w:numPr>
+          <w:ilvl w:val="0"/>
+          <w:numId w:val="9"/>
+        </w:numPr>
+        <w:spacing w:line="276" w:lineRule="auto"/>
+        <w:rPr>
+          <w:sz w:val="21"/>
+          <w:szCs w:val="21"/>
+        </w:rPr>
+      </w:pPr>
+      <w:hyperlink r:id="rId19" w:history="1">
+        <w:r>
+          <w:rPr>
+            <w:rStyle w:val="Hyperlink"/>
+            <w:sz w:val="21"/>
+            <w:szCs w:val="21"/>
+          </w:rPr>
+          <w:t>https://medium.com/@TechTim42/elastic-search-and-open-search-a-brief-history-of-the-license-war-8f474743e2ff</w:t>
+        </w:r>
+      </w:hyperlink>
+    </w:p>
+    <w:p>
+      <w:pPr>
+        <w:pStyle w:val="ListParagraph"/>
+        <w:numPr>
+          <w:ilvl w:val="0"/>
+          <w:numId w:val="9"/>
+        </w:numPr>
+        <w:spacing w:line="276" w:lineRule="auto"/>
+        <w:rPr>
+          <w:sz w:val="21"/>
+          <w:szCs w:val="21"/>
+        </w:rPr>
+      </w:pPr>
+      <w:hyperlink r:id="rId20" w:history="1">
+        <w:r>
+          <w:rPr>
+            <w:rStyle w:val="Hyperlink"/>
+            <w:sz w:val="21"/>
+            <w:szCs w:val="21"/>
+          </w:rPr>
+          <w:t>https://www.cdata.com/blog/elasticsearch-use-cases</w:t>
+        </w:r>
+      </w:hyperlink>
+    </w:p>
+    <w:p>
+      <w:pPr>
+        <w:spacing w:line="276" w:lineRule="auto"/>
+        <w:rPr>
+          <w:sz w:val="21"/>
+          <w:szCs w:val="21"/>
+        </w:rPr>
+      </w:pPr>
+    </w:p>
+    <w:p>
+      <w:pPr>
+        <w:spacing w:line="276" w:lineRule="auto"/>
+        <w:rPr>
+          <w:sz w:val="21"/>
+          <w:szCs w:val="21"/>
+        </w:rPr>
+      </w:pPr>
     </w:p>
     <w:p>
       <w:pPr>
@@ -485,6 +1841,259 @@
 <file path=word/numbering.xml><?xml version="1.0" encoding="utf-8"?>
 <w:numbering xmlns:wpc="http://schemas.microsoft.com/office/word/2010/wordprocessingCanvas" xmlns:cx="http://schemas.microsoft.com/office/drawing/2014/chartex" xmlns:cx1="http://schemas.microsoft.com/office/drawing/2015/9/8/chartex" xmlns:cx2="http://schemas.microsoft.com/office/drawing/2015/10/21/chartex" xmlns:cx3="http://schemas.microsoft.com/office/drawing/2016/5/9/chartex" xmlns:cx4="http://schemas.microsoft.com/office/drawing/2016/5/10/chartex" xmlns:cx5="http://schemas.microsoft.com/office/drawing/2016/5/11/chartex" xmlns:cx6="http://schemas.microsoft.com/office/drawing/2016/5/12/chartex" xmlns:cx7="http://schemas.microsoft.com/office/drawing/2016/5/13/chartex" xmlns:cx8="http://schemas.microsoft.com/office/drawing/2016/5/14/chartex" xmlns:mc="http://schemas.openxmlformats.org/markup-compatibility/2006" xmlns:aink="http://schemas.microsoft.com/office/drawing/2016/ink" xmlns:am3d="http://schemas.microsoft.com/office/drawing/2017/model3d" xmlns:o="urn:schemas-microsoft-com:office:office" xmlns:oel="http://schemas.microsoft.com/office/2019/extlst" xmlns:r="http://schemas.openxmlformats.org/officeDocument/2006/relationships" xmlns:m="http://schemas.openxmlformats.org/officeDocument/2006/math" xmlns:v="urn:schemas-microsoft-com:vml" xmlns:wp14="http://schemas.microsoft.com/office/word/2010/wordprocessingDrawing" xmlns:wp="http://schemas.openxmlformats.org/drawingml/2006/wordprocessingDrawing" xmlns:w10="urn:schemas-microsoft-com:office:word" xmlns:w="http://schemas.openxmlformats.org/wordprocessingml/2006/main" xmlns:w14="http://schemas.microsoft.com/office/word/2010/wordml" xmlns:w15="http://schemas.microsoft.com/office/word/2012/wordml" xmlns:w16cex="http://schemas.microsoft.com/office/word/2018/wordml/cex" xmlns:w16cid="http://schemas.microsoft.com/office/word/2016/wordml/cid" xmlns:w16="http://schemas.microsoft.com/office/word/2018/wordml" xmlns:w16du="http://schemas.microsoft.com/office/word/2023/wordml/word16du" xmlns:w16sdtdh="http://schemas.microsoft.com/office/word/2020/wordml/sdtdatahash" xmlns:w16sdtfl="http://schemas.microsoft.com/office/word/2024/wordml/sdtformatlock" xmlns:w16se="http://schemas.microsoft.com/office/word/2015/wordml/symex" xmlns:wpg="http://schemas.microsoft.com/office/word/2010/wordprocessingGroup" xmlns:wpi="http://schemas.microsoft.com/office/word/2010/wordprocessingInk" xmlns:wne="http://schemas.microsoft.com/office/word/2006/wordml" xmlns:wps="http://schemas.microsoft.com/office/word/2010/wordprocessingShape" mc:Ignorable="w14 w15 w16se w16cid w16 w16cex w16sdtdh w16sdtfl w16du wp14">
   <w:abstractNum w:abstractNumId="0" w15:restartNumberingAfterBreak="0">
+    <w:nsid w:val="15CB544E"/>
+    <w:multiLevelType w:val="hybridMultilevel"/>
+    <w:tmpl w:val="DE3C358A"/>
+    <w:lvl w:ilvl="0" w:tplc="08090001">
+      <w:start w:val="1"/>
+      <w:numFmt w:val="bullet"/>
+      <w:lvlText w:val=""/>
+      <w:lvlJc w:val="left"/>
+      <w:pPr>
+        <w:ind w:left="720" w:hanging="360"/>
+      </w:pPr>
+      <w:rPr>
+        <w:rFonts w:ascii="Symbol" w:hAnsi="Symbol" w:hint="default"/>
+      </w:rPr>
+    </w:lvl>
+    <w:lvl w:ilvl="1" w:tplc="08090003" w:tentative="1">
+      <w:start w:val="1"/>
+      <w:numFmt w:val="bullet"/>
+      <w:lvlText w:val="o"/>
+      <w:lvlJc w:val="left"/>
+      <w:pPr>
+        <w:ind w:left="1440" w:hanging="360"/>
+      </w:pPr>
+      <w:rPr>
+        <w:rFonts w:ascii="Courier New" w:hAnsi="Courier New" w:cs="Courier New" w:hint="default"/>
+      </w:rPr>
+    </w:lvl>
+    <w:lvl w:ilvl="2" w:tplc="08090005" w:tentative="1">
+      <w:start w:val="1"/>
+      <w:numFmt w:val="bullet"/>
+      <w:lvlText w:val=""/>
+      <w:lvlJc w:val="left"/>
+      <w:pPr>
+        <w:ind w:left="2160" w:hanging="360"/>
+      </w:pPr>
+      <w:rPr>
+        <w:rFonts w:ascii="Wingdings" w:hAnsi="Wingdings" w:hint="default"/>
+      </w:rPr>
+    </w:lvl>
+    <w:lvl w:ilvl="3" w:tplc="08090001" w:tentative="1">
+      <w:start w:val="1"/>
+      <w:numFmt w:val="bullet"/>
+      <w:lvlText w:val=""/>
+      <w:lvlJc w:val="left"/>
+      <w:pPr>
+        <w:ind w:left="2880" w:hanging="360"/>
+      </w:pPr>
+      <w:rPr>
+        <w:rFonts w:ascii="Symbol" w:hAnsi="Symbol" w:hint="default"/>
+      </w:rPr>
+    </w:lvl>
+    <w:lvl w:ilvl="4" w:tplc="08090003" w:tentative="1">
+      <w:start w:val="1"/>
+      <w:numFmt w:val="bullet"/>
+      <w:lvlText w:val="o"/>
+      <w:lvlJc w:val="left"/>
+      <w:pPr>
+        <w:ind w:left="3600" w:hanging="360"/>
+      </w:pPr>
+      <w:rPr>
+        <w:rFonts w:ascii="Courier New" w:hAnsi="Courier New" w:cs="Courier New" w:hint="default"/>
+      </w:rPr>
+    </w:lvl>
+    <w:lvl w:ilvl="5" w:tplc="08090005" w:tentative="1">
+      <w:start w:val="1"/>
+      <w:numFmt w:val="bullet"/>
+      <w:lvlText w:val=""/>
+      <w:lvlJc w:val="left"/>
+      <w:pPr>
+        <w:ind w:left="4320" w:hanging="360"/>
+      </w:pPr>
+      <w:rPr>
+        <w:rFonts w:ascii="Wingdings" w:hAnsi="Wingdings" w:hint="default"/>
+      </w:rPr>
+    </w:lvl>
+    <w:lvl w:ilvl="6" w:tplc="08090001" w:tentative="1">
+      <w:start w:val="1"/>
+      <w:numFmt w:val="bullet"/>
+      <w:lvlText w:val=""/>
+      <w:lvlJc w:val="left"/>
+      <w:pPr>
+        <w:ind w:left="5040" w:hanging="360"/>
+      </w:pPr>
+      <w:rPr>
+        <w:rFonts w:ascii="Symbol" w:hAnsi="Symbol" w:hint="default"/>
+      </w:rPr>
+    </w:lvl>
+    <w:lvl w:ilvl="7" w:tplc="08090003" w:tentative="1">
+      <w:start w:val="1"/>
+      <w:numFmt w:val="bullet"/>
+      <w:lvlText w:val="o"/>
+      <w:lvlJc w:val="left"/>
+      <w:pPr>
+        <w:ind w:left="5760" w:hanging="360"/>
+      </w:pPr>
+      <w:rPr>
+        <w:rFonts w:ascii="Courier New" w:hAnsi="Courier New" w:cs="Courier New" w:hint="default"/>
+      </w:rPr>
+    </w:lvl>
+    <w:lvl w:ilvl="8" w:tplc="08090005" w:tentative="1">
+      <w:start w:val="1"/>
+      <w:numFmt w:val="bullet"/>
+      <w:lvlText w:val=""/>
+      <w:lvlJc w:val="left"/>
+      <w:pPr>
+        <w:ind w:left="6480" w:hanging="360"/>
+      </w:pPr>
+      <w:rPr>
+        <w:rFonts w:ascii="Wingdings" w:hAnsi="Wingdings" w:hint="default"/>
+      </w:rPr>
+    </w:lvl>
+  </w:abstractNum>
+  <w:abstractNum w:abstractNumId="1" w15:restartNumberingAfterBreak="0">
+    <w:nsid w:val="24A46825"/>
+    <w:multiLevelType w:val="hybridMultilevel"/>
+    <w:tmpl w:val="667AF0FA"/>
+    <w:lvl w:ilvl="0" w:tplc="4AF29D60">
+      <w:start w:val="1"/>
+      <w:numFmt w:val="bullet"/>
+      <w:lvlText w:val="•"/>
+      <w:lvlJc w:val="left"/>
+      <w:pPr>
+        <w:tabs>
+          <w:tab w:val="num" w:pos="720"/>
+        </w:tabs>
+        <w:ind w:left="720" w:hanging="360"/>
+      </w:pPr>
+      <w:rPr>
+        <w:rFonts w:ascii="Arial" w:hAnsi="Arial" w:hint="default"/>
+      </w:rPr>
+    </w:lvl>
+    <w:lvl w:ilvl="1" w:tplc="1AD6040C">
+      <w:start w:val="1"/>
+      <w:numFmt w:val="bullet"/>
+      <w:lvlText w:val="•"/>
+      <w:lvlJc w:val="left"/>
+      <w:pPr>
+        <w:tabs>
+          <w:tab w:val="num" w:pos="1440"/>
+        </w:tabs>
+        <w:ind w:left="1440" w:hanging="360"/>
+      </w:pPr>
+      <w:rPr>
+        <w:rFonts w:ascii="Arial" w:hAnsi="Arial" w:hint="default"/>
+      </w:rPr>
+    </w:lvl>
+    <w:lvl w:ilvl="2" w:tplc="83945FB0" w:tentative="1">
+      <w:start w:val="1"/>
+      <w:numFmt w:val="bullet"/>
+      <w:lvlText w:val="•"/>
+      <w:lvlJc w:val="left"/>
+      <w:pPr>
+        <w:tabs>
+          <w:tab w:val="num" w:pos="2160"/>
+        </w:tabs>
+        <w:ind w:left="2160" w:hanging="360"/>
+      </w:pPr>
+      <w:rPr>
+        <w:rFonts w:ascii="Arial" w:hAnsi="Arial" w:hint="default"/>
+      </w:rPr>
+    </w:lvl>
+    <w:lvl w:ilvl="3" w:tplc="41363D86" w:tentative="1">
+      <w:start w:val="1"/>
+      <w:numFmt w:val="bullet"/>
+      <w:lvlText w:val="•"/>
+      <w:lvlJc w:val="left"/>
+      <w:pPr>
+        <w:tabs>
+          <w:tab w:val="num" w:pos="2880"/>
+        </w:tabs>
+        <w:ind w:left="2880" w:hanging="360"/>
+      </w:pPr>
+      <w:rPr>
+        <w:rFonts w:ascii="Arial" w:hAnsi="Arial" w:hint="default"/>
+      </w:rPr>
+    </w:lvl>
+    <w:lvl w:ilvl="4" w:tplc="CE784AB2" w:tentative="1">
+      <w:start w:val="1"/>
+      <w:numFmt w:val="bullet"/>
+      <w:lvlText w:val="•"/>
+      <w:lvlJc w:val="left"/>
+      <w:pPr>
+        <w:tabs>
+          <w:tab w:val="num" w:pos="3600"/>
+        </w:tabs>
+        <w:ind w:left="3600" w:hanging="360"/>
+      </w:pPr>
+      <w:rPr>
+        <w:rFonts w:ascii="Arial" w:hAnsi="Arial" w:hint="default"/>
+      </w:rPr>
+    </w:lvl>
+    <w:lvl w:ilvl="5" w:tplc="11A2D9BA" w:tentative="1">
+      <w:start w:val="1"/>
+      <w:numFmt w:val="bullet"/>
+      <w:lvlText w:val="•"/>
+      <w:lvlJc w:val="left"/>
+      <w:pPr>
+        <w:tabs>
+          <w:tab w:val="num" w:pos="4320"/>
+        </w:tabs>
+        <w:ind w:left="4320" w:hanging="360"/>
+      </w:pPr>
+      <w:rPr>
+        <w:rFonts w:ascii="Arial" w:hAnsi="Arial" w:hint="default"/>
+      </w:rPr>
+    </w:lvl>
+    <w:lvl w:ilvl="6" w:tplc="5B740652" w:tentative="1">
+      <w:start w:val="1"/>
+      <w:numFmt w:val="bullet"/>
+      <w:lvlText w:val="•"/>
+      <w:lvlJc w:val="left"/>
+      <w:pPr>
+        <w:tabs>
+          <w:tab w:val="num" w:pos="5040"/>
+        </w:tabs>
+        <w:ind w:left="5040" w:hanging="360"/>
+      </w:pPr>
+      <w:rPr>
+        <w:rFonts w:ascii="Arial" w:hAnsi="Arial" w:hint="default"/>
+      </w:rPr>
+    </w:lvl>
+    <w:lvl w:ilvl="7" w:tplc="E7E00E30" w:tentative="1">
+      <w:start w:val="1"/>
+      <w:numFmt w:val="bullet"/>
+      <w:lvlText w:val="•"/>
+      <w:lvlJc w:val="left"/>
+      <w:pPr>
+        <w:tabs>
+          <w:tab w:val="num" w:pos="5760"/>
+        </w:tabs>
+        <w:ind w:left="5760" w:hanging="360"/>
+      </w:pPr>
+      <w:rPr>
+        <w:rFonts w:ascii="Arial" w:hAnsi="Arial" w:hint="default"/>
+      </w:rPr>
+    </w:lvl>
+    <w:lvl w:ilvl="8" w:tplc="8440152E" w:tentative="1">
+      <w:start w:val="1"/>
+      <w:numFmt w:val="bullet"/>
+      <w:lvlText w:val="•"/>
+      <w:lvlJc w:val="left"/>
+      <w:pPr>
+        <w:tabs>
+          <w:tab w:val="num" w:pos="6480"/>
+        </w:tabs>
+        <w:ind w:left="6480" w:hanging="360"/>
+      </w:pPr>
+      <w:rPr>
+        <w:rFonts w:ascii="Arial" w:hAnsi="Arial" w:hint="default"/>
+      </w:rPr>
+    </w:lvl>
+  </w:abstractNum>
+  <w:abstractNum w:abstractNumId="2" w15:restartNumberingAfterBreak="0">
     <w:nsid w:val="25BB415F"/>
     <w:multiLevelType w:val="multilevel"/>
     <w:tmpl w:val="0407001F"/>
@@ -570,7 +2179,7 @@
       </w:pPr>
     </w:lvl>
   </w:abstractNum>
-  <w:abstractNum w:abstractNumId="1" w15:restartNumberingAfterBreak="0">
+  <w:abstractNum w:abstractNumId="3" w15:restartNumberingAfterBreak="0">
     <w:nsid w:val="2D5A0A94"/>
     <w:multiLevelType w:val="multilevel"/>
     <w:tmpl w:val="0407001F"/>
@@ -656,7 +2265,120 @@
       </w:pPr>
     </w:lvl>
   </w:abstractNum>
-  <w:abstractNum w:abstractNumId="2" w15:restartNumberingAfterBreak="0">
+  <w:abstractNum w:abstractNumId="4" w15:restartNumberingAfterBreak="0">
+    <w:nsid w:val="37C361CC"/>
+    <w:multiLevelType w:val="hybridMultilevel"/>
+    <w:tmpl w:val="4E707544"/>
+    <w:lvl w:ilvl="0" w:tplc="08090001">
+      <w:start w:val="1"/>
+      <w:numFmt w:val="bullet"/>
+      <w:lvlText w:val=""/>
+      <w:lvlJc w:val="left"/>
+      <w:pPr>
+        <w:ind w:left="720" w:hanging="360"/>
+      </w:pPr>
+      <w:rPr>
+        <w:rFonts w:ascii="Symbol" w:hAnsi="Symbol" w:hint="default"/>
+      </w:rPr>
+    </w:lvl>
+    <w:lvl w:ilvl="1" w:tplc="08090003" w:tentative="1">
+      <w:start w:val="1"/>
+      <w:numFmt w:val="bullet"/>
+      <w:lvlText w:val="o"/>
+      <w:lvlJc w:val="left"/>
+      <w:pPr>
+        <w:ind w:left="1440" w:hanging="360"/>
+      </w:pPr>
+      <w:rPr>
+        <w:rFonts w:ascii="Courier New" w:hAnsi="Courier New" w:cs="Courier New" w:hint="default"/>
+      </w:rPr>
+    </w:lvl>
+    <w:lvl w:ilvl="2" w:tplc="08090005" w:tentative="1">
+      <w:start w:val="1"/>
+      <w:numFmt w:val="bullet"/>
+      <w:lvlText w:val=""/>
+      <w:lvlJc w:val="left"/>
+      <w:pPr>
+        <w:ind w:left="2160" w:hanging="360"/>
+      </w:pPr>
+      <w:rPr>
+        <w:rFonts w:ascii="Wingdings" w:hAnsi="Wingdings" w:hint="default"/>
+      </w:rPr>
+    </w:lvl>
+    <w:lvl w:ilvl="3" w:tplc="08090001" w:tentative="1">
+      <w:start w:val="1"/>
+      <w:numFmt w:val="bullet"/>
+      <w:lvlText w:val=""/>
+      <w:lvlJc w:val="left"/>
+      <w:pPr>
+        <w:ind w:left="2880" w:hanging="360"/>
+      </w:pPr>
+      <w:rPr>
+        <w:rFonts w:ascii="Symbol" w:hAnsi="Symbol" w:hint="default"/>
+      </w:rPr>
+    </w:lvl>
+    <w:lvl w:ilvl="4" w:tplc="08090003" w:tentative="1">
+      <w:start w:val="1"/>
+      <w:numFmt w:val="bullet"/>
+      <w:lvlText w:val="o"/>
+      <w:lvlJc w:val="left"/>
+      <w:pPr>
+        <w:ind w:left="3600" w:hanging="360"/>
+      </w:pPr>
+      <w:rPr>
+        <w:rFonts w:ascii="Courier New" w:hAnsi="Courier New" w:cs="Courier New" w:hint="default"/>
+      </w:rPr>
+    </w:lvl>
+    <w:lvl w:ilvl="5" w:tplc="08090005" w:tentative="1">
+      <w:start w:val="1"/>
+      <w:numFmt w:val="bullet"/>
+      <w:lvlText w:val=""/>
+      <w:lvlJc w:val="left"/>
+      <w:pPr>
+        <w:ind w:left="4320" w:hanging="360"/>
+      </w:pPr>
+      <w:rPr>
+        <w:rFonts w:ascii="Wingdings" w:hAnsi="Wingdings" w:hint="default"/>
+      </w:rPr>
+    </w:lvl>
+    <w:lvl w:ilvl="6" w:tplc="08090001" w:tentative="1">
+      <w:start w:val="1"/>
+      <w:numFmt w:val="bullet"/>
+      <w:lvlText w:val=""/>
+      <w:lvlJc w:val="left"/>
+      <w:pPr>
+        <w:ind w:left="5040" w:hanging="360"/>
+      </w:pPr>
+      <w:rPr>
+        <w:rFonts w:ascii="Symbol" w:hAnsi="Symbol" w:hint="default"/>
+      </w:rPr>
+    </w:lvl>
+    <w:lvl w:ilvl="7" w:tplc="08090003" w:tentative="1">
+      <w:start w:val="1"/>
+      <w:numFmt w:val="bullet"/>
+      <w:lvlText w:val="o"/>
+      <w:lvlJc w:val="left"/>
+      <w:pPr>
+        <w:ind w:left="5760" w:hanging="360"/>
+      </w:pPr>
+      <w:rPr>
+        <w:rFonts w:ascii="Courier New" w:hAnsi="Courier New" w:cs="Courier New" w:hint="default"/>
+      </w:rPr>
+    </w:lvl>
+    <w:lvl w:ilvl="8" w:tplc="08090005" w:tentative="1">
+      <w:start w:val="1"/>
+      <w:numFmt w:val="bullet"/>
+      <w:lvlText w:val=""/>
+      <w:lvlJc w:val="left"/>
+      <w:pPr>
+        <w:ind w:left="6480" w:hanging="360"/>
+      </w:pPr>
+      <w:rPr>
+        <w:rFonts w:ascii="Wingdings" w:hAnsi="Wingdings" w:hint="default"/>
+      </w:rPr>
+    </w:lvl>
+  </w:abstractNum>
+  <w:abstractNum w:abstractNumId="5" w15:restartNumberingAfterBreak="0">
     <w:nsid w:val="4C31416B"/>
     <w:multiLevelType w:val="multilevel"/>
     <w:tmpl w:val="04070025"/>
@@ -742,7 +2464,7 @@
       </w:pPr>
     </w:lvl>
   </w:abstractNum>
-  <w:abstractNum w:abstractNumId="3" w15:restartNumberingAfterBreak="0">
+  <w:abstractNum w:abstractNumId="6" w15:restartNumberingAfterBreak="0">
     <w:nsid w:val="511D187E"/>
     <w:multiLevelType w:val="multilevel"/>
     <w:tmpl w:val="0407001F"/>
@@ -828,7 +2550,7 @@
       </w:pPr>
     </w:lvl>
   </w:abstractNum>
-  <w:abstractNum w:abstractNumId="4" w15:restartNumberingAfterBreak="0">
+  <w:abstractNum w:abstractNumId="7" w15:restartNumberingAfterBreak="0">
     <w:nsid w:val="54075CFE"/>
     <w:multiLevelType w:val="multilevel"/>
     <w:tmpl w:val="0407001F"/>
@@ -914,7 +2636,7 @@
       </w:pPr>
     </w:lvl>
   </w:abstractNum>
-  <w:abstractNum w:abstractNumId="5" w15:restartNumberingAfterBreak="0">
+  <w:abstractNum w:abstractNumId="8" w15:restartNumberingAfterBreak="0">
     <w:nsid w:val="5A9E2655"/>
     <w:multiLevelType w:val="multilevel"/>
     <w:tmpl w:val="0407001F"/>
@@ -1000,7 +2722,7 @@
       </w:pPr>
     </w:lvl>
   </w:abstractNum>
-  <w:abstractNum w:abstractNumId="6" w15:restartNumberingAfterBreak="0">
+  <w:abstractNum w:abstractNumId="9" w15:restartNumberingAfterBreak="0">
     <w:nsid w:val="62E64D81"/>
     <w:multiLevelType w:val="multilevel"/>
     <w:tmpl w:val="04070025"/>
@@ -1096,24 +2818,33 @@
     </w:lvl>
   </w:abstractNum>
   <w:num w:numId="1" w16cid:durableId="726143481">
+    <w:abstractNumId w:val="2"/>
+  </w:num>
+  <w:num w:numId="2" w16cid:durableId="48581088">
+    <w:abstractNumId w:val="9"/>
+  </w:num>
+  <w:num w:numId="3" w16cid:durableId="1675299582">
+    <w:abstractNumId w:val="6"/>
+  </w:num>
+  <w:num w:numId="4" w16cid:durableId="837967992">
+    <w:abstractNumId w:val="3"/>
+  </w:num>
+  <w:num w:numId="5" w16cid:durableId="1291084741">
+    <w:abstractNumId w:val="8"/>
+  </w:num>
+  <w:num w:numId="6" w16cid:durableId="271859767">
+    <w:abstractNumId w:val="5"/>
+  </w:num>
+  <w:num w:numId="7" w16cid:durableId="1720787299">
+    <w:abstractNumId w:val="7"/>
+  </w:num>
+  <w:num w:numId="8" w16cid:durableId="1798832943">
+    <w:abstractNumId w:val="1"/>
+  </w:num>
+  <w:num w:numId="9" w16cid:durableId="482813143">
     <w:abstractNumId w:val="0"/>
   </w:num>
-  <w:num w:numId="2" w16cid:durableId="48581088">
-    <w:abstractNumId w:val="6"/>
-  </w:num>
-  <w:num w:numId="3" w16cid:durableId="1675299582">
-    <w:abstractNumId w:val="3"/>
-  </w:num>
-  <w:num w:numId="4" w16cid:durableId="837967992">
-    <w:abstractNumId w:val="1"/>
-  </w:num>
-  <w:num w:numId="5" w16cid:durableId="1291084741">
-    <w:abstractNumId w:val="5"/>
-  </w:num>
-  <w:num w:numId="6" w16cid:durableId="271859767">
-    <w:abstractNumId w:val="2"/>
-  </w:num>
-  <w:num w:numId="7" w16cid:durableId="1720787299">
+  <w:num w:numId="10" w16cid:durableId="56704278">
     <w:abstractNumId w:val="4"/>
   </w:num>
 </w:numbering>
@@ -1729,7 +3460,6 @@
   <w:style w:type="character" w:default="1" w:styleId="DefaultParagraphFont">
     <w:name w:val="Default Paragraph Font"/>
     <w:uiPriority w:val="1"/>
-    <w:semiHidden/>
     <w:unhideWhenUsed/>
   </w:style>
   <w:style w:type="table" w:default="1" w:styleId="TableNormal">
@@ -2185,6 +3915,37 @@
     <w:pPr>
       <w:spacing w:before="100" w:beforeAutospacing="1" w:after="100" w:afterAutospacing="1"/>
     </w:pPr>
+  </w:style>
+  <w:style w:type="character" w:styleId="FollowedHyperlink">
+    <w:name w:val="FollowedHyperlink"/>
+    <w:basedOn w:val="DefaultParagraphFont"/>
+    <w:uiPriority w:val="99"/>
+    <w:semiHidden/>
+    <w:unhideWhenUsed/>
+    <w:rsid w:val="00BD0CB5"/>
+    <w:rPr>
+      <w:color w:val="96607D" w:themeColor="followedHyperlink"/>
+      <w:u w:val="single"/>
+    </w:rPr>
+  </w:style>
+  <w:style w:type="table" w:styleId="TableGrid">
+    <w:name w:val="Table Grid"/>
+    <w:basedOn w:val="TableNormal"/>
+    <w:uiPriority w:val="39"/>
+    <w:rsid w:val="00443D60"/>
+    <w:pPr>
+      <w:spacing w:after="0" w:line="240" w:lineRule="auto"/>
+    </w:pPr>
+    <w:tblPr>
+      <w:tblBorders>
+        <w:top w:val="single" w:sz="4" w:space="0" w:color="auto"/>
+        <w:left w:val="single" w:sz="4" w:space="0" w:color="auto"/>
+        <w:bottom w:val="single" w:sz="4" w:space="0" w:color="auto"/>
+        <w:right w:val="single" w:sz="4" w:space="0" w:color="auto"/>
+        <w:insideH w:val="single" w:sz="4" w:space="0" w:color="auto"/>
+        <w:insideV w:val="single" w:sz="4" w:space="0" w:color="auto"/>
+      </w:tblBorders>
+    </w:tblPr>
   </w:style>
 </w:styles>
 </file>
@@ -2489,7 +4250,7 @@
 </file>
 
 <file path=customXml/itemProps1.xml><?xml version="1.0" encoding="utf-8"?>
-<ds:datastoreItem xmlns:ds="http://schemas.openxmlformats.org/officeDocument/2006/customXml" ds:itemID="{445FAC64-C917-C64B-A004-30BE1E72DAD6}">
+<ds:datastoreItem xmlns:ds="http://schemas.openxmlformats.org/officeDocument/2006/customXml" ds:itemID="{93AF70FE-4869-D64F-A87F-18B8E246D7F7}">
   <ds:schemaRefs>
     <ds:schemaRef ds:uri="http://schemas.openxmlformats.org/officeDocument/2006/bibliography"/>
   </ds:schemaRefs>

</xml_diff>

<commit_message>
Architecture section in paper started
</commit_message>
<xml_diff>
--- a/Elasticsearch_Paper.docx
+++ b/Elasticsearch_Paper.docx
@@ -531,6 +531,12 @@
         <w:spacing w:line="276" w:lineRule="auto"/>
         <w:jc w:val="both"/>
       </w:pPr>
+    </w:p>
+    <w:p>
+      <w:pPr>
+        <w:spacing w:line="276" w:lineRule="auto"/>
+        <w:jc w:val="both"/>
+      </w:pPr>
       <w:r>
         <w:t>Elasticsearch has no concept of joins. Instead, related data must be combined into a single document before indexing, a process known as denormalization. This means that data is intentionally duplicated across documents in exchange for faster query performance, since Elasticsearch never needs to look up data from multiple places to answer a query.</w:t>
       </w:r>
@@ -540,6 +546,12 @@
         <w:spacing w:line="276" w:lineRule="auto"/>
         <w:jc w:val="both"/>
       </w:pPr>
+    </w:p>
+    <w:p>
+      <w:pPr>
+        <w:spacing w:line="276" w:lineRule="auto"/>
+        <w:jc w:val="both"/>
+      </w:pPr>
       <w:r>
         <w:t xml:space="preserve">Despite being a NoSQL document store, Elasticsearch is also a search engine which means it is </w:t>
       </w:r>
@@ -550,451 +562,34 @@
         <w:t xml:space="preserve"> </w:t>
       </w:r>
       <w:r>
-        <w:t>he key difference to a general-purpose document database such as MongoDB is the underlying data structure. While MongoDB stores documents in a format optimized for retrieval by ID or field value, Elasticsearch builds an inverted index over the content of every document at indexing time. This inverted index maps every individual word to the documents that contain it, allowing Elasticsearch to answer full-text search queries in milliseconds regardless of the total number of documents. This makes Elasticsearch orders of magnitude faster for search-heavy workloads compared to a relational or document database that would need to scan through records sequentially to find matches.</w:t>
-      </w:r>
-    </w:p>
-    <w:p>
-      <w:pPr>
-        <w:spacing w:line="276" w:lineRule="auto"/>
-        <w:jc w:val="both"/>
-      </w:pPr>
-    </w:p>
-    <w:p>
-      <w:pPr>
-        <w:spacing w:line="276" w:lineRule="auto"/>
-        <w:jc w:val="both"/>
-      </w:pPr>
-      <w:r>
-        <mc:AlternateContent>
-          <mc:Choice Requires="wpg">
-            <w:drawing>
-              <wp:anchor distT="0" distB="0" distL="114300" distR="114300" simplePos="0" relativeHeight="251659264" behindDoc="0" locked="0" layoutInCell="1" allowOverlap="1" wp14:anchorId="0D7FF325" wp14:editId="1CD40A8C">
-                <wp:simplePos x="0" y="0"/>
-                <wp:positionH relativeFrom="column">
-                  <wp:posOffset>-200895</wp:posOffset>
-                </wp:positionH>
-                <wp:positionV relativeFrom="paragraph">
-                  <wp:posOffset>83885</wp:posOffset>
-                </wp:positionV>
-                <wp:extent cx="6088080" cy="982767"/>
-                <wp:effectExtent l="0" t="0" r="0" b="0"/>
-                <wp:wrapNone/>
-                <wp:docPr id="4" name="Group 3">
-                  <a:extLst xmlns:a="http://schemas.openxmlformats.org/drawingml/2006/main">
-                    <a:ext uri="{FF2B5EF4-FFF2-40B4-BE49-F238E27FC236}">
-                      <a16:creationId xmlns:a16="http://schemas.microsoft.com/office/drawing/2014/main" id="{2CF57503-E4A7-0613-CD66-AF3D371F4F0A}"/>
-                    </a:ext>
-                  </a:extLst>
-                </wp:docPr>
-                <wp:cNvGraphicFramePr/>
-                <a:graphic xmlns:a="http://schemas.openxmlformats.org/drawingml/2006/main">
-                  <a:graphicData uri="http://schemas.microsoft.com/office/word/2010/wordprocessingGroup">
-                    <wpg:wgp>
-                      <wpg:cNvGrpSpPr/>
-                      <wpg:grpSpPr>
-                        <a:xfrm>
-                          <a:off x="0" y="0"/>
-                          <a:ext cx="6088080" cy="982767"/>
-                          <a:chOff x="0" y="0"/>
-                          <a:chExt cx="9428893" cy="1522638"/>
-                        </a:xfrm>
-                      </wpg:grpSpPr>
-                      <wpg:grpSp>
-                        <wpg:cNvPr id="877948927" name="Group 877948927">
-                          <a:extLst>
-                            <a:ext uri="{FF2B5EF4-FFF2-40B4-BE49-F238E27FC236}">
-                              <a16:creationId xmlns:a16="http://schemas.microsoft.com/office/drawing/2014/main" id="{C2472689-7A41-A70C-5E9C-CDCB03381588}"/>
-                            </a:ext>
-                          </a:extLst>
-                        </wpg:cNvPr>
-                        <wpg:cNvGrpSpPr/>
-                        <wpg:grpSpPr>
-                          <a:xfrm>
-                            <a:off x="0" y="300965"/>
-                            <a:ext cx="3013046" cy="712381"/>
-                            <a:chOff x="0" y="300965"/>
-                            <a:chExt cx="3461657" cy="826735"/>
-                          </a:xfrm>
-                        </wpg:grpSpPr>
-                        <wps:wsp>
-                          <wps:cNvPr id="1058396828" name="Rectangle 1058396828">
-                            <a:extLst>
-                              <a:ext uri="{FF2B5EF4-FFF2-40B4-BE49-F238E27FC236}">
-                                <a16:creationId xmlns:a16="http://schemas.microsoft.com/office/drawing/2014/main" id="{7CDBC851-880E-EACC-7E51-2912EACCF5E0}"/>
-                              </a:ext>
-                            </a:extLst>
-                          </wps:cNvPr>
-                          <wps:cNvSpPr/>
-                          <wps:spPr>
-                            <a:xfrm>
-                              <a:off x="0" y="300965"/>
-                              <a:ext cx="3461657" cy="826735"/>
-                            </a:xfrm>
-                            <a:prstGeom prst="rect">
-                              <a:avLst/>
-                            </a:prstGeom>
-                            <a:solidFill>
-                              <a:srgbClr val="00BFB3"/>
-                            </a:solidFill>
-                            <a:ln>
-                              <a:noFill/>
-                            </a:ln>
-                          </wps:spPr>
-                          <wps:style>
-                            <a:lnRef idx="2">
-                              <a:schemeClr val="accent1">
-                                <a:shade val="15000"/>
-                              </a:schemeClr>
-                            </a:lnRef>
-                            <a:fillRef idx="1">
-                              <a:schemeClr val="accent1"/>
-                            </a:fillRef>
-                            <a:effectRef idx="0">
-                              <a:schemeClr val="accent1"/>
-                            </a:effectRef>
-                            <a:fontRef idx="minor">
-                              <a:schemeClr val="lt1"/>
-                            </a:fontRef>
-                          </wps:style>
-                          <wps:bodyPr rtlCol="0" anchor="ctr"/>
-                        </wps:wsp>
-                        <pic:pic xmlns:pic="http://schemas.openxmlformats.org/drawingml/2006/picture">
-                          <pic:nvPicPr>
-                            <pic:cNvPr id="1106066645" name="Picture 1106066645">
-                              <a:extLst>
-                                <a:ext uri="{FF2B5EF4-FFF2-40B4-BE49-F238E27FC236}">
-                                  <a16:creationId xmlns:a16="http://schemas.microsoft.com/office/drawing/2014/main" id="{E1D9A5AF-BA1F-16E8-8A10-17FCC7E07E7B}"/>
-                                </a:ext>
-                              </a:extLst>
-                            </pic:cNvPr>
-                            <pic:cNvPicPr>
-                              <a:picLocks noChangeAspect="1"/>
-                            </pic:cNvPicPr>
-                          </pic:nvPicPr>
-                          <pic:blipFill>
-                            <a:blip r:embed="rId8"/>
-                            <a:stretch>
-                              <a:fillRect/>
-                            </a:stretch>
-                          </pic:blipFill>
-                          <pic:spPr>
-                            <a:xfrm>
-                              <a:off x="83198" y="381547"/>
-                              <a:ext cx="3295260" cy="647945"/>
-                            </a:xfrm>
-                            <a:prstGeom prst="rect">
-                              <a:avLst/>
-                            </a:prstGeom>
-                          </pic:spPr>
-                        </pic:pic>
-                      </wpg:grpSp>
-                      <wpg:grpSp>
-                        <wpg:cNvPr id="620119743" name="Group 620119743">
-                          <a:extLst>
-                            <a:ext uri="{FF2B5EF4-FFF2-40B4-BE49-F238E27FC236}">
-                              <a16:creationId xmlns:a16="http://schemas.microsoft.com/office/drawing/2014/main" id="{0148D32B-4A90-32FA-64A2-C4B15016D615}"/>
-                            </a:ext>
-                          </a:extLst>
-                        </wpg:cNvPr>
-                        <wpg:cNvGrpSpPr/>
-                        <wpg:grpSpPr>
-                          <a:xfrm>
-                            <a:off x="3331535" y="300965"/>
-                            <a:ext cx="3013046" cy="712381"/>
-                            <a:chOff x="3331535" y="300965"/>
-                            <a:chExt cx="3013046" cy="712381"/>
-                          </a:xfrm>
-                        </wpg:grpSpPr>
-                        <wps:wsp>
-                          <wps:cNvPr id="1905632818" name="Rectangle 1905632818">
-                            <a:extLst>
-                              <a:ext uri="{FF2B5EF4-FFF2-40B4-BE49-F238E27FC236}">
-                                <a16:creationId xmlns:a16="http://schemas.microsoft.com/office/drawing/2014/main" id="{5704C072-59A8-AEFE-45B6-284B7BBD56D5}"/>
-                              </a:ext>
-                            </a:extLst>
-                          </wps:cNvPr>
-                          <wps:cNvSpPr/>
-                          <wps:spPr>
-                            <a:xfrm>
-                              <a:off x="3331535" y="300965"/>
-                              <a:ext cx="3013046" cy="712381"/>
-                            </a:xfrm>
-                            <a:prstGeom prst="rect">
-                              <a:avLst/>
-                            </a:prstGeom>
-                            <a:solidFill>
-                              <a:srgbClr val="00BFB3"/>
-                            </a:solidFill>
-                            <a:ln>
-                              <a:noFill/>
-                            </a:ln>
-                          </wps:spPr>
-                          <wps:style>
-                            <a:lnRef idx="2">
-                              <a:schemeClr val="accent1">
-                                <a:shade val="15000"/>
-                              </a:schemeClr>
-                            </a:lnRef>
-                            <a:fillRef idx="1">
-                              <a:schemeClr val="accent1"/>
-                            </a:fillRef>
-                            <a:effectRef idx="0">
-                              <a:schemeClr val="accent1"/>
-                            </a:effectRef>
-                            <a:fontRef idx="minor">
-                              <a:schemeClr val="lt1"/>
-                            </a:fontRef>
-                          </wps:style>
-                          <wps:bodyPr rtlCol="0" anchor="ctr"/>
-                        </wps:wsp>
-                        <pic:pic xmlns:pic="http://schemas.openxmlformats.org/drawingml/2006/picture">
-                          <pic:nvPicPr>
-                            <pic:cNvPr id="1391589729" name="Picture 1391589729">
-                              <a:extLst>
-                                <a:ext uri="{FF2B5EF4-FFF2-40B4-BE49-F238E27FC236}">
-                                  <a16:creationId xmlns:a16="http://schemas.microsoft.com/office/drawing/2014/main" id="{71152164-2EF5-EDD1-4262-7014902D7BD5}"/>
-                                </a:ext>
-                              </a:extLst>
-                            </pic:cNvPr>
-                            <pic:cNvPicPr>
-                              <a:picLocks noChangeAspect="1"/>
-                            </pic:cNvPicPr>
-                          </pic:nvPicPr>
-                          <pic:blipFill>
-                            <a:blip r:embed="rId9"/>
-                            <a:stretch>
-                              <a:fillRect/>
-                            </a:stretch>
-                          </pic:blipFill>
-                          <pic:spPr>
-                            <a:xfrm>
-                              <a:off x="3407735" y="395931"/>
-                              <a:ext cx="2860645" cy="513805"/>
-                            </a:xfrm>
-                            <a:prstGeom prst="rect">
-                              <a:avLst/>
-                            </a:prstGeom>
-                          </pic:spPr>
-                        </pic:pic>
-                      </wpg:grpSp>
-                      <wpg:grpSp>
-                        <wpg:cNvPr id="642552197" name="Group 642552197">
-                          <a:extLst>
-                            <a:ext uri="{FF2B5EF4-FFF2-40B4-BE49-F238E27FC236}">
-                              <a16:creationId xmlns:a16="http://schemas.microsoft.com/office/drawing/2014/main" id="{A92F3C1E-8B2D-79AD-95FA-84F25EBD56AD}"/>
-                            </a:ext>
-                          </a:extLst>
-                        </wpg:cNvPr>
-                        <wpg:cNvGrpSpPr/>
-                        <wpg:grpSpPr>
-                          <a:xfrm>
-                            <a:off x="6783014" y="0"/>
-                            <a:ext cx="2645879" cy="1522638"/>
-                            <a:chOff x="6783014" y="0"/>
-                            <a:chExt cx="2645879" cy="1522638"/>
-                          </a:xfrm>
-                        </wpg:grpSpPr>
-                        <wps:wsp>
-                          <wps:cNvPr id="1865568681" name="Rectangle 1865568681">
-                            <a:extLst>
-                              <a:ext uri="{FF2B5EF4-FFF2-40B4-BE49-F238E27FC236}">
-                                <a16:creationId xmlns:a16="http://schemas.microsoft.com/office/drawing/2014/main" id="{AD736C13-2413-9561-0668-08F3D0D24DEE}"/>
-                              </a:ext>
-                            </a:extLst>
-                          </wps:cNvPr>
-                          <wps:cNvSpPr/>
-                          <wps:spPr>
-                            <a:xfrm>
-                              <a:off x="6783014" y="0"/>
-                              <a:ext cx="2645879" cy="1522638"/>
-                            </a:xfrm>
-                            <a:prstGeom prst="rect">
-                              <a:avLst/>
-                            </a:prstGeom>
-                            <a:solidFill>
-                              <a:srgbClr val="00BFB3"/>
-                            </a:solidFill>
-                            <a:ln>
-                              <a:noFill/>
-                            </a:ln>
-                          </wps:spPr>
-                          <wps:style>
-                            <a:lnRef idx="2">
-                              <a:schemeClr val="accent1">
-                                <a:shade val="15000"/>
-                              </a:schemeClr>
-                            </a:lnRef>
-                            <a:fillRef idx="1">
-                              <a:schemeClr val="accent1"/>
-                            </a:fillRef>
-                            <a:effectRef idx="0">
-                              <a:schemeClr val="accent1"/>
-                            </a:effectRef>
-                            <a:fontRef idx="minor">
-                              <a:schemeClr val="lt1"/>
-                            </a:fontRef>
-                          </wps:style>
-                          <wps:bodyPr rtlCol="0" anchor="ctr"/>
-                        </wps:wsp>
-                        <pic:pic xmlns:pic="http://schemas.openxmlformats.org/drawingml/2006/picture">
-                          <pic:nvPicPr>
-                            <pic:cNvPr id="1666411749" name="Picture 1666411749">
-                              <a:extLst>
-                                <a:ext uri="{FF2B5EF4-FFF2-40B4-BE49-F238E27FC236}">
-                                  <a16:creationId xmlns:a16="http://schemas.microsoft.com/office/drawing/2014/main" id="{A0677A90-797C-7C1F-2BF1-82B5EEFFA5AA}"/>
-                                </a:ext>
-                              </a:extLst>
-                            </pic:cNvPr>
-                            <pic:cNvPicPr>
-                              <a:picLocks noChangeAspect="1"/>
-                            </pic:cNvPicPr>
-                          </pic:nvPicPr>
-                          <pic:blipFill>
-                            <a:blip r:embed="rId10"/>
-                            <a:stretch>
-                              <a:fillRect/>
-                            </a:stretch>
-                          </pic:blipFill>
-                          <pic:spPr>
-                            <a:xfrm>
-                              <a:off x="6829376" y="105300"/>
-                              <a:ext cx="2553153" cy="1312037"/>
-                            </a:xfrm>
-                            <a:prstGeom prst="rect">
-                              <a:avLst/>
-                            </a:prstGeom>
-                          </pic:spPr>
-                        </pic:pic>
-                      </wpg:grpSp>
-                    </wpg:wgp>
-                  </a:graphicData>
-                </a:graphic>
-                <wp14:sizeRelH relativeFrom="margin">
-                  <wp14:pctWidth>0</wp14:pctWidth>
-                </wp14:sizeRelH>
-                <wp14:sizeRelV relativeFrom="margin">
-                  <wp14:pctHeight>0</wp14:pctHeight>
-                </wp14:sizeRelV>
-              </wp:anchor>
-            </w:drawing>
-          </mc:Choice>
-          <mc:Fallback>
-            <w:pict>
-              <v:group w14:anchorId="1081E855" id="Group 3" o:spid="_x0000_s1026" style="position:absolute;margin-left:-15.8pt;margin-top:6.6pt;width:479.4pt;height:77.4pt;z-index:251659264;mso-width-relative:margin;mso-height-relative:margin" coordsize="94288,15226" o:gfxdata="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">
-                <v:group id="Group 877948927" o:spid="_x0000_s1027" style="position:absolute;top:3009;width:30130;height:7124" coordorigin=",3009" coordsize="34616,8267" o:gfxdata="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">
-                  <v:rect id="Rectangle 1058396828" o:spid="_x0000_s1028" style="position:absolute;top:3009;width:34616;height:8268;visibility:visible;mso-wrap-style:square;v-text-anchor:middle" o:gfxdata="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" fillcolor="#00bfb3" stroked="f" strokeweight="1pt"/>
-                  <v:shapetype id="_x0000_t75" coordsize="21600,21600" o:spt="75" o:preferrelative="t" path="m@4@5l@4@11@9@11@9@5xe" filled="f" stroked="f">
-                    <v:stroke joinstyle="miter"/>
-                    <v:formulas>
-                      <v:f eqn="if lineDrawn pixelLineWidth 0"/>
-                      <v:f eqn="sum @0 1 0"/>
-                      <v:f eqn="sum 0 0 @1"/>
-                      <v:f eqn="prod @2 1 2"/>
-                      <v:f eqn="prod @3 21600 pixelWidth"/>
-                      <v:f eqn="prod @3 21600 pixelHeight"/>
-                      <v:f eqn="sum @0 0 1"/>
-                      <v:f eqn="prod @6 1 2"/>
-                      <v:f eqn="prod @7 21600 pixelWidth"/>
-                      <v:f eqn="sum @8 21600 0"/>
-                      <v:f eqn="prod @7 21600 pixelHeight"/>
-                      <v:f eqn="sum @10 21600 0"/>
-                    </v:formulas>
-                    <v:path o:extrusionok="f" gradientshapeok="t" o:connecttype="rect"/>
-                    <o:lock v:ext="edit" aspectratio="t"/>
-                  </v:shapetype>
-                  <v:shape id="Picture 1106066645" o:spid="_x0000_s1029" type="#_x0000_t75" style="position:absolute;left:831;top:3815;width:32953;height:6479;visibility:visible;mso-wrap-style:square" o:gfxdata="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">
-                    <v:imagedata r:id="rId11" o:title=""/>
-                  </v:shape>
-                </v:group>
-                <v:group id="Group 620119743" o:spid="_x0000_s1030" style="position:absolute;left:33315;top:3009;width:30130;height:7124" coordorigin="33315,3009" coordsize="30130,7123" o:gfxdata="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">
-                  <v:rect id="Rectangle 1905632818" o:spid="_x0000_s1031" style="position:absolute;left:33315;top:3009;width:30130;height:7124;visibility:visible;mso-wrap-style:square;v-text-anchor:middle" o:gfxdata="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" fillcolor="#00bfb3" stroked="f" strokeweight="1pt"/>
-                  <v:shape id="Picture 1391589729" o:spid="_x0000_s1032" type="#_x0000_t75" style="position:absolute;left:34077;top:3959;width:28606;height:5138;visibility:visible;mso-wrap-style:square" o:gfxdata="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">
-                    <v:imagedata r:id="rId12" o:title=""/>
-                  </v:shape>
-                </v:group>
-                <v:group id="Group 642552197" o:spid="_x0000_s1033" style="position:absolute;left:67830;width:26458;height:15226" coordorigin="67830" coordsize="26458,15226" o:gfxdata="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">
-                  <v:rect id="Rectangle 1865568681" o:spid="_x0000_s1034" style="position:absolute;left:67830;width:26458;height:15226;visibility:visible;mso-wrap-style:square;v-text-anchor:middle" o:gfxdata="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" fillcolor="#00bfb3" stroked="f" strokeweight="1pt"/>
-                  <v:shape id="Picture 1666411749" o:spid="_x0000_s1035" type="#_x0000_t75" style="position:absolute;left:68293;top:1053;width:25532;height:13120;visibility:visible;mso-wrap-style:square" o:gfxdata="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">
-                    <v:imagedata r:id="rId13" o:title=""/>
-                  </v:shape>
-                </v:group>
-              </v:group>
-            </w:pict>
-          </mc:Fallback>
-        </mc:AlternateContent>
-      </w:r>
-    </w:p>
-    <w:p>
-      <w:pPr>
-        <w:spacing w:line="276" w:lineRule="auto"/>
-        <w:jc w:val="both"/>
-      </w:pPr>
-    </w:p>
-    <w:p>
-      <w:pPr>
-        <w:spacing w:line="276" w:lineRule="auto"/>
-        <w:jc w:val="both"/>
-      </w:pPr>
-    </w:p>
-    <w:p>
-      <w:pPr>
-        <w:spacing w:line="276" w:lineRule="auto"/>
-        <w:jc w:val="both"/>
-      </w:pPr>
-    </w:p>
-    <w:p>
-      <w:pPr>
-        <w:spacing w:line="276" w:lineRule="auto"/>
-        <w:jc w:val="both"/>
-      </w:pPr>
-    </w:p>
-    <w:p>
-      <w:pPr>
-        <w:spacing w:line="276" w:lineRule="auto"/>
-        <w:jc w:val="both"/>
-      </w:pPr>
-    </w:p>
-    <w:p>
-      <w:pPr>
-        <w:spacing w:line="276" w:lineRule="auto"/>
-        <w:jc w:val="both"/>
-      </w:pPr>
-    </w:p>
-    <w:p>
-      <w:pPr>
-        <w:spacing w:line="276" w:lineRule="auto"/>
-        <w:jc w:val="both"/>
-      </w:pPr>
-    </w:p>
-    <w:p>
-      <w:pPr>
-        <w:spacing w:line="276" w:lineRule="auto"/>
-        <w:jc w:val="both"/>
-      </w:pPr>
-    </w:p>
-    <w:p>
-      <w:pPr>
-        <w:spacing w:line="276" w:lineRule="auto"/>
-        <w:jc w:val="both"/>
-      </w:pPr>
-    </w:p>
-    <w:p>
-      <w:pPr>
-        <w:spacing w:line="276" w:lineRule="auto"/>
-        <w:jc w:val="both"/>
-      </w:pPr>
-    </w:p>
-    <w:p>
-      <w:pPr>
-        <w:spacing w:line="276" w:lineRule="auto"/>
-        <w:jc w:val="both"/>
-      </w:pPr>
-    </w:p>
-    <w:p>
-      <w:pPr>
-        <w:spacing w:line="276" w:lineRule="auto"/>
-        <w:jc w:val="both"/>
-      </w:pPr>
+        <w:t>T</w:t>
+      </w:r>
+      <w:r>
+        <w:t xml:space="preserve">he key difference to a general-purpose document database such as MongoDB is the underlying data structure. While MongoDB stores documents in a format optimized for retrieval by ID or field value, Elasticsearch builds an </w:t>
+      </w:r>
+      <w:hyperlink w:anchor="_Inverted_Index" w:history="1">
+        <w:r>
+          <w:rPr>
+            <w:rStyle w:val="Hyperlink"/>
+          </w:rPr>
+          <w:t>inverted i</w:t>
+        </w:r>
+        <w:r>
+          <w:rPr>
+            <w:rStyle w:val="Hyperlink"/>
+          </w:rPr>
+          <w:t>n</w:t>
+        </w:r>
+        <w:r>
+          <w:rPr>
+            <w:rStyle w:val="Hyperlink"/>
+          </w:rPr>
+          <w:t>dex</w:t>
+        </w:r>
+      </w:hyperlink>
+      <w:r>
+        <w:t xml:space="preserve"> over the content of every document at indexing time. This inverted index maps every individual word to the documents that contain it, allowing Elasticsearch to answer full-text search queries in milliseconds regardless of the total number of documents. This makes Elasticsearch orders of magnitude faster for search-heavy workloads compared to a relational or document database that would need to scan through records sequentially to find matches.</w:t>
+      </w:r>
     </w:p>
     <w:p>
       <w:pPr>
@@ -1032,7 +627,6 @@
                 <w:b/>
                 <w:bCs/>
               </w:rPr>
-              <w:lastRenderedPageBreak/>
               <w:t>Asepect</w:t>
             </w:r>
           </w:p>
@@ -1414,12 +1008,6 @@
     </w:tbl>
     <w:p>
       <w:pPr>
-        <w:spacing w:line="276" w:lineRule="auto"/>
-        <w:jc w:val="both"/>
-      </w:pPr>
-    </w:p>
-    <w:p>
-      <w:pPr>
         <w:pStyle w:val="Heading1"/>
         <w:numPr>
           <w:ilvl w:val="1"/>
@@ -1436,6 +1024,7 @@
           <w:sz w:val="32"/>
           <w:szCs w:val="32"/>
         </w:rPr>
+        <w:lastRenderedPageBreak/>
         <w:t>When to use Elasticsearch</w:t>
       </w:r>
     </w:p>
@@ -1518,7 +1107,14 @@
         <w:jc w:val="both"/>
       </w:pPr>
       <w:r>
-        <w:t xml:space="preserve">Geospatial search is supported by Elasticsearch. The geo_point type stores latitude and longitude coordinates. </w:t>
+        <w:rPr>
+          <w:b/>
+          <w:bCs/>
+        </w:rPr>
+        <w:t>Geospatial search</w:t>
+      </w:r>
+      <w:r>
+        <w:t xml:space="preserve"> is supported by Elasticsearch. The geo_point type stores latitude and longitude coordinates. </w:t>
       </w:r>
       <w:r>
         <w:t>This enables proximity queries, radius-based filtering, and map visualizations</w:t>
@@ -1541,40 +1137,11 @@
     </w:p>
     <w:p>
       <w:pPr>
-        <w:spacing w:line="276" w:lineRule="auto"/>
-        <w:jc w:val="both"/>
-      </w:pPr>
-    </w:p>
-    <w:p>
-      <w:pPr>
-        <w:spacing w:line="276" w:lineRule="auto"/>
-        <w:jc w:val="both"/>
-      </w:pPr>
-    </w:p>
-    <w:p>
-      <w:pPr>
-        <w:spacing w:line="276" w:lineRule="auto"/>
-        <w:jc w:val="both"/>
-      </w:pPr>
-    </w:p>
-    <w:p>
-      <w:pPr>
-        <w:spacing w:line="276" w:lineRule="auto"/>
-        <w:jc w:val="both"/>
-      </w:pPr>
-    </w:p>
-    <w:p>
-      <w:pPr>
         <w:spacing w:after="160" w:line="278" w:lineRule="auto"/>
       </w:pPr>
       <w:r>
         <w:br w:type="page"/>
       </w:r>
-    </w:p>
-    <w:p>
-      <w:pPr>
-        <w:spacing w:line="276" w:lineRule="auto"/>
-      </w:pPr>
     </w:p>
     <w:p>
       <w:pPr>
@@ -1584,11 +1151,1142 @@
           <w:numId w:val="4"/>
         </w:numPr>
       </w:pPr>
-      <w:bookmarkStart w:id="3" w:name="_Toc229380754"/>
+      <w:r>
+        <w:lastRenderedPageBreak/>
+        <w:t>Architecture</w:t>
+      </w:r>
+    </w:p>
+    <w:p>
+      <w:pPr>
+        <w:pStyle w:val="Heading1"/>
+        <w:numPr>
+          <w:ilvl w:val="1"/>
+          <w:numId w:val="4"/>
+        </w:numPr>
+        <w:ind w:left="567" w:hanging="573"/>
+        <w:rPr>
+          <w:sz w:val="32"/>
+          <w:szCs w:val="32"/>
+        </w:rPr>
+      </w:pPr>
+      <w:r>
+        <w:rPr>
+          <w:sz w:val="32"/>
+          <w:szCs w:val="32"/>
+        </w:rPr>
+        <w:t>Core Concepts</w:t>
+      </w:r>
+    </w:p>
+    <w:p>
+      <w:pPr>
+        <w:spacing w:line="276" w:lineRule="auto"/>
+        <w:jc w:val="both"/>
+      </w:pPr>
+      <w:r>
+        <w:t>Before understanding how Elasticsearch distributes data and processes queries, it is first necessary to unterdand the underlying system architecture and how the idividual components work and work together.</w:t>
+      </w:r>
+    </w:p>
+    <w:p>
+      <w:pPr>
+        <w:keepNext/>
+        <w:spacing w:line="276" w:lineRule="auto"/>
+        <w:jc w:val="center"/>
+      </w:pPr>
+      <w:r>
+        <w:drawing>
+          <wp:inline distT="0" distB="0" distL="0" distR="0" wp14:anchorId="59A2F346" wp14:editId="71A0A782">
+            <wp:extent cx="4495088" cy="4678358"/>
+            <wp:effectExtent l="0" t="0" r="1270" b="0"/>
+            <wp:docPr id="397760877" name="Picture 1"/>
+            <wp:cNvGraphicFramePr>
+              <a:graphicFrameLocks xmlns:a="http://schemas.openxmlformats.org/drawingml/2006/main" noChangeAspect="1"/>
+            </wp:cNvGraphicFramePr>
+            <a:graphic xmlns:a="http://schemas.openxmlformats.org/drawingml/2006/main">
+              <a:graphicData uri="http://schemas.openxmlformats.org/drawingml/2006/picture">
+                <pic:pic xmlns:pic="http://schemas.openxmlformats.org/drawingml/2006/picture">
+                  <pic:nvPicPr>
+                    <pic:cNvPr id="397760877" name=""/>
+                    <pic:cNvPicPr/>
+                  </pic:nvPicPr>
+                  <pic:blipFill>
+                    <a:blip r:embed="rId8"/>
+                    <a:stretch>
+                      <a:fillRect/>
+                    </a:stretch>
+                  </pic:blipFill>
+                  <pic:spPr>
+                    <a:xfrm>
+                      <a:off x="0" y="0"/>
+                      <a:ext cx="4525756" cy="4710276"/>
+                    </a:xfrm>
+                    <a:prstGeom prst="rect">
+                      <a:avLst/>
+                    </a:prstGeom>
+                  </pic:spPr>
+                </pic:pic>
+              </a:graphicData>
+            </a:graphic>
+          </wp:inline>
+        </w:drawing>
+      </w:r>
+    </w:p>
+    <w:p>
+      <w:pPr>
+        <w:pStyle w:val="Caption"/>
+        <w:jc w:val="center"/>
+      </w:pPr>
+      <w:r>
+        <w:t xml:space="preserve">Figure </w:t>
+      </w:r>
+      <w:r>
+        <w:fldChar w:fldCharType="begin"/>
+      </w:r>
+      <w:r>
+        <w:instrText xml:space="preserve"> SEQ Figure \* ARABIC </w:instrText>
+      </w:r>
+      <w:r>
+        <w:fldChar w:fldCharType="separate"/>
+      </w:r>
+      <w:r>
+        <w:rPr>
+          <w:noProof/>
+        </w:rPr>
+        <w:t>1</w:t>
+      </w:r>
+      <w:r>
+        <w:fldChar w:fldCharType="end"/>
+      </w:r>
+      <w:r>
+        <w:t xml:space="preserve">: Based on description of </w:t>
+      </w:r>
+      <w:r>
+        <w:t>https://www.geeksforgeeks.org/elasticsearch/elasticsearch-architecture/</w:t>
+      </w:r>
+    </w:p>
+    <w:p>
+      <w:pPr>
+        <w:spacing w:line="276" w:lineRule="auto"/>
+        <w:jc w:val="both"/>
+      </w:pPr>
+    </w:p>
+    <w:p>
+      <w:pPr>
+        <w:spacing w:line="276" w:lineRule="auto"/>
+        <w:jc w:val="both"/>
+        <w:rPr>
+          <w:b/>
+          <w:bCs/>
+        </w:rPr>
+      </w:pPr>
+      <w:r>
+        <w:rPr>
+          <w:b/>
+          <w:bCs/>
+        </w:rPr>
+        <w:t>Cluster</w:t>
+      </w:r>
+    </w:p>
+    <w:p>
+      <w:pPr>
+        <w:spacing w:line="276" w:lineRule="auto"/>
+        <w:jc w:val="both"/>
+      </w:pPr>
+      <w:r>
+        <w:t>A cluster consits of one or more nodes that work together and share the same data. Every cluster has a unique name tat nodes use to identify which cluster they belong to. In production environment a cluster typically spans multiple physical or virtual maschines.</w:t>
+      </w:r>
+    </w:p>
+    <w:p>
+      <w:pPr>
+        <w:spacing w:line="276" w:lineRule="auto"/>
+        <w:jc w:val="both"/>
+      </w:pPr>
+    </w:p>
+    <w:p>
+      <w:pPr>
+        <w:spacing w:line="276" w:lineRule="auto"/>
+        <w:jc w:val="both"/>
+        <w:rPr>
+          <w:b/>
+          <w:bCs/>
+        </w:rPr>
+      </w:pPr>
+      <w:r>
+        <w:rPr>
+          <w:b/>
+          <w:bCs/>
+        </w:rPr>
+        <w:t>Node</w:t>
+      </w:r>
+    </w:p>
+    <w:p>
+      <w:pPr>
+        <w:spacing w:line="276" w:lineRule="auto"/>
+        <w:jc w:val="both"/>
+      </w:pPr>
+      <w:r>
+        <w:t>A node is a single running instance of Elasticsearch. Each node stores a portion of the clusters data and participates in indexing and search operations. Nodes can be assigned different roles. A master node manages cluster-level operations such as tracking which nodes are part of the cluster and there shards are allocated. Data notes are responsible for storing data and executing queries.</w:t>
+      </w:r>
+    </w:p>
+    <w:p>
+      <w:pPr>
+        <w:spacing w:line="276" w:lineRule="auto"/>
+        <w:jc w:val="both"/>
+        <w:rPr>
+          <w:b/>
+          <w:bCs/>
+        </w:rPr>
+      </w:pPr>
+      <w:r>
+        <w:rPr>
+          <w:b/>
+          <w:bCs/>
+        </w:rPr>
+        <w:lastRenderedPageBreak/>
+        <w:t>Index</w:t>
+      </w:r>
+    </w:p>
+    <w:p>
+      <w:pPr>
+        <w:spacing w:line="276" w:lineRule="auto"/>
+        <w:jc w:val="both"/>
+      </w:pPr>
+      <w:r>
+        <w:t xml:space="preserve">An index is a logical container for a collection of documents that share a common purpose. </w:t>
+      </w:r>
+    </w:p>
+    <w:p>
+      <w:pPr>
+        <w:spacing w:line="276" w:lineRule="auto"/>
+        <w:jc w:val="both"/>
+      </w:pPr>
+    </w:p>
+    <w:p>
+      <w:pPr>
+        <w:spacing w:line="276" w:lineRule="auto"/>
+        <w:jc w:val="both"/>
+        <w:rPr>
+          <w:b/>
+          <w:bCs/>
+        </w:rPr>
+      </w:pPr>
+      <w:r>
+        <w:rPr>
+          <w:b/>
+          <w:bCs/>
+        </w:rPr>
+        <w:t>Document</w:t>
+      </w:r>
+    </w:p>
+    <w:p>
+      <w:pPr>
+        <w:spacing w:line="276" w:lineRule="auto"/>
+        <w:jc w:val="both"/>
+      </w:pPr>
+      <w:r>
+        <w:t>A document is the basic unit of data in Elasticsearch. It is represented as a JSON object and stored within an index. Every document has a unique identifier assigned. When a document is indexed, Elasticsearch analyses its fields and build the internal data structure needed for fast acess.</w:t>
+      </w:r>
+    </w:p>
+    <w:p>
+      <w:pPr>
+        <w:spacing w:line="276" w:lineRule="auto"/>
+        <w:jc w:val="both"/>
+      </w:pPr>
+    </w:p>
+    <w:p>
+      <w:pPr>
+        <w:spacing w:line="276" w:lineRule="auto"/>
+        <w:jc w:val="both"/>
+        <w:rPr>
+          <w:b/>
+          <w:bCs/>
+        </w:rPr>
+      </w:pPr>
+      <w:r>
+        <w:rPr>
+          <w:b/>
+          <w:bCs/>
+        </w:rPr>
+        <w:t>Shard</w:t>
+      </w:r>
+    </w:p>
+    <w:p>
+      <w:pPr>
+        <w:spacing w:line="276" w:lineRule="auto"/>
+        <w:jc w:val="both"/>
+      </w:pPr>
+      <w:r>
+        <w:t xml:space="preserve">A shard is a physical subdivision of an index. When an index is created, Elasticsearch distributes its documents across one or more shards. Each shard is itself a fully functional index and can be stored on any node in the cluster. Sharding servers two purposes. It allwos data that exceeds the storage capacity of a single maschine to be spread across multiple nodes and it enables search queries </w:t>
+      </w:r>
+      <w:r>
+        <w:t>to be executed in parallel across all shards simultaneosly.</w:t>
+      </w:r>
+    </w:p>
+    <w:p>
+      <w:pPr>
+        <w:spacing w:line="276" w:lineRule="auto"/>
+        <w:jc w:val="both"/>
+      </w:pPr>
+    </w:p>
+    <w:p>
+      <w:pPr>
+        <w:spacing w:line="276" w:lineRule="auto"/>
+        <w:jc w:val="both"/>
+        <w:rPr>
+          <w:b/>
+          <w:bCs/>
+        </w:rPr>
+      </w:pPr>
+      <w:r>
+        <w:rPr>
+          <w:b/>
+          <w:bCs/>
+        </w:rPr>
+        <w:t>Replica</w:t>
+      </w:r>
+    </w:p>
+    <w:p>
+      <w:pPr>
+        <w:spacing w:line="276" w:lineRule="auto"/>
+        <w:jc w:val="both"/>
+      </w:pPr>
+      <w:r>
+        <w:t>A replica is a copy of a shard stored on a different node than the original, also called the primary shard. Replicas serve two purposes. They can act as a backup in case a node fails and they can serve read requests in parallel with the primary shard, increasing query throughput.</w:t>
+      </w:r>
+    </w:p>
+    <w:p>
+      <w:pPr>
+        <w:spacing w:line="276" w:lineRule="auto"/>
+        <w:jc w:val="both"/>
+      </w:pPr>
+    </w:p>
+    <w:p>
+      <w:pPr>
+        <w:pStyle w:val="Heading1"/>
+        <w:numPr>
+          <w:ilvl w:val="1"/>
+          <w:numId w:val="4"/>
+        </w:numPr>
+        <w:ind w:left="567" w:hanging="573"/>
+        <w:rPr>
+          <w:sz w:val="32"/>
+          <w:szCs w:val="32"/>
+        </w:rPr>
+      </w:pPr>
+      <w:bookmarkStart w:id="3" w:name="_Inverted_Index"/>
+      <w:bookmarkEnd w:id="3"/>
+      <w:r>
+        <w:rPr>
+          <w:sz w:val="32"/>
+          <w:szCs w:val="32"/>
+        </w:rPr>
+        <w:t>Inverted Index</w:t>
+      </w:r>
+    </w:p>
+    <w:p>
+      <w:pPr>
+        <w:spacing w:line="276" w:lineRule="auto"/>
+        <w:jc w:val="both"/>
+      </w:pPr>
+      <w:r>
+        <w:t xml:space="preserve">When a document is indexed in Elasticsearch, its text fields are not stored as they are. Before the content is written to the inverted index, it passes through an analyzer. The analyzer is a processing pipeline that transforms raw text into a set of normalized tokens that can be efficiently looked up during search. The pipeline consists of three stage </w:t>
+      </w:r>
+      <w:r>
+        <w:sym w:font="Wingdings" w:char="F0E0"/>
+      </w:r>
+      <w:r>
+        <w:t xml:space="preserve"> Tokenization – lowercasing – word removal</w:t>
+      </w:r>
+    </w:p>
+    <w:p>
+      <w:pPr>
+        <w:spacing w:line="276" w:lineRule="auto"/>
+        <w:jc w:val="both"/>
+      </w:pPr>
+    </w:p>
+    <w:p>
+      <w:pPr>
+        <w:spacing w:line="276" w:lineRule="auto"/>
+        <w:jc w:val="both"/>
+        <w:rPr>
+          <w:b/>
+          <w:bCs/>
+        </w:rPr>
+      </w:pPr>
+      <w:r>
+        <w:rPr>
+          <w:b/>
+          <w:bCs/>
+        </w:rPr>
+        <w:t>Tokenization</w:t>
+      </w:r>
+    </w:p>
+    <w:p>
+      <w:pPr>
+        <w:spacing w:line="276" w:lineRule="auto"/>
+        <w:jc w:val="both"/>
+      </w:pPr>
+      <w:r>
+        <w:t xml:space="preserve">The text is split into individual terms at workd boundaries. </w:t>
+      </w:r>
+    </w:p>
+    <w:p>
+      <w:pPr>
+        <w:spacing w:line="276" w:lineRule="auto"/>
+        <w:jc w:val="both"/>
+      </w:pPr>
+      <w:r>
+        <w:drawing>
+          <wp:inline distT="0" distB="0" distL="0" distR="0" wp14:anchorId="50C588E0" wp14:editId="3D62F4D1">
+            <wp:extent cx="5731510" cy="850900"/>
+            <wp:effectExtent l="0" t="0" r="0" b="0"/>
+            <wp:docPr id="639630265" name="Picture 1"/>
+            <wp:cNvGraphicFramePr>
+              <a:graphicFrameLocks xmlns:a="http://schemas.openxmlformats.org/drawingml/2006/main" noChangeAspect="1"/>
+            </wp:cNvGraphicFramePr>
+            <a:graphic xmlns:a="http://schemas.openxmlformats.org/drawingml/2006/main">
+              <a:graphicData uri="http://schemas.openxmlformats.org/drawingml/2006/picture">
+                <pic:pic xmlns:pic="http://schemas.openxmlformats.org/drawingml/2006/picture">
+                  <pic:nvPicPr>
+                    <pic:cNvPr id="639630265" name=""/>
+                    <pic:cNvPicPr/>
+                  </pic:nvPicPr>
+                  <pic:blipFill>
+                    <a:blip r:embed="rId9"/>
+                    <a:stretch>
+                      <a:fillRect/>
+                    </a:stretch>
+                  </pic:blipFill>
+                  <pic:spPr>
+                    <a:xfrm>
+                      <a:off x="0" y="0"/>
+                      <a:ext cx="5731510" cy="850900"/>
+                    </a:xfrm>
+                    <a:prstGeom prst="rect">
+                      <a:avLst/>
+                    </a:prstGeom>
+                  </pic:spPr>
+                </pic:pic>
+              </a:graphicData>
+            </a:graphic>
+          </wp:inline>
+        </w:drawing>
+      </w:r>
+    </w:p>
+    <w:p>
+      <w:pPr>
+        <w:spacing w:line="276" w:lineRule="auto"/>
+        <w:jc w:val="both"/>
+        <w:rPr>
+          <w:b/>
+          <w:bCs/>
+        </w:rPr>
+      </w:pPr>
+      <w:r>
+        <w:rPr>
+          <w:b/>
+          <w:bCs/>
+        </w:rPr>
+        <w:t>Lowercasing</w:t>
+      </w:r>
+    </w:p>
+    <w:p>
+      <w:pPr>
+        <w:spacing w:line="276" w:lineRule="auto"/>
+        <w:jc w:val="both"/>
+      </w:pPr>
+      <w:r>
+        <w:rPr>
+          <w:noProof/>
+          <w14:ligatures w14:val="standardContextual"/>
+        </w:rPr>
+        <mc:AlternateContent>
+          <mc:Choice Requires="wpg">
+            <w:drawing>
+              <wp:anchor distT="0" distB="0" distL="114300" distR="114300" simplePos="0" relativeHeight="251658240" behindDoc="0" locked="0" layoutInCell="1" allowOverlap="1" wp14:anchorId="191B47B6" wp14:editId="1A69D64E">
+                <wp:simplePos x="0" y="0"/>
+                <wp:positionH relativeFrom="column">
+                  <wp:posOffset>85072</wp:posOffset>
+                </wp:positionH>
+                <wp:positionV relativeFrom="paragraph">
+                  <wp:posOffset>180340</wp:posOffset>
+                </wp:positionV>
+                <wp:extent cx="3013046" cy="712381"/>
+                <wp:effectExtent l="0" t="0" r="0" b="0"/>
+                <wp:wrapNone/>
+                <wp:docPr id="472385087" name="Group 1"/>
+                <wp:cNvGraphicFramePr/>
+                <a:graphic xmlns:a="http://schemas.openxmlformats.org/drawingml/2006/main">
+                  <a:graphicData uri="http://schemas.microsoft.com/office/word/2010/wordprocessingGroup">
+                    <wpg:wgp>
+                      <wpg:cNvGrpSpPr/>
+                      <wpg:grpSpPr>
+                        <a:xfrm>
+                          <a:off x="0" y="0"/>
+                          <a:ext cx="3013046" cy="712381"/>
+                          <a:chOff x="0" y="0"/>
+                          <a:chExt cx="3013046" cy="712381"/>
+                        </a:xfrm>
+                      </wpg:grpSpPr>
+                      <wps:wsp>
+                        <wps:cNvPr id="2083967906" name="Rectangle 1708469171">
+                          <a:extLst>
+                            <a:ext uri="{FF2B5EF4-FFF2-40B4-BE49-F238E27FC236}">
+                              <a16:creationId xmlns:a16="http://schemas.microsoft.com/office/drawing/2014/main" id="{7CDBC851-880E-EACC-7E51-2912EACCF5E0}"/>
+                            </a:ext>
+                          </a:extLst>
+                        </wps:cNvPr>
+                        <wps:cNvSpPr/>
+                        <wps:spPr>
+                          <a:xfrm>
+                            <a:off x="0" y="0"/>
+                            <a:ext cx="3013046" cy="712381"/>
+                          </a:xfrm>
+                          <a:prstGeom prst="rect">
+                            <a:avLst/>
+                          </a:prstGeom>
+                          <a:solidFill>
+                            <a:srgbClr val="00BFB3"/>
+                          </a:solidFill>
+                          <a:ln>
+                            <a:noFill/>
+                          </a:ln>
+                        </wps:spPr>
+                        <wps:style>
+                          <a:lnRef idx="2">
+                            <a:schemeClr val="accent1">
+                              <a:shade val="15000"/>
+                            </a:schemeClr>
+                          </a:lnRef>
+                          <a:fillRef idx="1">
+                            <a:schemeClr val="accent1"/>
+                          </a:fillRef>
+                          <a:effectRef idx="0">
+                            <a:schemeClr val="accent1"/>
+                          </a:effectRef>
+                          <a:fontRef idx="minor">
+                            <a:schemeClr val="lt1"/>
+                          </a:fontRef>
+                        </wps:style>
+                        <wps:bodyPr rtlCol="0" anchor="ctr"/>
+                      </wps:wsp>
+                      <pic:pic xmlns:pic="http://schemas.openxmlformats.org/drawingml/2006/picture">
+                        <pic:nvPicPr>
+                          <pic:cNvPr id="2119378414" name="Picture 1"/>
+                          <pic:cNvPicPr>
+                            <a:picLocks noChangeAspect="1"/>
+                          </pic:cNvPicPr>
+                        </pic:nvPicPr>
+                        <pic:blipFill>
+                          <a:blip r:embed="rId10">
+                            <a:extLst>
+                              <a:ext uri="{28A0092B-C50C-407E-A947-70E740481C1C}">
+                                <a14:useLocalDpi xmlns:a14="http://schemas.microsoft.com/office/drawing/2010/main" val="0"/>
+                              </a:ext>
+                            </a:extLst>
+                          </a:blip>
+                          <a:stretch>
+                            <a:fillRect/>
+                          </a:stretch>
+                        </pic:blipFill>
+                        <pic:spPr>
+                          <a:xfrm>
+                            <a:off x="51275" y="59821"/>
+                            <a:ext cx="2905125" cy="542925"/>
+                          </a:xfrm>
+                          <a:prstGeom prst="rect">
+                            <a:avLst/>
+                          </a:prstGeom>
+                        </pic:spPr>
+                      </pic:pic>
+                    </wpg:wgp>
+                  </a:graphicData>
+                </a:graphic>
+              </wp:anchor>
+            </w:drawing>
+          </mc:Choice>
+          <mc:Fallback>
+            <w:pict>
+              <v:group w14:anchorId="003A87B4" id="Group 1" o:spid="_x0000_s1026" style="position:absolute;margin-left:6.7pt;margin-top:14.2pt;width:237.25pt;height:56.1pt;z-index:251658240" coordsize="30130,7123" o:gfxdata="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">
+                <v:rect id="Rectangle 1708469171" o:spid="_x0000_s1027" style="position:absolute;width:30130;height:7123;visibility:visible;mso-wrap-style:square;v-text-anchor:middle" o:gfxdata="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" fillcolor="#00bfb3" stroked="f" strokeweight="1pt"/>
+                <v:shapetype id="_x0000_t75" coordsize="21600,21600" o:spt="75" o:preferrelative="t" path="m@4@5l@4@11@9@11@9@5xe" filled="f" stroked="f">
+                  <v:stroke joinstyle="miter"/>
+                  <v:formulas>
+                    <v:f eqn="if lineDrawn pixelLineWidth 0"/>
+                    <v:f eqn="sum @0 1 0"/>
+                    <v:f eqn="sum 0 0 @1"/>
+                    <v:f eqn="prod @2 1 2"/>
+                    <v:f eqn="prod @3 21600 pixelWidth"/>
+                    <v:f eqn="prod @3 21600 pixelHeight"/>
+                    <v:f eqn="sum @0 0 1"/>
+                    <v:f eqn="prod @6 1 2"/>
+                    <v:f eqn="prod @7 21600 pixelWidth"/>
+                    <v:f eqn="sum @8 21600 0"/>
+                    <v:f eqn="prod @7 21600 pixelHeight"/>
+                    <v:f eqn="sum @10 21600 0"/>
+                  </v:formulas>
+                  <v:path o:extrusionok="f" gradientshapeok="t" o:connecttype="rect"/>
+                  <o:lock v:ext="edit" aspectratio="t"/>
+                </v:shapetype>
+                <v:shape id="Picture 1" o:spid="_x0000_s1028" type="#_x0000_t75" style="position:absolute;left:512;top:598;width:29052;height:5429;visibility:visible;mso-wrap-style:square" o:gfxdata="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">
+                  <v:imagedata r:id="rId11" o:title=""/>
+                </v:shape>
+              </v:group>
+            </w:pict>
+          </mc:Fallback>
+        </mc:AlternateContent>
+      </w:r>
+      <w:r>
+        <w:t xml:space="preserve">Every token is converted to lowercase so that searches are case-insensitiv by default. </w:t>
+      </w:r>
+    </w:p>
+    <w:p>
+      <w:pPr>
+        <w:spacing w:line="276" w:lineRule="auto"/>
+        <w:jc w:val="both"/>
+      </w:pPr>
+    </w:p>
+    <w:p>
+      <w:pPr>
+        <w:spacing w:line="276" w:lineRule="auto"/>
+        <w:jc w:val="both"/>
+      </w:pPr>
+    </w:p>
+    <w:p>
+      <w:pPr>
+        <w:spacing w:line="276" w:lineRule="auto"/>
+        <w:jc w:val="both"/>
+      </w:pPr>
+    </w:p>
+    <w:p>
+      <w:pPr>
+        <w:spacing w:line="276" w:lineRule="auto"/>
+        <w:jc w:val="both"/>
+      </w:pPr>
+    </w:p>
+    <w:p>
+      <w:pPr>
+        <w:spacing w:line="276" w:lineRule="auto"/>
+        <w:jc w:val="both"/>
+      </w:pPr>
+    </w:p>
+    <w:p>
+      <w:pPr>
+        <w:spacing w:line="276" w:lineRule="auto"/>
+        <w:jc w:val="both"/>
+      </w:pPr>
+    </w:p>
+    <w:p>
+      <w:pPr>
+        <w:spacing w:line="276" w:lineRule="auto"/>
+        <w:jc w:val="both"/>
+        <w:rPr>
+          <w:b/>
+          <w:bCs/>
+        </w:rPr>
+      </w:pPr>
+      <w:r>
+        <w:rPr>
+          <w:b/>
+          <w:bCs/>
+        </w:rPr>
+        <w:lastRenderedPageBreak/>
+        <w:t xml:space="preserve">Stop </w:t>
+      </w:r>
+      <w:r>
+        <w:rPr>
+          <w:b/>
+          <w:bCs/>
+        </w:rPr>
+        <w:t>Word removal</w:t>
+      </w:r>
+    </w:p>
+    <w:p>
+      <w:pPr>
+        <w:spacing w:line="276" w:lineRule="auto"/>
+        <w:jc w:val="both"/>
+      </w:pPr>
+      <w:r>
+        <w:t>Common words that appear in almost every document and carry no meaningful search value</w:t>
+      </w:r>
+      <w:r>
+        <w:t xml:space="preserve">, </w:t>
+      </w:r>
+      <w:r>
+        <w:t>such as "the", "a", or "and"</w:t>
+      </w:r>
+      <w:r>
+        <w:t>,</w:t>
+      </w:r>
+      <w:r>
+        <w:t xml:space="preserve"> are removed from the token list. These words are known as stop words. Keeping them in the index would waste storage and slow down queries without improving search quality.</w:t>
+      </w:r>
+    </w:p>
+    <w:p>
+      <w:pPr>
+        <w:spacing w:line="276" w:lineRule="auto"/>
+        <w:jc w:val="both"/>
+      </w:pPr>
+      <w:r>
+        <w:rPr>
+          <w:noProof/>
+          <w14:ligatures w14:val="standardContextual"/>
+        </w:rPr>
+        <mc:AlternateContent>
+          <mc:Choice Requires="wpg">
+            <w:drawing>
+              <wp:anchor distT="0" distB="0" distL="114300" distR="114300" simplePos="0" relativeHeight="251663360" behindDoc="0" locked="0" layoutInCell="1" allowOverlap="1" wp14:anchorId="2B4F6379" wp14:editId="0661597E">
+                <wp:simplePos x="0" y="0"/>
+                <wp:positionH relativeFrom="column">
+                  <wp:posOffset>-481</wp:posOffset>
+                </wp:positionH>
+                <wp:positionV relativeFrom="paragraph">
+                  <wp:posOffset>16867</wp:posOffset>
+                </wp:positionV>
+                <wp:extent cx="2802759" cy="711835"/>
+                <wp:effectExtent l="0" t="0" r="4445" b="0"/>
+                <wp:wrapNone/>
+                <wp:docPr id="1620772941" name="Group 2"/>
+                <wp:cNvGraphicFramePr/>
+                <a:graphic xmlns:a="http://schemas.openxmlformats.org/drawingml/2006/main">
+                  <a:graphicData uri="http://schemas.microsoft.com/office/word/2010/wordprocessingGroup">
+                    <wpg:wgp>
+                      <wpg:cNvGrpSpPr/>
+                      <wpg:grpSpPr>
+                        <a:xfrm>
+                          <a:off x="0" y="0"/>
+                          <a:ext cx="2802759" cy="711835"/>
+                          <a:chOff x="0" y="0"/>
+                          <a:chExt cx="2802759" cy="711835"/>
+                        </a:xfrm>
+                      </wpg:grpSpPr>
+                      <wps:wsp>
+                        <wps:cNvPr id="665941768" name="Rectangle 1708469171"/>
+                        <wps:cNvSpPr/>
+                        <wps:spPr>
+                          <a:xfrm>
+                            <a:off x="0" y="0"/>
+                            <a:ext cx="2802759" cy="711835"/>
+                          </a:xfrm>
+                          <a:prstGeom prst="rect">
+                            <a:avLst/>
+                          </a:prstGeom>
+                          <a:solidFill>
+                            <a:srgbClr val="00BFB3"/>
+                          </a:solidFill>
+                          <a:ln>
+                            <a:noFill/>
+                          </a:ln>
+                        </wps:spPr>
+                        <wps:style>
+                          <a:lnRef idx="2">
+                            <a:schemeClr val="accent1">
+                              <a:shade val="15000"/>
+                            </a:schemeClr>
+                          </a:lnRef>
+                          <a:fillRef idx="1">
+                            <a:schemeClr val="accent1"/>
+                          </a:fillRef>
+                          <a:effectRef idx="0">
+                            <a:schemeClr val="accent1"/>
+                          </a:effectRef>
+                          <a:fontRef idx="minor">
+                            <a:schemeClr val="lt1"/>
+                          </a:fontRef>
+                        </wps:style>
+                        <wps:bodyPr rtlCol="0" anchor="ctr"/>
+                      </wps:wsp>
+                      <pic:pic xmlns:pic="http://schemas.openxmlformats.org/drawingml/2006/picture">
+                        <pic:nvPicPr>
+                          <pic:cNvPr id="1035349969" name="Picture 1"/>
+                          <pic:cNvPicPr>
+                            <a:picLocks noChangeAspect="1"/>
+                          </pic:cNvPicPr>
+                        </pic:nvPicPr>
+                        <pic:blipFill>
+                          <a:blip r:embed="rId12">
+                            <a:extLst>
+                              <a:ext uri="{28A0092B-C50C-407E-A947-70E740481C1C}">
+                                <a14:useLocalDpi xmlns:a14="http://schemas.microsoft.com/office/drawing/2010/main" val="0"/>
+                              </a:ext>
+                            </a:extLst>
+                          </a:blip>
+                          <a:stretch>
+                            <a:fillRect/>
+                          </a:stretch>
+                        </pic:blipFill>
+                        <pic:spPr>
+                          <a:xfrm>
+                            <a:off x="94003" y="68367"/>
+                            <a:ext cx="2640330" cy="521970"/>
+                          </a:xfrm>
+                          <a:prstGeom prst="rect">
+                            <a:avLst/>
+                          </a:prstGeom>
+                        </pic:spPr>
+                      </pic:pic>
+                    </wpg:wgp>
+                  </a:graphicData>
+                </a:graphic>
+              </wp:anchor>
+            </w:drawing>
+          </mc:Choice>
+          <mc:Fallback>
+            <w:pict>
+              <v:group w14:anchorId="292C083C" id="Group 2" o:spid="_x0000_s1026" style="position:absolute;margin-left:-.05pt;margin-top:1.35pt;width:220.7pt;height:56.05pt;z-index:251663360" coordsize="28027,7118" o:gfxdata="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">
+                <v:rect id="Rectangle 1708469171" o:spid="_x0000_s1027" style="position:absolute;width:28027;height:7118;visibility:visible;mso-wrap-style:square;v-text-anchor:middle" o:gfxdata="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" fillcolor="#00bfb3" stroked="f" strokeweight="1pt"/>
+                <v:shape id="Picture 1" o:spid="_x0000_s1028" type="#_x0000_t75" style="position:absolute;left:940;top:683;width:26403;height:5220;visibility:visible;mso-wrap-style:square" o:gfxdata="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">
+                  <v:imagedata r:id="rId13" o:title=""/>
+                </v:shape>
+              </v:group>
+            </w:pict>
+          </mc:Fallback>
+        </mc:AlternateContent>
+      </w:r>
+    </w:p>
+    <w:p>
+      <w:pPr>
+        <w:spacing w:line="276" w:lineRule="auto"/>
+        <w:jc w:val="both"/>
+      </w:pPr>
+    </w:p>
+    <w:p>
+      <w:pPr>
+        <w:spacing w:line="276" w:lineRule="auto"/>
+        <w:jc w:val="both"/>
+      </w:pPr>
+    </w:p>
+    <w:p>
+      <w:pPr>
+        <w:spacing w:line="276" w:lineRule="auto"/>
+        <w:jc w:val="both"/>
+      </w:pPr>
+    </w:p>
+    <w:p>
+      <w:pPr>
+        <w:spacing w:line="276" w:lineRule="auto"/>
+        <w:jc w:val="both"/>
+      </w:pPr>
+    </w:p>
+    <w:p>
+      <w:pPr>
+        <w:spacing w:line="276" w:lineRule="auto"/>
+        <w:jc w:val="both"/>
+        <w:rPr>
+          <w:b/>
+          <w:bCs/>
+        </w:rPr>
+      </w:pPr>
+      <w:r>
+        <w:rPr>
+          <w:b/>
+          <w:bCs/>
+        </w:rPr>
+        <w:t>Result</w:t>
+      </w:r>
+    </w:p>
+    <w:p>
+      <w:pPr>
+        <w:spacing w:line="276" w:lineRule="auto"/>
+        <w:jc w:val="both"/>
+      </w:pPr>
+      <w:r>
+        <w:t>The same analyzer pipeline is applied to the search query before it is looked up in the index.</w:t>
+      </w:r>
+    </w:p>
+    <w:p>
+      <w:pPr>
+        <w:spacing w:line="276" w:lineRule="auto"/>
+        <w:jc w:val="both"/>
+      </w:pPr>
+      <w:r>
+        <w:t>After the analysier pipline, the tokes are stored like this:</w:t>
+      </w:r>
+      <w:r>
+        <w:rPr>
+          <w:noProof/>
+          <w14:ligatures w14:val="standardContextual"/>
+        </w:rPr>
+        <w:t xml:space="preserve"> </w:t>
+      </w:r>
+    </w:p>
+    <w:p>
+      <w:pPr>
+        <w:spacing w:line="276" w:lineRule="auto"/>
+        <w:jc w:val="both"/>
+      </w:pPr>
+      <w:r>
+        <mc:AlternateContent>
+          <mc:Choice Requires="wpg">
+            <w:drawing>
+              <wp:anchor distT="0" distB="0" distL="114300" distR="114300" simplePos="0" relativeHeight="251665408" behindDoc="0" locked="0" layoutInCell="1" allowOverlap="1" wp14:anchorId="1498E6BD" wp14:editId="36D86D6C">
+                <wp:simplePos x="0" y="0"/>
+                <wp:positionH relativeFrom="column">
+                  <wp:posOffset>-636</wp:posOffset>
+                </wp:positionH>
+                <wp:positionV relativeFrom="paragraph">
+                  <wp:posOffset>28575</wp:posOffset>
+                </wp:positionV>
+                <wp:extent cx="2645879" cy="1522638"/>
+                <wp:effectExtent l="0" t="0" r="0" b="1905"/>
+                <wp:wrapNone/>
+                <wp:docPr id="25" name="Group 24">
+                  <a:extLst xmlns:a="http://schemas.openxmlformats.org/drawingml/2006/main">
+                    <a:ext uri="{FF2B5EF4-FFF2-40B4-BE49-F238E27FC236}">
+                      <a16:creationId xmlns:a16="http://schemas.microsoft.com/office/drawing/2014/main" id="{A92F3C1E-8B2D-79AD-95FA-84F25EBD56AD}"/>
+                    </a:ext>
+                  </a:extLst>
+                </wp:docPr>
+                <wp:cNvGraphicFramePr/>
+                <a:graphic xmlns:a="http://schemas.openxmlformats.org/drawingml/2006/main">
+                  <a:graphicData uri="http://schemas.microsoft.com/office/word/2010/wordprocessingGroup">
+                    <wpg:wgp>
+                      <wpg:cNvGrpSpPr/>
+                      <wpg:grpSpPr>
+                        <a:xfrm>
+                          <a:off x="0" y="0"/>
+                          <a:ext cx="2645879" cy="1522638"/>
+                          <a:chOff x="0" y="0"/>
+                          <a:chExt cx="2645879" cy="1522638"/>
+                        </a:xfrm>
+                      </wpg:grpSpPr>
+                      <wps:wsp>
+                        <wps:cNvPr id="1592125735" name="Rectangle 1592125735">
+                          <a:extLst>
+                            <a:ext uri="{FF2B5EF4-FFF2-40B4-BE49-F238E27FC236}">
+                              <a16:creationId xmlns:a16="http://schemas.microsoft.com/office/drawing/2014/main" id="{AD736C13-2413-9561-0668-08F3D0D24DEE}"/>
+                            </a:ext>
+                          </a:extLst>
+                        </wps:cNvPr>
+                        <wps:cNvSpPr/>
+                        <wps:spPr>
+                          <a:xfrm>
+                            <a:off x="0" y="0"/>
+                            <a:ext cx="2645879" cy="1522638"/>
+                          </a:xfrm>
+                          <a:prstGeom prst="rect">
+                            <a:avLst/>
+                          </a:prstGeom>
+                          <a:solidFill>
+                            <a:srgbClr val="00BFB3"/>
+                          </a:solidFill>
+                          <a:ln>
+                            <a:noFill/>
+                          </a:ln>
+                        </wps:spPr>
+                        <wps:style>
+                          <a:lnRef idx="2">
+                            <a:schemeClr val="accent1">
+                              <a:shade val="15000"/>
+                            </a:schemeClr>
+                          </a:lnRef>
+                          <a:fillRef idx="1">
+                            <a:schemeClr val="accent1"/>
+                          </a:fillRef>
+                          <a:effectRef idx="0">
+                            <a:schemeClr val="accent1"/>
+                          </a:effectRef>
+                          <a:fontRef idx="minor">
+                            <a:schemeClr val="lt1"/>
+                          </a:fontRef>
+                        </wps:style>
+                        <wps:bodyPr rtlCol="0" anchor="ctr"/>
+                      </wps:wsp>
+                      <pic:pic xmlns:pic="http://schemas.openxmlformats.org/drawingml/2006/picture">
+                        <pic:nvPicPr>
+                          <pic:cNvPr id="1067572422" name="Picture 1067572422">
+                            <a:extLst>
+                              <a:ext uri="{FF2B5EF4-FFF2-40B4-BE49-F238E27FC236}">
+                                <a16:creationId xmlns:a16="http://schemas.microsoft.com/office/drawing/2014/main" id="{A0677A90-797C-7C1F-2BF1-82B5EEFFA5AA}"/>
+                              </a:ext>
+                            </a:extLst>
+                          </pic:cNvPr>
+                          <pic:cNvPicPr>
+                            <a:picLocks noChangeAspect="1"/>
+                          </pic:cNvPicPr>
+                        </pic:nvPicPr>
+                        <pic:blipFill>
+                          <a:blip r:embed="rId14"/>
+                          <a:stretch>
+                            <a:fillRect/>
+                          </a:stretch>
+                        </pic:blipFill>
+                        <pic:spPr>
+                          <a:xfrm>
+                            <a:off x="46362" y="105300"/>
+                            <a:ext cx="2553153" cy="1312037"/>
+                          </a:xfrm>
+                          <a:prstGeom prst="rect">
+                            <a:avLst/>
+                          </a:prstGeom>
+                        </pic:spPr>
+                      </pic:pic>
+                    </wpg:wgp>
+                  </a:graphicData>
+                </a:graphic>
+              </wp:anchor>
+            </w:drawing>
+          </mc:Choice>
+          <mc:Fallback>
+            <w:pict>
+              <v:group w14:anchorId="42898D1C" id="Group 24" o:spid="_x0000_s1026" style="position:absolute;margin-left:-.05pt;margin-top:2.25pt;width:208.35pt;height:119.9pt;z-index:251665408" coordsize="26458,15226" o:gfxdata="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">
+                <v:rect id="Rectangle 1592125735" o:spid="_x0000_s1027" style="position:absolute;width:26458;height:15226;visibility:visible;mso-wrap-style:square;v-text-anchor:middle" o:gfxdata="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" fillcolor="#00bfb3" stroked="f" strokeweight="1pt"/>
+                <v:shape id="Picture 1067572422" o:spid="_x0000_s1028" type="#_x0000_t75" style="position:absolute;left:463;top:1053;width:25532;height:13120;visibility:visible;mso-wrap-style:square" o:gfxdata="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">
+                  <v:imagedata r:id="rId15" o:title=""/>
+                </v:shape>
+              </v:group>
+            </w:pict>
+          </mc:Fallback>
+        </mc:AlternateContent>
+      </w:r>
+    </w:p>
+    <w:p>
+      <w:pPr>
+        <w:spacing w:line="276" w:lineRule="auto"/>
+        <w:jc w:val="both"/>
+      </w:pPr>
+    </w:p>
+    <w:p>
+      <w:pPr>
+        <w:spacing w:line="276" w:lineRule="auto"/>
+        <w:jc w:val="both"/>
+      </w:pPr>
+    </w:p>
+    <w:p>
+      <w:pPr>
+        <w:spacing w:line="276" w:lineRule="auto"/>
+        <w:jc w:val="both"/>
+      </w:pPr>
+    </w:p>
+    <w:p>
+      <w:pPr>
+        <w:spacing w:line="276" w:lineRule="auto"/>
+        <w:jc w:val="both"/>
+      </w:pPr>
+    </w:p>
+    <w:p>
+      <w:pPr>
+        <w:spacing w:line="276" w:lineRule="auto"/>
+        <w:jc w:val="both"/>
+      </w:pPr>
+    </w:p>
+    <w:p>
+      <w:pPr>
+        <w:spacing w:line="276" w:lineRule="auto"/>
+        <w:jc w:val="both"/>
+      </w:pPr>
+    </w:p>
+    <w:p>
+      <w:pPr>
+        <w:spacing w:line="276" w:lineRule="auto"/>
+        <w:jc w:val="both"/>
+      </w:pPr>
+    </w:p>
+    <w:p>
+      <w:pPr>
+        <w:spacing w:line="276" w:lineRule="auto"/>
+        <w:jc w:val="both"/>
+      </w:pPr>
+    </w:p>
+    <w:p>
+      <w:pPr>
+        <w:spacing w:line="276" w:lineRule="auto"/>
+        <w:jc w:val="both"/>
+      </w:pPr>
+      <w:r>
+        <w:t>For each token Elasticsearch stores in which document this token appears.</w:t>
+      </w:r>
+    </w:p>
+    <w:p>
+      <w:pPr>
+        <w:spacing w:line="276" w:lineRule="auto"/>
+        <w:jc w:val="both"/>
+      </w:pPr>
+    </w:p>
+    <w:p>
+      <w:pPr>
+        <w:spacing w:line="276" w:lineRule="auto"/>
+        <w:jc w:val="both"/>
+        <w:rPr>
+          <w:b/>
+          <w:bCs/>
+        </w:rPr>
+      </w:pPr>
+      <w:r>
+        <w:rPr>
+          <w:b/>
+          <w:bCs/>
+        </w:rPr>
+        <w:t>Search</w:t>
+      </w:r>
+    </w:p>
+    <w:p>
+      <w:pPr>
+        <w:spacing w:line="276" w:lineRule="auto"/>
+        <w:jc w:val="both"/>
+      </w:pPr>
+      <w:r>
+        <w:t>Elasticsearch does not look for an exact match in the inverted index. Instead it calculates the edit distance between the search term and the stored tokens, where edit distance refers to the number of single-character insertions, deletions or substitutions needed to transform one string into another. Since "Hamilten" and "hamilton" differ by only one character, they fall within the allowed fuzziness threshold and Elasticsearch returns the correct results despite the typo.</w:t>
+      </w:r>
+    </w:p>
+    <w:p>
+      <w:pPr>
+        <w:spacing w:line="276" w:lineRule="auto"/>
+        <w:jc w:val="both"/>
+      </w:pPr>
+    </w:p>
+    <w:p>
+      <w:pPr>
+        <w:pStyle w:val="Heading1"/>
+        <w:numPr>
+          <w:ilvl w:val="1"/>
+          <w:numId w:val="4"/>
+        </w:numPr>
+        <w:ind w:left="567" w:hanging="573"/>
+        <w:rPr>
+          <w:sz w:val="32"/>
+          <w:szCs w:val="32"/>
+        </w:rPr>
+      </w:pPr>
+      <w:r>
+        <w:rPr>
+          <w:sz w:val="32"/>
+          <w:szCs w:val="32"/>
+        </w:rPr>
+        <w:t>Sharding, Replication and Distrubited Search</w:t>
+      </w:r>
+    </w:p>
+    <w:p>
+      <w:pPr>
+        <w:spacing w:line="276" w:lineRule="auto"/>
+        <w:jc w:val="both"/>
+      </w:pPr>
+    </w:p>
+    <w:p>
+      <w:pPr>
+        <w:spacing w:after="160" w:line="278" w:lineRule="auto"/>
+      </w:pPr>
+      <w:r>
+        <w:br w:type="page"/>
+      </w:r>
+    </w:p>
+    <w:p>
+      <w:pPr>
+        <w:spacing w:line="276" w:lineRule="auto"/>
+      </w:pPr>
+    </w:p>
+    <w:p>
+      <w:pPr>
+        <w:pStyle w:val="Heading1"/>
+        <w:numPr>
+          <w:ilvl w:val="0"/>
+          <w:numId w:val="4"/>
+        </w:numPr>
+      </w:pPr>
+      <w:bookmarkStart w:id="4" w:name="_Toc229380754"/>
       <w:r>
         <w:t>References</w:t>
       </w:r>
-      <w:bookmarkEnd w:id="3"/>
+      <w:bookmarkEnd w:id="4"/>
     </w:p>
     <w:p>
       <w:pPr>
@@ -1603,7 +2301,7 @@
           <w:szCs w:val="21"/>
         </w:rPr>
       </w:pPr>
-      <w:hyperlink r:id="rId14" w:history="1">
+      <w:hyperlink r:id="rId16" w:history="1">
         <w:r>
           <w:rPr>
             <w:rStyle w:val="Hyperlink"/>
@@ -1627,7 +2325,7 @@
           <w:szCs w:val="21"/>
         </w:rPr>
       </w:pPr>
-      <w:hyperlink r:id="rId15" w:history="1">
+      <w:hyperlink r:id="rId17" w:history="1">
         <w:r>
           <w:rPr>
             <w:rStyle w:val="Hyperlink"/>
@@ -1676,7 +2374,7 @@
         </w:rPr>
         <w:t xml:space="preserve">[Dataset]: </w:t>
       </w:r>
-      <w:hyperlink r:id="rId16" w:history="1">
+      <w:hyperlink r:id="rId18" w:history="1">
         <w:r>
           <w:rPr>
             <w:rStyle w:val="Hyperlink"/>
@@ -1700,7 +2398,7 @@
           <w:szCs w:val="21"/>
         </w:rPr>
       </w:pPr>
-      <w:hyperlink r:id="rId17" w:history="1">
+      <w:hyperlink r:id="rId19" w:history="1">
         <w:r>
           <w:rPr>
             <w:rStyle w:val="Hyperlink"/>
@@ -1724,7 +2422,7 @@
           <w:szCs w:val="21"/>
         </w:rPr>
       </w:pPr>
-      <w:hyperlink r:id="rId18" w:history="1">
+      <w:hyperlink r:id="rId20" w:history="1">
         <w:r>
           <w:rPr>
             <w:rStyle w:val="Hyperlink"/>
@@ -1748,7 +2446,7 @@
           <w:szCs w:val="21"/>
         </w:rPr>
       </w:pPr>
-      <w:hyperlink r:id="rId19" w:history="1">
+      <w:hyperlink r:id="rId21" w:history="1">
         <w:r>
           <w:rPr>
             <w:rStyle w:val="Hyperlink"/>
@@ -1772,7 +2470,7 @@
           <w:szCs w:val="21"/>
         </w:rPr>
       </w:pPr>
-      <w:hyperlink r:id="rId20" w:history="1">
+      <w:hyperlink r:id="rId22" w:history="1">
         <w:r>
           <w:rPr>
             <w:rStyle w:val="Hyperlink"/>
@@ -1782,6 +2480,58 @@
           <w:t>https://www.cdata.com/blog/elasticsearch-use-cases</w:t>
         </w:r>
       </w:hyperlink>
+    </w:p>
+    <w:p>
+      <w:pPr>
+        <w:pStyle w:val="ListParagraph"/>
+        <w:numPr>
+          <w:ilvl w:val="0"/>
+          <w:numId w:val="9"/>
+        </w:numPr>
+        <w:spacing w:line="276" w:lineRule="auto"/>
+        <w:rPr>
+          <w:rStyle w:val="Hyperlink"/>
+        </w:rPr>
+      </w:pPr>
+      <w:hyperlink r:id="rId23" w:history="1">
+        <w:r>
+          <w:rPr>
+            <w:rStyle w:val="Hyperlink"/>
+          </w:rPr>
+          <w:t>https://www.elastic.co/guide/en/elasticsearch/reference/current/analysis.html</w:t>
+        </w:r>
+      </w:hyperlink>
+    </w:p>
+    <w:p>
+      <w:pPr>
+        <w:pStyle w:val="ListParagraph"/>
+        <w:numPr>
+          <w:ilvl w:val="0"/>
+          <w:numId w:val="9"/>
+        </w:numPr>
+        <w:spacing w:line="276" w:lineRule="auto"/>
+        <w:rPr>
+          <w:rStyle w:val="Hyperlink"/>
+        </w:rPr>
+      </w:pPr>
+      <w:hyperlink r:id="rId24" w:history="1">
+        <w:r>
+          <w:rPr>
+            <w:rStyle w:val="Hyperlink"/>
+          </w:rPr>
+          <w:t>https://www.elastic.co/guide/en/elasticsearch/reference/current/documents-indices.html</w:t>
+        </w:r>
+      </w:hyperlink>
+    </w:p>
+    <w:p>
+      <w:pPr>
+        <w:pStyle w:val="ListParagraph"/>
+        <w:numPr>
+          <w:ilvl w:val="0"/>
+          <w:numId w:val="9"/>
+        </w:numPr>
+        <w:spacing w:line="276" w:lineRule="auto"/>
+      </w:pPr>
     </w:p>
     <w:p>
       <w:pPr>
@@ -3947,6 +4697,38 @@
       </w:tblBorders>
     </w:tblPr>
   </w:style>
+  <w:style w:type="paragraph" w:styleId="Caption">
+    <w:name w:val="caption"/>
+    <w:basedOn w:val="Normal"/>
+    <w:next w:val="Normal"/>
+    <w:uiPriority w:val="35"/>
+    <w:unhideWhenUsed/>
+    <w:qFormat/>
+    <w:rsid w:val="00815A56"/>
+    <w:pPr>
+      <w:spacing w:after="200"/>
+    </w:pPr>
+    <w:rPr>
+      <w:i/>
+      <w:iCs/>
+      <w:color w:val="0E2841" w:themeColor="text2"/>
+      <w:sz w:val="18"/>
+      <w:szCs w:val="18"/>
+    </w:rPr>
+  </w:style>
+  <w:style w:type="character" w:styleId="HTMLCode">
+    <w:name w:val="HTML Code"/>
+    <w:basedOn w:val="DefaultParagraphFont"/>
+    <w:uiPriority w:val="99"/>
+    <w:semiHidden/>
+    <w:unhideWhenUsed/>
+    <w:rsid w:val="00F421A8"/>
+    <w:rPr>
+      <w:rFonts w:ascii="Courier New" w:eastAsia="Times New Roman" w:hAnsi="Courier New" w:cs="Courier New"/>
+      <w:sz w:val="20"/>
+      <w:szCs w:val="20"/>
+    </w:rPr>
+  </w:style>
 </w:styles>
 </file>
 
@@ -4250,7 +5032,7 @@
 </file>
 
 <file path=customXml/itemProps1.xml><?xml version="1.0" encoding="utf-8"?>
-<ds:datastoreItem xmlns:ds="http://schemas.openxmlformats.org/officeDocument/2006/customXml" ds:itemID="{93AF70FE-4869-D64F-A87F-18B8E246D7F7}">
+<ds:datastoreItem xmlns:ds="http://schemas.openxmlformats.org/officeDocument/2006/customXml" ds:itemID="{77E46D63-A46B-EE4D-848F-E070A2161CE1}">
   <ds:schemaRefs>
     <ds:schemaRef ds:uri="http://schemas.openxmlformats.org/officeDocument/2006/bibliography"/>
   </ds:schemaRefs>

</xml_diff>

<commit_message>
Finished section architecture in paper
</commit_message>
<xml_diff>
--- a/Elasticsearch_Paper.docx
+++ b/Elasticsearch_Paper.docx
@@ -1600,137 +1600,78 @@
           <w14:ligatures w14:val="standardContextual"/>
         </w:rPr>
         <mc:AlternateContent>
-          <mc:Choice Requires="wpg">
+          <mc:Choice Requires="wps">
             <w:drawing>
-              <wp:anchor distT="0" distB="0" distL="114300" distR="114300" simplePos="0" relativeHeight="251658240" behindDoc="0" locked="0" layoutInCell="1" allowOverlap="1" wp14:anchorId="191B47B6" wp14:editId="1A69D64E">
+              <wp:anchor distT="0" distB="0" distL="114300" distR="114300" simplePos="0" relativeHeight="251658240" behindDoc="0" locked="0" layoutInCell="1" allowOverlap="1" wp14:anchorId="10AFADC0" wp14:editId="44986276">
                 <wp:simplePos x="0" y="0"/>
                 <wp:positionH relativeFrom="column">
-                  <wp:posOffset>85072</wp:posOffset>
+                  <wp:posOffset>85458</wp:posOffset>
                 </wp:positionH>
                 <wp:positionV relativeFrom="paragraph">
-                  <wp:posOffset>180340</wp:posOffset>
+                  <wp:posOffset>180939</wp:posOffset>
                 </wp:positionV>
-                <wp:extent cx="3013046" cy="712381"/>
+                <wp:extent cx="3315768" cy="649481"/>
                 <wp:effectExtent l="0" t="0" r="0" b="0"/>
                 <wp:wrapNone/>
-                <wp:docPr id="472385087" name="Group 1"/>
+                <wp:docPr id="1242039539" name="Rectangle 1708469171">
+                  <a:extLst xmlns:a="http://schemas.openxmlformats.org/drawingml/2006/main">
+                    <a:ext uri="{FF2B5EF4-FFF2-40B4-BE49-F238E27FC236}">
+                      <a16:creationId xmlns:a16="http://schemas.microsoft.com/office/drawing/2014/main" id="{7CDBC851-880E-EACC-7E51-2912EACCF5E0}"/>
+                    </a:ext>
+                  </a:extLst>
+                </wp:docPr>
                 <wp:cNvGraphicFramePr/>
                 <a:graphic xmlns:a="http://schemas.openxmlformats.org/drawingml/2006/main">
-                  <a:graphicData uri="http://schemas.microsoft.com/office/word/2010/wordprocessingGroup">
-                    <wpg:wgp>
-                      <wpg:cNvGrpSpPr/>
-                      <wpg:grpSpPr>
+                  <a:graphicData uri="http://schemas.microsoft.com/office/word/2010/wordprocessingShape">
+                    <wps:wsp>
+                      <wps:cNvSpPr/>
+                      <wps:spPr>
                         <a:xfrm>
                           <a:off x="0" y="0"/>
-                          <a:ext cx="3013046" cy="712381"/>
-                          <a:chOff x="0" y="0"/>
-                          <a:chExt cx="3013046" cy="712381"/>
+                          <a:ext cx="3315768" cy="649481"/>
                         </a:xfrm>
-                      </wpg:grpSpPr>
-                      <wps:wsp>
-                        <wps:cNvPr id="2083967906" name="Rectangle 1708469171">
-                          <a:extLst>
-                            <a:ext uri="{FF2B5EF4-FFF2-40B4-BE49-F238E27FC236}">
-                              <a16:creationId xmlns:a16="http://schemas.microsoft.com/office/drawing/2014/main" id="{7CDBC851-880E-EACC-7E51-2912EACCF5E0}"/>
-                            </a:ext>
-                          </a:extLst>
-                        </wps:cNvPr>
-                        <wps:cNvSpPr/>
-                        <wps:spPr>
-                          <a:xfrm>
-                            <a:off x="0" y="0"/>
-                            <a:ext cx="3013046" cy="712381"/>
-                          </a:xfrm>
-                          <a:prstGeom prst="rect">
-                            <a:avLst/>
-                          </a:prstGeom>
-                          <a:solidFill>
-                            <a:srgbClr val="00BFB3"/>
-                          </a:solidFill>
-                          <a:ln>
-                            <a:noFill/>
-                          </a:ln>
-                        </wps:spPr>
-                        <wps:style>
-                          <a:lnRef idx="2">
-                            <a:schemeClr val="accent1">
-                              <a:shade val="15000"/>
-                            </a:schemeClr>
-                          </a:lnRef>
-                          <a:fillRef idx="1">
-                            <a:schemeClr val="accent1"/>
-                          </a:fillRef>
-                          <a:effectRef idx="0">
-                            <a:schemeClr val="accent1"/>
-                          </a:effectRef>
-                          <a:fontRef idx="minor">
-                            <a:schemeClr val="lt1"/>
-                          </a:fontRef>
-                        </wps:style>
-                        <wps:bodyPr rtlCol="0" anchor="ctr"/>
-                      </wps:wsp>
-                      <pic:pic xmlns:pic="http://schemas.openxmlformats.org/drawingml/2006/picture">
-                        <pic:nvPicPr>
-                          <pic:cNvPr id="2119378414" name="Picture 1"/>
-                          <pic:cNvPicPr>
-                            <a:picLocks noChangeAspect="1"/>
-                          </pic:cNvPicPr>
-                        </pic:nvPicPr>
-                        <pic:blipFill>
-                          <a:blip r:embed="rId10">
-                            <a:extLst>
-                              <a:ext uri="{28A0092B-C50C-407E-A947-70E740481C1C}">
-                                <a14:useLocalDpi xmlns:a14="http://schemas.microsoft.com/office/drawing/2010/main" val="0"/>
-                              </a:ext>
-                            </a:extLst>
-                          </a:blip>
-                          <a:stretch>
-                            <a:fillRect/>
-                          </a:stretch>
-                        </pic:blipFill>
-                        <pic:spPr>
-                          <a:xfrm>
-                            <a:off x="51275" y="59821"/>
-                            <a:ext cx="2905125" cy="542925"/>
-                          </a:xfrm>
-                          <a:prstGeom prst="rect">
-                            <a:avLst/>
-                          </a:prstGeom>
-                        </pic:spPr>
-                      </pic:pic>
-                    </wpg:wgp>
+                        <a:prstGeom prst="rect">
+                          <a:avLst/>
+                        </a:prstGeom>
+                        <a:solidFill>
+                          <a:srgbClr val="00BFB3"/>
+                        </a:solidFill>
+                        <a:ln>
+                          <a:noFill/>
+                        </a:ln>
+                      </wps:spPr>
+                      <wps:style>
+                        <a:lnRef idx="2">
+                          <a:schemeClr val="accent1">
+                            <a:shade val="15000"/>
+                          </a:schemeClr>
+                        </a:lnRef>
+                        <a:fillRef idx="1">
+                          <a:schemeClr val="accent1"/>
+                        </a:fillRef>
+                        <a:effectRef idx="0">
+                          <a:schemeClr val="accent1"/>
+                        </a:effectRef>
+                        <a:fontRef idx="minor">
+                          <a:schemeClr val="lt1"/>
+                        </a:fontRef>
+                      </wps:style>
+                      <wps:bodyPr rtlCol="0" anchor="ctr"/>
+                    </wps:wsp>
                   </a:graphicData>
                 </a:graphic>
+                <wp14:sizeRelH relativeFrom="margin">
+                  <wp14:pctWidth>0</wp14:pctWidth>
+                </wp14:sizeRelH>
+                <wp14:sizeRelV relativeFrom="margin">
+                  <wp14:pctHeight>0</wp14:pctHeight>
+                </wp14:sizeRelV>
               </wp:anchor>
             </w:drawing>
           </mc:Choice>
           <mc:Fallback>
             <w:pict>
-              <v:group w14:anchorId="003A87B4" id="Group 1" o:spid="_x0000_s1026" style="position:absolute;margin-left:6.7pt;margin-top:14.2pt;width:237.25pt;height:56.1pt;z-index:251658240" coordsize="30130,7123" o:gfxdata="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">
-                <v:rect id="Rectangle 1708469171" o:spid="_x0000_s1027" style="position:absolute;width:30130;height:7123;visibility:visible;mso-wrap-style:square;v-text-anchor:middle" o:gfxdata="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" fillcolor="#00bfb3" stroked="f" strokeweight="1pt"/>
-                <v:shapetype id="_x0000_t75" coordsize="21600,21600" o:spt="75" o:preferrelative="t" path="m@4@5l@4@11@9@11@9@5xe" filled="f" stroked="f">
-                  <v:stroke joinstyle="miter"/>
-                  <v:formulas>
-                    <v:f eqn="if lineDrawn pixelLineWidth 0"/>
-                    <v:f eqn="sum @0 1 0"/>
-                    <v:f eqn="sum 0 0 @1"/>
-                    <v:f eqn="prod @2 1 2"/>
-                    <v:f eqn="prod @3 21600 pixelWidth"/>
-                    <v:f eqn="prod @3 21600 pixelHeight"/>
-                    <v:f eqn="sum @0 0 1"/>
-                    <v:f eqn="prod @6 1 2"/>
-                    <v:f eqn="prod @7 21600 pixelWidth"/>
-                    <v:f eqn="sum @8 21600 0"/>
-                    <v:f eqn="prod @7 21600 pixelHeight"/>
-                    <v:f eqn="sum @10 21600 0"/>
-                  </v:formulas>
-                  <v:path o:extrusionok="f" gradientshapeok="t" o:connecttype="rect"/>
-                  <o:lock v:ext="edit" aspectratio="t"/>
-                </v:shapetype>
-                <v:shape id="Picture 1" o:spid="_x0000_s1028" type="#_x0000_t75" style="position:absolute;left:512;top:598;width:29052;height:5429;visibility:visible;mso-wrap-style:square" o:gfxdata="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">
-                  <v:imagedata r:id="rId11" o:title=""/>
-                </v:shape>
-              </v:group>
+              <v:rect w14:anchorId="5E644538" id="Rectangle 1708469171" o:spid="_x0000_s1026" style="position:absolute;margin-left:6.75pt;margin-top:14.25pt;width:261.1pt;height:51.15pt;z-index:251658240;visibility:visible;mso-wrap-style:square;mso-width-percent:0;mso-height-percent:0;mso-wrap-distance-left:9pt;mso-wrap-distance-top:0;mso-wrap-distance-right:9pt;mso-wrap-distance-bottom:0;mso-position-horizontal:absolute;mso-position-horizontal-relative:text;mso-position-vertical:absolute;mso-position-vertical-relative:text;mso-width-percent:0;mso-height-percent:0;mso-width-relative:margin;mso-height-relative:margin;v-text-anchor:middle" o:gfxdata="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" fillcolor="#00bfb3" stroked="f" strokeweight="1pt"/>
             </w:pict>
           </mc:Fallback>
         </mc:AlternateContent>
@@ -1744,6 +1685,81 @@
         <w:spacing w:line="276" w:lineRule="auto"/>
         <w:jc w:val="both"/>
       </w:pPr>
+      <w:r>
+        <w:rPr>
+          <w:noProof/>
+          <w14:ligatures w14:val="standardContextual"/>
+        </w:rPr>
+        <w:drawing>
+          <wp:anchor distT="0" distB="0" distL="114300" distR="114300" simplePos="0" relativeHeight="251666432" behindDoc="0" locked="0" layoutInCell="1" allowOverlap="1" wp14:anchorId="6D2F5160" wp14:editId="19F7BA3F">
+            <wp:simplePos x="0" y="0"/>
+            <wp:positionH relativeFrom="column">
+              <wp:posOffset>153824</wp:posOffset>
+            </wp:positionH>
+            <wp:positionV relativeFrom="paragraph">
+              <wp:posOffset>90105</wp:posOffset>
+            </wp:positionV>
+            <wp:extent cx="3181012" cy="487045"/>
+            <wp:effectExtent l="0" t="0" r="0" b="0"/>
+            <wp:wrapNone/>
+            <wp:docPr id="5" name="Picture 4">
+              <a:extLst xmlns:a="http://schemas.openxmlformats.org/drawingml/2006/main">
+                <a:ext uri="{FF2B5EF4-FFF2-40B4-BE49-F238E27FC236}">
+                  <a16:creationId xmlns:a16="http://schemas.microsoft.com/office/drawing/2014/main" id="{3FBDF86E-2174-CF34-E191-82A30BE8D9C1}"/>
+                </a:ext>
+              </a:extLst>
+            </wp:docPr>
+            <wp:cNvGraphicFramePr>
+              <a:graphicFrameLocks xmlns:a="http://schemas.openxmlformats.org/drawingml/2006/main" noChangeAspect="1"/>
+            </wp:cNvGraphicFramePr>
+            <a:graphic xmlns:a="http://schemas.openxmlformats.org/drawingml/2006/main">
+              <a:graphicData uri="http://schemas.openxmlformats.org/drawingml/2006/picture">
+                <pic:pic xmlns:pic="http://schemas.openxmlformats.org/drawingml/2006/picture">
+                  <pic:nvPicPr>
+                    <pic:cNvPr id="5" name="Picture 4">
+                      <a:extLst>
+                        <a:ext uri="{FF2B5EF4-FFF2-40B4-BE49-F238E27FC236}">
+                          <a16:creationId xmlns:a16="http://schemas.microsoft.com/office/drawing/2014/main" id="{3FBDF86E-2174-CF34-E191-82A30BE8D9C1}"/>
+                        </a:ext>
+                      </a:extLst>
+                    </pic:cNvPr>
+                    <pic:cNvPicPr>
+                      <a:picLocks noChangeAspect="1"/>
+                    </pic:cNvPicPr>
+                  </pic:nvPicPr>
+                  <pic:blipFill>
+                    <a:blip r:embed="rId10">
+                      <a:extLst>
+                        <a:ext uri="{28A0092B-C50C-407E-A947-70E740481C1C}">
+                          <a14:useLocalDpi xmlns:a14="http://schemas.microsoft.com/office/drawing/2010/main" val="0"/>
+                        </a:ext>
+                      </a:extLst>
+                    </a:blip>
+                    <a:stretch>
+                      <a:fillRect/>
+                    </a:stretch>
+                  </pic:blipFill>
+                  <pic:spPr>
+                    <a:xfrm>
+                      <a:off x="0" y="0"/>
+                      <a:ext cx="3201542" cy="490188"/>
+                    </a:xfrm>
+                    <a:prstGeom prst="rect">
+                      <a:avLst/>
+                    </a:prstGeom>
+                  </pic:spPr>
+                </pic:pic>
+              </a:graphicData>
+            </a:graphic>
+            <wp14:sizeRelH relativeFrom="page">
+              <wp14:pctWidth>0</wp14:pctWidth>
+            </wp14:sizeRelH>
+            <wp14:sizeRelV relativeFrom="page">
+              <wp14:pctHeight>0</wp14:pctHeight>
+            </wp14:sizeRelV>
+          </wp:anchor>
+        </w:drawing>
+      </w:r>
     </w:p>
     <w:p>
       <w:pPr>
@@ -1903,7 +1919,7 @@
                           </pic:cNvPicPr>
                         </pic:nvPicPr>
                         <pic:blipFill>
-                          <a:blip r:embed="rId12">
+                          <a:blip r:embed="rId11">
                             <a:extLst>
                               <a:ext uri="{28A0092B-C50C-407E-A947-70E740481C1C}">
                                 <a14:useLocalDpi xmlns:a14="http://schemas.microsoft.com/office/drawing/2010/main" val="0"/>
@@ -1932,10 +1948,29 @@
           </mc:Choice>
           <mc:Fallback>
             <w:pict>
-              <v:group w14:anchorId="292C083C" id="Group 2" o:spid="_x0000_s1026" style="position:absolute;margin-left:-.05pt;margin-top:1.35pt;width:220.7pt;height:56.05pt;z-index:251663360" coordsize="28027,7118" o:gfxdata="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">
+              <v:group w14:anchorId="6E088399" id="Group 2" o:spid="_x0000_s1026" style="position:absolute;margin-left:-.05pt;margin-top:1.35pt;width:220.7pt;height:56.05pt;z-index:251663360" coordsize="28027,7118" o:gfxdata="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">
                 <v:rect id="Rectangle 1708469171" o:spid="_x0000_s1027" style="position:absolute;width:28027;height:7118;visibility:visible;mso-wrap-style:square;v-text-anchor:middle" o:gfxdata="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" fillcolor="#00bfb3" stroked="f" strokeweight="1pt"/>
+                <v:shapetype id="_x0000_t75" coordsize="21600,21600" o:spt="75" o:preferrelative="t" path="m@4@5l@4@11@9@11@9@5xe" filled="f" stroked="f">
+                  <v:stroke joinstyle="miter"/>
+                  <v:formulas>
+                    <v:f eqn="if lineDrawn pixelLineWidth 0"/>
+                    <v:f eqn="sum @0 1 0"/>
+                    <v:f eqn="sum 0 0 @1"/>
+                    <v:f eqn="prod @2 1 2"/>
+                    <v:f eqn="prod @3 21600 pixelWidth"/>
+                    <v:f eqn="prod @3 21600 pixelHeight"/>
+                    <v:f eqn="sum @0 0 1"/>
+                    <v:f eqn="prod @6 1 2"/>
+                    <v:f eqn="prod @7 21600 pixelWidth"/>
+                    <v:f eqn="sum @8 21600 0"/>
+                    <v:f eqn="prod @7 21600 pixelHeight"/>
+                    <v:f eqn="sum @10 21600 0"/>
+                  </v:formulas>
+                  <v:path o:extrusionok="f" gradientshapeok="t" o:connecttype="rect"/>
+                  <o:lock v:ext="edit" aspectratio="t"/>
+                </v:shapetype>
                 <v:shape id="Picture 1" o:spid="_x0000_s1028" type="#_x0000_t75" style="position:absolute;left:940;top:683;width:26403;height:5220;visibility:visible;mso-wrap-style:square" o:gfxdata="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">
-                  <v:imagedata r:id="rId13" o:title=""/>
+                  <v:imagedata r:id="rId12" o:title=""/>
                 </v:shape>
               </v:group>
             </w:pict>
@@ -2105,7 +2140,7 @@
                           </pic:cNvPicPr>
                         </pic:nvPicPr>
                         <pic:blipFill>
-                          <a:blip r:embed="rId14"/>
+                          <a:blip r:embed="rId13"/>
                           <a:stretch>
                             <a:fillRect/>
                           </a:stretch>
@@ -2128,10 +2163,10 @@
           </mc:Choice>
           <mc:Fallback>
             <w:pict>
-              <v:group w14:anchorId="42898D1C" id="Group 24" o:spid="_x0000_s1026" style="position:absolute;margin-left:-.05pt;margin-top:2.25pt;width:208.35pt;height:119.9pt;z-index:251665408" coordsize="26458,15226" o:gfxdata="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">
+              <v:group w14:anchorId="71F6A120" id="Group 24" o:spid="_x0000_s1026" style="position:absolute;margin-left:-.05pt;margin-top:2.25pt;width:208.35pt;height:119.9pt;z-index:251665408" coordsize="26458,15226" o:gfxdata="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">
                 <v:rect id="Rectangle 1592125735" o:spid="_x0000_s1027" style="position:absolute;width:26458;height:15226;visibility:visible;mso-wrap-style:square;v-text-anchor:middle" o:gfxdata="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" fillcolor="#00bfb3" stroked="f" strokeweight="1pt"/>
                 <v:shape id="Picture 1067572422" o:spid="_x0000_s1028" type="#_x0000_t75" style="position:absolute;left:463;top:1053;width:25532;height:13120;visibility:visible;mso-wrap-style:square" o:gfxdata="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">
-                  <v:imagedata r:id="rId15" o:title=""/>
+                  <v:imagedata r:id="rId14" o:title=""/>
                 </v:shape>
               </v:group>
             </w:pict>
@@ -2252,14 +2287,53 @@
           <w:sz w:val="32"/>
           <w:szCs w:val="32"/>
         </w:rPr>
-        <w:t>Sharding, Replication and Distrubited Search</w:t>
-      </w:r>
-    </w:p>
-    <w:p>
-      <w:pPr>
-        <w:spacing w:line="276" w:lineRule="auto"/>
-        <w:jc w:val="both"/>
-      </w:pPr>
+        <w:t>Sharding, Replication and Distr</w:t>
+      </w:r>
+      <w:r>
+        <w:rPr>
+          <w:sz w:val="32"/>
+          <w:szCs w:val="32"/>
+        </w:rPr>
+        <w:t>i</w:t>
+      </w:r>
+      <w:r>
+        <w:rPr>
+          <w:sz w:val="32"/>
+          <w:szCs w:val="32"/>
+        </w:rPr>
+        <w:t>bited Search</w:t>
+      </w:r>
+    </w:p>
+    <w:p>
+      <w:pPr>
+        <w:spacing w:line="276" w:lineRule="auto"/>
+        <w:jc w:val="both"/>
+      </w:pPr>
+      <w:r>
+        <w:t xml:space="preserve">When Elasticsearch receives a search query, it does not search a single location. Instead, a node designated as the coordinating node for that request distributes that query to all shards that belong to the target index, whether they are primary shards or replicas. Each shard executes the search independently and in parallel on its own portion of the data, returning its local results along with relevance scores to the coordingating node. The coordinating node then merges all </w:t>
+      </w:r>
+      <w:r>
+        <w:t>partial results, sorts them by relevance score and returns the final unified response to client.</w:t>
+      </w:r>
+    </w:p>
+    <w:p>
+      <w:pPr>
+        <w:spacing w:line="276" w:lineRule="auto"/>
+        <w:jc w:val="both"/>
+      </w:pPr>
+    </w:p>
+    <w:p>
+      <w:pPr>
+        <w:spacing w:line="276" w:lineRule="auto"/>
+        <w:jc w:val="both"/>
+      </w:pPr>
+      <w:r>
+        <w:t xml:space="preserve">The combination of sharding and replication gives Elasticsearch three important properties. First, it can store datasets that exeed the capacity of any single maschine by distributing shards across nodes. Second, it can handle high query volumns by serving read requsts from both </w:t>
+      </w:r>
+      <w:r>
+        <w:lastRenderedPageBreak/>
+        <w:t>primary shards and replicas in parallel. Third, it remains available even when individual nodes fail because replicas on surviving nodes can take over immediately without any data loss.</w:t>
+      </w:r>
     </w:p>
     <w:p>
       <w:pPr>
@@ -2297,14 +2371,17 @@
         </w:numPr>
         <w:spacing w:line="276" w:lineRule="auto"/>
         <w:rPr>
+          <w:rStyle w:val="Hyperlink"/>
+          <w:color w:val="000000" w:themeColor="text1"/>
           <w:sz w:val="21"/>
           <w:szCs w:val="21"/>
         </w:rPr>
       </w:pPr>
-      <w:hyperlink r:id="rId16" w:history="1">
+      <w:hyperlink r:id="rId15" w:history="1">
         <w:r>
           <w:rPr>
             <w:rStyle w:val="Hyperlink"/>
+            <w:color w:val="000000" w:themeColor="text1"/>
             <w:sz w:val="21"/>
             <w:szCs w:val="21"/>
           </w:rPr>
@@ -2321,14 +2398,17 @@
         </w:numPr>
         <w:spacing w:line="276" w:lineRule="auto"/>
         <w:rPr>
+          <w:rStyle w:val="Hyperlink"/>
+          <w:color w:val="000000" w:themeColor="text1"/>
           <w:sz w:val="21"/>
           <w:szCs w:val="21"/>
         </w:rPr>
       </w:pPr>
-      <w:hyperlink r:id="rId17" w:history="1">
+      <w:hyperlink r:id="rId16" w:history="1">
         <w:r>
           <w:rPr>
             <w:rStyle w:val="Hyperlink"/>
+            <w:color w:val="000000" w:themeColor="text1"/>
             <w:sz w:val="21"/>
             <w:szCs w:val="21"/>
           </w:rPr>
@@ -2337,6 +2417,7 @@
         <w:r>
           <w:rPr>
             <w:rStyle w:val="Hyperlink"/>
+            <w:color w:val="000000" w:themeColor="text1"/>
             <w:sz w:val="21"/>
             <w:szCs w:val="21"/>
           </w:rPr>
@@ -2345,6 +2426,7 @@
         <w:r>
           <w:rPr>
             <w:rStyle w:val="Hyperlink"/>
+            <w:color w:val="000000" w:themeColor="text1"/>
             <w:sz w:val="21"/>
             <w:szCs w:val="21"/>
           </w:rPr>
@@ -2361,6 +2443,7 @@
         </w:numPr>
         <w:spacing w:line="276" w:lineRule="auto"/>
         <w:rPr>
+          <w:color w:val="000000" w:themeColor="text1"/>
           <w:sz w:val="21"/>
           <w:szCs w:val="21"/>
           <w:u w:val="single"/>
@@ -2368,16 +2451,18 @@
       </w:pPr>
       <w:r>
         <w:rPr>
+          <w:color w:val="000000" w:themeColor="text1"/>
           <w:sz w:val="21"/>
           <w:szCs w:val="21"/>
           <w:u w:val="single"/>
         </w:rPr>
         <w:t xml:space="preserve">[Dataset]: </w:t>
       </w:r>
-      <w:hyperlink r:id="rId18" w:history="1">
+      <w:hyperlink r:id="rId17" w:history="1">
         <w:r>
           <w:rPr>
             <w:rStyle w:val="Hyperlink"/>
+            <w:color w:val="000000" w:themeColor="text1"/>
             <w:sz w:val="21"/>
             <w:szCs w:val="21"/>
           </w:rPr>
@@ -2394,14 +2479,16 @@
         </w:numPr>
         <w:spacing w:line="276" w:lineRule="auto"/>
         <w:rPr>
+          <w:color w:val="000000" w:themeColor="text1"/>
           <w:sz w:val="21"/>
           <w:szCs w:val="21"/>
         </w:rPr>
       </w:pPr>
-      <w:hyperlink r:id="rId19" w:history="1">
+      <w:hyperlink r:id="rId18" w:history="1">
         <w:r>
           <w:rPr>
             <w:rStyle w:val="Hyperlink"/>
+            <w:color w:val="000000" w:themeColor="text1"/>
             <w:sz w:val="21"/>
             <w:szCs w:val="21"/>
           </w:rPr>
@@ -2418,14 +2505,16 @@
         </w:numPr>
         <w:spacing w:line="276" w:lineRule="auto"/>
         <w:rPr>
+          <w:color w:val="000000" w:themeColor="text1"/>
           <w:sz w:val="21"/>
           <w:szCs w:val="21"/>
         </w:rPr>
       </w:pPr>
-      <w:hyperlink r:id="rId20" w:history="1">
+      <w:hyperlink r:id="rId19" w:history="1">
         <w:r>
           <w:rPr>
             <w:rStyle w:val="Hyperlink"/>
+            <w:color w:val="000000" w:themeColor="text1"/>
             <w:sz w:val="21"/>
             <w:szCs w:val="21"/>
           </w:rPr>
@@ -2442,14 +2531,16 @@
         </w:numPr>
         <w:spacing w:line="276" w:lineRule="auto"/>
         <w:rPr>
+          <w:color w:val="000000" w:themeColor="text1"/>
           <w:sz w:val="21"/>
           <w:szCs w:val="21"/>
         </w:rPr>
       </w:pPr>
-      <w:hyperlink r:id="rId21" w:history="1">
+      <w:hyperlink r:id="rId20" w:history="1">
         <w:r>
           <w:rPr>
             <w:rStyle w:val="Hyperlink"/>
+            <w:color w:val="000000" w:themeColor="text1"/>
             <w:sz w:val="21"/>
             <w:szCs w:val="21"/>
           </w:rPr>
@@ -2466,14 +2557,16 @@
         </w:numPr>
         <w:spacing w:line="276" w:lineRule="auto"/>
         <w:rPr>
+          <w:color w:val="000000" w:themeColor="text1"/>
           <w:sz w:val="21"/>
           <w:szCs w:val="21"/>
         </w:rPr>
       </w:pPr>
-      <w:hyperlink r:id="rId22" w:history="1">
+      <w:hyperlink r:id="rId21" w:history="1">
         <w:r>
           <w:rPr>
             <w:rStyle w:val="Hyperlink"/>
+            <w:color w:val="000000" w:themeColor="text1"/>
             <w:sz w:val="21"/>
             <w:szCs w:val="21"/>
           </w:rPr>
@@ -2491,12 +2584,14 @@
         <w:spacing w:line="276" w:lineRule="auto"/>
         <w:rPr>
           <w:rStyle w:val="Hyperlink"/>
-        </w:rPr>
-      </w:pPr>
-      <w:hyperlink r:id="rId23" w:history="1">
+          <w:color w:val="000000" w:themeColor="text1"/>
+        </w:rPr>
+      </w:pPr>
+      <w:hyperlink r:id="rId22" w:history="1">
         <w:r>
           <w:rPr>
             <w:rStyle w:val="Hyperlink"/>
+            <w:color w:val="000000" w:themeColor="text1"/>
           </w:rPr>
           <w:t>https://www.elastic.co/guide/en/elasticsearch/reference/current/analysis.html</w:t>
         </w:r>
@@ -2512,12 +2607,14 @@
         <w:spacing w:line="276" w:lineRule="auto"/>
         <w:rPr>
           <w:rStyle w:val="Hyperlink"/>
-        </w:rPr>
-      </w:pPr>
-      <w:hyperlink r:id="rId24" w:history="1">
+          <w:color w:val="000000" w:themeColor="text1"/>
+        </w:rPr>
+      </w:pPr>
+      <w:hyperlink r:id="rId23" w:history="1">
         <w:r>
           <w:rPr>
             <w:rStyle w:val="Hyperlink"/>
+            <w:color w:val="000000" w:themeColor="text1"/>
           </w:rPr>
           <w:t>https://www.elastic.co/guide/en/elasticsearch/reference/current/documents-indices.html</w:t>
         </w:r>
@@ -5032,7 +5129,7 @@
 </file>
 
 <file path=customXml/itemProps1.xml><?xml version="1.0" encoding="utf-8"?>
-<ds:datastoreItem xmlns:ds="http://schemas.openxmlformats.org/officeDocument/2006/customXml" ds:itemID="{77E46D63-A46B-EE4D-848F-E070A2161CE1}">
+<ds:datastoreItem xmlns:ds="http://schemas.openxmlformats.org/officeDocument/2006/customXml" ds:itemID="{B49002C2-19EF-1E4D-BE84-6DF61D1D504E}">
   <ds:schemaRefs>
     <ds:schemaRef ds:uri="http://schemas.openxmlformats.org/officeDocument/2006/bibliography"/>
   </ds:schemaRefs>

</xml_diff>

<commit_message>
Section Project with description, setup, python files
</commit_message>
<xml_diff>
--- a/Elasticsearch_Paper.docx
+++ b/Elasticsearch_Paper.docx
@@ -31,7 +31,7 @@
           <w:noProof/>
         </w:rPr>
         <w:drawing>
-          <wp:inline distT="0" distB="0" distL="0" distR="0" wp14:anchorId="5A103B59" wp14:editId="11400F90">
+          <wp:inline distT="0" distB="0" distL="0" distR="0" wp14:anchorId="5A103B59" wp14:editId="764598D4">
             <wp:extent cx="4812162" cy="1307804"/>
             <wp:effectExtent l="0" t="0" r="1270" b="635"/>
             <wp:docPr id="1881383930" name="Picture 1" descr="A red and black logo&#10;&#10;AI-generated content may be incorrect."/>
@@ -46,7 +46,7 @@
                     <pic:cNvPicPr/>
                   </pic:nvPicPr>
                   <pic:blipFill>
-                    <a:blip r:embed="rId6" cstate="print">
+                    <a:blip r:embed="rId8" cstate="print">
                       <a:extLst>
                         <a:ext uri="{28A0092B-C50C-407E-A947-70E740481C1C}">
                           <a14:useLocalDpi xmlns:a14="http://schemas.microsoft.com/office/drawing/2010/main" val="0"/>
@@ -430,7 +430,7 @@
       <w:r>
         <w:t xml:space="preserve">To demenstrate Elasticsearch and its core functionality in practice, I decided to develop the µ-Project using the Formula 1 World Championship dataset from </w:t>
       </w:r>
-      <w:hyperlink r:id="rId7" w:history="1">
+      <w:hyperlink r:id="rId9" w:history="1">
         <w:r>
           <w:rPr>
             <w:rStyle w:val="Hyperlink"/>
@@ -669,8 +669,16 @@
             <w:pPr>
               <w:spacing w:line="276" w:lineRule="auto"/>
               <w:jc w:val="both"/>
+              <w:rPr>
+                <w:b/>
+                <w:bCs/>
+              </w:rPr>
             </w:pPr>
             <w:r>
+              <w:rPr>
+                <w:b/>
+                <w:bCs/>
+              </w:rPr>
               <w:t>Data model</w:t>
             </w:r>
           </w:p>
@@ -716,8 +724,16 @@
             <w:pPr>
               <w:spacing w:line="276" w:lineRule="auto"/>
               <w:jc w:val="both"/>
+              <w:rPr>
+                <w:b/>
+                <w:bCs/>
+              </w:rPr>
             </w:pPr>
             <w:r>
+              <w:rPr>
+                <w:b/>
+                <w:bCs/>
+              </w:rPr>
               <w:t>Schema</w:t>
             </w:r>
           </w:p>
@@ -763,8 +779,16 @@
             <w:pPr>
               <w:spacing w:line="276" w:lineRule="auto"/>
               <w:jc w:val="both"/>
+              <w:rPr>
+                <w:b/>
+                <w:bCs/>
+              </w:rPr>
             </w:pPr>
             <w:r>
+              <w:rPr>
+                <w:b/>
+                <w:bCs/>
+              </w:rPr>
               <w:t>Query language</w:t>
             </w:r>
           </w:p>
@@ -810,8 +834,16 @@
             <w:pPr>
               <w:spacing w:line="276" w:lineRule="auto"/>
               <w:jc w:val="both"/>
+              <w:rPr>
+                <w:b/>
+                <w:bCs/>
+              </w:rPr>
             </w:pPr>
             <w:r>
+              <w:rPr>
+                <w:b/>
+                <w:bCs/>
+              </w:rPr>
               <w:t>Joins</w:t>
             </w:r>
           </w:p>
@@ -857,8 +889,16 @@
             <w:pPr>
               <w:spacing w:line="276" w:lineRule="auto"/>
               <w:jc w:val="both"/>
+              <w:rPr>
+                <w:b/>
+                <w:bCs/>
+              </w:rPr>
             </w:pPr>
             <w:r>
+              <w:rPr>
+                <w:b/>
+                <w:bCs/>
+              </w:rPr>
               <w:t>Scalability</w:t>
             </w:r>
           </w:p>
@@ -904,8 +944,16 @@
             <w:pPr>
               <w:spacing w:line="276" w:lineRule="auto"/>
               <w:jc w:val="both"/>
+              <w:rPr>
+                <w:b/>
+                <w:bCs/>
+              </w:rPr>
             </w:pPr>
             <w:r>
+              <w:rPr>
+                <w:b/>
+                <w:bCs/>
+              </w:rPr>
               <w:t>Consistency</w:t>
             </w:r>
           </w:p>
@@ -951,8 +999,16 @@
             <w:pPr>
               <w:spacing w:line="276" w:lineRule="auto"/>
               <w:jc w:val="both"/>
+              <w:rPr>
+                <w:b/>
+                <w:bCs/>
+              </w:rPr>
             </w:pPr>
             <w:r>
+              <w:rPr>
+                <w:b/>
+                <w:bCs/>
+              </w:rPr>
               <w:t>Best suited for</w:t>
             </w:r>
           </w:p>
@@ -1190,7 +1246,7 @@
                     <pic:cNvPicPr/>
                   </pic:nvPicPr>
                   <pic:blipFill>
-                    <a:blip r:embed="rId8"/>
+                    <a:blip r:embed="rId10"/>
                     <a:stretch>
                       <a:fillRect/>
                     </a:stretch>
@@ -1219,14 +1275,27 @@
       <w:r>
         <w:t xml:space="preserve">Figure </w:t>
       </w:r>
-      <w:fldSimple w:instr=" SEQ Figure \* ARABIC ">
-        <w:r>
-          <w:rPr>
-            <w:noProof/>
-          </w:rPr>
-          <w:t>1</w:t>
-        </w:r>
-      </w:fldSimple>
+      <w:r>
+        <w:fldChar w:fldCharType="begin"/>
+      </w:r>
+      <w:r>
+        <w:instrText xml:space="preserve"> SEQ Figure \* ARABIC </w:instrText>
+      </w:r>
+      <w:r>
+        <w:fldChar w:fldCharType="separate"/>
+      </w:r>
+      <w:r>
+        <w:rPr>
+          <w:noProof/>
+        </w:rPr>
+        <w:t>1</w:t>
+      </w:r>
+      <w:r>
+        <w:rPr>
+          <w:noProof/>
+        </w:rPr>
+        <w:fldChar w:fldCharType="end"/>
+      </w:r>
       <w:r>
         <w:t xml:space="preserve">: Based on description of </w:t>
       </w:r>
@@ -1525,7 +1594,7 @@
                     <pic:cNvPicPr/>
                   </pic:nvPicPr>
                   <pic:blipFill>
-                    <a:blip r:embed="rId9"/>
+                    <a:blip r:embed="rId11"/>
                     <a:stretch>
                       <a:fillRect/>
                     </a:stretch>
@@ -1702,7 +1771,7 @@
                     </pic:cNvPicPr>
                   </pic:nvPicPr>
                   <pic:blipFill>
-                    <a:blip r:embed="rId10">
+                    <a:blip r:embed="rId12">
                       <a:extLst>
                         <a:ext uri="{28A0092B-C50C-407E-A947-70E740481C1C}">
                           <a14:useLocalDpi xmlns:a14="http://schemas.microsoft.com/office/drawing/2010/main" val="0"/>
@@ -1893,7 +1962,7 @@
                           </pic:cNvPicPr>
                         </pic:nvPicPr>
                         <pic:blipFill>
-                          <a:blip r:embed="rId11">
+                          <a:blip r:embed="rId13">
                             <a:extLst>
                               <a:ext uri="{28A0092B-C50C-407E-A947-70E740481C1C}">
                                 <a14:useLocalDpi xmlns:a14="http://schemas.microsoft.com/office/drawing/2010/main" val="0"/>
@@ -1944,19 +2013,13 @@
                   <o:lock v:ext="edit" aspectratio="t"/>
                 </v:shapetype>
                 <v:shape id="Picture 1" o:spid="_x0000_s1028" type="#_x0000_t75" style="position:absolute;left:940;top:683;width:26403;height:5220;visibility:visible;mso-wrap-style:square" o:gfxdata="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">
-                  <v:imagedata r:id="rId12" o:title=""/>
+                  <v:imagedata r:id="rId14" o:title=""/>
                 </v:shape>
               </v:group>
             </w:pict>
           </mc:Fallback>
         </mc:AlternateContent>
       </w:r>
-    </w:p>
-    <w:p>
-      <w:pPr>
-        <w:spacing w:line="276" w:lineRule="auto"/>
-        <w:jc w:val="both"/>
-      </w:pPr>
     </w:p>
     <w:p>
       <w:pPr>
@@ -2117,7 +2180,7 @@
                           </pic:cNvPicPr>
                         </pic:nvPicPr>
                         <pic:blipFill>
-                          <a:blip r:embed="rId13"/>
+                          <a:blip r:embed="rId15"/>
                           <a:stretch>
                             <a:fillRect/>
                           </a:stretch>
@@ -2143,7 +2206,7 @@
               <v:group w14:anchorId="71F6A120" id="Group 24" o:spid="_x0000_s1026" style="position:absolute;margin-left:-.05pt;margin-top:2.25pt;width:208.35pt;height:119.9pt;z-index:251665408" coordsize="26458,15226" o:gfxdata="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">
                 <v:rect id="Rectangle 1592125735" o:spid="_x0000_s1027" style="position:absolute;width:26458;height:15226;visibility:visible;mso-wrap-style:square;v-text-anchor:middle" o:gfxdata="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" fillcolor="#00bfb3" stroked="f" strokeweight="1pt"/>
                 <v:shape id="Picture 1067572422" o:spid="_x0000_s1028" type="#_x0000_t75" style="position:absolute;left:463;top:1053;width:25532;height:13120;visibility:visible;mso-wrap-style:square" o:gfxdata="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">
-                  <v:imagedata r:id="rId14" o:title=""/>
+                  <v:imagedata r:id="rId16" o:title=""/>
                 </v:shape>
               </v:group>
             </w:pict>
@@ -2239,12 +2302,6 @@
       <w:r>
         <w:t>Elasticsearch does not look for an exact match in the inverted index. Instead it calculates the edit distance between the search term and the stored tokens, where edit distance refers to the number of single-character insertions, deletions or substitutions needed to transform one string into another. Since "Hamilten" and "hamilton" differ by only one character, they fall within the allowed fuzziness threshold and Elasticsearch returns the correct results despite the typo.</w:t>
       </w:r>
-    </w:p>
-    <w:p>
-      <w:pPr>
-        <w:spacing w:line="276" w:lineRule="auto"/>
-        <w:jc w:val="both"/>
-      </w:pPr>
     </w:p>
     <w:p>
       <w:pPr>
@@ -2305,25 +2362,8 @@
         <w:jc w:val="both"/>
       </w:pPr>
       <w:r>
-        <w:t xml:space="preserve">The combination of sharding and replication gives Elasticsearch three important properties. First, it can store datasets that exeed the capacity of any single maschine by distributing shards across nodes. Second, it can handle high query volumns by serving read requsts from both </w:t>
-      </w:r>
-      <w:r>
-        <w:lastRenderedPageBreak/>
-        <w:t>primary shards and replicas in parallel. Third, it remains available even when individual nodes fail because replicas on surviving nodes can take over immediately without any data loss.</w:t>
-      </w:r>
-    </w:p>
-    <w:p>
-      <w:pPr>
-        <w:spacing w:after="160" w:line="278" w:lineRule="auto"/>
-      </w:pPr>
-      <w:r>
-        <w:br w:type="page"/>
-      </w:r>
-    </w:p>
-    <w:p>
-      <w:pPr>
-        <w:spacing w:line="276" w:lineRule="auto"/>
-      </w:pPr>
+        <w:t>The combination of sharding and replication gives Elasticsearch three important properties. First, it can store datasets that exeed the capacity of any single maschine by distributing shards across nodes. Second, it can handle high query volumns by serving read requsts from both primary shards and replicas in parallel. Third, it remains available even when individual nodes fail because replicas on surviving nodes can take over immediately without any data loss.</w:t>
+      </w:r>
     </w:p>
     <w:p>
       <w:pPr>
@@ -2333,6 +2373,2173 @@
           <w:numId w:val="4"/>
         </w:numPr>
       </w:pPr>
+      <w:r>
+        <w:lastRenderedPageBreak/>
+        <w:t>Key features</w:t>
+      </w:r>
+    </w:p>
+    <w:p>
+      <w:pPr>
+        <w:pStyle w:val="Heading1"/>
+        <w:numPr>
+          <w:ilvl w:val="1"/>
+          <w:numId w:val="4"/>
+        </w:numPr>
+        <w:ind w:left="567" w:hanging="573"/>
+        <w:rPr>
+          <w:sz w:val="32"/>
+          <w:szCs w:val="32"/>
+        </w:rPr>
+      </w:pPr>
+      <w:r>
+        <w:rPr>
+          <w:sz w:val="32"/>
+          <w:szCs w:val="32"/>
+        </w:rPr>
+        <w:t>Full-Text Search and Relevance Scoring</w:t>
+      </w:r>
+    </w:p>
+    <w:p>
+      <w:pPr>
+        <w:spacing w:line="276" w:lineRule="auto"/>
+        <w:jc w:val="both"/>
+      </w:pPr>
+      <w:r>
+        <w:drawing>
+          <wp:anchor distT="0" distB="0" distL="114300" distR="114300" simplePos="0" relativeHeight="251667456" behindDoc="1" locked="0" layoutInCell="1" allowOverlap="1" wp14:anchorId="5D7807C8" wp14:editId="444424B8">
+            <wp:simplePos x="0" y="0"/>
+            <wp:positionH relativeFrom="column">
+              <wp:posOffset>2960370</wp:posOffset>
+            </wp:positionH>
+            <wp:positionV relativeFrom="paragraph">
+              <wp:posOffset>103819</wp:posOffset>
+            </wp:positionV>
+            <wp:extent cx="2598420" cy="2987040"/>
+            <wp:effectExtent l="0" t="0" r="5080" b="0"/>
+            <wp:wrapTight wrapText="bothSides">
+              <wp:wrapPolygon edited="0">
+                <wp:start x="0" y="0"/>
+                <wp:lineTo x="0" y="21490"/>
+                <wp:lineTo x="21537" y="21490"/>
+                <wp:lineTo x="21537" y="0"/>
+                <wp:lineTo x="0" y="0"/>
+              </wp:wrapPolygon>
+            </wp:wrapTight>
+            <wp:docPr id="1800194896" name="Picture 1"/>
+            <wp:cNvGraphicFramePr>
+              <a:graphicFrameLocks xmlns:a="http://schemas.openxmlformats.org/drawingml/2006/main" noChangeAspect="1"/>
+            </wp:cNvGraphicFramePr>
+            <a:graphic xmlns:a="http://schemas.openxmlformats.org/drawingml/2006/main">
+              <a:graphicData uri="http://schemas.openxmlformats.org/drawingml/2006/picture">
+                <pic:pic xmlns:pic="http://schemas.openxmlformats.org/drawingml/2006/picture">
+                  <pic:nvPicPr>
+                    <pic:cNvPr id="1800194896" name=""/>
+                    <pic:cNvPicPr/>
+                  </pic:nvPicPr>
+                  <pic:blipFill rotWithShape="1">
+                    <a:blip r:embed="rId17" cstate="print">
+                      <a:extLst>
+                        <a:ext uri="{28A0092B-C50C-407E-A947-70E740481C1C}">
+                          <a14:useLocalDpi xmlns:a14="http://schemas.microsoft.com/office/drawing/2010/main" val="0"/>
+                        </a:ext>
+                      </a:extLst>
+                    </a:blip>
+                    <a:srcRect t="8334"/>
+                    <a:stretch>
+                      <a:fillRect/>
+                    </a:stretch>
+                  </pic:blipFill>
+                  <pic:spPr bwMode="auto">
+                    <a:xfrm>
+                      <a:off x="0" y="0"/>
+                      <a:ext cx="2598420" cy="2987040"/>
+                    </a:xfrm>
+                    <a:prstGeom prst="rect">
+                      <a:avLst/>
+                    </a:prstGeom>
+                    <a:ln>
+                      <a:noFill/>
+                    </a:ln>
+                    <a:extLst>
+                      <a:ext uri="{53640926-AAD7-44D8-BBD7-CCE9431645EC}">
+                        <a14:shadowObscured xmlns:a14="http://schemas.microsoft.com/office/drawing/2010/main"/>
+                      </a:ext>
+                    </a:extLst>
+                  </pic:spPr>
+                </pic:pic>
+              </a:graphicData>
+            </a:graphic>
+            <wp14:sizeRelH relativeFrom="page">
+              <wp14:pctWidth>0</wp14:pctWidth>
+            </wp14:sizeRelH>
+            <wp14:sizeRelV relativeFrom="page">
+              <wp14:pctHeight>0</wp14:pctHeight>
+            </wp14:sizeRelV>
+          </wp:anchor>
+        </w:drawing>
+      </w:r>
+      <w:r>
+        <w:t xml:space="preserve">Full-Text Search is the most prominent feature of Elasticsearch and the primary reason why organizations adtop to it. Unlike a relational database that performs exact string matching, Elasticsearch analyses both the indexed document and the the search query throught the analyzer pipeline descriped in </w:t>
+      </w:r>
+      <w:hyperlink w:anchor="_Inverted_Index" w:history="1">
+        <w:r>
+          <w:rPr>
+            <w:rStyle w:val="Hyperlink"/>
+          </w:rPr>
+          <w:t>Sectio</w:t>
+        </w:r>
+        <w:r>
+          <w:rPr>
+            <w:rStyle w:val="Hyperlink"/>
+          </w:rPr>
+          <w:t>n</w:t>
+        </w:r>
+        <w:r>
+          <w:rPr>
+            <w:rStyle w:val="Hyperlink"/>
+          </w:rPr>
+          <w:t xml:space="preserve"> 4.2</w:t>
+        </w:r>
+      </w:hyperlink>
+      <w:r>
+        <w:t>.</w:t>
+      </w:r>
+    </w:p>
+    <w:p>
+      <w:pPr>
+        <w:spacing w:line="276" w:lineRule="auto"/>
+        <w:jc w:val="both"/>
+      </w:pPr>
+    </w:p>
+    <w:p>
+      <w:pPr>
+        <w:spacing w:line="276" w:lineRule="auto"/>
+        <w:jc w:val="both"/>
+      </w:pPr>
+      <w:r>
+        <w:rPr>
+          <w:noProof/>
+        </w:rPr>
+        <mc:AlternateContent>
+          <mc:Choice Requires="wps">
+            <w:drawing>
+              <wp:anchor distT="0" distB="0" distL="114300" distR="114300" simplePos="0" relativeHeight="251669504" behindDoc="1" locked="0" layoutInCell="1" allowOverlap="1" wp14:anchorId="2036DBF1" wp14:editId="3D82214C">
+                <wp:simplePos x="0" y="0"/>
+                <wp:positionH relativeFrom="column">
+                  <wp:posOffset>3014345</wp:posOffset>
+                </wp:positionH>
+                <wp:positionV relativeFrom="paragraph">
+                  <wp:posOffset>1569720</wp:posOffset>
+                </wp:positionV>
+                <wp:extent cx="2661285" cy="635"/>
+                <wp:effectExtent l="0" t="0" r="5715" b="0"/>
+                <wp:wrapTight wrapText="bothSides">
+                  <wp:wrapPolygon edited="0">
+                    <wp:start x="0" y="0"/>
+                    <wp:lineTo x="0" y="21048"/>
+                    <wp:lineTo x="21543" y="21048"/>
+                    <wp:lineTo x="21543" y="0"/>
+                    <wp:lineTo x="0" y="0"/>
+                  </wp:wrapPolygon>
+                </wp:wrapTight>
+                <wp:docPr id="1270803436" name="Text Box 1"/>
+                <wp:cNvGraphicFramePr/>
+                <a:graphic xmlns:a="http://schemas.openxmlformats.org/drawingml/2006/main">
+                  <a:graphicData uri="http://schemas.microsoft.com/office/word/2010/wordprocessingShape">
+                    <wps:wsp>
+                      <wps:cNvSpPr txBox="1"/>
+                      <wps:spPr>
+                        <a:xfrm>
+                          <a:off x="0" y="0"/>
+                          <a:ext cx="2661285" cy="635"/>
+                        </a:xfrm>
+                        <a:prstGeom prst="rect">
+                          <a:avLst/>
+                        </a:prstGeom>
+                        <a:solidFill>
+                          <a:prstClr val="white"/>
+                        </a:solidFill>
+                        <a:ln>
+                          <a:noFill/>
+                        </a:ln>
+                      </wps:spPr>
+                      <wps:txbx>
+                        <w:txbxContent>
+                          <w:p>
+                            <w:pPr>
+                              <w:pStyle w:val="Caption"/>
+                            </w:pPr>
+                            <w:r>
+                              <w:t xml:space="preserve">Figure </w:t>
+                            </w:r>
+                            <w:r>
+                              <w:fldChar w:fldCharType="begin"/>
+                            </w:r>
+                            <w:r>
+                              <w:instrText xml:space="preserve"> SEQ Figure \* ARABIC </w:instrText>
+                            </w:r>
+                            <w:r>
+                              <w:fldChar w:fldCharType="separate"/>
+                            </w:r>
+                            <w:r>
+                              <w:rPr>
+                                <w:noProof/>
+                              </w:rPr>
+                              <w:t>2</w:t>
+                            </w:r>
+                            <w:r>
+                              <w:fldChar w:fldCharType="end"/>
+                            </w:r>
+                            <w:r>
+                              <w:t>:</w:t>
+                            </w:r>
+                            <w:r>
+                              <w:t>https://www.elastic.co/docs/solutions/images/elasticsearch-reference-full-text-search-overview.svg</w:t>
+                            </w:r>
+                          </w:p>
+                        </w:txbxContent>
+                      </wps:txbx>
+                      <wps:bodyPr rot="0" spcFirstLastPara="0" vertOverflow="overflow" horzOverflow="overflow" vert="horz" wrap="square" lIns="0" tIns="0" rIns="0" bIns="0" numCol="1" spcCol="0" rtlCol="0" fromWordArt="0" anchor="t" anchorCtr="0" forceAA="0" compatLnSpc="1">
+                        <a:prstTxWarp prst="textNoShape">
+                          <a:avLst/>
+                        </a:prstTxWarp>
+                        <a:spAutoFit/>
+                      </wps:bodyPr>
+                    </wps:wsp>
+                  </a:graphicData>
+                </a:graphic>
+                <wp14:sizeRelH relativeFrom="margin">
+                  <wp14:pctWidth>0</wp14:pctWidth>
+                </wp14:sizeRelH>
+              </wp:anchor>
+            </w:drawing>
+          </mc:Choice>
+          <mc:Fallback>
+            <w:pict>
+              <v:shapetype w14:anchorId="2036DBF1" id="_x0000_t202" coordsize="21600,21600" o:spt="202" path="m,l,21600r21600,l21600,xe">
+                <v:stroke joinstyle="miter"/>
+                <v:path gradientshapeok="t" o:connecttype="rect"/>
+              </v:shapetype>
+              <v:shape id="Text Box 1" o:spid="_x0000_s1026" type="#_x0000_t202" style="position:absolute;left:0;text-align:left;margin-left:237.35pt;margin-top:123.6pt;width:209.55pt;height:.05pt;z-index:-251646976;visibility:visible;mso-wrap-style:square;mso-width-percent:0;mso-wrap-distance-left:9pt;mso-wrap-distance-top:0;mso-wrap-distance-right:9pt;mso-wrap-distance-bottom:0;mso-position-horizontal:absolute;mso-position-horizontal-relative:text;mso-position-vertical:absolute;mso-position-vertical-relative:text;mso-width-percent:0;mso-width-relative:margin;v-text-anchor:top" o:gfxdata="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" stroked="f">
+                <v:textbox style="mso-fit-shape-to-text:t" inset="0,0,0,0">
+                  <w:txbxContent>
+                    <w:p>
+                      <w:pPr>
+                        <w:pStyle w:val="Caption"/>
+                      </w:pPr>
+                      <w:r>
+                        <w:t xml:space="preserve">Figure </w:t>
+                      </w:r>
+                      <w:r>
+                        <w:fldChar w:fldCharType="begin"/>
+                      </w:r>
+                      <w:r>
+                        <w:instrText xml:space="preserve"> SEQ Figure \* ARABIC </w:instrText>
+                      </w:r>
+                      <w:r>
+                        <w:fldChar w:fldCharType="separate"/>
+                      </w:r>
+                      <w:r>
+                        <w:rPr>
+                          <w:noProof/>
+                        </w:rPr>
+                        <w:t>2</w:t>
+                      </w:r>
+                      <w:r>
+                        <w:fldChar w:fldCharType="end"/>
+                      </w:r>
+                      <w:r>
+                        <w:t>:</w:t>
+                      </w:r>
+                      <w:r>
+                        <w:t>https://www.elastic.co/docs/solutions/images/elasticsearch-reference-full-text-search-overview.svg</w:t>
+                      </w:r>
+                    </w:p>
+                  </w:txbxContent>
+                </v:textbox>
+                <w10:wrap type="tight"/>
+              </v:shape>
+            </w:pict>
+          </mc:Fallback>
+        </mc:AlternateContent>
+      </w:r>
+      <w:r>
+        <w:t>Beyond simply finding matching documents, Elasticsearch assigns each result a relevance score, referred to inter</w:t>
+      </w:r>
+      <w:r>
+        <w:t>nally as _score. This score reflects how closely a documents matches the search query based on factors such as how often the search term appears in the document and how rare the term is across the entire index. Results are returned sorted by this score by default, so the most relevant socuments appear first. This behavior is fundamentally different from a relational database, which has no concept of relevance and returns all matching rows equal weight</w:t>
+      </w:r>
+    </w:p>
+    <w:p>
+      <w:pPr>
+        <w:pStyle w:val="Heading1"/>
+        <w:numPr>
+          <w:ilvl w:val="1"/>
+          <w:numId w:val="4"/>
+        </w:numPr>
+        <w:ind w:left="567" w:hanging="573"/>
+        <w:rPr>
+          <w:sz w:val="32"/>
+          <w:szCs w:val="32"/>
+        </w:rPr>
+      </w:pPr>
+      <w:r>
+        <w:rPr>
+          <w:sz w:val="32"/>
+          <w:szCs w:val="32"/>
+        </w:rPr>
+        <w:t>Distributed and Scalable</w:t>
+      </w:r>
+    </w:p>
+    <w:p>
+      <w:pPr>
+        <w:spacing w:line="276" w:lineRule="auto"/>
+        <w:jc w:val="both"/>
+      </w:pPr>
+      <w:r>
+        <w:t xml:space="preserve">Elasticsearch is designed from the ground up to scale horizontally. When the data volume or query load grows beyond the capacity of a single node, additional nodes can be added to the cluster and Elasticsearch will automatically redistribute shards across them. This means that scaling an Elasticsearch deployment does not require replacing hardware with more powerful machines, it requires adding more maschines, which is significantly </w:t>
+      </w:r>
+      <w:r>
+        <w:t>more cost effective at large scale.</w:t>
+      </w:r>
+      <w:r>
+        <w:rPr>
+          <w:noProof/>
+          <w14:ligatures w14:val="standardContextual"/>
+        </w:rPr>
+        <w:t xml:space="preserve"> </w:t>
+      </w:r>
+    </w:p>
+    <w:p>
+      <w:pPr>
+        <w:spacing w:line="276" w:lineRule="auto"/>
+        <w:jc w:val="both"/>
+      </w:pPr>
+    </w:p>
+    <w:p>
+      <w:pPr>
+        <w:pStyle w:val="Heading1"/>
+        <w:numPr>
+          <w:ilvl w:val="1"/>
+          <w:numId w:val="4"/>
+        </w:numPr>
+        <w:ind w:left="567" w:hanging="573"/>
+        <w:rPr>
+          <w:sz w:val="32"/>
+          <w:szCs w:val="32"/>
+        </w:rPr>
+      </w:pPr>
+      <w:r>
+        <w:rPr>
+          <w:sz w:val="32"/>
+          <w:szCs w:val="32"/>
+        </w:rPr>
+        <w:t>Near Real-Time Data Analysis</w:t>
+      </w:r>
+    </w:p>
+    <w:p>
+      <w:pPr>
+        <w:spacing w:line="276" w:lineRule="auto"/>
+        <w:jc w:val="both"/>
+      </w:pPr>
+      <w:r>
+        <w:t xml:space="preserve">Elasticsearch supports near real-time data indexing, meaning that documents become searchable approximately one second after they are written </w:t>
+      </w:r>
+      <w:r>
+        <w:t>This one-second delay results from the internal refresh cycle, during which buffered documents are committed to the index and made available for search. For the vast majority of applications this delay is imperceptible, and it allows Elasticsearch to handle continuous data streams such as server logs or sensor data  and make them immediately queryable without any additional processing steps.</w:t>
+      </w:r>
+    </w:p>
+    <w:p>
+      <w:pPr>
+        <w:spacing w:line="276" w:lineRule="auto"/>
+        <w:jc w:val="both"/>
+      </w:pPr>
+    </w:p>
+    <w:p>
+      <w:pPr>
+        <w:pStyle w:val="Heading1"/>
+        <w:numPr>
+          <w:ilvl w:val="1"/>
+          <w:numId w:val="4"/>
+        </w:numPr>
+        <w:ind w:left="567" w:hanging="573"/>
+        <w:rPr>
+          <w:sz w:val="32"/>
+          <w:szCs w:val="32"/>
+        </w:rPr>
+      </w:pPr>
+      <w:r>
+        <w:rPr>
+          <w:sz w:val="32"/>
+          <w:szCs w:val="32"/>
+        </w:rPr>
+        <w:lastRenderedPageBreak/>
+        <w:t>RESTful API</w:t>
+      </w:r>
+    </w:p>
+    <w:p>
+      <w:pPr>
+        <w:spacing w:line="276" w:lineRule="auto"/>
+        <w:jc w:val="both"/>
+      </w:pPr>
+      <w:r>
+        <w:t xml:space="preserve">All interactions with Elasticsearch are carried out through a RESTful HTTP API. Every operation, indexing a document, executing a search, creating an indexm or deleting data, is expressed as an HTTP request with a JSON body. This design makes Elasticsearch accessible from any programming language or tool that can send HTTP requests, without requiring a dedicated driver or </w:t>
+      </w:r>
+      <w:r>
+        <w:t>client library.</w:t>
+      </w:r>
+      <w:r>
+        <w:t xml:space="preserve"> </w:t>
+      </w:r>
+    </w:p>
+    <w:p>
+      <w:pPr>
+        <w:spacing w:line="276" w:lineRule="auto"/>
+        <w:jc w:val="both"/>
+      </w:pPr>
+      <w:r>
+        <w:t>Every operation is expressed as a standard HTTP request directed at a specific endpoint, and every response is returned as a JSON object.</w:t>
+      </w:r>
+      <w:r>
+        <w:t>The four HTTP methods map to the four fundamental operations</w:t>
+      </w:r>
+    </w:p>
+    <w:p>
+      <w:pPr>
+        <w:pStyle w:val="ListParagraph"/>
+        <w:numPr>
+          <w:ilvl w:val="0"/>
+          <w:numId w:val="11"/>
+        </w:numPr>
+        <w:spacing w:line="276" w:lineRule="auto"/>
+        <w:jc w:val="both"/>
+      </w:pPr>
+      <w:r>
+        <w:t xml:space="preserve">GET </w:t>
+      </w:r>
+      <w:r>
+        <w:sym w:font="Wingdings" w:char="F0E0"/>
+      </w:r>
+      <w:r>
+        <w:t xml:space="preserve"> retrieve or search documents</w:t>
+      </w:r>
+    </w:p>
+    <w:p>
+      <w:pPr>
+        <w:pStyle w:val="ListParagraph"/>
+        <w:numPr>
+          <w:ilvl w:val="0"/>
+          <w:numId w:val="11"/>
+        </w:numPr>
+        <w:spacing w:line="276" w:lineRule="auto"/>
+        <w:jc w:val="both"/>
+      </w:pPr>
+      <w:r>
+        <w:t xml:space="preserve">POST </w:t>
+      </w:r>
+      <w:r>
+        <w:sym w:font="Wingdings" w:char="F0E0"/>
+      </w:r>
+      <w:r>
+        <w:t xml:space="preserve"> index a new document or execute a search with a request body</w:t>
+      </w:r>
+    </w:p>
+    <w:p>
+      <w:pPr>
+        <w:pStyle w:val="ListParagraph"/>
+        <w:numPr>
+          <w:ilvl w:val="0"/>
+          <w:numId w:val="11"/>
+        </w:numPr>
+        <w:spacing w:line="276" w:lineRule="auto"/>
+        <w:jc w:val="both"/>
+      </w:pPr>
+      <w:r>
+        <w:t xml:space="preserve">PUT </w:t>
+      </w:r>
+      <w:r>
+        <w:sym w:font="Wingdings" w:char="F0E0"/>
+      </w:r>
+      <w:r>
+        <w:t xml:space="preserve"> create or update an index or document</w:t>
+      </w:r>
+    </w:p>
+    <w:p>
+      <w:pPr>
+        <w:pStyle w:val="ListParagraph"/>
+        <w:numPr>
+          <w:ilvl w:val="0"/>
+          <w:numId w:val="11"/>
+        </w:numPr>
+        <w:spacing w:line="276" w:lineRule="auto"/>
+        <w:jc w:val="both"/>
+      </w:pPr>
+      <w:r>
+        <w:t xml:space="preserve">DELETE </w:t>
+      </w:r>
+      <w:r>
+        <w:sym w:font="Wingdings" w:char="F0E0"/>
+      </w:r>
+      <w:r>
+        <w:t xml:space="preserve"> remove a document or an entire index</w:t>
+      </w:r>
+    </w:p>
+    <w:p>
+      <w:pPr>
+        <w:spacing w:line="276" w:lineRule="auto"/>
+        <w:jc w:val="both"/>
+      </w:pPr>
+      <w:r>
+        <w:t>For example, searching all documents of the f1 index looks like this</w:t>
+      </w:r>
+      <w:r>
+        <w:t>:</w:t>
+      </w:r>
+    </w:p>
+    <w:p>
+      <w:pPr>
+        <w:spacing w:line="276" w:lineRule="auto"/>
+        <w:jc w:val="both"/>
+      </w:pPr>
+      <w:r>
+        <w:drawing>
+          <wp:inline distT="0" distB="0" distL="0" distR="0" wp14:anchorId="6472AE41" wp14:editId="0F6E763A">
+            <wp:extent cx="1887166" cy="1406473"/>
+            <wp:effectExtent l="0" t="0" r="5715" b="3810"/>
+            <wp:docPr id="6" name="Picture 5">
+              <a:extLst xmlns:a="http://schemas.openxmlformats.org/drawingml/2006/main">
+                <a:ext uri="{FF2B5EF4-FFF2-40B4-BE49-F238E27FC236}">
+                  <a16:creationId xmlns:a16="http://schemas.microsoft.com/office/drawing/2014/main" id="{7AE6EA4D-8EFC-6B0A-7623-0882F103D034}"/>
+                </a:ext>
+              </a:extLst>
+            </wp:docPr>
+            <wp:cNvGraphicFramePr>
+              <a:graphicFrameLocks xmlns:a="http://schemas.openxmlformats.org/drawingml/2006/main" noChangeAspect="1"/>
+            </wp:cNvGraphicFramePr>
+            <a:graphic xmlns:a="http://schemas.openxmlformats.org/drawingml/2006/main">
+              <a:graphicData uri="http://schemas.openxmlformats.org/drawingml/2006/picture">
+                <pic:pic xmlns:pic="http://schemas.openxmlformats.org/drawingml/2006/picture">
+                  <pic:nvPicPr>
+                    <pic:cNvPr id="6" name="Picture 5">
+                      <a:extLst>
+                        <a:ext uri="{FF2B5EF4-FFF2-40B4-BE49-F238E27FC236}">
+                          <a16:creationId xmlns:a16="http://schemas.microsoft.com/office/drawing/2014/main" id="{7AE6EA4D-8EFC-6B0A-7623-0882F103D034}"/>
+                        </a:ext>
+                      </a:extLst>
+                    </pic:cNvPr>
+                    <pic:cNvPicPr>
+                      <a:picLocks noChangeAspect="1"/>
+                    </pic:cNvPicPr>
+                  </pic:nvPicPr>
+                  <pic:blipFill>
+                    <a:blip r:embed="rId18"/>
+                    <a:stretch>
+                      <a:fillRect/>
+                    </a:stretch>
+                  </pic:blipFill>
+                  <pic:spPr>
+                    <a:xfrm>
+                      <a:off x="0" y="0"/>
+                      <a:ext cx="1906792" cy="1421100"/>
+                    </a:xfrm>
+                    <a:prstGeom prst="rect">
+                      <a:avLst/>
+                    </a:prstGeom>
+                  </pic:spPr>
+                </pic:pic>
+              </a:graphicData>
+            </a:graphic>
+          </wp:inline>
+        </w:drawing>
+      </w:r>
+    </w:p>
+    <w:p>
+      <w:pPr>
+        <w:spacing w:line="276" w:lineRule="auto"/>
+        <w:jc w:val="both"/>
+      </w:pPr>
+      <w:r>
+        <w:t>And the response includes metadata about the query execution alongside the matching documents:</w:t>
+      </w:r>
+    </w:p>
+    <w:p>
+      <w:pPr>
+        <w:spacing w:line="276" w:lineRule="auto"/>
+        <w:jc w:val="both"/>
+      </w:pPr>
+      <w:r>
+        <w:drawing>
+          <wp:anchor distT="0" distB="0" distL="114300" distR="114300" simplePos="0" relativeHeight="251670528" behindDoc="0" locked="0" layoutInCell="1" allowOverlap="1" wp14:anchorId="6C95A582" wp14:editId="6101518D">
+            <wp:simplePos x="0" y="0"/>
+            <wp:positionH relativeFrom="column">
+              <wp:posOffset>0</wp:posOffset>
+            </wp:positionH>
+            <wp:positionV relativeFrom="paragraph">
+              <wp:posOffset>-1270</wp:posOffset>
+            </wp:positionV>
+            <wp:extent cx="1984375" cy="3763645"/>
+            <wp:effectExtent l="0" t="0" r="0" b="0"/>
+            <wp:wrapSquare wrapText="bothSides"/>
+            <wp:docPr id="4" name="Content Placeholder 3">
+              <a:extLst xmlns:a="http://schemas.openxmlformats.org/drawingml/2006/main">
+                <a:ext uri="{FF2B5EF4-FFF2-40B4-BE49-F238E27FC236}">
+                  <a16:creationId xmlns:a16="http://schemas.microsoft.com/office/drawing/2014/main" id="{4AEF158B-5C4E-5939-D936-A8218FEB23BD}"/>
+                </a:ext>
+              </a:extLst>
+            </wp:docPr>
+            <wp:cNvGraphicFramePr>
+              <a:graphicFrameLocks xmlns:a="http://schemas.openxmlformats.org/drawingml/2006/main" noGrp="1" noChangeAspect="1"/>
+            </wp:cNvGraphicFramePr>
+            <a:graphic xmlns:a="http://schemas.openxmlformats.org/drawingml/2006/main">
+              <a:graphicData uri="http://schemas.openxmlformats.org/drawingml/2006/picture">
+                <pic:pic xmlns:pic="http://schemas.openxmlformats.org/drawingml/2006/picture">
+                  <pic:nvPicPr>
+                    <pic:cNvPr id="4" name="Content Placeholder 3">
+                      <a:extLst>
+                        <a:ext uri="{FF2B5EF4-FFF2-40B4-BE49-F238E27FC236}">
+                          <a16:creationId xmlns:a16="http://schemas.microsoft.com/office/drawing/2014/main" id="{4AEF158B-5C4E-5939-D936-A8218FEB23BD}"/>
+                        </a:ext>
+                      </a:extLst>
+                    </pic:cNvPr>
+                    <pic:cNvPicPr>
+                      <a:picLocks noGrp="1" noChangeAspect="1"/>
+                    </pic:cNvPicPr>
+                  </pic:nvPicPr>
+                  <pic:blipFill>
+                    <a:blip r:embed="rId19">
+                      <a:extLst>
+                        <a:ext uri="{28A0092B-C50C-407E-A947-70E740481C1C}">
+                          <a14:useLocalDpi xmlns:a14="http://schemas.microsoft.com/office/drawing/2010/main" val="0"/>
+                        </a:ext>
+                      </a:extLst>
+                    </a:blip>
+                    <a:stretch>
+                      <a:fillRect/>
+                    </a:stretch>
+                  </pic:blipFill>
+                  <pic:spPr>
+                    <a:xfrm>
+                      <a:off x="0" y="0"/>
+                      <a:ext cx="1984375" cy="3763645"/>
+                    </a:xfrm>
+                    <a:prstGeom prst="rect">
+                      <a:avLst/>
+                    </a:prstGeom>
+                  </pic:spPr>
+                </pic:pic>
+              </a:graphicData>
+            </a:graphic>
+            <wp14:sizeRelH relativeFrom="page">
+              <wp14:pctWidth>0</wp14:pctWidth>
+            </wp14:sizeRelH>
+            <wp14:sizeRelV relativeFrom="page">
+              <wp14:pctHeight>0</wp14:pctHeight>
+            </wp14:sizeRelV>
+          </wp:anchor>
+        </w:drawing>
+      </w:r>
+      <w:r>
+        <w:t>The took field indicates how many milliseconds the query required. The _score field represents the relevance score assigned to each result</w:t>
+      </w:r>
+      <w:r>
+        <w:t>. The _source field contains the original document as it was indexed.</w:t>
+      </w:r>
+    </w:p>
+    <w:p>
+      <w:pPr>
+        <w:spacing w:line="276" w:lineRule="auto"/>
+        <w:jc w:val="both"/>
+      </w:pPr>
+    </w:p>
+    <w:p>
+      <w:pPr>
+        <w:spacing w:line="276" w:lineRule="auto"/>
+        <w:jc w:val="both"/>
+      </w:pPr>
+    </w:p>
+    <w:p>
+      <w:pPr>
+        <w:spacing w:line="276" w:lineRule="auto"/>
+        <w:jc w:val="both"/>
+      </w:pPr>
+    </w:p>
+    <w:p>
+      <w:pPr>
+        <w:spacing w:line="276" w:lineRule="auto"/>
+        <w:jc w:val="both"/>
+      </w:pPr>
+    </w:p>
+    <w:p>
+      <w:pPr>
+        <w:spacing w:line="276" w:lineRule="auto"/>
+        <w:jc w:val="both"/>
+      </w:pPr>
+    </w:p>
+    <w:p>
+      <w:pPr>
+        <w:spacing w:line="276" w:lineRule="auto"/>
+        <w:jc w:val="both"/>
+      </w:pPr>
+    </w:p>
+    <w:p>
+      <w:pPr>
+        <w:spacing w:line="276" w:lineRule="auto"/>
+        <w:jc w:val="both"/>
+      </w:pPr>
+    </w:p>
+    <w:p>
+      <w:pPr>
+        <w:spacing w:line="276" w:lineRule="auto"/>
+        <w:jc w:val="both"/>
+      </w:pPr>
+    </w:p>
+    <w:p>
+      <w:pPr>
+        <w:spacing w:line="276" w:lineRule="auto"/>
+        <w:jc w:val="both"/>
+      </w:pPr>
+    </w:p>
+    <w:p>
+      <w:pPr>
+        <w:spacing w:line="276" w:lineRule="auto"/>
+        <w:jc w:val="both"/>
+      </w:pPr>
+    </w:p>
+    <w:p>
+      <w:pPr>
+        <w:spacing w:line="276" w:lineRule="auto"/>
+        <w:jc w:val="both"/>
+      </w:pPr>
+    </w:p>
+    <w:p>
+      <w:pPr>
+        <w:spacing w:line="276" w:lineRule="auto"/>
+        <w:jc w:val="both"/>
+      </w:pPr>
+    </w:p>
+    <w:p>
+      <w:pPr>
+        <w:spacing w:line="276" w:lineRule="auto"/>
+        <w:jc w:val="both"/>
+      </w:pPr>
+    </w:p>
+    <w:p>
+      <w:pPr>
+        <w:spacing w:line="276" w:lineRule="auto"/>
+        <w:jc w:val="both"/>
+      </w:pPr>
+    </w:p>
+    <w:p>
+      <w:pPr>
+        <w:spacing w:line="276" w:lineRule="auto"/>
+        <w:jc w:val="both"/>
+      </w:pPr>
+    </w:p>
+    <w:p>
+      <w:pPr>
+        <w:spacing w:line="276" w:lineRule="auto"/>
+        <w:jc w:val="both"/>
+      </w:pPr>
+    </w:p>
+    <w:p>
+      <w:pPr>
+        <w:pStyle w:val="Heading1"/>
+        <w:numPr>
+          <w:ilvl w:val="0"/>
+          <w:numId w:val="4"/>
+        </w:numPr>
+      </w:pPr>
+      <w:r>
+        <w:lastRenderedPageBreak/>
+        <w:t>Query Language</w:t>
+      </w:r>
+    </w:p>
+    <w:p>
+      <w:pPr>
+        <w:pStyle w:val="Heading1"/>
+        <w:numPr>
+          <w:ilvl w:val="1"/>
+          <w:numId w:val="4"/>
+        </w:numPr>
+        <w:ind w:left="567" w:hanging="573"/>
+        <w:rPr>
+          <w:sz w:val="32"/>
+          <w:szCs w:val="32"/>
+        </w:rPr>
+      </w:pPr>
+      <w:r>
+        <w:rPr>
+          <w:sz w:val="32"/>
+          <w:szCs w:val="32"/>
+        </w:rPr>
+        <w:t>Query DSL</w:t>
+      </w:r>
+    </w:p>
+    <w:p>
+      <w:r>
+        <w:t xml:space="preserve">The Query DSL is a JSON-based language for constructing search queries. It is sent as the body of a HTTP Request to the _search endpoint. </w:t>
+      </w:r>
+      <w:r>
+        <w:t>The Query DSL offers different types to search for documents</w:t>
+      </w:r>
+    </w:p>
+    <w:p/>
+    <w:p>
+      <w:r>
+        <w:rPr>
+          <w:b/>
+          <w:bCs/>
+        </w:rPr>
+        <w:t>Match</w:t>
+      </w:r>
+      <w:r>
+        <w:t xml:space="preserve"> performs a full-text search on a text field.</w:t>
+      </w:r>
+    </w:p>
+    <w:p/>
+    <w:p>
+      <w:r>
+        <w:drawing>
+          <wp:inline distT="0" distB="0" distL="0" distR="0" wp14:anchorId="4DA9C130" wp14:editId="4133FD04">
+            <wp:extent cx="2986391" cy="1125307"/>
+            <wp:effectExtent l="0" t="0" r="0" b="5080"/>
+            <wp:docPr id="467678336" name="Picture 1"/>
+            <wp:cNvGraphicFramePr>
+              <a:graphicFrameLocks xmlns:a="http://schemas.openxmlformats.org/drawingml/2006/main" noChangeAspect="1"/>
+            </wp:cNvGraphicFramePr>
+            <a:graphic xmlns:a="http://schemas.openxmlformats.org/drawingml/2006/main">
+              <a:graphicData uri="http://schemas.openxmlformats.org/drawingml/2006/picture">
+                <pic:pic xmlns:pic="http://schemas.openxmlformats.org/drawingml/2006/picture">
+                  <pic:nvPicPr>
+                    <pic:cNvPr id="467678336" name=""/>
+                    <pic:cNvPicPr/>
+                  </pic:nvPicPr>
+                  <pic:blipFill>
+                    <a:blip r:embed="rId20"/>
+                    <a:stretch>
+                      <a:fillRect/>
+                    </a:stretch>
+                  </pic:blipFill>
+                  <pic:spPr>
+                    <a:xfrm>
+                      <a:off x="0" y="0"/>
+                      <a:ext cx="3061540" cy="1153624"/>
+                    </a:xfrm>
+                    <a:prstGeom prst="rect">
+                      <a:avLst/>
+                    </a:prstGeom>
+                  </pic:spPr>
+                </pic:pic>
+              </a:graphicData>
+            </a:graphic>
+          </wp:inline>
+        </w:drawing>
+      </w:r>
+    </w:p>
+    <w:p/>
+    <w:p>
+      <w:r>
+        <w:rPr>
+          <w:b/>
+          <w:bCs/>
+        </w:rPr>
+        <w:t>Fuzzy</w:t>
+      </w:r>
+      <w:r>
+        <w:t xml:space="preserve"> search extends the match query by tolerating typos. The fuzziness: AUTO setting allows Elasticsearch to calculate the edit distance between the search term and the stored tokens and returns results within the allowed threshold.</w:t>
+      </w:r>
+    </w:p>
+    <w:p/>
+    <w:p>
+      <w:pPr>
+        <w:spacing w:line="276" w:lineRule="auto"/>
+        <w:jc w:val="both"/>
+      </w:pPr>
+      <w:r>
+        <w:drawing>
+          <wp:inline distT="0" distB="0" distL="0" distR="0" wp14:anchorId="4E6AE5D1" wp14:editId="7E8DD441">
+            <wp:extent cx="4776281" cy="1829338"/>
+            <wp:effectExtent l="0" t="0" r="0" b="0"/>
+            <wp:docPr id="169245449" name="Picture 1"/>
+            <wp:cNvGraphicFramePr>
+              <a:graphicFrameLocks xmlns:a="http://schemas.openxmlformats.org/drawingml/2006/main" noChangeAspect="1"/>
+            </wp:cNvGraphicFramePr>
+            <a:graphic xmlns:a="http://schemas.openxmlformats.org/drawingml/2006/main">
+              <a:graphicData uri="http://schemas.openxmlformats.org/drawingml/2006/picture">
+                <pic:pic xmlns:pic="http://schemas.openxmlformats.org/drawingml/2006/picture">
+                  <pic:nvPicPr>
+                    <pic:cNvPr id="169245449" name=""/>
+                    <pic:cNvPicPr/>
+                  </pic:nvPicPr>
+                  <pic:blipFill>
+                    <a:blip r:embed="rId21"/>
+                    <a:stretch>
+                      <a:fillRect/>
+                    </a:stretch>
+                  </pic:blipFill>
+                  <pic:spPr>
+                    <a:xfrm>
+                      <a:off x="0" y="0"/>
+                      <a:ext cx="4805448" cy="1840509"/>
+                    </a:xfrm>
+                    <a:prstGeom prst="rect">
+                      <a:avLst/>
+                    </a:prstGeom>
+                  </pic:spPr>
+                </pic:pic>
+              </a:graphicData>
+            </a:graphic>
+          </wp:inline>
+        </w:drawing>
+      </w:r>
+    </w:p>
+    <w:p>
+      <w:pPr>
+        <w:spacing w:line="276" w:lineRule="auto"/>
+        <w:jc w:val="both"/>
+      </w:pPr>
+    </w:p>
+    <w:p>
+      <w:pPr>
+        <w:spacing w:after="160" w:line="278" w:lineRule="auto"/>
+      </w:pPr>
+      <w:r>
+        <w:rPr>
+          <w:b/>
+          <w:bCs/>
+        </w:rPr>
+        <w:t>Term</w:t>
+      </w:r>
+      <w:r>
+        <w:t xml:space="preserve"> performs an exact match on a keyword field without any text analysis. It is used for filtering rather than searching.</w:t>
+      </w:r>
+    </w:p>
+    <w:p>
+      <w:pPr>
+        <w:spacing w:after="160" w:line="278" w:lineRule="auto"/>
+      </w:pPr>
+      <w:r>
+        <w:drawing>
+          <wp:inline distT="0" distB="0" distL="0" distR="0" wp14:anchorId="096628DB" wp14:editId="58AAA849">
+            <wp:extent cx="3472774" cy="1507787"/>
+            <wp:effectExtent l="0" t="0" r="0" b="3810"/>
+            <wp:docPr id="754279949" name="Picture 1"/>
+            <wp:cNvGraphicFramePr>
+              <a:graphicFrameLocks xmlns:a="http://schemas.openxmlformats.org/drawingml/2006/main" noChangeAspect="1"/>
+            </wp:cNvGraphicFramePr>
+            <a:graphic xmlns:a="http://schemas.openxmlformats.org/drawingml/2006/main">
+              <a:graphicData uri="http://schemas.openxmlformats.org/drawingml/2006/picture">
+                <pic:pic xmlns:pic="http://schemas.openxmlformats.org/drawingml/2006/picture">
+                  <pic:nvPicPr>
+                    <pic:cNvPr id="754279949" name=""/>
+                    <pic:cNvPicPr/>
+                  </pic:nvPicPr>
+                  <pic:blipFill>
+                    <a:blip r:embed="rId22"/>
+                    <a:stretch>
+                      <a:fillRect/>
+                    </a:stretch>
+                  </pic:blipFill>
+                  <pic:spPr>
+                    <a:xfrm>
+                      <a:off x="0" y="0"/>
+                      <a:ext cx="3491876" cy="1516081"/>
+                    </a:xfrm>
+                    <a:prstGeom prst="rect">
+                      <a:avLst/>
+                    </a:prstGeom>
+                  </pic:spPr>
+                </pic:pic>
+              </a:graphicData>
+            </a:graphic>
+          </wp:inline>
+        </w:drawing>
+      </w:r>
+    </w:p>
+    <w:p>
+      <w:pPr>
+        <w:spacing w:after="160" w:line="278" w:lineRule="auto"/>
+      </w:pPr>
+    </w:p>
+    <w:p>
+      <w:pPr>
+        <w:spacing w:after="160" w:line="278" w:lineRule="auto"/>
+      </w:pPr>
+    </w:p>
+    <w:p>
+      <w:pPr>
+        <w:spacing w:after="160" w:line="278" w:lineRule="auto"/>
+      </w:pPr>
+      <w:r>
+        <w:rPr>
+          <w:b/>
+          <w:bCs/>
+        </w:rPr>
+        <w:lastRenderedPageBreak/>
+        <w:t>Bool</w:t>
+      </w:r>
+      <w:r>
+        <w:t xml:space="preserve"> queries combine multiple conditions into a single query using clauses. The must clause requires a condition to match and affects the relevance score. The filter clause also requires a condition to match but does not affect scroing and is cached for performance.</w:t>
+      </w:r>
+    </w:p>
+    <w:p>
+      <w:pPr>
+        <w:spacing w:after="160" w:line="278" w:lineRule="auto"/>
+      </w:pPr>
+      <w:r>
+        <w:drawing>
+          <wp:inline distT="0" distB="0" distL="0" distR="0" wp14:anchorId="604AEDCD" wp14:editId="7C323977">
+            <wp:extent cx="5068111" cy="2062956"/>
+            <wp:effectExtent l="0" t="0" r="0" b="0"/>
+            <wp:docPr id="1525028935" name="Picture 1"/>
+            <wp:cNvGraphicFramePr>
+              <a:graphicFrameLocks xmlns:a="http://schemas.openxmlformats.org/drawingml/2006/main" noChangeAspect="1"/>
+            </wp:cNvGraphicFramePr>
+            <a:graphic xmlns:a="http://schemas.openxmlformats.org/drawingml/2006/main">
+              <a:graphicData uri="http://schemas.openxmlformats.org/drawingml/2006/picture">
+                <pic:pic xmlns:pic="http://schemas.openxmlformats.org/drawingml/2006/picture">
+                  <pic:nvPicPr>
+                    <pic:cNvPr id="1525028935" name=""/>
+                    <pic:cNvPicPr/>
+                  </pic:nvPicPr>
+                  <pic:blipFill>
+                    <a:blip r:embed="rId23"/>
+                    <a:stretch>
+                      <a:fillRect/>
+                    </a:stretch>
+                  </pic:blipFill>
+                  <pic:spPr>
+                    <a:xfrm>
+                      <a:off x="0" y="0"/>
+                      <a:ext cx="5111961" cy="2080805"/>
+                    </a:xfrm>
+                    <a:prstGeom prst="rect">
+                      <a:avLst/>
+                    </a:prstGeom>
+                  </pic:spPr>
+                </pic:pic>
+              </a:graphicData>
+            </a:graphic>
+          </wp:inline>
+        </w:drawing>
+      </w:r>
+    </w:p>
+    <w:p>
+      <w:pPr>
+        <w:spacing w:after="160" w:line="278" w:lineRule="auto"/>
+      </w:pPr>
+    </w:p>
+    <w:p>
+      <w:pPr>
+        <w:pStyle w:val="Heading1"/>
+        <w:numPr>
+          <w:ilvl w:val="1"/>
+          <w:numId w:val="4"/>
+        </w:numPr>
+        <w:ind w:left="567" w:hanging="573"/>
+        <w:rPr>
+          <w:sz w:val="32"/>
+          <w:szCs w:val="32"/>
+        </w:rPr>
+      </w:pPr>
+      <w:r>
+        <w:rPr>
+          <w:sz w:val="32"/>
+          <w:szCs w:val="32"/>
+        </w:rPr>
+        <w:t>Aggregations</w:t>
+      </w:r>
+    </w:p>
+    <w:p>
+      <w:pPr>
+        <w:spacing w:after="160" w:line="278" w:lineRule="auto"/>
+      </w:pPr>
+      <w:r>
+        <w:t>Aggregations are Elasticsearchs equivalent of SQL Group by combined with aggregate functions sich as COUNT, SUM and AVG. Aggregations are defined inside the aggs key of a request body and can be nested to produce multi-level grouping.</w:t>
+      </w:r>
+    </w:p>
+    <w:p>
+      <w:pPr>
+        <w:spacing w:after="160" w:line="278" w:lineRule="auto"/>
+      </w:pPr>
+      <w:r>
+        <w:drawing>
+          <wp:inline distT="0" distB="0" distL="0" distR="0" wp14:anchorId="3790BE74" wp14:editId="32D90C57">
+            <wp:extent cx="3657600" cy="2465416"/>
+            <wp:effectExtent l="0" t="0" r="0" b="0"/>
+            <wp:docPr id="1089919428" name="Picture 1"/>
+            <wp:cNvGraphicFramePr>
+              <a:graphicFrameLocks xmlns:a="http://schemas.openxmlformats.org/drawingml/2006/main" noChangeAspect="1"/>
+            </wp:cNvGraphicFramePr>
+            <a:graphic xmlns:a="http://schemas.openxmlformats.org/drawingml/2006/main">
+              <a:graphicData uri="http://schemas.openxmlformats.org/drawingml/2006/picture">
+                <pic:pic xmlns:pic="http://schemas.openxmlformats.org/drawingml/2006/picture">
+                  <pic:nvPicPr>
+                    <pic:cNvPr id="1089919428" name=""/>
+                    <pic:cNvPicPr/>
+                  </pic:nvPicPr>
+                  <pic:blipFill>
+                    <a:blip r:embed="rId24"/>
+                    <a:stretch>
+                      <a:fillRect/>
+                    </a:stretch>
+                  </pic:blipFill>
+                  <pic:spPr>
+                    <a:xfrm>
+                      <a:off x="0" y="0"/>
+                      <a:ext cx="3693813" cy="2489825"/>
+                    </a:xfrm>
+                    <a:prstGeom prst="rect">
+                      <a:avLst/>
+                    </a:prstGeom>
+                  </pic:spPr>
+                </pic:pic>
+              </a:graphicData>
+            </a:graphic>
+          </wp:inline>
+        </w:drawing>
+      </w:r>
+    </w:p>
+    <w:p>
+      <w:pPr>
+        <w:spacing w:after="160" w:line="278" w:lineRule="auto"/>
+      </w:pPr>
+    </w:p>
+    <w:p>
+      <w:pPr>
+        <w:spacing w:after="160" w:line="278" w:lineRule="auto"/>
+      </w:pPr>
+      <w:r>
+        <w:t>The “size: 0” tells Elasticsearch not to return any documents hits, only the aggregation result is needed.</w:t>
+      </w:r>
+    </w:p>
+    <w:p>
+      <w:pPr>
+        <w:spacing w:after="160" w:line="278" w:lineRule="auto"/>
+      </w:pPr>
+    </w:p>
+    <w:p>
+      <w:pPr>
+        <w:spacing w:after="160" w:line="278" w:lineRule="auto"/>
+      </w:pPr>
+    </w:p>
+    <w:p>
+      <w:pPr>
+        <w:spacing w:after="160" w:line="278" w:lineRule="auto"/>
+      </w:pPr>
+    </w:p>
+    <w:p>
+      <w:pPr>
+        <w:spacing w:after="160" w:line="278" w:lineRule="auto"/>
+      </w:pPr>
+    </w:p>
+    <w:p>
+      <w:pPr>
+        <w:pStyle w:val="Heading1"/>
+        <w:numPr>
+          <w:ilvl w:val="0"/>
+          <w:numId w:val="4"/>
+        </w:numPr>
+      </w:pPr>
+      <w:r>
+        <w:lastRenderedPageBreak/>
+        <w:t>Project</w:t>
+      </w:r>
+    </w:p>
+    <w:p>
+      <w:pPr>
+        <w:pStyle w:val="Heading1"/>
+        <w:numPr>
+          <w:ilvl w:val="1"/>
+          <w:numId w:val="4"/>
+        </w:numPr>
+        <w:ind w:left="567" w:hanging="573"/>
+        <w:rPr>
+          <w:sz w:val="32"/>
+          <w:szCs w:val="32"/>
+        </w:rPr>
+      </w:pPr>
+      <w:r>
+        <w:rPr>
+          <w:sz w:val="32"/>
+          <w:szCs w:val="32"/>
+        </w:rPr>
+        <w:t>Project Description</w:t>
+      </w:r>
+    </w:p>
+    <w:p>
+      <w:pPr>
+        <w:spacing w:after="160" w:line="278" w:lineRule="auto"/>
+      </w:pPr>
+      <w:r>
+        <w:t xml:space="preserve">To demonstrate the core capabilities of Elasticsearch in a practical context, I developed a project using the </w:t>
+      </w:r>
+      <w:hyperlink r:id="rId25" w:history="1">
+        <w:r>
+          <w:rPr>
+            <w:rStyle w:val="Hyperlink"/>
+          </w:rPr>
+          <w:t>F1 World Championship</w:t>
+        </w:r>
+        <w:r>
+          <w:rPr>
+            <w:rStyle w:val="Hyperlink"/>
+          </w:rPr>
+          <w:t xml:space="preserve"> dataset form Kaggle</w:t>
+        </w:r>
+      </w:hyperlink>
+      <w:r>
+        <w:t xml:space="preserve">. The dataset covers every race result from 1950 until 2024. It consists of several CSV files containing information about races, drivers, constructorsm circuits, race results and more. </w:t>
+      </w:r>
+    </w:p>
+    <w:p>
+      <w:pPr>
+        <w:spacing w:after="160" w:line="278" w:lineRule="auto"/>
+      </w:pPr>
+      <w:r>
+        <w:t>The goal fo the project is to demonstrate how Elasticsearch handles real-world data from ingestion and indexing through to querying and visualization. The project consists of two Python script and a Kibana dashboard, all running against a local Elasticsearch instance inside Docker.</w:t>
+      </w:r>
+    </w:p>
+    <w:p>
+      <w:pPr>
+        <w:spacing w:after="160" w:line="278" w:lineRule="auto"/>
+      </w:pPr>
+      <w:r>
+        <w:t xml:space="preserve">The first script, </w:t>
+      </w:r>
+      <w:r>
+        <w:rPr>
+          <w:rFonts w:ascii="Courier New" w:hAnsi="Courier New" w:cs="Courier New"/>
+        </w:rPr>
+        <w:t>f1_dataset_inserter.py</w:t>
+      </w:r>
+      <w:r>
+        <w:t xml:space="preserve">, </w:t>
+      </w:r>
+      <w:r>
+        <w:t xml:space="preserve">is responsible for loading the raw csv files, transforming them into a flat document structure and indexing them into Elasticsearch. The second script, </w:t>
+      </w:r>
+      <w:r>
+        <w:rPr>
+          <w:rFonts w:ascii="Courier New" w:hAnsi="Courier New" w:cs="Courier New"/>
+        </w:rPr>
+        <w:t>f1_queries.py</w:t>
+      </w:r>
+      <w:r>
+        <w:t>, demonstrates eight different query types against the indexed data, covering full-text search, fuzzy search, exact filtering, boolean queries and aggregations.</w:t>
+      </w:r>
+      <w:r>
+        <w:t xml:space="preserve"> The Kibana dashboard provides visual insights into the dataset through charts and an interactive world map of Formula 1 circuits.</w:t>
+      </w:r>
+    </w:p>
+    <w:p>
+      <w:pPr>
+        <w:spacing w:after="160" w:line="278" w:lineRule="auto"/>
+      </w:pPr>
+      <w:r>
+        <w:t xml:space="preserve">The complete project, including both Python scripts, the Docker configuration etc. is available on GitHub at </w:t>
+      </w:r>
+      <w:hyperlink r:id="rId26" w:history="1">
+        <w:r>
+          <w:rPr>
+            <w:rStyle w:val="Hyperlink"/>
+          </w:rPr>
+          <w:t>https://githu</w:t>
+        </w:r>
+        <w:r>
+          <w:rPr>
+            <w:rStyle w:val="Hyperlink"/>
+          </w:rPr>
+          <w:t>b</w:t>
+        </w:r>
+        <w:r>
+          <w:rPr>
+            <w:rStyle w:val="Hyperlink"/>
+          </w:rPr>
+          <w:t>.com/fabi2k03/dab_elasticsearch_paper</w:t>
+        </w:r>
+      </w:hyperlink>
+      <w:r>
+        <w:t xml:space="preserve">. </w:t>
+      </w:r>
+    </w:p>
+    <w:p>
+      <w:pPr>
+        <w:pStyle w:val="Heading1"/>
+        <w:numPr>
+          <w:ilvl w:val="1"/>
+          <w:numId w:val="4"/>
+        </w:numPr>
+        <w:ind w:left="567" w:hanging="573"/>
+        <w:rPr>
+          <w:sz w:val="32"/>
+          <w:szCs w:val="32"/>
+        </w:rPr>
+      </w:pPr>
+      <w:r>
+        <w:rPr>
+          <w:sz w:val="32"/>
+          <w:szCs w:val="32"/>
+        </w:rPr>
+        <w:t>The Indexing script</w:t>
+      </w:r>
+      <w:r>
+        <w:rPr>
+          <w:sz w:val="32"/>
+          <w:szCs w:val="32"/>
+        </w:rPr>
+        <w:t xml:space="preserve">: </w:t>
+      </w:r>
+      <w:r>
+        <w:rPr>
+          <w:sz w:val="32"/>
+          <w:szCs w:val="32"/>
+        </w:rPr>
+        <w:t>f1_dataset_inserter_py</w:t>
+      </w:r>
+    </w:p>
+    <w:p>
+      <w:pPr>
+        <w:spacing w:after="160" w:line="278" w:lineRule="auto"/>
+      </w:pPr>
+      <w:r>
+        <w:t xml:space="preserve">The indexing script is the entry point of the project. Its purpose is to take the raw csv files and load them into the elasticsearch instance. </w:t>
+      </w:r>
+    </w:p>
+    <w:p>
+      <w:pPr>
+        <w:spacing w:after="160" w:line="278" w:lineRule="auto"/>
+        <w:rPr>
+          <w:b/>
+          <w:bCs/>
+        </w:rPr>
+      </w:pPr>
+      <w:r>
+        <w:rPr>
+          <w:b/>
+          <w:bCs/>
+        </w:rPr>
+        <w:t>Loading the csv files</w:t>
+      </w:r>
+    </w:p>
+    <w:p>
+      <w:pPr>
+        <w:spacing w:after="160" w:line="278" w:lineRule="auto"/>
+      </w:pPr>
+      <w:r>
+        <w:t>The first step is to load all necessarycsv files into pandas dataframes. Each file is read independently and stored.</w:t>
+      </w:r>
+      <w:r>
+        <w:t xml:space="preserve"> At this stage the data is still in its original form, each file represents one entity and references other entities only through integer IDS, exactly as a relational database would</w:t>
+      </w:r>
+    </w:p>
+    <w:p>
+      <w:pPr>
+        <w:spacing w:after="160" w:line="278" w:lineRule="auto"/>
+        <w:rPr>
+          <w:b/>
+          <w:bCs/>
+        </w:rPr>
+      </w:pPr>
+      <w:r>
+        <w:rPr>
+          <w:b/>
+          <w:bCs/>
+        </w:rPr>
+        <w:t>Denormalization and document creation</w:t>
+      </w:r>
+    </w:p>
+    <w:p>
+      <w:pPr>
+        <w:spacing w:after="160" w:line="278" w:lineRule="auto"/>
+      </w:pPr>
+      <w:r>
+        <w:t xml:space="preserve">The most important step is the </w:t>
+      </w:r>
+      <w:r>
+        <w:rPr>
+          <w:rFonts w:ascii="Courier New" w:hAnsi="Courier New" w:cs="Courier New"/>
+        </w:rPr>
+        <w:t>build_</w:t>
+      </w:r>
+      <w:r>
+        <w:rPr>
+          <w:rFonts w:ascii="Courier New" w:hAnsi="Courier New" w:cs="Courier New"/>
+        </w:rPr>
+        <w:t>document</w:t>
+      </w:r>
+      <w:r>
+        <w:t xml:space="preserve"> function, which merges all six dataframes into a single flat structure. With this step the relational aspect of the data is removed and the data normally require joins at query time is combined into one document per race result upfront</w:t>
+      </w:r>
+      <w:r>
+        <w:t>. The result is one document per race result per driver, meaning each document represents exactly one drivers participation in one race. The document has all associated information such as the race name, circuit, constructur and finishing position embedded directly inside it. The fields contained in ea</w:t>
+      </w:r>
+      <w:r>
+        <w:t>ch document correspond exactly to the mapping defined at the top of the script, which specifies the data type of every field and determines how Elasticsearch stores and indexes the data.</w:t>
+      </w:r>
+    </w:p>
+    <w:p>
+      <w:pPr>
+        <w:spacing w:after="160" w:line="278" w:lineRule="auto"/>
+        <w:rPr>
+          <w:b/>
+          <w:bCs/>
+        </w:rPr>
+      </w:pPr>
+      <w:r>
+        <w:rPr>
+          <w:b/>
+          <w:bCs/>
+        </w:rPr>
+        <w:lastRenderedPageBreak/>
+        <w:t>Creating the index</w:t>
+      </w:r>
+    </w:p>
+    <w:p>
+      <w:pPr>
+        <w:spacing w:after="160" w:line="278" w:lineRule="auto"/>
+      </w:pPr>
+      <w:r>
+        <w:t xml:space="preserve">Before documents can be indexed, the </w:t>
+      </w:r>
+      <w:r>
+        <w:rPr>
+          <w:rFonts w:ascii="Courier New" w:hAnsi="Courier New" w:cs="Courier New"/>
+        </w:rPr>
+        <w:t>create_index</w:t>
+      </w:r>
+      <w:r>
+        <w:t xml:space="preserve"> function deletes any existing index with the same name and creates a fresh one with the explicit mapping.</w:t>
+      </w:r>
+    </w:p>
+    <w:p>
+      <w:pPr>
+        <w:pStyle w:val="Heading1"/>
+        <w:numPr>
+          <w:ilvl w:val="1"/>
+          <w:numId w:val="4"/>
+        </w:numPr>
+        <w:ind w:left="567" w:hanging="573"/>
+        <w:rPr>
+          <w:sz w:val="32"/>
+          <w:szCs w:val="32"/>
+        </w:rPr>
+      </w:pPr>
+      <w:r>
+        <w:rPr>
+          <w:sz w:val="32"/>
+          <w:szCs w:val="32"/>
+        </w:rPr>
+        <w:t>The Query Script</w:t>
+      </w:r>
+      <w:r>
+        <w:rPr>
+          <w:sz w:val="32"/>
+          <w:szCs w:val="32"/>
+        </w:rPr>
+        <w:t>:</w:t>
+      </w:r>
+      <w:r>
+        <w:rPr>
+          <w:sz w:val="32"/>
+          <w:szCs w:val="32"/>
+        </w:rPr>
+        <w:t xml:space="preserve"> f1_queries.py</w:t>
+      </w:r>
+    </w:p>
+    <w:p>
+      <w:pPr>
+        <w:spacing w:after="160" w:line="278" w:lineRule="auto"/>
+      </w:pPr>
+      <w:r>
+        <w:t xml:space="preserve">The query script demonstrates eight different query types against the indexed F1 data. Each function sends a Query DSL request to Elasticsearch via the Python client and prints the result. </w:t>
+      </w:r>
+      <w:r>
+        <w:t>The following query types are implemented in the script:</w:t>
+      </w:r>
+    </w:p>
+    <w:tbl>
+      <w:tblPr>
+        <w:tblStyle w:val="TableGrid"/>
+        <w:tblW w:w="0" w:type="auto"/>
+        <w:tblLook w:val="04A0" w:firstRow="1" w:lastRow="0" w:firstColumn="1" w:lastColumn="0" w:noHBand="0" w:noVBand="1"/>
+      </w:tblPr>
+      <w:tblGrid>
+        <w:gridCol w:w="4508"/>
+        <w:gridCol w:w="4508"/>
+      </w:tblGrid>
+      <w:tr>
+        <w:tc>
+          <w:tcPr>
+            <w:tcW w:w="4508" w:type="dxa"/>
+          </w:tcPr>
+          <w:p>
+            <w:pPr>
+              <w:spacing w:after="160" w:line="278" w:lineRule="auto"/>
+              <w:jc w:val="center"/>
+              <w:rPr>
+                <w:b/>
+                <w:bCs/>
+              </w:rPr>
+            </w:pPr>
+            <w:r>
+              <w:rPr>
+                <w:b/>
+                <w:bCs/>
+              </w:rPr>
+              <w:t>Query</w:t>
+            </w:r>
+          </w:p>
+        </w:tc>
+        <w:tc>
+          <w:tcPr>
+            <w:tcW w:w="4508" w:type="dxa"/>
+          </w:tcPr>
+          <w:p>
+            <w:pPr>
+              <w:spacing w:after="160" w:line="278" w:lineRule="auto"/>
+              <w:jc w:val="center"/>
+              <w:rPr>
+                <w:b/>
+                <w:bCs/>
+              </w:rPr>
+            </w:pPr>
+            <w:r>
+              <w:rPr>
+                <w:b/>
+                <w:bCs/>
+              </w:rPr>
+              <w:t>Description</w:t>
+            </w:r>
+          </w:p>
+        </w:tc>
+      </w:tr>
+      <w:tr>
+        <w:tc>
+          <w:tcPr>
+            <w:tcW w:w="4508" w:type="dxa"/>
+          </w:tcPr>
+          <w:p>
+            <w:pPr>
+              <w:spacing w:after="160" w:line="278" w:lineRule="auto"/>
+            </w:pPr>
+            <w:r>
+              <w:t>Full-text search</w:t>
+            </w:r>
+          </w:p>
+        </w:tc>
+        <w:tc>
+          <w:tcPr>
+            <w:tcW w:w="4508" w:type="dxa"/>
+          </w:tcPr>
+          <w:p>
+            <w:pPr>
+              <w:spacing w:after="160" w:line="278" w:lineRule="auto"/>
+            </w:pPr>
+            <w:r>
+              <w:t>Search races by name using tokenized text matching</w:t>
+            </w:r>
+          </w:p>
+        </w:tc>
+      </w:tr>
+      <w:tr>
+        <w:tc>
+          <w:tcPr>
+            <w:tcW w:w="4508" w:type="dxa"/>
+          </w:tcPr>
+          <w:p>
+            <w:pPr>
+              <w:spacing w:after="160" w:line="278" w:lineRule="auto"/>
+            </w:pPr>
+            <w:r>
+              <w:t>Fuzzy search</w:t>
+            </w:r>
+          </w:p>
+        </w:tc>
+        <w:tc>
+          <w:tcPr>
+            <w:tcW w:w="4508" w:type="dxa"/>
+          </w:tcPr>
+          <w:p>
+            <w:pPr>
+              <w:spacing w:after="160" w:line="278" w:lineRule="auto"/>
+            </w:pPr>
+            <w:r>
+              <w:t>Find driver even when the name contains one or more typos</w:t>
+            </w:r>
+          </w:p>
+        </w:tc>
+      </w:tr>
+      <w:tr>
+        <w:tc>
+          <w:tcPr>
+            <w:tcW w:w="4508" w:type="dxa"/>
+          </w:tcPr>
+          <w:p>
+            <w:pPr>
+              <w:spacing w:after="160" w:line="278" w:lineRule="auto"/>
+            </w:pPr>
+            <w:r>
+              <w:t>Filter</w:t>
+            </w:r>
+          </w:p>
+        </w:tc>
+        <w:tc>
+          <w:tcPr>
+            <w:tcW w:w="4508" w:type="dxa"/>
+          </w:tcPr>
+          <w:p>
+            <w:pPr>
+              <w:spacing w:after="160" w:line="278" w:lineRule="auto"/>
+            </w:pPr>
+            <w:r>
+              <w:t>Exact match one keyword field such as country</w:t>
+            </w:r>
+          </w:p>
+        </w:tc>
+      </w:tr>
+      <w:tr>
+        <w:tc>
+          <w:tcPr>
+            <w:tcW w:w="4508" w:type="dxa"/>
+          </w:tcPr>
+          <w:p>
+            <w:pPr>
+              <w:spacing w:after="160" w:line="278" w:lineRule="auto"/>
+            </w:pPr>
+            <w:r>
+              <w:t>Bool query</w:t>
+            </w:r>
+          </w:p>
+        </w:tc>
+        <w:tc>
+          <w:tcPr>
+            <w:tcW w:w="4508" w:type="dxa"/>
+          </w:tcPr>
+          <w:p>
+            <w:pPr>
+              <w:spacing w:after="160" w:line="278" w:lineRule="auto"/>
+            </w:pPr>
+            <w:r>
+              <w:t>Combine multiple conditions using must and filter, e.g In which races a driver finished under the top 3</w:t>
+            </w:r>
+          </w:p>
+        </w:tc>
+      </w:tr>
+      <w:tr>
+        <w:tc>
+          <w:tcPr>
+            <w:tcW w:w="4508" w:type="dxa"/>
+          </w:tcPr>
+          <w:p>
+            <w:pPr>
+              <w:spacing w:after="160" w:line="278" w:lineRule="auto"/>
+            </w:pPr>
+            <w:r>
+              <w:t>Term aggregation</w:t>
+            </w:r>
+          </w:p>
+        </w:tc>
+        <w:tc>
+          <w:tcPr>
+            <w:tcW w:w="4508" w:type="dxa"/>
+          </w:tcPr>
+          <w:p>
+            <w:pPr>
+              <w:spacing w:after="160" w:line="278" w:lineRule="auto"/>
+            </w:pPr>
+            <w:r>
+              <w:t>Group and count results, e.g wins per driver</w:t>
+            </w:r>
+          </w:p>
+        </w:tc>
+      </w:tr>
+      <w:tr>
+        <w:tc>
+          <w:tcPr>
+            <w:tcW w:w="4508" w:type="dxa"/>
+          </w:tcPr>
+          <w:p>
+            <w:pPr>
+              <w:spacing w:after="160" w:line="278" w:lineRule="auto"/>
+            </w:pPr>
+            <w:r>
+              <w:t>Sum aggregation</w:t>
+            </w:r>
+          </w:p>
+        </w:tc>
+        <w:tc>
+          <w:tcPr>
+            <w:tcW w:w="4508" w:type="dxa"/>
+          </w:tcPr>
+          <w:p>
+            <w:pPr>
+              <w:spacing w:after="160" w:line="278" w:lineRule="auto"/>
+            </w:pPr>
+            <w:r>
+              <w:t>Calculate totals, e.g points per</w:t>
+            </w:r>
+            <w:r>
+              <w:t xml:space="preserve"> constructor</w:t>
+            </w:r>
+          </w:p>
+        </w:tc>
+      </w:tr>
+      <w:tr>
+        <w:tc>
+          <w:tcPr>
+            <w:tcW w:w="4508" w:type="dxa"/>
+          </w:tcPr>
+          <w:p>
+            <w:pPr>
+              <w:spacing w:after="160" w:line="278" w:lineRule="auto"/>
+            </w:pPr>
+            <w:r>
+              <w:t>Cardinality aggregation</w:t>
+            </w:r>
+          </w:p>
+        </w:tc>
+        <w:tc>
+          <w:tcPr>
+            <w:tcW w:w="4508" w:type="dxa"/>
+          </w:tcPr>
+          <w:p>
+            <w:pPr>
+              <w:spacing w:after="160" w:line="278" w:lineRule="auto"/>
+            </w:pPr>
+            <w:r>
+              <w:t>Count distinct values, e.g races per season</w:t>
+            </w:r>
+          </w:p>
+        </w:tc>
+      </w:tr>
+      <w:tr>
+        <w:tc>
+          <w:tcPr>
+            <w:tcW w:w="4508" w:type="dxa"/>
+          </w:tcPr>
+          <w:p>
+            <w:pPr>
+              <w:spacing w:after="160" w:line="278" w:lineRule="auto"/>
+            </w:pPr>
+            <w:r>
+              <w:t>Multi-match search</w:t>
+            </w:r>
+          </w:p>
+        </w:tc>
+        <w:tc>
+          <w:tcPr>
+            <w:tcW w:w="4508" w:type="dxa"/>
+          </w:tcPr>
+          <w:p>
+            <w:pPr>
+              <w:spacing w:after="160" w:line="278" w:lineRule="auto"/>
+            </w:pPr>
+            <w:r>
+              <w:t>Search a single term across multiple fields at once</w:t>
+            </w:r>
+          </w:p>
+        </w:tc>
+      </w:tr>
+    </w:tbl>
+    <w:p>
+      <w:pPr>
+        <w:spacing w:after="160" w:line="278" w:lineRule="auto"/>
+      </w:pPr>
+    </w:p>
+    <w:p>
+      <w:pPr>
+        <w:pStyle w:val="Heading1"/>
+        <w:numPr>
+          <w:ilvl w:val="1"/>
+          <w:numId w:val="4"/>
+        </w:numPr>
+        <w:ind w:left="567" w:hanging="573"/>
+        <w:rPr>
+          <w:sz w:val="32"/>
+          <w:szCs w:val="32"/>
+        </w:rPr>
+      </w:pPr>
+      <w:r>
+        <w:rPr>
+          <w:sz w:val="32"/>
+          <w:szCs w:val="32"/>
+        </w:rPr>
+        <w:t>Setup and Configration</w:t>
+      </w:r>
+    </w:p>
+    <w:p>
+      <w:pPr>
+        <w:spacing w:after="160" w:line="278" w:lineRule="auto"/>
+        <w:rPr>
+          <w:b/>
+          <w:bCs/>
+        </w:rPr>
+      </w:pPr>
+      <w:r>
+        <w:rPr>
+          <w:b/>
+          <w:bCs/>
+        </w:rPr>
+        <w:t>Development setup with Docker</w:t>
+      </w:r>
+    </w:p>
+    <w:p>
+      <w:pPr>
+        <w:spacing w:after="160" w:line="278" w:lineRule="auto"/>
+      </w:pPr>
+      <w:r>
+        <w:t>For local development, both Elasticsearch and Kibana are run as Docker containers using a docker-compose file. In this file, three environment variables configure the Elasticsearch container.</w:t>
+      </w:r>
+    </w:p>
+    <w:p>
+      <w:pPr>
+        <w:spacing w:after="160" w:line="278" w:lineRule="auto"/>
+        <w:ind w:left="2880" w:hanging="2880"/>
+      </w:pPr>
+      <w:r>
+        <w:t>discovery.type=single-node</w:t>
+      </w:r>
+      <w:r>
+        <w:t>:</w:t>
+      </w:r>
+      <w:r>
+        <w:tab/>
+      </w:r>
+      <w:r>
+        <w:t>It declairs the Elasticsearch instance as a single node one.</w:t>
+      </w:r>
+      <w:r>
+        <w:t xml:space="preserve"> Furthermore, it tells Elasticsearch not to wait for other nodes before starting. Without this setting a single-node clustger would remain in a waiting state indefinitely.</w:t>
+      </w:r>
+    </w:p>
+    <w:p>
+      <w:pPr>
+        <w:spacing w:after="160" w:line="278" w:lineRule="auto"/>
+        <w:ind w:left="2880" w:hanging="2880"/>
+      </w:pPr>
+      <w:r>
+        <w:lastRenderedPageBreak/>
+        <w:t>xpack.security.enabled=fals</w:t>
+      </w:r>
+      <w:r>
+        <w:t>e:</w:t>
+      </w:r>
+      <w:r>
+        <w:tab/>
+      </w:r>
+      <w:r>
+        <w:t>d</w:t>
+      </w:r>
+      <w:r>
+        <w:t>isables authentication, which is acceptable for a local development environment but must never be used in production</w:t>
+      </w:r>
+    </w:p>
+    <w:p>
+      <w:pPr>
+        <w:spacing w:after="160" w:line="278" w:lineRule="auto"/>
+        <w:ind w:left="4320" w:hanging="4320"/>
+      </w:pPr>
+      <w:r>
+        <w:t>ES_JAVA_OPTS=-Xms512m -Xmx512m</w:t>
+      </w:r>
+      <w:r>
+        <w:t>:</w:t>
+      </w:r>
+      <w:r>
+        <w:tab/>
+      </w:r>
+      <w:r>
+        <w:t xml:space="preserve">sets the JVM (Java Virtual Maschine) heapt to 512 MB </w:t>
+      </w:r>
+      <w:r>
+        <w:sym w:font="Wingdings" w:char="F0E0"/>
+      </w:r>
+      <w:r>
+        <w:t xml:space="preserve"> sufficient for this project but far below the recommended allocation for production workloads</w:t>
+      </w:r>
+    </w:p>
+    <w:p>
+      <w:pPr>
+        <w:spacing w:after="160" w:line="278" w:lineRule="auto"/>
+      </w:pPr>
+      <w:r>
+        <w:t xml:space="preserve">After that file is configurated, we can now start the docker-containers with: </w:t>
+      </w:r>
+      <w:r>
+        <w:rPr>
+          <w:rFonts w:ascii="Courier New" w:hAnsi="Courier New" w:cs="Courier New"/>
+        </w:rPr>
+        <w:t>docker-compose up -d</w:t>
+      </w:r>
+    </w:p>
+    <w:p>
+      <w:pPr>
+        <w:spacing w:after="160" w:line="278" w:lineRule="auto"/>
+      </w:pPr>
+      <w:r>
+        <w:t xml:space="preserve">Elasticsearch becomes available at </w:t>
+      </w:r>
+      <w:hyperlink r:id="rId27" w:history="1">
+        <w:r>
+          <w:rPr>
+            <w:rStyle w:val="Hyperlink"/>
+          </w:rPr>
+          <w:t>http://localhost:</w:t>
+        </w:r>
+        <w:r>
+          <w:rPr>
+            <w:rStyle w:val="Hyperlink"/>
+          </w:rPr>
+          <w:t>9200</w:t>
+        </w:r>
+      </w:hyperlink>
+      <w:r>
+        <w:t xml:space="preserve"> and Kibana at </w:t>
+      </w:r>
+      <w:hyperlink r:id="rId28" w:history="1">
+        <w:r>
+          <w:rPr>
+            <w:rStyle w:val="Hyperlink"/>
+          </w:rPr>
+          <w:t>http://localhost:5601</w:t>
+        </w:r>
+      </w:hyperlink>
+      <w:r>
+        <w:t xml:space="preserve"> </w:t>
+      </w:r>
+    </w:p>
+    <w:p>
+      <w:pPr>
+        <w:spacing w:after="160" w:line="278" w:lineRule="auto"/>
+      </w:pPr>
+    </w:p>
+    <w:p>
+      <w:pPr>
+        <w:spacing w:after="160" w:line="278" w:lineRule="auto"/>
+        <w:rPr>
+          <w:b/>
+          <w:bCs/>
+        </w:rPr>
+      </w:pPr>
+      <w:r>
+        <w:rPr>
+          <w:b/>
+          <w:bCs/>
+        </w:rPr>
+        <w:t>Procuction setup</w:t>
+      </w:r>
+    </w:p>
+    <w:p>
+      <w:pPr>
+        <w:spacing w:after="160" w:line="278" w:lineRule="auto"/>
+      </w:pPr>
+      <w:r>
+        <w:t>The Docker setup descriped above is suitable for development and demonstration purposes. A production deployment differs significantly in several aspects.</w:t>
+      </w:r>
+    </w:p>
+    <w:p>
+      <w:pPr>
+        <w:spacing w:after="160" w:line="278" w:lineRule="auto"/>
+      </w:pPr>
+      <w:r>
+        <w:t xml:space="preserve">In production, a cluster should at least consists of three nodes to ensure high availability and to prevent split-brain scenarios during network partitions. </w:t>
+      </w:r>
+      <w:r>
+        <w:t>Memory allocation is critical</w:t>
+      </w:r>
+      <w:r>
+        <w:t xml:space="preserve">, </w:t>
+      </w:r>
+      <w:r>
+        <w:t>Elasticsearch recommends allocating half of the available system memory to the JVM heap, leaving the remainder for the Lucene file cache. Security must be enabled in production, including TLS encryption and role-based access control.</w:t>
+      </w:r>
+    </w:p>
+    <w:p>
+      <w:pPr>
+        <w:spacing w:after="160" w:line="278" w:lineRule="auto"/>
+      </w:pPr>
+      <w:r>
+        <w:t>As an alternative to managing the infratructure manually, Elastic NV offers a managed cloud service called Elastic Cloud. With Elastic Cloud, the entire Elasticsearch and Kibana stack is hosted and maintained by Elastic NV. This eliminates the operational complexity of cluster management, security configuration and software upgrades.</w:t>
+      </w:r>
+    </w:p>
+    <w:p>
+      <w:pPr>
+        <w:spacing w:after="160" w:line="278" w:lineRule="auto"/>
+      </w:pPr>
+      <w:hyperlink r:id="rId29" w:history="1">
+        <w:r>
+          <w:rPr>
+            <w:rStyle w:val="Hyperlink"/>
+          </w:rPr>
+          <w:t>https://www.elastic.co/de/cloud</w:t>
+        </w:r>
+      </w:hyperlink>
+      <w:r>
+        <w:tab/>
+      </w:r>
+    </w:p>
+    <w:p>
+      <w:pPr>
+        <w:spacing w:after="160" w:line="278" w:lineRule="auto"/>
+      </w:pPr>
+      <w:r>
+        <w:t>After creating an account and setting up a deployment, Elastic Cloud provides a web-based Kibana interface and a dedicated Elasticsearch endpoint URL. To connect the Python indexing script to the cloud instance, authentication via API key is required. The API key is</w:t>
+      </w:r>
+      <w:r>
+        <w:t xml:space="preserve"> </w:t>
+      </w:r>
+      <w:r>
+        <w:t>generated in the Elastic Cloud</w:t>
+      </w:r>
+      <w:r>
+        <w:t>.</w:t>
+      </w:r>
+    </w:p>
+    <w:p>
+      <w:pPr>
+        <w:spacing w:after="160" w:line="278" w:lineRule="auto"/>
+      </w:pPr>
+      <w:r>
+        <w:drawing>
+          <wp:inline distT="0" distB="0" distL="0" distR="0" wp14:anchorId="6416AD9E" wp14:editId="182BCE10">
+            <wp:extent cx="4066743" cy="2238375"/>
+            <wp:effectExtent l="0" t="0" r="0" b="0"/>
+            <wp:docPr id="135138375" name="Picture 1"/>
+            <wp:cNvGraphicFramePr>
+              <a:graphicFrameLocks xmlns:a="http://schemas.openxmlformats.org/drawingml/2006/main" noChangeAspect="1"/>
+            </wp:cNvGraphicFramePr>
+            <a:graphic xmlns:a="http://schemas.openxmlformats.org/drawingml/2006/main">
+              <a:graphicData uri="http://schemas.openxmlformats.org/drawingml/2006/picture">
+                <pic:pic xmlns:pic="http://schemas.openxmlformats.org/drawingml/2006/picture">
+                  <pic:nvPicPr>
+                    <pic:cNvPr id="135138375" name=""/>
+                    <pic:cNvPicPr/>
+                  </pic:nvPicPr>
+                  <pic:blipFill>
+                    <a:blip r:embed="rId30"/>
+                    <a:stretch>
+                      <a:fillRect/>
+                    </a:stretch>
+                  </pic:blipFill>
+                  <pic:spPr>
+                    <a:xfrm>
+                      <a:off x="0" y="0"/>
+                      <a:ext cx="4137770" cy="2277469"/>
+                    </a:xfrm>
+                    <a:prstGeom prst="rect">
+                      <a:avLst/>
+                    </a:prstGeom>
+                  </pic:spPr>
+                </pic:pic>
+              </a:graphicData>
+            </a:graphic>
+          </wp:inline>
+        </w:drawing>
+      </w:r>
+    </w:p>
+    <w:p>
+      <w:pPr>
+        <w:spacing w:after="160" w:line="278" w:lineRule="auto"/>
+      </w:pPr>
+      <w:r>
+        <w:lastRenderedPageBreak/>
+        <w:t>After running the indexing script against the cloud instance, the</w:t>
+      </w:r>
+      <w:r>
+        <w:t xml:space="preserve"> ‘f1’ </w:t>
+      </w:r>
+      <w:r>
+        <w:t>index is created with 26,759 documents</w:t>
+      </w:r>
+      <w:r>
+        <w:t xml:space="preserve">. </w:t>
+      </w:r>
+      <w:r>
+        <w:t>The index status is reported as green, indicating that all primary shards and replicas are fully allocated and the cluster is healthy.</w:t>
+      </w:r>
+      <w:r>
+        <w:drawing>
+          <wp:inline distT="0" distB="0" distL="0" distR="0" wp14:anchorId="02EA6890" wp14:editId="66F28604">
+            <wp:extent cx="5731510" cy="3176270"/>
+            <wp:effectExtent l="0" t="0" r="0" b="0"/>
+            <wp:docPr id="2138448199" name="Picture 1"/>
+            <wp:cNvGraphicFramePr>
+              <a:graphicFrameLocks xmlns:a="http://schemas.openxmlformats.org/drawingml/2006/main" noChangeAspect="1"/>
+            </wp:cNvGraphicFramePr>
+            <a:graphic xmlns:a="http://schemas.openxmlformats.org/drawingml/2006/main">
+              <a:graphicData uri="http://schemas.openxmlformats.org/drawingml/2006/picture">
+                <pic:pic xmlns:pic="http://schemas.openxmlformats.org/drawingml/2006/picture">
+                  <pic:nvPicPr>
+                    <pic:cNvPr id="2138448199" name=""/>
+                    <pic:cNvPicPr/>
+                  </pic:nvPicPr>
+                  <pic:blipFill>
+                    <a:blip r:embed="rId31"/>
+                    <a:stretch>
+                      <a:fillRect/>
+                    </a:stretch>
+                  </pic:blipFill>
+                  <pic:spPr>
+                    <a:xfrm>
+                      <a:off x="0" y="0"/>
+                      <a:ext cx="5731510" cy="3176270"/>
+                    </a:xfrm>
+                    <a:prstGeom prst="rect">
+                      <a:avLst/>
+                    </a:prstGeom>
+                  </pic:spPr>
+                </pic:pic>
+              </a:graphicData>
+            </a:graphic>
+          </wp:inline>
+        </w:drawing>
+      </w:r>
+    </w:p>
+    <w:p>
+      <w:pPr>
+        <w:spacing w:after="160" w:line="278" w:lineRule="auto"/>
+      </w:pPr>
+    </w:p>
+    <w:p>
+      <w:pPr>
+        <w:spacing w:after="160" w:line="278" w:lineRule="auto"/>
+      </w:pPr>
+      <w:r>
+        <w:t>Elastic Cloud is available through a 14-day free trial, after which a paid subscription is required.</w:t>
+      </w:r>
+    </w:p>
+    <w:p>
+      <w:pPr>
+        <w:spacing w:after="160" w:line="278" w:lineRule="auto"/>
+      </w:pPr>
+    </w:p>
+    <w:p>
+      <w:pPr>
+        <w:spacing w:after="160" w:line="278" w:lineRule="auto"/>
+      </w:pPr>
+    </w:p>
+    <w:p>
+      <w:pPr>
+        <w:spacing w:after="160" w:line="278" w:lineRule="auto"/>
+      </w:pPr>
+      <w:r>
+        <w:br w:type="page"/>
+      </w:r>
+    </w:p>
+    <w:p>
+      <w:pPr>
+        <w:spacing w:line="276" w:lineRule="auto"/>
+      </w:pPr>
+    </w:p>
+    <w:p>
+      <w:pPr>
+        <w:pStyle w:val="Heading1"/>
+        <w:numPr>
+          <w:ilvl w:val="0"/>
+          <w:numId w:val="4"/>
+        </w:numPr>
+      </w:pPr>
       <w:bookmarkStart w:id="4" w:name="_Toc229380754"/>
       <w:r>
         <w:t>References</w:t>
@@ -2354,7 +4561,7 @@
           <w:szCs w:val="21"/>
         </w:rPr>
       </w:pPr>
-      <w:hyperlink r:id="rId15" w:history="1">
+      <w:hyperlink r:id="rId32" w:history="1">
         <w:r>
           <w:rPr>
             <w:rStyle w:val="Hyperlink"/>
@@ -2381,7 +4588,7 @@
           <w:szCs w:val="21"/>
         </w:rPr>
       </w:pPr>
-      <w:hyperlink r:id="rId16" w:anchor=":~:text=The%20Elastic%20Stack%20is%20a,fit%20together%20across%20Elastic%20deployments" w:history="1">
+      <w:hyperlink r:id="rId33" w:anchor=":~:text=The%20Elastic%20Stack%20is%20a,fit%20together%20across%20Elastic%20deployments" w:history="1">
         <w:r>
           <w:rPr>
             <w:rStyle w:val="Hyperlink"/>
@@ -2417,7 +4624,7 @@
         </w:rPr>
         <w:t xml:space="preserve">[Dataset]: </w:t>
       </w:r>
-      <w:hyperlink r:id="rId17" w:history="1">
+      <w:hyperlink r:id="rId34" w:history="1">
         <w:r>
           <w:rPr>
             <w:rStyle w:val="Hyperlink"/>
@@ -2443,7 +4650,7 @@
           <w:szCs w:val="21"/>
         </w:rPr>
       </w:pPr>
-      <w:hyperlink r:id="rId18" w:history="1">
+      <w:hyperlink r:id="rId35" w:history="1">
         <w:r>
           <w:rPr>
             <w:rStyle w:val="Hyperlink"/>
@@ -2469,7 +4676,7 @@
           <w:szCs w:val="21"/>
         </w:rPr>
       </w:pPr>
-      <w:hyperlink r:id="rId19" w:history="1">
+      <w:hyperlink r:id="rId36" w:history="1">
         <w:r>
           <w:rPr>
             <w:rStyle w:val="Hyperlink"/>
@@ -2495,7 +4702,7 @@
           <w:szCs w:val="21"/>
         </w:rPr>
       </w:pPr>
-      <w:hyperlink r:id="rId20" w:history="1">
+      <w:hyperlink r:id="rId37" w:history="1">
         <w:r>
           <w:rPr>
             <w:rStyle w:val="Hyperlink"/>
@@ -2521,7 +4728,7 @@
           <w:szCs w:val="21"/>
         </w:rPr>
       </w:pPr>
-      <w:hyperlink r:id="rId21" w:history="1">
+      <w:hyperlink r:id="rId38" w:history="1">
         <w:r>
           <w:rPr>
             <w:rStyle w:val="Hyperlink"/>
@@ -2546,7 +4753,7 @@
           <w:color w:val="000000" w:themeColor="text1"/>
         </w:rPr>
       </w:pPr>
-      <w:hyperlink r:id="rId22" w:history="1">
+      <w:hyperlink r:id="rId39" w:history="1">
         <w:r>
           <w:rPr>
             <w:rStyle w:val="Hyperlink"/>
@@ -2569,13 +4776,75 @@
           <w:color w:val="000000" w:themeColor="text1"/>
         </w:rPr>
       </w:pPr>
-      <w:hyperlink r:id="rId23" w:history="1">
+      <w:hyperlink r:id="rId40" w:history="1">
         <w:r>
           <w:rPr>
             <w:rStyle w:val="Hyperlink"/>
             <w:color w:val="000000" w:themeColor="text1"/>
           </w:rPr>
           <w:t>https://www.elastic.co/guide/en/elasticsearch/reference/current/documents-indices.html</w:t>
+        </w:r>
+      </w:hyperlink>
+    </w:p>
+    <w:p>
+      <w:pPr>
+        <w:pStyle w:val="ListParagraph"/>
+        <w:numPr>
+          <w:ilvl w:val="0"/>
+          <w:numId w:val="9"/>
+        </w:numPr>
+        <w:spacing w:line="276" w:lineRule="auto"/>
+        <w:rPr>
+          <w:color w:val="000000" w:themeColor="text1"/>
+        </w:rPr>
+      </w:pPr>
+      <w:hyperlink r:id="rId41" w:history="1">
+        <w:r>
+          <w:rPr>
+            <w:rStyle w:val="Hyperlink"/>
+            <w:color w:val="000000" w:themeColor="text1"/>
+          </w:rPr>
+          <w:t>https://www.elastic.co/docs/solutions/search/full-text/how-full-text-works</w:t>
+        </w:r>
+      </w:hyperlink>
+    </w:p>
+    <w:p>
+      <w:pPr>
+        <w:pStyle w:val="ListParagraph"/>
+        <w:numPr>
+          <w:ilvl w:val="0"/>
+          <w:numId w:val="9"/>
+        </w:numPr>
+        <w:spacing w:line="276" w:lineRule="auto"/>
+        <w:rPr>
+          <w:color w:val="000000" w:themeColor="text1"/>
+        </w:rPr>
+      </w:pPr>
+      <w:hyperlink r:id="rId42" w:history="1">
+        <w:r>
+          <w:rPr>
+            <w:rStyle w:val="Hyperlink"/>
+            <w:color w:val="000000" w:themeColor="text1"/>
+          </w:rPr>
+          <w:t>https://www.elastic.co/docs/explore-analyze/query-filter/languages/querydsl</w:t>
+        </w:r>
+      </w:hyperlink>
+    </w:p>
+    <w:p>
+      <w:pPr>
+        <w:pStyle w:val="ListParagraph"/>
+        <w:numPr>
+          <w:ilvl w:val="0"/>
+          <w:numId w:val="9"/>
+        </w:numPr>
+        <w:spacing w:line="276" w:lineRule="auto"/>
+      </w:pPr>
+      <w:hyperlink r:id="rId43" w:history="1">
+        <w:r>
+          <w:rPr>
+            <w:rStyle w:val="Hyperlink"/>
+          </w:rPr>
+          <w:t>https://www.elastic.co/de/cloud</w:t>
         </w:r>
       </w:hyperlink>
     </w:p>
@@ -2644,6 +4913,44 @@
 </w:document>
 </file>
 
+<file path=word/endnotes.xml><?xml version="1.0" encoding="utf-8"?>
+<w:endnotes xmlns:wpc="http://schemas.microsoft.com/office/word/2010/wordprocessingCanvas" xmlns:cx="http://schemas.microsoft.com/office/drawing/2014/chartex" xmlns:cx1="http://schemas.microsoft.com/office/drawing/2015/9/8/chartex" xmlns:cx2="http://schemas.microsoft.com/office/drawing/2015/10/21/chartex" xmlns:cx3="http://schemas.microsoft.com/office/drawing/2016/5/9/chartex" xmlns:cx4="http://schemas.microsoft.com/office/drawing/2016/5/10/chartex" xmlns:cx5="http://schemas.microsoft.com/office/drawing/2016/5/11/chartex" xmlns:cx6="http://schemas.microsoft.com/office/drawing/2016/5/12/chartex" xmlns:cx7="http://schemas.microsoft.com/office/drawing/2016/5/13/chartex" xmlns:cx8="http://schemas.microsoft.com/office/drawing/2016/5/14/chartex" xmlns:mc="http://schemas.openxmlformats.org/markup-compatibility/2006" xmlns:aink="http://schemas.microsoft.com/office/drawing/2016/ink" xmlns:am3d="http://schemas.microsoft.com/office/drawing/2017/model3d" xmlns:o="urn:schemas-microsoft-com:office:office" xmlns:oel="http://schemas.microsoft.com/office/2019/extlst" xmlns:r="http://schemas.openxmlformats.org/officeDocument/2006/relationships" xmlns:m="http://schemas.openxmlformats.org/officeDocument/2006/math" xmlns:v="urn:schemas-microsoft-com:vml" xmlns:wp14="http://schemas.microsoft.com/office/word/2010/wordprocessingDrawing" xmlns:wp="http://schemas.openxmlformats.org/drawingml/2006/wordprocessingDrawing" xmlns:w10="urn:schemas-microsoft-com:office:word" xmlns:w="http://schemas.openxmlformats.org/wordprocessingml/2006/main" xmlns:w14="http://schemas.microsoft.com/office/word/2010/wordml" xmlns:w15="http://schemas.microsoft.com/office/word/2012/wordml" xmlns:w16cex="http://schemas.microsoft.com/office/word/2018/wordml/cex" xmlns:w16cid="http://schemas.microsoft.com/office/word/2016/wordml/cid" xmlns:w16="http://schemas.microsoft.com/office/word/2018/wordml" xmlns:w16du="http://schemas.microsoft.com/office/word/2023/wordml/word16du" xmlns:w16sdtdh="http://schemas.microsoft.com/office/word/2020/wordml/sdtdatahash" xmlns:w16sdtfl="http://schemas.microsoft.com/office/word/2024/wordml/sdtformatlock" xmlns:w16se="http://schemas.microsoft.com/office/word/2015/wordml/symex" xmlns:wpg="http://schemas.microsoft.com/office/word/2010/wordprocessingGroup" xmlns:wpi="http://schemas.microsoft.com/office/word/2010/wordprocessingInk" xmlns:wne="http://schemas.microsoft.com/office/word/2006/wordml" xmlns:wps="http://schemas.microsoft.com/office/word/2010/wordprocessingShape" mc:Ignorable="w14 w15 w16se w16cid w16 w16cex w16sdtdh w16sdtfl w16du wp14">
+  <w:endnote w:type="separator" w:id="-1">
+    <w:p>
+      <w:r>
+        <w:separator/>
+      </w:r>
+    </w:p>
+  </w:endnote>
+  <w:endnote w:type="continuationSeparator" w:id="0">
+    <w:p>
+      <w:r>
+        <w:continuationSeparator/>
+      </w:r>
+    </w:p>
+  </w:endnote>
+</w:endnotes>
+</file>
+
+<file path=word/footnotes.xml><?xml version="1.0" encoding="utf-8"?>
+<w:footnotes xmlns:wpc="http://schemas.microsoft.com/office/word/2010/wordprocessingCanvas" xmlns:cx="http://schemas.microsoft.com/office/drawing/2014/chartex" xmlns:cx1="http://schemas.microsoft.com/office/drawing/2015/9/8/chartex" xmlns:cx2="http://schemas.microsoft.com/office/drawing/2015/10/21/chartex" xmlns:cx3="http://schemas.microsoft.com/office/drawing/2016/5/9/chartex" xmlns:cx4="http://schemas.microsoft.com/office/drawing/2016/5/10/chartex" xmlns:cx5="http://schemas.microsoft.com/office/drawing/2016/5/11/chartex" xmlns:cx6="http://schemas.microsoft.com/office/drawing/2016/5/12/chartex" xmlns:cx7="http://schemas.microsoft.com/office/drawing/2016/5/13/chartex" xmlns:cx8="http://schemas.microsoft.com/office/drawing/2016/5/14/chartex" xmlns:mc="http://schemas.openxmlformats.org/markup-compatibility/2006" xmlns:aink="http://schemas.microsoft.com/office/drawing/2016/ink" xmlns:am3d="http://schemas.microsoft.com/office/drawing/2017/model3d" xmlns:o="urn:schemas-microsoft-com:office:office" xmlns:oel="http://schemas.microsoft.com/office/2019/extlst" xmlns:r="http://schemas.openxmlformats.org/officeDocument/2006/relationships" xmlns:m="http://schemas.openxmlformats.org/officeDocument/2006/math" xmlns:v="urn:schemas-microsoft-com:vml" xmlns:wp14="http://schemas.microsoft.com/office/word/2010/wordprocessingDrawing" xmlns:wp="http://schemas.openxmlformats.org/drawingml/2006/wordprocessingDrawing" xmlns:w10="urn:schemas-microsoft-com:office:word" xmlns:w="http://schemas.openxmlformats.org/wordprocessingml/2006/main" xmlns:w14="http://schemas.microsoft.com/office/word/2010/wordml" xmlns:w15="http://schemas.microsoft.com/office/word/2012/wordml" xmlns:w16cex="http://schemas.microsoft.com/office/word/2018/wordml/cex" xmlns:w16cid="http://schemas.microsoft.com/office/word/2016/wordml/cid" xmlns:w16="http://schemas.microsoft.com/office/word/2018/wordml" xmlns:w16du="http://schemas.microsoft.com/office/word/2023/wordml/word16du" xmlns:w16sdtdh="http://schemas.microsoft.com/office/word/2020/wordml/sdtdatahash" xmlns:w16sdtfl="http://schemas.microsoft.com/office/word/2024/wordml/sdtformatlock" xmlns:w16se="http://schemas.microsoft.com/office/word/2015/wordml/symex" xmlns:wpg="http://schemas.microsoft.com/office/word/2010/wordprocessingGroup" xmlns:wpi="http://schemas.microsoft.com/office/word/2010/wordprocessingInk" xmlns:wne="http://schemas.microsoft.com/office/word/2006/wordml" xmlns:wps="http://schemas.microsoft.com/office/word/2010/wordprocessingShape" mc:Ignorable="w14 w15 w16se w16cid w16 w16cex w16sdtdh w16sdtfl w16du wp14">
+  <w:footnote w:type="separator" w:id="-1">
+    <w:p>
+      <w:r>
+        <w:separator/>
+      </w:r>
+    </w:p>
+  </w:footnote>
+  <w:footnote w:type="continuationSeparator" w:id="0">
+    <w:p>
+      <w:r>
+        <w:continuationSeparator/>
+      </w:r>
+    </w:p>
+  </w:footnote>
+</w:footnotes>
+</file>
+
 <file path=word/numbering.xml><?xml version="1.0" encoding="utf-8"?>
 <w:numbering xmlns:wpc="http://schemas.microsoft.com/office/word/2010/wordprocessingCanvas" xmlns:cx="http://schemas.microsoft.com/office/drawing/2014/chartex" xmlns:cx1="http://schemas.microsoft.com/office/drawing/2015/9/8/chartex" xmlns:cx2="http://schemas.microsoft.com/office/drawing/2015/10/21/chartex" xmlns:cx3="http://schemas.microsoft.com/office/drawing/2016/5/9/chartex" xmlns:cx4="http://schemas.microsoft.com/office/drawing/2016/5/10/chartex" xmlns:cx5="http://schemas.microsoft.com/office/drawing/2016/5/11/chartex" xmlns:cx6="http://schemas.microsoft.com/office/drawing/2016/5/12/chartex" xmlns:cx7="http://schemas.microsoft.com/office/drawing/2016/5/13/chartex" xmlns:cx8="http://schemas.microsoft.com/office/drawing/2016/5/14/chartex" xmlns:mc="http://schemas.openxmlformats.org/markup-compatibility/2006" xmlns:aink="http://schemas.microsoft.com/office/drawing/2016/ink" xmlns:am3d="http://schemas.microsoft.com/office/drawing/2017/model3d" xmlns:o="urn:schemas-microsoft-com:office:office" xmlns:oel="http://schemas.microsoft.com/office/2019/extlst" xmlns:r="http://schemas.openxmlformats.org/officeDocument/2006/relationships" xmlns:m="http://schemas.openxmlformats.org/officeDocument/2006/math" xmlns:v="urn:schemas-microsoft-com:vml" xmlns:wp14="http://schemas.microsoft.com/office/word/2010/wordprocessingDrawing" xmlns:wp="http://schemas.openxmlformats.org/drawingml/2006/wordprocessingDrawing" xmlns:w10="urn:schemas-microsoft-com:office:word" xmlns:w="http://schemas.openxmlformats.org/wordprocessingml/2006/main" xmlns:w14="http://schemas.microsoft.com/office/word/2010/wordml" xmlns:w15="http://schemas.microsoft.com/office/word/2012/wordml" xmlns:w16cex="http://schemas.microsoft.com/office/word/2018/wordml/cex" xmlns:w16cid="http://schemas.microsoft.com/office/word/2016/wordml/cid" xmlns:w16="http://schemas.microsoft.com/office/word/2018/wordml" xmlns:w16du="http://schemas.microsoft.com/office/word/2023/wordml/word16du" xmlns:w16sdtdh="http://schemas.microsoft.com/office/word/2020/wordml/sdtdatahash" xmlns:w16sdtfl="http://schemas.microsoft.com/office/word/2024/wordml/sdtformatlock" xmlns:w16se="http://schemas.microsoft.com/office/word/2015/wordml/symex" xmlns:wpg="http://schemas.microsoft.com/office/word/2010/wordprocessingGroup" xmlns:wpi="http://schemas.microsoft.com/office/word/2010/wordprocessingInk" xmlns:wne="http://schemas.microsoft.com/office/word/2006/wordml" xmlns:wps="http://schemas.microsoft.com/office/word/2010/wordprocessingShape" mc:Ignorable="w14 w15 w16se w16cid w16 w16cex w16sdtdh w16sdtfl w16du wp14">
   <w:abstractNum w:abstractNumId="0" w15:restartNumberingAfterBreak="0">
@@ -3185,6 +5492,118 @@
     </w:lvl>
   </w:abstractNum>
   <w:abstractNum w:abstractNumId="5" w15:restartNumberingAfterBreak="0">
+    <w:nsid w:val="38FC4A57"/>
+    <w:multiLevelType w:val="hybridMultilevel"/>
+    <w:tmpl w:val="6F185854"/>
+    <w:lvl w:ilvl="0" w:tplc="F5F68B82">
+      <w:numFmt w:val="bullet"/>
+      <w:lvlText w:val="-"/>
+      <w:lvlJc w:val="left"/>
+      <w:pPr>
+        <w:ind w:left="720" w:hanging="360"/>
+      </w:pPr>
+      <w:rPr>
+        <w:rFonts w:ascii="Times New Roman" w:eastAsia="Times New Roman" w:hAnsi="Times New Roman" w:cs="Times New Roman" w:hint="default"/>
+      </w:rPr>
+    </w:lvl>
+    <w:lvl w:ilvl="1" w:tplc="08090003" w:tentative="1">
+      <w:start w:val="1"/>
+      <w:numFmt w:val="bullet"/>
+      <w:lvlText w:val="o"/>
+      <w:lvlJc w:val="left"/>
+      <w:pPr>
+        <w:ind w:left="1440" w:hanging="360"/>
+      </w:pPr>
+      <w:rPr>
+        <w:rFonts w:ascii="Courier New" w:hAnsi="Courier New" w:cs="Courier New" w:hint="default"/>
+      </w:rPr>
+    </w:lvl>
+    <w:lvl w:ilvl="2" w:tplc="08090005" w:tentative="1">
+      <w:start w:val="1"/>
+      <w:numFmt w:val="bullet"/>
+      <w:lvlText w:val=""/>
+      <w:lvlJc w:val="left"/>
+      <w:pPr>
+        <w:ind w:left="2160" w:hanging="360"/>
+      </w:pPr>
+      <w:rPr>
+        <w:rFonts w:ascii="Wingdings" w:hAnsi="Wingdings" w:hint="default"/>
+      </w:rPr>
+    </w:lvl>
+    <w:lvl w:ilvl="3" w:tplc="08090001" w:tentative="1">
+      <w:start w:val="1"/>
+      <w:numFmt w:val="bullet"/>
+      <w:lvlText w:val=""/>
+      <w:lvlJc w:val="left"/>
+      <w:pPr>
+        <w:ind w:left="2880" w:hanging="360"/>
+      </w:pPr>
+      <w:rPr>
+        <w:rFonts w:ascii="Symbol" w:hAnsi="Symbol" w:hint="default"/>
+      </w:rPr>
+    </w:lvl>
+    <w:lvl w:ilvl="4" w:tplc="08090003" w:tentative="1">
+      <w:start w:val="1"/>
+      <w:numFmt w:val="bullet"/>
+      <w:lvlText w:val="o"/>
+      <w:lvlJc w:val="left"/>
+      <w:pPr>
+        <w:ind w:left="3600" w:hanging="360"/>
+      </w:pPr>
+      <w:rPr>
+        <w:rFonts w:ascii="Courier New" w:hAnsi="Courier New" w:cs="Courier New" w:hint="default"/>
+      </w:rPr>
+    </w:lvl>
+    <w:lvl w:ilvl="5" w:tplc="08090005" w:tentative="1">
+      <w:start w:val="1"/>
+      <w:numFmt w:val="bullet"/>
+      <w:lvlText w:val=""/>
+      <w:lvlJc w:val="left"/>
+      <w:pPr>
+        <w:ind w:left="4320" w:hanging="360"/>
+      </w:pPr>
+      <w:rPr>
+        <w:rFonts w:ascii="Wingdings" w:hAnsi="Wingdings" w:hint="default"/>
+      </w:rPr>
+    </w:lvl>
+    <w:lvl w:ilvl="6" w:tplc="08090001" w:tentative="1">
+      <w:start w:val="1"/>
+      <w:numFmt w:val="bullet"/>
+      <w:lvlText w:val=""/>
+      <w:lvlJc w:val="left"/>
+      <w:pPr>
+        <w:ind w:left="5040" w:hanging="360"/>
+      </w:pPr>
+      <w:rPr>
+        <w:rFonts w:ascii="Symbol" w:hAnsi="Symbol" w:hint="default"/>
+      </w:rPr>
+    </w:lvl>
+    <w:lvl w:ilvl="7" w:tplc="08090003" w:tentative="1">
+      <w:start w:val="1"/>
+      <w:numFmt w:val="bullet"/>
+      <w:lvlText w:val="o"/>
+      <w:lvlJc w:val="left"/>
+      <w:pPr>
+        <w:ind w:left="5760" w:hanging="360"/>
+      </w:pPr>
+      <w:rPr>
+        <w:rFonts w:ascii="Courier New" w:hAnsi="Courier New" w:cs="Courier New" w:hint="default"/>
+      </w:rPr>
+    </w:lvl>
+    <w:lvl w:ilvl="8" w:tplc="08090005" w:tentative="1">
+      <w:start w:val="1"/>
+      <w:numFmt w:val="bullet"/>
+      <w:lvlText w:val=""/>
+      <w:lvlJc w:val="left"/>
+      <w:pPr>
+        <w:ind w:left="6480" w:hanging="360"/>
+      </w:pPr>
+      <w:rPr>
+        <w:rFonts w:ascii="Wingdings" w:hAnsi="Wingdings" w:hint="default"/>
+      </w:rPr>
+    </w:lvl>
+  </w:abstractNum>
+  <w:abstractNum w:abstractNumId="6" w15:restartNumberingAfterBreak="0">
     <w:nsid w:val="4C31416B"/>
     <w:multiLevelType w:val="multilevel"/>
     <w:tmpl w:val="04070025"/>
@@ -3270,7 +5689,7 @@
       </w:pPr>
     </w:lvl>
   </w:abstractNum>
-  <w:abstractNum w:abstractNumId="6" w15:restartNumberingAfterBreak="0">
+  <w:abstractNum w:abstractNumId="7" w15:restartNumberingAfterBreak="0">
     <w:nsid w:val="511D187E"/>
     <w:multiLevelType w:val="multilevel"/>
     <w:tmpl w:val="0407001F"/>
@@ -3356,7 +5775,7 @@
       </w:pPr>
     </w:lvl>
   </w:abstractNum>
-  <w:abstractNum w:abstractNumId="7" w15:restartNumberingAfterBreak="0">
+  <w:abstractNum w:abstractNumId="8" w15:restartNumberingAfterBreak="0">
     <w:nsid w:val="54075CFE"/>
     <w:multiLevelType w:val="multilevel"/>
     <w:tmpl w:val="0407001F"/>
@@ -3442,7 +5861,7 @@
       </w:pPr>
     </w:lvl>
   </w:abstractNum>
-  <w:abstractNum w:abstractNumId="8" w15:restartNumberingAfterBreak="0">
+  <w:abstractNum w:abstractNumId="9" w15:restartNumberingAfterBreak="0">
     <w:nsid w:val="5A9E2655"/>
     <w:multiLevelType w:val="multilevel"/>
     <w:tmpl w:val="0407001F"/>
@@ -3528,7 +5947,7 @@
       </w:pPr>
     </w:lvl>
   </w:abstractNum>
-  <w:abstractNum w:abstractNumId="9" w15:restartNumberingAfterBreak="0">
+  <w:abstractNum w:abstractNumId="10" w15:restartNumberingAfterBreak="0">
     <w:nsid w:val="62E64D81"/>
     <w:multiLevelType w:val="multilevel"/>
     <w:tmpl w:val="04070025"/>
@@ -3627,22 +6046,22 @@
     <w:abstractNumId w:val="2"/>
   </w:num>
   <w:num w:numId="2" w16cid:durableId="48581088">
-    <w:abstractNumId w:val="9"/>
+    <w:abstractNumId w:val="10"/>
   </w:num>
   <w:num w:numId="3" w16cid:durableId="1675299582">
-    <w:abstractNumId w:val="6"/>
+    <w:abstractNumId w:val="7"/>
   </w:num>
   <w:num w:numId="4" w16cid:durableId="837967992">
     <w:abstractNumId w:val="3"/>
   </w:num>
   <w:num w:numId="5" w16cid:durableId="1291084741">
-    <w:abstractNumId w:val="8"/>
+    <w:abstractNumId w:val="9"/>
   </w:num>
   <w:num w:numId="6" w16cid:durableId="271859767">
-    <w:abstractNumId w:val="5"/>
+    <w:abstractNumId w:val="6"/>
   </w:num>
   <w:num w:numId="7" w16cid:durableId="1720787299">
-    <w:abstractNumId w:val="7"/>
+    <w:abstractNumId w:val="8"/>
   </w:num>
   <w:num w:numId="8" w16cid:durableId="1798832943">
     <w:abstractNumId w:val="1"/>
@@ -3652,6 +6071,9 @@
   </w:num>
   <w:num w:numId="10" w16cid:durableId="56704278">
     <w:abstractNumId w:val="4"/>
+  </w:num>
+  <w:num w:numId="11" w16cid:durableId="1765571575">
+    <w:abstractNumId w:val="5"/>
   </w:num>
 </w:numbering>
 </file>
@@ -4266,7 +6688,6 @@
   <w:style w:type="character" w:default="1" w:styleId="DefaultParagraphFont">
     <w:name w:val="Default Paragraph Font"/>
     <w:uiPriority w:val="1"/>
-    <w:semiHidden/>
     <w:unhideWhenUsed/>
   </w:style>
   <w:style w:type="table" w:default="1" w:styleId="TableNormal">
@@ -4786,6 +7207,120 @@
       <w:szCs w:val="20"/>
     </w:rPr>
   </w:style>
+  <w:style w:type="character" w:customStyle="1" w:styleId="notion-enable-hover">
+    <w:name w:val="notion-enable-hover"/>
+    <w:basedOn w:val="DefaultParagraphFont"/>
+    <w:rsid w:val="00093895"/>
+  </w:style>
+  <w:style w:type="paragraph" w:styleId="HTMLPreformatted">
+    <w:name w:val="HTML Preformatted"/>
+    <w:basedOn w:val="Normal"/>
+    <w:link w:val="HTMLPreformattedChar"/>
+    <w:uiPriority w:val="99"/>
+    <w:semiHidden/>
+    <w:unhideWhenUsed/>
+    <w:rsid w:val="00B7780B"/>
+    <w:pPr>
+      <w:tabs>
+        <w:tab w:val="left" w:pos="916"/>
+        <w:tab w:val="left" w:pos="1832"/>
+        <w:tab w:val="left" w:pos="2748"/>
+        <w:tab w:val="left" w:pos="3664"/>
+        <w:tab w:val="left" w:pos="4580"/>
+        <w:tab w:val="left" w:pos="5496"/>
+        <w:tab w:val="left" w:pos="6412"/>
+        <w:tab w:val="left" w:pos="7328"/>
+        <w:tab w:val="left" w:pos="8244"/>
+        <w:tab w:val="left" w:pos="9160"/>
+        <w:tab w:val="left" w:pos="10076"/>
+        <w:tab w:val="left" w:pos="10992"/>
+        <w:tab w:val="left" w:pos="11908"/>
+        <w:tab w:val="left" w:pos="12824"/>
+        <w:tab w:val="left" w:pos="13740"/>
+        <w:tab w:val="left" w:pos="14656"/>
+      </w:tabs>
+    </w:pPr>
+    <w:rPr>
+      <w:rFonts w:ascii="Courier New" w:hAnsi="Courier New" w:cs="Courier New"/>
+      <w:sz w:val="20"/>
+      <w:szCs w:val="20"/>
+    </w:rPr>
+  </w:style>
+  <w:style w:type="character" w:customStyle="1" w:styleId="HTMLPreformattedChar">
+    <w:name w:val="HTML Preformatted Char"/>
+    <w:basedOn w:val="DefaultParagraphFont"/>
+    <w:link w:val="HTMLPreformatted"/>
+    <w:uiPriority w:val="99"/>
+    <w:semiHidden/>
+    <w:rsid w:val="00B7780B"/>
+    <w:rPr>
+      <w:rFonts w:ascii="Courier New" w:eastAsia="Times New Roman" w:hAnsi="Courier New" w:cs="Courier New"/>
+      <w:kern w:val="0"/>
+      <w:sz w:val="20"/>
+      <w:szCs w:val="20"/>
+      <w:lang w:eastAsia="en-GB"/>
+      <w14:ligatures w14:val="none"/>
+    </w:rPr>
+  </w:style>
+  <w:style w:type="character" w:customStyle="1" w:styleId="apple-converted-space">
+    <w:name w:val="apple-converted-space"/>
+    <w:basedOn w:val="DefaultParagraphFont"/>
+    <w:rsid w:val="00BB378E"/>
+  </w:style>
+  <w:style w:type="paragraph" w:styleId="Header">
+    <w:name w:val="header"/>
+    <w:basedOn w:val="Normal"/>
+    <w:link w:val="HeaderChar"/>
+    <w:uiPriority w:val="99"/>
+    <w:unhideWhenUsed/>
+    <w:rsid w:val="00B62302"/>
+    <w:pPr>
+      <w:tabs>
+        <w:tab w:val="center" w:pos="4513"/>
+        <w:tab w:val="right" w:pos="9026"/>
+      </w:tabs>
+    </w:pPr>
+  </w:style>
+  <w:style w:type="character" w:customStyle="1" w:styleId="HeaderChar">
+    <w:name w:val="Header Char"/>
+    <w:basedOn w:val="DefaultParagraphFont"/>
+    <w:link w:val="Header"/>
+    <w:uiPriority w:val="99"/>
+    <w:rsid w:val="00B62302"/>
+    <w:rPr>
+      <w:rFonts w:ascii="Times New Roman" w:eastAsia="Times New Roman" w:hAnsi="Times New Roman" w:cs="Times New Roman"/>
+      <w:kern w:val="0"/>
+      <w:lang w:eastAsia="en-GB"/>
+      <w14:ligatures w14:val="none"/>
+    </w:rPr>
+  </w:style>
+  <w:style w:type="paragraph" w:styleId="Footer">
+    <w:name w:val="footer"/>
+    <w:basedOn w:val="Normal"/>
+    <w:link w:val="FooterChar"/>
+    <w:uiPriority w:val="99"/>
+    <w:unhideWhenUsed/>
+    <w:rsid w:val="00B62302"/>
+    <w:pPr>
+      <w:tabs>
+        <w:tab w:val="center" w:pos="4513"/>
+        <w:tab w:val="right" w:pos="9026"/>
+      </w:tabs>
+    </w:pPr>
+  </w:style>
+  <w:style w:type="character" w:customStyle="1" w:styleId="FooterChar">
+    <w:name w:val="Footer Char"/>
+    <w:basedOn w:val="DefaultParagraphFont"/>
+    <w:link w:val="Footer"/>
+    <w:uiPriority w:val="99"/>
+    <w:rsid w:val="00B62302"/>
+    <w:rPr>
+      <w:rFonts w:ascii="Times New Roman" w:eastAsia="Times New Roman" w:hAnsi="Times New Roman" w:cs="Times New Roman"/>
+      <w:kern w:val="0"/>
+      <w:lang w:eastAsia="en-GB"/>
+      <w14:ligatures w14:val="none"/>
+    </w:rPr>
+  </w:style>
 </w:styles>
 </file>
 

</xml_diff>

<commit_message>
Kibana Dashboard section added to paper
</commit_message>
<xml_diff>
--- a/Elasticsearch_Paper.docx
+++ b/Elasticsearch_Paper.docx
@@ -31,7 +31,7 @@
           <w:noProof/>
         </w:rPr>
         <w:drawing>
-          <wp:inline distT="0" distB="0" distL="0" distR="0" wp14:anchorId="5A103B59" wp14:editId="764598D4">
+          <wp:inline distT="0" distB="0" distL="0" distR="0" wp14:anchorId="5A103B59" wp14:editId="190B1F58">
             <wp:extent cx="4812162" cy="1307804"/>
             <wp:effectExtent l="0" t="0" r="1270" b="635"/>
             <wp:docPr id="1881383930" name="Picture 1" descr="A red and black logo&#10;&#10;AI-generated content may be incorrect."/>
@@ -385,87 +385,11 @@
     </w:p>
     <w:p>
       <w:pPr>
-        <w:spacing w:line="276" w:lineRule="auto"/>
-        <w:jc w:val="both"/>
-      </w:pPr>
-    </w:p>
-    <w:p>
-      <w:pPr>
-        <w:pStyle w:val="Heading1"/>
-        <w:numPr>
-          <w:ilvl w:val="1"/>
-          <w:numId w:val="4"/>
-        </w:numPr>
-        <w:ind w:left="567" w:hanging="573"/>
-        <w:rPr>
-          <w:sz w:val="32"/>
-          <w:szCs w:val="32"/>
-        </w:rPr>
-      </w:pPr>
-      <w:r>
-        <w:rPr>
-          <w:sz w:val="32"/>
-          <w:szCs w:val="32"/>
-        </w:rPr>
-        <w:t>The F1 Elasticsearch Project</w:t>
-      </w:r>
-    </w:p>
-    <w:p>
-      <w:pPr>
-        <w:spacing w:line="276" w:lineRule="auto"/>
-        <w:jc w:val="both"/>
-      </w:pPr>
-      <w:r>
-        <w:rPr>
-          <w:highlight w:val="yellow"/>
-        </w:rPr>
-        <w:t>Move to Project section</w:t>
-      </w:r>
-    </w:p>
-    <w:p>
-      <w:pPr>
-        <w:spacing w:line="276" w:lineRule="auto"/>
-        <w:jc w:val="both"/>
-      </w:pPr>
-      <w:r>
-        <w:t xml:space="preserve">To demenstrate Elasticsearch and its core functionality in practice, I decided to develop the µ-Project using the Formula 1 World Championship dataset from </w:t>
-      </w:r>
-      <w:hyperlink r:id="rId9" w:history="1">
-        <w:r>
-          <w:rPr>
-            <w:rStyle w:val="Hyperlink"/>
-          </w:rPr>
-          <w:t>Kaggle</w:t>
-        </w:r>
-      </w:hyperlink>
-      <w:r>
-        <w:t xml:space="preserve"> </w:t>
-      </w:r>
-      <w:r>
-        <w:t>.</w:t>
-      </w:r>
-      <w:r>
-        <w:t xml:space="preserve"> This dataset covers races results from1950 to 2024. The dataset consists of many .csv Files containing information about races, results, drivers, consructors, cicuits and race statuses. These files are loaded and merged into a single flat structure using Python and pandas and then indexed into Elasticsearch as </w:t>
-      </w:r>
-      <w:r>
-        <w:t>26,759 individual documents</w:t>
-      </w:r>
-      <w:r>
-        <w:t>.</w:t>
-      </w:r>
-      <w:r>
-        <w:t xml:space="preserve"> A Python script demonstrates the core querying capabilities </w:t>
-      </w:r>
-      <w:r>
-        <w:lastRenderedPageBreak/>
-        <w:t>of Elasticsearch including full-text search, fuzzy search, boolean queries and aggregations. The data is additionally visualized through a Kibana dashboard. Both, Elasticsearch and Kibana, are running alongside in Docker containers.</w:t>
-      </w:r>
-    </w:p>
-    <w:p>
-      <w:pPr>
-        <w:spacing w:line="276" w:lineRule="auto"/>
-        <w:jc w:val="both"/>
-      </w:pPr>
+        <w:spacing w:after="160" w:line="278" w:lineRule="auto"/>
+      </w:pPr>
+      <w:r>
+        <w:br w:type="page"/>
+      </w:r>
     </w:p>
     <w:p>
       <w:pPr>
@@ -476,6 +400,7 @@
         </w:numPr>
       </w:pPr>
       <w:r>
+        <w:lastRenderedPageBreak/>
         <w:t>Fundamentals of Elasticsearch</w:t>
       </w:r>
     </w:p>
@@ -1061,7 +986,6 @@
           <w:sz w:val="32"/>
           <w:szCs w:val="32"/>
         </w:rPr>
-        <w:lastRenderedPageBreak/>
         <w:t>When to use Elasticsearch</w:t>
       </w:r>
     </w:p>
@@ -1246,7 +1170,7 @@
                     <pic:cNvPicPr/>
                   </pic:nvPicPr>
                   <pic:blipFill>
-                    <a:blip r:embed="rId10"/>
+                    <a:blip r:embed="rId9"/>
                     <a:stretch>
                       <a:fillRect/>
                     </a:stretch>
@@ -1275,27 +1199,14 @@
       <w:r>
         <w:t xml:space="preserve">Figure </w:t>
       </w:r>
-      <w:r>
-        <w:fldChar w:fldCharType="begin"/>
-      </w:r>
-      <w:r>
-        <w:instrText xml:space="preserve"> SEQ Figure \* ARABIC </w:instrText>
-      </w:r>
-      <w:r>
-        <w:fldChar w:fldCharType="separate"/>
-      </w:r>
-      <w:r>
-        <w:rPr>
-          <w:noProof/>
-        </w:rPr>
-        <w:t>1</w:t>
-      </w:r>
-      <w:r>
-        <w:rPr>
-          <w:noProof/>
-        </w:rPr>
-        <w:fldChar w:fldCharType="end"/>
-      </w:r>
+      <w:fldSimple w:instr=" SEQ Figure \* ARABIC ">
+        <w:r>
+          <w:rPr>
+            <w:noProof/>
+          </w:rPr>
+          <w:t>1</w:t>
+        </w:r>
+      </w:fldSimple>
       <w:r>
         <w:t xml:space="preserve">: Based on description of </w:t>
       </w:r>
@@ -1594,7 +1505,7 @@
                     <pic:cNvPicPr/>
                   </pic:nvPicPr>
                   <pic:blipFill>
-                    <a:blip r:embed="rId11"/>
+                    <a:blip r:embed="rId10"/>
                     <a:stretch>
                       <a:fillRect/>
                     </a:stretch>
@@ -1771,7 +1682,7 @@
                     </pic:cNvPicPr>
                   </pic:nvPicPr>
                   <pic:blipFill>
-                    <a:blip r:embed="rId12">
+                    <a:blip r:embed="rId11">
                       <a:extLst>
                         <a:ext uri="{28A0092B-C50C-407E-A947-70E740481C1C}">
                           <a14:useLocalDpi xmlns:a14="http://schemas.microsoft.com/office/drawing/2010/main" val="0"/>
@@ -1962,7 +1873,7 @@
                           </pic:cNvPicPr>
                         </pic:nvPicPr>
                         <pic:blipFill>
-                          <a:blip r:embed="rId13">
+                          <a:blip r:embed="rId12">
                             <a:extLst>
                               <a:ext uri="{28A0092B-C50C-407E-A947-70E740481C1C}">
                                 <a14:useLocalDpi xmlns:a14="http://schemas.microsoft.com/office/drawing/2010/main" val="0"/>
@@ -2405,6 +2316,9 @@
         <w:jc w:val="both"/>
       </w:pPr>
       <w:r>
+        <w:rPr>
+          <w:noProof/>
+        </w:rPr>
         <w:drawing>
           <wp:anchor distT="0" distB="0" distL="114300" distR="114300" simplePos="0" relativeHeight="251667456" behindDoc="1" locked="0" layoutInCell="1" allowOverlap="1" wp14:anchorId="5D7807C8" wp14:editId="444424B8">
             <wp:simplePos x="0" y="0"/>
@@ -2486,19 +2400,7 @@
           <w:rPr>
             <w:rStyle w:val="Hyperlink"/>
           </w:rPr>
-          <w:t>Sectio</w:t>
-        </w:r>
-        <w:r>
-          <w:rPr>
-            <w:rStyle w:val="Hyperlink"/>
-          </w:rPr>
-          <w:t>n</w:t>
-        </w:r>
-        <w:r>
-          <w:rPr>
-            <w:rStyle w:val="Hyperlink"/>
-          </w:rPr>
-          <w:t xml:space="preserve"> 4.2</w:t>
+          <w:t>Section 4.2</w:t>
         </w:r>
       </w:hyperlink>
       <w:r>
@@ -2572,24 +2474,14 @@
                             <w:r>
                               <w:t xml:space="preserve">Figure </w:t>
                             </w:r>
-                            <w:r>
-                              <w:fldChar w:fldCharType="begin"/>
-                            </w:r>
-                            <w:r>
-                              <w:instrText xml:space="preserve"> SEQ Figure \* ARABIC </w:instrText>
-                            </w:r>
-                            <w:r>
-                              <w:fldChar w:fldCharType="separate"/>
-                            </w:r>
-                            <w:r>
-                              <w:rPr>
-                                <w:noProof/>
-                              </w:rPr>
-                              <w:t>2</w:t>
-                            </w:r>
-                            <w:r>
-                              <w:fldChar w:fldCharType="end"/>
-                            </w:r>
+                            <w:fldSimple w:instr=" SEQ Figure \* ARABIC ">
+                              <w:r>
+                                <w:rPr>
+                                  <w:noProof/>
+                                </w:rPr>
+                                <w:t>2</w:t>
+                              </w:r>
+                            </w:fldSimple>
                             <w:r>
                               <w:t>:</w:t>
                             </w:r>
@@ -2902,6 +2794,9 @@
         <w:jc w:val="both"/>
       </w:pPr>
       <w:r>
+        <w:rPr>
+          <w:noProof/>
+        </w:rPr>
         <w:drawing>
           <wp:inline distT="0" distB="0" distL="0" distR="0" wp14:anchorId="6472AE41" wp14:editId="0F6E763A">
             <wp:extent cx="1887166" cy="1406473"/>
@@ -2968,6 +2863,9 @@
         <w:jc w:val="both"/>
       </w:pPr>
       <w:r>
+        <w:rPr>
+          <w:noProof/>
+        </w:rPr>
         <w:drawing>
           <wp:anchor distT="0" distB="0" distL="114300" distR="114300" simplePos="0" relativeHeight="251670528" behindDoc="0" locked="0" layoutInCell="1" allowOverlap="1" wp14:anchorId="6C95A582" wp14:editId="6101518D">
             <wp:simplePos x="0" y="0"/>
@@ -3199,6 +3097,9 @@
     <w:p/>
     <w:p>
       <w:r>
+        <w:rPr>
+          <w:noProof/>
+        </w:rPr>
         <w:drawing>
           <wp:inline distT="0" distB="0" distL="0" distR="0" wp14:anchorId="4DA9C130" wp14:editId="4133FD04">
             <wp:extent cx="2986391" cy="1125307"/>
@@ -3256,6 +3157,9 @@
         <w:jc w:val="both"/>
       </w:pPr>
       <w:r>
+        <w:rPr>
+          <w:noProof/>
+        </w:rPr>
         <w:drawing>
           <wp:inline distT="0" distB="0" distL="0" distR="0" wp14:anchorId="4E6AE5D1" wp14:editId="7E8DD441">
             <wp:extent cx="4776281" cy="1829338"/>
@@ -3319,6 +3223,9 @@
         <w:spacing w:after="160" w:line="278" w:lineRule="auto"/>
       </w:pPr>
       <w:r>
+        <w:rPr>
+          <w:noProof/>
+        </w:rPr>
         <w:drawing>
           <wp:inline distT="0" distB="0" distL="0" distR="0" wp14:anchorId="096628DB" wp14:editId="58AAA849">
             <wp:extent cx="3472774" cy="1507787"/>
@@ -3387,6 +3294,9 @@
         <w:spacing w:after="160" w:line="278" w:lineRule="auto"/>
       </w:pPr>
       <w:r>
+        <w:rPr>
+          <w:noProof/>
+        </w:rPr>
         <w:drawing>
           <wp:inline distT="0" distB="0" distL="0" distR="0" wp14:anchorId="604AEDCD" wp14:editId="7C323977">
             <wp:extent cx="5068111" cy="2062956"/>
@@ -3463,6 +3373,9 @@
         <w:spacing w:after="160" w:line="278" w:lineRule="auto"/>
       </w:pPr>
       <w:r>
+        <w:rPr>
+          <w:noProof/>
+        </w:rPr>
         <w:drawing>
           <wp:inline distT="0" distB="0" distL="0" distR="0" wp14:anchorId="3790BE74" wp14:editId="32D90C57">
             <wp:extent cx="3657600" cy="2465416"/>
@@ -3579,13 +3492,7 @@
           <w:rPr>
             <w:rStyle w:val="Hyperlink"/>
           </w:rPr>
-          <w:t>F1 World Championship</w:t>
-        </w:r>
-        <w:r>
-          <w:rPr>
-            <w:rStyle w:val="Hyperlink"/>
-          </w:rPr>
-          <w:t xml:space="preserve"> dataset form Kaggle</w:t>
+          <w:t>F1 World Championship dataset form Kaggle</w:t>
         </w:r>
       </w:hyperlink>
       <w:r>
@@ -3644,19 +3551,7 @@
           <w:rPr>
             <w:rStyle w:val="Hyperlink"/>
           </w:rPr>
-          <w:t>https://githu</w:t>
-        </w:r>
-        <w:r>
-          <w:rPr>
-            <w:rStyle w:val="Hyperlink"/>
-          </w:rPr>
-          <w:t>b</w:t>
-        </w:r>
-        <w:r>
-          <w:rPr>
-            <w:rStyle w:val="Hyperlink"/>
-          </w:rPr>
-          <w:t>.com/fabi2k03/dab_elasticsearch_paper</w:t>
+          <w:t>https://github.com/fabi2k03/dab_elasticsearch_paper</w:t>
         </w:r>
       </w:hyperlink>
       <w:r>
@@ -4205,12 +4100,7 @@
       </w:r>
       <w:r>
         <w:tab/>
-      </w:r>
-      <w:r>
-        <w:t>It declairs the Elasticsearch instance as a single node one.</w:t>
-      </w:r>
-      <w:r>
-        <w:t xml:space="preserve"> Furthermore, it tells Elasticsearch not to wait for other nodes before starting. Without this setting a single-node clustger would remain in a waiting state indefinitely.</w:t>
+        <w:t>It declairs the Elasticsearch instance as a single node one. Furthermore, it tells Elasticsearch not to wait for other nodes before starting. Without this setting a single-node clustger would remain in a waiting state indefinitely.</w:t>
       </w:r>
     </w:p>
     <w:p>
@@ -4285,13 +4175,7 @@
           <w:rPr>
             <w:rStyle w:val="Hyperlink"/>
           </w:rPr>
-          <w:t>http://localhost:</w:t>
-        </w:r>
-        <w:r>
-          <w:rPr>
-            <w:rStyle w:val="Hyperlink"/>
-          </w:rPr>
-          <w:t>9200</w:t>
+          <w:t>http://localhost:9200</w:t>
         </w:r>
       </w:hyperlink>
       <w:r>
@@ -4401,6 +4285,9 @@
         <w:spacing w:after="160" w:line="278" w:lineRule="auto"/>
       </w:pPr>
       <w:r>
+        <w:rPr>
+          <w:noProof/>
+        </w:rPr>
         <w:drawing>
           <wp:inline distT="0" distB="0" distL="0" distR="0" wp14:anchorId="6416AD9E" wp14:editId="182BCE10">
             <wp:extent cx="4066743" cy="2238375"/>
@@ -4459,6 +4346,9 @@
         <w:t>The index status is reported as green, indicating that all primary shards and replicas are fully allocated and the cluster is healthy.</w:t>
       </w:r>
       <w:r>
+        <w:rPr>
+          <w:noProof/>
+        </w:rPr>
         <w:drawing>
           <wp:inline distT="0" distB="0" distL="0" distR="0" wp14:anchorId="02EA6890" wp14:editId="66F28604">
             <wp:extent cx="5731510" cy="3176270"/>
@@ -4516,20 +4406,928 @@
     </w:p>
     <w:p>
       <w:pPr>
-        <w:spacing w:after="160" w:line="278" w:lineRule="auto"/>
-      </w:pPr>
-    </w:p>
-    <w:p>
-      <w:pPr>
-        <w:spacing w:after="160" w:line="278" w:lineRule="auto"/>
-      </w:pPr>
-      <w:r>
-        <w:br w:type="page"/>
-      </w:r>
-    </w:p>
-    <w:p>
-      <w:pPr>
-        <w:spacing w:line="276" w:lineRule="auto"/>
+        <w:pStyle w:val="Heading1"/>
+        <w:numPr>
+          <w:ilvl w:val="1"/>
+          <w:numId w:val="4"/>
+        </w:numPr>
+        <w:ind w:left="567" w:hanging="573"/>
+        <w:rPr>
+          <w:sz w:val="32"/>
+          <w:szCs w:val="32"/>
+        </w:rPr>
+      </w:pPr>
+      <w:r>
+        <w:rPr>
+          <w:sz w:val="32"/>
+          <w:szCs w:val="32"/>
+        </w:rPr>
+        <w:t>Kibana Dashboard</w:t>
+      </w:r>
+    </w:p>
+    <w:p>
+      <w:pPr>
+        <w:spacing w:after="160" w:line="278" w:lineRule="auto"/>
+      </w:pPr>
+      <w:r>
+        <w:t xml:space="preserve">Kibana connects directly to Elasticsearch and provides a web-based interface for creating visualizations and dashboards without writing any code. </w:t>
+      </w:r>
+    </w:p>
+    <w:p>
+      <w:pPr>
+        <w:spacing w:after="160" w:line="278" w:lineRule="auto"/>
+      </w:pPr>
+      <w:r>
+        <w:t xml:space="preserve">To acess Kibana, you just have to type in the URL: </w:t>
+      </w:r>
+      <w:hyperlink r:id="rId32" w:history="1">
+        <w:r>
+          <w:rPr>
+            <w:rStyle w:val="Hyperlink"/>
+          </w:rPr>
+          <w:t>http://localhost:5601</w:t>
+        </w:r>
+      </w:hyperlink>
+      <w:r>
+        <w:t xml:space="preserve"> after the running the docker compose script.</w:t>
+      </w:r>
+    </w:p>
+    <w:p>
+      <w:pPr>
+        <w:spacing w:after="160" w:line="278" w:lineRule="auto"/>
+      </w:pPr>
+      <w:r>
+        <w:drawing>
+          <wp:anchor distT="0" distB="0" distL="114300" distR="114300" simplePos="0" relativeHeight="251671552" behindDoc="0" locked="0" layoutInCell="1" allowOverlap="1" wp14:anchorId="28D5AE6F" wp14:editId="70EA3C18">
+            <wp:simplePos x="0" y="0"/>
+            <wp:positionH relativeFrom="column">
+              <wp:posOffset>-170815</wp:posOffset>
+            </wp:positionH>
+            <wp:positionV relativeFrom="paragraph">
+              <wp:posOffset>480695</wp:posOffset>
+            </wp:positionV>
+            <wp:extent cx="2324100" cy="2083435"/>
+            <wp:effectExtent l="0" t="0" r="0" b="0"/>
+            <wp:wrapNone/>
+            <wp:docPr id="1736694579" name="Picture 1"/>
+            <wp:cNvGraphicFramePr>
+              <a:graphicFrameLocks xmlns:a="http://schemas.openxmlformats.org/drawingml/2006/main" noChangeAspect="1"/>
+            </wp:cNvGraphicFramePr>
+            <a:graphic xmlns:a="http://schemas.openxmlformats.org/drawingml/2006/main">
+              <a:graphicData uri="http://schemas.openxmlformats.org/drawingml/2006/picture">
+                <pic:pic xmlns:pic="http://schemas.openxmlformats.org/drawingml/2006/picture">
+                  <pic:nvPicPr>
+                    <pic:cNvPr id="1736694579" name=""/>
+                    <pic:cNvPicPr/>
+                  </pic:nvPicPr>
+                  <pic:blipFill rotWithShape="1">
+                    <a:blip r:embed="rId33" cstate="print">
+                      <a:extLst>
+                        <a:ext uri="{28A0092B-C50C-407E-A947-70E740481C1C}">
+                          <a14:useLocalDpi xmlns:a14="http://schemas.microsoft.com/office/drawing/2010/main" val="0"/>
+                        </a:ext>
+                      </a:extLst>
+                    </a:blip>
+                    <a:srcRect r="35771"/>
+                    <a:stretch>
+                      <a:fillRect/>
+                    </a:stretch>
+                  </pic:blipFill>
+                  <pic:spPr bwMode="auto">
+                    <a:xfrm>
+                      <a:off x="0" y="0"/>
+                      <a:ext cx="2324100" cy="2083435"/>
+                    </a:xfrm>
+                    <a:prstGeom prst="rect">
+                      <a:avLst/>
+                    </a:prstGeom>
+                    <a:ln>
+                      <a:noFill/>
+                    </a:ln>
+                    <a:extLst>
+                      <a:ext uri="{53640926-AAD7-44D8-BBD7-CCE9431645EC}">
+                        <a14:shadowObscured xmlns:a14="http://schemas.microsoft.com/office/drawing/2010/main"/>
+                      </a:ext>
+                    </a:extLst>
+                  </pic:spPr>
+                </pic:pic>
+              </a:graphicData>
+            </a:graphic>
+            <wp14:sizeRelH relativeFrom="page">
+              <wp14:pctWidth>0</wp14:pctWidth>
+            </wp14:sizeRelH>
+            <wp14:sizeRelV relativeFrom="page">
+              <wp14:pctHeight>0</wp14:pctHeight>
+            </wp14:sizeRelV>
+          </wp:anchor>
+        </w:drawing>
+      </w:r>
+      <w:r>
+        <w:t xml:space="preserve">Before visualizations can be created, a data view must be configured in Kibana that points to the ‘f1’ index and designates ‘race_date’ as the time field. </w:t>
+      </w:r>
+    </w:p>
+    <w:p>
+      <w:pPr>
+        <w:spacing w:after="160" w:line="278" w:lineRule="auto"/>
+      </w:pPr>
+      <w:r>
+        <w:drawing>
+          <wp:anchor distT="0" distB="0" distL="114300" distR="114300" simplePos="0" relativeHeight="251672576" behindDoc="0" locked="0" layoutInCell="1" allowOverlap="1" wp14:anchorId="0463D04B" wp14:editId="04634F6A">
+            <wp:simplePos x="0" y="0"/>
+            <wp:positionH relativeFrom="column">
+              <wp:posOffset>2743200</wp:posOffset>
+            </wp:positionH>
+            <wp:positionV relativeFrom="paragraph">
+              <wp:posOffset>20955</wp:posOffset>
+            </wp:positionV>
+            <wp:extent cx="3048000" cy="1976120"/>
+            <wp:effectExtent l="0" t="0" r="0" b="5080"/>
+            <wp:wrapNone/>
+            <wp:docPr id="2105343947" name="Picture 1"/>
+            <wp:cNvGraphicFramePr>
+              <a:graphicFrameLocks xmlns:a="http://schemas.openxmlformats.org/drawingml/2006/main" noChangeAspect="1"/>
+            </wp:cNvGraphicFramePr>
+            <a:graphic xmlns:a="http://schemas.openxmlformats.org/drawingml/2006/main">
+              <a:graphicData uri="http://schemas.openxmlformats.org/drawingml/2006/picture">
+                <pic:pic xmlns:pic="http://schemas.openxmlformats.org/drawingml/2006/picture">
+                  <pic:nvPicPr>
+                    <pic:cNvPr id="2105343947" name=""/>
+                    <pic:cNvPicPr/>
+                  </pic:nvPicPr>
+                  <pic:blipFill rotWithShape="1">
+                    <a:blip r:embed="rId34" cstate="print">
+                      <a:extLst>
+                        <a:ext uri="{28A0092B-C50C-407E-A947-70E740481C1C}">
+                          <a14:useLocalDpi xmlns:a14="http://schemas.microsoft.com/office/drawing/2010/main" val="0"/>
+                        </a:ext>
+                      </a:extLst>
+                    </a:blip>
+                    <a:srcRect l="22892"/>
+                    <a:stretch>
+                      <a:fillRect/>
+                    </a:stretch>
+                  </pic:blipFill>
+                  <pic:spPr bwMode="auto">
+                    <a:xfrm>
+                      <a:off x="0" y="0"/>
+                      <a:ext cx="3048000" cy="1976120"/>
+                    </a:xfrm>
+                    <a:prstGeom prst="rect">
+                      <a:avLst/>
+                    </a:prstGeom>
+                    <a:ln>
+                      <a:noFill/>
+                    </a:ln>
+                    <a:extLst>
+                      <a:ext uri="{53640926-AAD7-44D8-BBD7-CCE9431645EC}">
+                        <a14:shadowObscured xmlns:a14="http://schemas.microsoft.com/office/drawing/2010/main"/>
+                      </a:ext>
+                    </a:extLst>
+                  </pic:spPr>
+                </pic:pic>
+              </a:graphicData>
+            </a:graphic>
+            <wp14:sizeRelH relativeFrom="page">
+              <wp14:pctWidth>0</wp14:pctWidth>
+            </wp14:sizeRelH>
+            <wp14:sizeRelV relativeFrom="page">
+              <wp14:pctHeight>0</wp14:pctHeight>
+            </wp14:sizeRelV>
+          </wp:anchor>
+        </w:drawing>
+      </w:r>
+    </w:p>
+    <w:p>
+      <w:pPr>
+        <w:spacing w:after="160" w:line="278" w:lineRule="auto"/>
+      </w:pPr>
+    </w:p>
+    <w:p>
+      <w:pPr>
+        <w:spacing w:after="160" w:line="278" w:lineRule="auto"/>
+      </w:pPr>
+    </w:p>
+    <w:p>
+      <w:pPr>
+        <w:spacing w:after="160" w:line="278" w:lineRule="auto"/>
+      </w:pPr>
+      <w:r>
+        <w:rPr>
+          <w:noProof/>
+          <w14:ligatures w14:val="standardContextual"/>
+        </w:rPr>
+        <mc:AlternateContent>
+          <mc:Choice Requires="wps">
+            <w:drawing>
+              <wp:anchor distT="0" distB="0" distL="114300" distR="114300" simplePos="0" relativeHeight="251673600" behindDoc="0" locked="0" layoutInCell="1" allowOverlap="1" wp14:anchorId="4FBA1DA4" wp14:editId="773D43EA">
+                <wp:simplePos x="0" y="0"/>
+                <wp:positionH relativeFrom="column">
+                  <wp:posOffset>2076450</wp:posOffset>
+                </wp:positionH>
+                <wp:positionV relativeFrom="paragraph">
+                  <wp:posOffset>69215</wp:posOffset>
+                </wp:positionV>
+                <wp:extent cx="771525" cy="0"/>
+                <wp:effectExtent l="0" t="63500" r="0" b="63500"/>
+                <wp:wrapNone/>
+                <wp:docPr id="1632030387" name="Straight Arrow Connector 5"/>
+                <wp:cNvGraphicFramePr/>
+                <a:graphic xmlns:a="http://schemas.openxmlformats.org/drawingml/2006/main">
+                  <a:graphicData uri="http://schemas.microsoft.com/office/word/2010/wordprocessingShape">
+                    <wps:wsp>
+                      <wps:cNvCnPr/>
+                      <wps:spPr>
+                        <a:xfrm>
+                          <a:off x="0" y="0"/>
+                          <a:ext cx="771525" cy="0"/>
+                        </a:xfrm>
+                        <a:prstGeom prst="straightConnector1">
+                          <a:avLst/>
+                        </a:prstGeom>
+                        <a:ln w="19050">
+                          <a:tailEnd type="triangle"/>
+                        </a:ln>
+                      </wps:spPr>
+                      <wps:style>
+                        <a:lnRef idx="1">
+                          <a:schemeClr val="accent2"/>
+                        </a:lnRef>
+                        <a:fillRef idx="0">
+                          <a:schemeClr val="accent2"/>
+                        </a:fillRef>
+                        <a:effectRef idx="0">
+                          <a:schemeClr val="accent2"/>
+                        </a:effectRef>
+                        <a:fontRef idx="minor">
+                          <a:schemeClr val="tx1"/>
+                        </a:fontRef>
+                      </wps:style>
+                      <wps:bodyPr/>
+                    </wps:wsp>
+                  </a:graphicData>
+                </a:graphic>
+              </wp:anchor>
+            </w:drawing>
+          </mc:Choice>
+          <mc:Fallback>
+            <w:pict>
+              <v:shapetype w14:anchorId="7EABA6FF" id="_x0000_t32" coordsize="21600,21600" o:spt="32" o:oned="t" path="m,l21600,21600e" filled="f">
+                <v:path arrowok="t" fillok="f" o:connecttype="none"/>
+                <o:lock v:ext="edit" shapetype="t"/>
+              </v:shapetype>
+              <v:shape id="Straight Arrow Connector 5" o:spid="_x0000_s1026" type="#_x0000_t32" style="position:absolute;margin-left:163.5pt;margin-top:5.45pt;width:60.75pt;height:0;z-index:251673600;visibility:visible;mso-wrap-style:square;mso-wrap-distance-left:9pt;mso-wrap-distance-top:0;mso-wrap-distance-right:9pt;mso-wrap-distance-bottom:0;mso-position-horizontal:absolute;mso-position-horizontal-relative:text;mso-position-vertical:absolute;mso-position-vertical-relative:text" o:gfxdata="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" strokecolor="#e97132 [3205]" strokeweight="1.5pt">
+                <v:stroke endarrow="block" joinstyle="miter"/>
+              </v:shape>
+            </w:pict>
+          </mc:Fallback>
+        </mc:AlternateContent>
+      </w:r>
+    </w:p>
+    <w:p>
+      <w:pPr>
+        <w:spacing w:after="160" w:line="278" w:lineRule="auto"/>
+      </w:pPr>
+    </w:p>
+    <w:p>
+      <w:pPr>
+        <w:spacing w:after="160" w:line="278" w:lineRule="auto"/>
+      </w:pPr>
+    </w:p>
+    <w:p>
+      <w:pPr>
+        <w:spacing w:after="160" w:line="278" w:lineRule="auto"/>
+      </w:pPr>
+      <w:r>
+        <w:lastRenderedPageBreak/>
+        <w:t xml:space="preserve">This time filed is used by Kibanas default time filter, which is set to “last 15 minutes” by default. </w:t>
+      </w:r>
+      <w:r>
+        <w:t>For the F1 data, the time range must be adjusted to cover the full period from 1950 to 2024 before any data becomes visible.</w:t>
+      </w:r>
+    </w:p>
+    <w:p>
+      <w:pPr>
+        <w:spacing w:after="160" w:line="278" w:lineRule="auto"/>
+      </w:pPr>
+      <w:r>
+        <w:drawing>
+          <wp:inline distT="0" distB="0" distL="0" distR="0" wp14:anchorId="132D8214" wp14:editId="0828EE81">
+            <wp:extent cx="5474335" cy="483386"/>
+            <wp:effectExtent l="0" t="0" r="0" b="0"/>
+            <wp:docPr id="696595311" name="Picture 1"/>
+            <wp:cNvGraphicFramePr>
+              <a:graphicFrameLocks xmlns:a="http://schemas.openxmlformats.org/drawingml/2006/main" noChangeAspect="1"/>
+            </wp:cNvGraphicFramePr>
+            <a:graphic xmlns:a="http://schemas.openxmlformats.org/drawingml/2006/main">
+              <a:graphicData uri="http://schemas.openxmlformats.org/drawingml/2006/picture">
+                <pic:pic xmlns:pic="http://schemas.openxmlformats.org/drawingml/2006/picture">
+                  <pic:nvPicPr>
+                    <pic:cNvPr id="696595311" name=""/>
+                    <pic:cNvPicPr/>
+                  </pic:nvPicPr>
+                  <pic:blipFill>
+                    <a:blip r:embed="rId35"/>
+                    <a:stretch>
+                      <a:fillRect/>
+                    </a:stretch>
+                  </pic:blipFill>
+                  <pic:spPr>
+                    <a:xfrm>
+                      <a:off x="0" y="0"/>
+                      <a:ext cx="5607173" cy="495116"/>
+                    </a:xfrm>
+                    <a:prstGeom prst="rect">
+                      <a:avLst/>
+                    </a:prstGeom>
+                  </pic:spPr>
+                </pic:pic>
+              </a:graphicData>
+            </a:graphic>
+          </wp:inline>
+        </w:drawing>
+      </w:r>
+    </w:p>
+    <w:p>
+      <w:pPr>
+        <w:spacing w:after="160" w:line="278" w:lineRule="auto"/>
+      </w:pPr>
+      <w:r>
+        <w:t>The dashboard created for this project contains five visualizations, each demonstrating a different aspect of the indexed data.</w:t>
+      </w:r>
+    </w:p>
+    <w:p>
+      <w:pPr>
+        <w:spacing w:after="160" w:line="278" w:lineRule="auto"/>
+        <w:rPr>
+          <w:b/>
+          <w:bCs/>
+        </w:rPr>
+      </w:pPr>
+      <w:r>
+        <w:rPr>
+          <w:b/>
+          <w:bCs/>
+        </w:rPr>
+        <w:t>Wins per driver</w:t>
+      </w:r>
+    </w:p>
+    <w:p>
+      <w:pPr>
+        <w:spacing w:after="160" w:line="278" w:lineRule="auto"/>
+      </w:pPr>
+      <w:r>
+        <w:t xml:space="preserve">A bar chart showing the top 10 drivers ranked by total career race wins. It is build by applying a KGL filter of </w:t>
+      </w:r>
+      <w:r>
+        <w:rPr>
+          <w:rFonts w:ascii="Courier New" w:hAnsi="Courier New" w:cs="Courier New"/>
+        </w:rPr>
+        <w:t>finish_position: 1</w:t>
+      </w:r>
+      <w:r>
+        <w:t xml:space="preserve"> to restrict the dataset to race wins only, then using a unique count of </w:t>
+      </w:r>
+      <w:r>
+        <w:rPr>
+          <w:rFonts w:ascii="Courier New" w:hAnsi="Courier New" w:cs="Courier New"/>
+        </w:rPr>
+        <w:t xml:space="preserve">race_id </w:t>
+      </w:r>
+      <w:r>
+        <w:t xml:space="preserve">per </w:t>
+      </w:r>
+      <w:r>
+        <w:rPr>
+          <w:rFonts w:ascii="Courier New" w:hAnsi="Courier New" w:cs="Courier New"/>
+        </w:rPr>
+        <w:t>driver_</w:t>
+      </w:r>
+      <w:r>
+        <w:rPr>
+          <w:rFonts w:ascii="Courier New" w:hAnsi="Courier New" w:cs="Courier New"/>
+        </w:rPr>
+        <w:t>forename</w:t>
+      </w:r>
+      <w:r>
+        <w:rPr>
+          <w:rFonts w:ascii="Courier New" w:hAnsi="Courier New" w:cs="Courier New"/>
+        </w:rPr>
+        <w:t>.keyword</w:t>
+      </w:r>
+      <w:r>
+        <w:t xml:space="preserve">  and </w:t>
+      </w:r>
+      <w:r>
+        <w:rPr>
+          <w:rFonts w:ascii="Courier New" w:hAnsi="Courier New" w:cs="Courier New"/>
+        </w:rPr>
+        <w:t>driver_surename.keyword</w:t>
+      </w:r>
+      <w:r>
+        <w:t xml:space="preserve">. </w:t>
+      </w:r>
+    </w:p>
+    <w:p>
+      <w:pPr>
+        <w:spacing w:after="160" w:line="278" w:lineRule="auto"/>
+      </w:pPr>
+      <w:r>
+        <w:rPr>
+          <w:noProof/>
+          <w14:ligatures w14:val="standardContextual"/>
+        </w:rPr>
+        <w:drawing>
+          <wp:inline distT="0" distB="0" distL="0" distR="0" wp14:anchorId="6F6CF55F" wp14:editId="5104BEE3">
+            <wp:extent cx="5731510" cy="1802130"/>
+            <wp:effectExtent l="0" t="0" r="0" b="1270"/>
+            <wp:docPr id="1277421244" name="Picture 6"/>
+            <wp:cNvGraphicFramePr>
+              <a:graphicFrameLocks xmlns:a="http://schemas.openxmlformats.org/drawingml/2006/main" noChangeAspect="1"/>
+            </wp:cNvGraphicFramePr>
+            <a:graphic xmlns:a="http://schemas.openxmlformats.org/drawingml/2006/main">
+              <a:graphicData uri="http://schemas.openxmlformats.org/drawingml/2006/picture">
+                <pic:pic xmlns:pic="http://schemas.openxmlformats.org/drawingml/2006/picture">
+                  <pic:nvPicPr>
+                    <pic:cNvPr id="1277421244" name="Picture 1277421244"/>
+                    <pic:cNvPicPr/>
+                  </pic:nvPicPr>
+                  <pic:blipFill>
+                    <a:blip r:embed="rId36" cstate="print">
+                      <a:extLst>
+                        <a:ext uri="{28A0092B-C50C-407E-A947-70E740481C1C}">
+                          <a14:useLocalDpi xmlns:a14="http://schemas.microsoft.com/office/drawing/2010/main" val="0"/>
+                        </a:ext>
+                      </a:extLst>
+                    </a:blip>
+                    <a:stretch>
+                      <a:fillRect/>
+                    </a:stretch>
+                  </pic:blipFill>
+                  <pic:spPr>
+                    <a:xfrm>
+                      <a:off x="0" y="0"/>
+                      <a:ext cx="5731510" cy="1802130"/>
+                    </a:xfrm>
+                    <a:prstGeom prst="rect">
+                      <a:avLst/>
+                    </a:prstGeom>
+                  </pic:spPr>
+                </pic:pic>
+              </a:graphicData>
+            </a:graphic>
+          </wp:inline>
+        </w:drawing>
+      </w:r>
+    </w:p>
+    <w:p>
+      <w:pPr>
+        <w:spacing w:after="160" w:line="278" w:lineRule="auto"/>
+      </w:pPr>
+    </w:p>
+    <w:p>
+      <w:pPr>
+        <w:spacing w:after="160" w:line="278" w:lineRule="auto"/>
+        <w:rPr>
+          <w:b/>
+          <w:bCs/>
+        </w:rPr>
+      </w:pPr>
+      <w:r>
+        <w:rPr>
+          <w:b/>
+          <w:bCs/>
+        </w:rPr>
+        <w:t>Races per season</w:t>
+      </w:r>
+    </w:p>
+    <w:p>
+      <w:pPr>
+        <w:spacing w:after="160" w:line="278" w:lineRule="auto"/>
+      </w:pPr>
+      <w:r>
+        <w:t xml:space="preserve">Is a linechart showing how many distinct races were held in each Formula 1 season. It uses a terms aggregation on the </w:t>
+      </w:r>
+      <w:r>
+        <w:rPr>
+          <w:rFonts w:ascii="Courier New" w:hAnsi="Courier New" w:cs="Courier New"/>
+        </w:rPr>
+        <w:t>season</w:t>
+      </w:r>
+      <w:r>
+        <w:t xml:space="preserve"> field combined with a cardinality aggregation on </w:t>
+      </w:r>
+      <w:r>
+        <w:rPr>
+          <w:rFonts w:ascii="Courier New" w:hAnsi="Courier New" w:cs="Courier New"/>
+        </w:rPr>
+        <w:t>race_id</w:t>
+      </w:r>
+      <w:r>
+        <w:t xml:space="preserve"> to count distinct races per year.</w:t>
+      </w:r>
+    </w:p>
+    <w:p>
+      <w:pPr>
+        <w:spacing w:after="160" w:line="278" w:lineRule="auto"/>
+      </w:pPr>
+      <w:r>
+        <w:rPr>
+          <w:noProof/>
+          <w14:ligatures w14:val="standardContextual"/>
+        </w:rPr>
+        <w:drawing>
+          <wp:inline distT="0" distB="0" distL="0" distR="0" wp14:anchorId="0548E0BF" wp14:editId="6DBD1277">
+            <wp:extent cx="5731510" cy="2313940"/>
+            <wp:effectExtent l="0" t="0" r="0" b="0"/>
+            <wp:docPr id="29070489" name="Picture 8"/>
+            <wp:cNvGraphicFramePr>
+              <a:graphicFrameLocks xmlns:a="http://schemas.openxmlformats.org/drawingml/2006/main" noChangeAspect="1"/>
+            </wp:cNvGraphicFramePr>
+            <a:graphic xmlns:a="http://schemas.openxmlformats.org/drawingml/2006/main">
+              <a:graphicData uri="http://schemas.openxmlformats.org/drawingml/2006/picture">
+                <pic:pic xmlns:pic="http://schemas.openxmlformats.org/drawingml/2006/picture">
+                  <pic:nvPicPr>
+                    <pic:cNvPr id="29070489" name="Picture 29070489"/>
+                    <pic:cNvPicPr/>
+                  </pic:nvPicPr>
+                  <pic:blipFill>
+                    <a:blip r:embed="rId37" cstate="print">
+                      <a:extLst>
+                        <a:ext uri="{28A0092B-C50C-407E-A947-70E740481C1C}">
+                          <a14:useLocalDpi xmlns:a14="http://schemas.microsoft.com/office/drawing/2010/main" val="0"/>
+                        </a:ext>
+                      </a:extLst>
+                    </a:blip>
+                    <a:stretch>
+                      <a:fillRect/>
+                    </a:stretch>
+                  </pic:blipFill>
+                  <pic:spPr>
+                    <a:xfrm>
+                      <a:off x="0" y="0"/>
+                      <a:ext cx="5731510" cy="2313940"/>
+                    </a:xfrm>
+                    <a:prstGeom prst="rect">
+                      <a:avLst/>
+                    </a:prstGeom>
+                  </pic:spPr>
+                </pic:pic>
+              </a:graphicData>
+            </a:graphic>
+          </wp:inline>
+        </w:drawing>
+      </w:r>
+    </w:p>
+    <w:p>
+      <w:pPr>
+        <w:spacing w:after="160" w:line="278" w:lineRule="auto"/>
+        <w:rPr>
+          <w:b/>
+          <w:bCs/>
+        </w:rPr>
+      </w:pPr>
+      <w:r>
+        <w:rPr>
+          <w:b/>
+          <w:bCs/>
+        </w:rPr>
+        <w:lastRenderedPageBreak/>
+        <w:t>Driver nationalities</w:t>
+      </w:r>
+    </w:p>
+    <w:p>
+      <w:pPr>
+        <w:spacing w:after="160" w:line="278" w:lineRule="auto"/>
+      </w:pPr>
+      <w:r>
+        <w:t xml:space="preserve">Is a pie chart showing the distribution of all Formula 1 drivers by nationality. It uses a term aggregation on the </w:t>
+      </w:r>
+      <w:r>
+        <w:rPr>
+          <w:rFonts w:ascii="Courier New" w:hAnsi="Courier New" w:cs="Courier New"/>
+        </w:rPr>
+        <w:t>driver_nationality</w:t>
+      </w:r>
+      <w:r>
+        <w:t xml:space="preserve"> keyword field. </w:t>
+      </w:r>
+    </w:p>
+    <w:p>
+      <w:pPr>
+        <w:spacing w:after="160" w:line="278" w:lineRule="auto"/>
+      </w:pPr>
+      <w:r>
+        <w:rPr>
+          <w:noProof/>
+          <w14:ligatures w14:val="standardContextual"/>
+        </w:rPr>
+        <w:drawing>
+          <wp:inline distT="0" distB="0" distL="0" distR="0" wp14:anchorId="4EE21556" wp14:editId="0607E48B">
+            <wp:extent cx="5331460" cy="1780894"/>
+            <wp:effectExtent l="0" t="0" r="2540" b="0"/>
+            <wp:docPr id="310841755" name="Picture 9"/>
+            <wp:cNvGraphicFramePr>
+              <a:graphicFrameLocks xmlns:a="http://schemas.openxmlformats.org/drawingml/2006/main" noChangeAspect="1"/>
+            </wp:cNvGraphicFramePr>
+            <a:graphic xmlns:a="http://schemas.openxmlformats.org/drawingml/2006/main">
+              <a:graphicData uri="http://schemas.openxmlformats.org/drawingml/2006/picture">
+                <pic:pic xmlns:pic="http://schemas.openxmlformats.org/drawingml/2006/picture">
+                  <pic:nvPicPr>
+                    <pic:cNvPr id="310841755" name="Picture 310841755"/>
+                    <pic:cNvPicPr/>
+                  </pic:nvPicPr>
+                  <pic:blipFill>
+                    <a:blip r:embed="rId38" cstate="print">
+                      <a:extLst>
+                        <a:ext uri="{28A0092B-C50C-407E-A947-70E740481C1C}">
+                          <a14:useLocalDpi xmlns:a14="http://schemas.microsoft.com/office/drawing/2010/main" val="0"/>
+                        </a:ext>
+                      </a:extLst>
+                    </a:blip>
+                    <a:stretch>
+                      <a:fillRect/>
+                    </a:stretch>
+                  </pic:blipFill>
+                  <pic:spPr>
+                    <a:xfrm>
+                      <a:off x="0" y="0"/>
+                      <a:ext cx="5420067" cy="1810492"/>
+                    </a:xfrm>
+                    <a:prstGeom prst="rect">
+                      <a:avLst/>
+                    </a:prstGeom>
+                  </pic:spPr>
+                </pic:pic>
+              </a:graphicData>
+            </a:graphic>
+          </wp:inline>
+        </w:drawing>
+      </w:r>
+    </w:p>
+    <w:p>
+      <w:pPr>
+        <w:spacing w:after="160" w:line="278" w:lineRule="auto"/>
+      </w:pPr>
+    </w:p>
+    <w:p>
+      <w:pPr>
+        <w:spacing w:after="160" w:line="278" w:lineRule="auto"/>
+        <w:rPr>
+          <w:b/>
+          <w:bCs/>
+        </w:rPr>
+      </w:pPr>
+      <w:r>
+        <w:rPr>
+          <w:b/>
+          <w:bCs/>
+        </w:rPr>
+        <w:t>Points per constructor</w:t>
+      </w:r>
+    </w:p>
+    <w:p>
+      <w:pPr>
+        <w:spacing w:after="160" w:line="278" w:lineRule="auto"/>
+      </w:pPr>
+      <w:r>
+        <w:t>I</w:t>
+      </w:r>
+      <w:r>
+        <w:t>s a bar chart showing the total championship points accumulated by each constructor across all seasons. It uses a nested aggregation</w:t>
+      </w:r>
+      <w:r>
+        <w:t xml:space="preserve">, </w:t>
+      </w:r>
+      <w:r>
+        <w:t>a terms aggregation on</w:t>
+      </w:r>
+      <w:r>
+        <w:t xml:space="preserve"> </w:t>
+      </w:r>
+      <w:r>
+        <w:rPr>
+          <w:rFonts w:ascii="Courier New" w:hAnsi="Courier New" w:cs="Courier New"/>
+        </w:rPr>
+        <w:t>constructor_name.keyword</w:t>
+      </w:r>
+      <w:r>
+        <w:rPr>
+          <w:rFonts w:ascii="Courier New" w:hAnsi="Courier New" w:cs="Courier New"/>
+        </w:rPr>
+        <w:t xml:space="preserve"> </w:t>
+      </w:r>
+      <w:r>
+        <w:t>containing a sum aggregation on the</w:t>
+      </w:r>
+      <w:r>
+        <w:t xml:space="preserve"> </w:t>
+      </w:r>
+      <w:r>
+        <w:rPr>
+          <w:rFonts w:ascii="Courier New" w:hAnsi="Courier New" w:cs="Courier New"/>
+        </w:rPr>
+        <w:t>points</w:t>
+      </w:r>
+      <w:r>
+        <w:t xml:space="preserve"> </w:t>
+      </w:r>
+      <w:r>
+        <w:t>field</w:t>
+      </w:r>
+    </w:p>
+    <w:p>
+      <w:pPr>
+        <w:spacing w:after="160" w:line="278" w:lineRule="auto"/>
+      </w:pPr>
+      <w:r>
+        <w:rPr>
+          <w:noProof/>
+          <w14:ligatures w14:val="standardContextual"/>
+        </w:rPr>
+        <w:drawing>
+          <wp:inline distT="0" distB="0" distL="0" distR="0" wp14:anchorId="6EF3FA49" wp14:editId="6A45778A">
+            <wp:extent cx="5150485" cy="1715307"/>
+            <wp:effectExtent l="0" t="0" r="5715" b="0"/>
+            <wp:docPr id="1719070883" name="Picture 10"/>
+            <wp:cNvGraphicFramePr>
+              <a:graphicFrameLocks xmlns:a="http://schemas.openxmlformats.org/drawingml/2006/main" noChangeAspect="1"/>
+            </wp:cNvGraphicFramePr>
+            <a:graphic xmlns:a="http://schemas.openxmlformats.org/drawingml/2006/main">
+              <a:graphicData uri="http://schemas.openxmlformats.org/drawingml/2006/picture">
+                <pic:pic xmlns:pic="http://schemas.openxmlformats.org/drawingml/2006/picture">
+                  <pic:nvPicPr>
+                    <pic:cNvPr id="1719070883" name="Picture 1719070883"/>
+                    <pic:cNvPicPr/>
+                  </pic:nvPicPr>
+                  <pic:blipFill>
+                    <a:blip r:embed="rId39" cstate="print">
+                      <a:extLst>
+                        <a:ext uri="{28A0092B-C50C-407E-A947-70E740481C1C}">
+                          <a14:useLocalDpi xmlns:a14="http://schemas.microsoft.com/office/drawing/2010/main" val="0"/>
+                        </a:ext>
+                      </a:extLst>
+                    </a:blip>
+                    <a:stretch>
+                      <a:fillRect/>
+                    </a:stretch>
+                  </pic:blipFill>
+                  <pic:spPr>
+                    <a:xfrm>
+                      <a:off x="0" y="0"/>
+                      <a:ext cx="5167512" cy="1720978"/>
+                    </a:xfrm>
+                    <a:prstGeom prst="rect">
+                      <a:avLst/>
+                    </a:prstGeom>
+                  </pic:spPr>
+                </pic:pic>
+              </a:graphicData>
+            </a:graphic>
+          </wp:inline>
+        </w:drawing>
+      </w:r>
+    </w:p>
+    <w:p>
+      <w:pPr>
+        <w:spacing w:after="160" w:line="278" w:lineRule="auto"/>
+      </w:pPr>
+    </w:p>
+    <w:p>
+      <w:pPr>
+        <w:spacing w:after="160" w:line="278" w:lineRule="auto"/>
+        <w:rPr>
+          <w:b/>
+          <w:bCs/>
+        </w:rPr>
+      </w:pPr>
+      <w:r>
+        <w:rPr>
+          <w:b/>
+          <w:bCs/>
+        </w:rPr>
+        <w:t>Map of F1 circuits</w:t>
+      </w:r>
+    </w:p>
+    <w:p>
+      <w:pPr>
+        <w:spacing w:after="160" w:line="278" w:lineRule="auto"/>
+      </w:pPr>
+      <w:r>
+        <w:rPr>
+          <w:noProof/>
+          <w14:ligatures w14:val="standardContextual"/>
+        </w:rPr>
+        <w:drawing>
+          <wp:anchor distT="0" distB="0" distL="114300" distR="114300" simplePos="0" relativeHeight="251674624" behindDoc="0" locked="0" layoutInCell="1" allowOverlap="1" wp14:anchorId="3401D8B6" wp14:editId="25E6C1C6">
+            <wp:simplePos x="0" y="0"/>
+            <wp:positionH relativeFrom="column">
+              <wp:posOffset>57150</wp:posOffset>
+            </wp:positionH>
+            <wp:positionV relativeFrom="paragraph">
+              <wp:posOffset>1075690</wp:posOffset>
+            </wp:positionV>
+            <wp:extent cx="3829050" cy="1675262"/>
+            <wp:effectExtent l="0" t="0" r="0" b="1270"/>
+            <wp:wrapNone/>
+            <wp:docPr id="1893380187" name="Picture 11"/>
+            <wp:cNvGraphicFramePr>
+              <a:graphicFrameLocks xmlns:a="http://schemas.openxmlformats.org/drawingml/2006/main" noChangeAspect="1"/>
+            </wp:cNvGraphicFramePr>
+            <a:graphic xmlns:a="http://schemas.openxmlformats.org/drawingml/2006/main">
+              <a:graphicData uri="http://schemas.openxmlformats.org/drawingml/2006/picture">
+                <pic:pic xmlns:pic="http://schemas.openxmlformats.org/drawingml/2006/picture">
+                  <pic:nvPicPr>
+                    <pic:cNvPr id="1893380187" name="Picture 1893380187"/>
+                    <pic:cNvPicPr/>
+                  </pic:nvPicPr>
+                  <pic:blipFill>
+                    <a:blip r:embed="rId40" cstate="print">
+                      <a:extLst>
+                        <a:ext uri="{28A0092B-C50C-407E-A947-70E740481C1C}">
+                          <a14:useLocalDpi xmlns:a14="http://schemas.microsoft.com/office/drawing/2010/main" val="0"/>
+                        </a:ext>
+                      </a:extLst>
+                    </a:blip>
+                    <a:stretch>
+                      <a:fillRect/>
+                    </a:stretch>
+                  </pic:blipFill>
+                  <pic:spPr>
+                    <a:xfrm>
+                      <a:off x="0" y="0"/>
+                      <a:ext cx="3829050" cy="1675262"/>
+                    </a:xfrm>
+                    <a:prstGeom prst="rect">
+                      <a:avLst/>
+                    </a:prstGeom>
+                  </pic:spPr>
+                </pic:pic>
+              </a:graphicData>
+            </a:graphic>
+            <wp14:sizeRelH relativeFrom="page">
+              <wp14:pctWidth>0</wp14:pctWidth>
+            </wp14:sizeRelH>
+            <wp14:sizeRelV relativeFrom="page">
+              <wp14:pctHeight>0</wp14:pctHeight>
+            </wp14:sizeRelV>
+          </wp:anchor>
+        </w:drawing>
+      </w:r>
+      <w:r>
+        <w:t xml:space="preserve">Is a map visualization that plots every F1 track on an interactive world map. This visualization is made possible entirely by the </w:t>
+      </w:r>
+      <w:r>
+        <w:rPr>
+          <w:rFonts w:ascii="Courier New" w:hAnsi="Courier New" w:cs="Courier New"/>
+        </w:rPr>
+        <w:t>geo_point</w:t>
+      </w:r>
+      <w:r>
+        <w:t xml:space="preserve"> field type defined in the index mapping. </w:t>
+      </w:r>
+      <w:r>
+        <w:t>Kibana automatically recognizes</w:t>
+      </w:r>
+      <w:r>
+        <w:t xml:space="preserve"> </w:t>
+      </w:r>
+      <w:r>
+        <w:rPr>
+          <w:rFonts w:ascii="Courier New" w:hAnsi="Courier New" w:cs="Courier New"/>
+        </w:rPr>
+        <w:t>c</w:t>
+      </w:r>
+      <w:r>
+        <w:rPr>
+          <w:rFonts w:ascii="Courier New" w:hAnsi="Courier New" w:cs="Courier New"/>
+        </w:rPr>
+        <w:t>ircuit_coords</w:t>
+      </w:r>
+      <w:r>
+        <w:t xml:space="preserve"> </w:t>
+      </w:r>
+      <w:r>
+        <w:t>as a geographic coordinate field and renders each unique circuit location as a point on the map. No additional configuration is required beyond selecting the field in the visualization editor.</w:t>
+      </w:r>
+    </w:p>
+    <w:p>
+      <w:pPr>
+        <w:spacing w:after="160" w:line="278" w:lineRule="auto"/>
+      </w:pPr>
+    </w:p>
+    <w:p>
+      <w:pPr>
+        <w:spacing w:after="160" w:line="278" w:lineRule="auto"/>
+      </w:pPr>
+    </w:p>
+    <w:p>
+      <w:pPr>
+        <w:spacing w:after="160" w:line="278" w:lineRule="auto"/>
+      </w:pPr>
+    </w:p>
+    <w:p>
+      <w:pPr>
+        <w:spacing w:after="160" w:line="278" w:lineRule="auto"/>
       </w:pPr>
     </w:p>
     <w:p>
@@ -4540,6 +5338,55 @@
           <w:numId w:val="4"/>
         </w:numPr>
       </w:pPr>
+      <w:r>
+        <w:lastRenderedPageBreak/>
+        <w:t>Conclusion</w:t>
+      </w:r>
+    </w:p>
+    <w:p>
+      <w:pPr>
+        <w:spacing w:after="160" w:line="278" w:lineRule="auto"/>
+      </w:pPr>
+      <w:r>
+        <w:t xml:space="preserve">Elasticsearch is a powerful search and analytics engine. Its inverted index structure, distributed </w:t>
+      </w:r>
+    </w:p>
+    <w:p>
+      <w:pPr>
+        <w:spacing w:after="160" w:line="278" w:lineRule="auto"/>
+      </w:pPr>
+    </w:p>
+    <w:p>
+      <w:pPr>
+        <w:spacing w:after="160" w:line="278" w:lineRule="auto"/>
+      </w:pPr>
+    </w:p>
+    <w:p>
+      <w:pPr>
+        <w:spacing w:after="160" w:line="278" w:lineRule="auto"/>
+      </w:pPr>
+    </w:p>
+    <w:p>
+      <w:pPr>
+        <w:spacing w:after="160" w:line="278" w:lineRule="auto"/>
+      </w:pPr>
+      <w:r>
+        <w:br w:type="page"/>
+      </w:r>
+    </w:p>
+    <w:p>
+      <w:pPr>
+        <w:spacing w:line="276" w:lineRule="auto"/>
+      </w:pPr>
+    </w:p>
+    <w:p>
+      <w:pPr>
+        <w:pStyle w:val="Heading1"/>
+        <w:numPr>
+          <w:ilvl w:val="0"/>
+          <w:numId w:val="4"/>
+        </w:numPr>
+      </w:pPr>
       <w:bookmarkStart w:id="4" w:name="_Toc229380754"/>
       <w:r>
         <w:t>References</w:t>
@@ -4561,7 +5408,7 @@
           <w:szCs w:val="21"/>
         </w:rPr>
       </w:pPr>
-      <w:hyperlink r:id="rId32" w:history="1">
+      <w:hyperlink r:id="rId41" w:history="1">
         <w:r>
           <w:rPr>
             <w:rStyle w:val="Hyperlink"/>
@@ -4588,7 +5435,7 @@
           <w:szCs w:val="21"/>
         </w:rPr>
       </w:pPr>
-      <w:hyperlink r:id="rId33" w:anchor=":~:text=The%20Elastic%20Stack%20is%20a,fit%20together%20across%20Elastic%20deployments" w:history="1">
+      <w:hyperlink r:id="rId42" w:anchor=":~:text=The%20Elastic%20Stack%20is%20a,fit%20together%20across%20Elastic%20deployments" w:history="1">
         <w:r>
           <w:rPr>
             <w:rStyle w:val="Hyperlink"/>
@@ -4624,7 +5471,7 @@
         </w:rPr>
         <w:t xml:space="preserve">[Dataset]: </w:t>
       </w:r>
-      <w:hyperlink r:id="rId34" w:history="1">
+      <w:hyperlink r:id="rId43" w:history="1">
         <w:r>
           <w:rPr>
             <w:rStyle w:val="Hyperlink"/>
@@ -4650,7 +5497,7 @@
           <w:szCs w:val="21"/>
         </w:rPr>
       </w:pPr>
-      <w:hyperlink r:id="rId35" w:history="1">
+      <w:hyperlink r:id="rId44" w:history="1">
         <w:r>
           <w:rPr>
             <w:rStyle w:val="Hyperlink"/>
@@ -4676,7 +5523,7 @@
           <w:szCs w:val="21"/>
         </w:rPr>
       </w:pPr>
-      <w:hyperlink r:id="rId36" w:history="1">
+      <w:hyperlink r:id="rId45" w:history="1">
         <w:r>
           <w:rPr>
             <w:rStyle w:val="Hyperlink"/>
@@ -4702,7 +5549,7 @@
           <w:szCs w:val="21"/>
         </w:rPr>
       </w:pPr>
-      <w:hyperlink r:id="rId37" w:history="1">
+      <w:hyperlink r:id="rId46" w:history="1">
         <w:r>
           <w:rPr>
             <w:rStyle w:val="Hyperlink"/>
@@ -4728,7 +5575,7 @@
           <w:szCs w:val="21"/>
         </w:rPr>
       </w:pPr>
-      <w:hyperlink r:id="rId38" w:history="1">
+      <w:hyperlink r:id="rId47" w:history="1">
         <w:r>
           <w:rPr>
             <w:rStyle w:val="Hyperlink"/>
@@ -4753,7 +5600,7 @@
           <w:color w:val="000000" w:themeColor="text1"/>
         </w:rPr>
       </w:pPr>
-      <w:hyperlink r:id="rId39" w:history="1">
+      <w:hyperlink r:id="rId48" w:history="1">
         <w:r>
           <w:rPr>
             <w:rStyle w:val="Hyperlink"/>
@@ -4776,7 +5623,7 @@
           <w:color w:val="000000" w:themeColor="text1"/>
         </w:rPr>
       </w:pPr>
-      <w:hyperlink r:id="rId40" w:history="1">
+      <w:hyperlink r:id="rId49" w:history="1">
         <w:r>
           <w:rPr>
             <w:rStyle w:val="Hyperlink"/>
@@ -4798,7 +5645,7 @@
           <w:color w:val="000000" w:themeColor="text1"/>
         </w:rPr>
       </w:pPr>
-      <w:hyperlink r:id="rId41" w:history="1">
+      <w:hyperlink r:id="rId50" w:history="1">
         <w:r>
           <w:rPr>
             <w:rStyle w:val="Hyperlink"/>
@@ -4820,7 +5667,7 @@
           <w:color w:val="000000" w:themeColor="text1"/>
         </w:rPr>
       </w:pPr>
-      <w:hyperlink r:id="rId42" w:history="1">
+      <w:hyperlink r:id="rId51" w:history="1">
         <w:r>
           <w:rPr>
             <w:rStyle w:val="Hyperlink"/>
@@ -4839,7 +5686,7 @@
         </w:numPr>
         <w:spacing w:line="276" w:lineRule="auto"/>
       </w:pPr>
-      <w:hyperlink r:id="rId43" w:history="1">
+      <w:hyperlink r:id="rId52" w:history="1">
         <w:r>
           <w:rPr>
             <w:rStyle w:val="Hyperlink"/>
@@ -4857,6 +5704,14 @@
         </w:numPr>
         <w:spacing w:line="276" w:lineRule="auto"/>
       </w:pPr>
+      <w:hyperlink r:id="rId53" w:history="1">
+        <w:r>
+          <w:rPr>
+            <w:rStyle w:val="Hyperlink"/>
+          </w:rPr>
+          <w:t>https://www.elastic.co/de/kibana</w:t>
+        </w:r>
+      </w:hyperlink>
     </w:p>
     <w:p>
       <w:pPr>
@@ -6688,6 +7543,7 @@
   <w:style w:type="character" w:default="1" w:styleId="DefaultParagraphFont">
     <w:name w:val="Default Paragraph Font"/>
     <w:uiPriority w:val="1"/>
+    <w:semiHidden/>
     <w:unhideWhenUsed/>
   </w:style>
   <w:style w:type="table" w:default="1" w:styleId="TableNormal">

</xml_diff>

<commit_message>
typo fixing and final formatting
</commit_message>
<xml_diff>
--- a/Elasticsearch_Paper.docx
+++ b/Elasticsearch_Paper.docx
@@ -47,7 +47,7 @@
           <w:lang w:val="en-GB"/>
         </w:rPr>
         <w:drawing>
-          <wp:inline distT="0" distB="0" distL="0" distR="0" wp14:anchorId="5A103B59" wp14:editId="73D4B1C4">
+          <wp:inline distT="0" distB="0" distL="0" distR="0" wp14:anchorId="5A103B59" wp14:editId="2258F399">
             <wp:extent cx="4812162" cy="1307804"/>
             <wp:effectExtent l="0" t="0" r="1270" b="635"/>
             <wp:docPr id="1881383930" name="Picture 1" descr="A red and black logo&#10;&#10;AI-generated content may be incorrect."/>
@@ -2845,19 +2845,21 @@
         <w:rPr>
           <w:lang w:val="en-GB"/>
         </w:rPr>
-        <w:t xml:space="preserve"> Unlike relational databases, it does not require a rigid schema to be defined upfront. Because of that fact it is obvious that Elasticsearch is a NoSQL Database. Due to its architecture and schemaless nature, documents with varying structures can be indexed seamlessly, while Elasticsearch automatically infers the data types when no explicit mapping is defined. This flexibility mak</w:t>
-      </w:r>
-      <w:r>
-        <w:rPr>
-          <w:lang w:val="en-GB"/>
-        </w:rPr>
-        <w:t>s</w:t>
-      </w:r>
-      <w:r>
-        <w:rPr>
-          <w:lang w:val="en-GB"/>
-        </w:rPr>
-        <w:t>e</w:t>
+        <w:t xml:space="preserve"> Unlike relational databases, it does not require a rigid schema to be defined upfront. Because of that fact it is obvious that Elasticsearch is a NoSQL Database. Due to its architecture and </w:t>
+      </w:r>
+      <w:proofErr w:type="spellStart"/>
+      <w:r>
+        <w:rPr>
+          <w:lang w:val="en-GB"/>
+        </w:rPr>
+        <w:t>schemaless</w:t>
+      </w:r>
+      <w:proofErr w:type="spellEnd"/>
+      <w:r>
+        <w:rPr>
+          <w:lang w:val="en-GB"/>
+        </w:rPr>
+        <w:t xml:space="preserve"> nature, documents with varying structures can be indexed seamlessly, while Elasticsearch automatically infers the data types when no explicit mapping is defined. This flexibility make</w:t>
       </w:r>
       <w:r>
         <w:rPr>
@@ -3818,6 +3820,15 @@
     </w:p>
     <w:p>
       <w:pPr>
+        <w:spacing w:line="276" w:lineRule="auto"/>
+        <w:jc w:val="both"/>
+        <w:rPr>
+          <w:lang w:val="en-GB"/>
+        </w:rPr>
+      </w:pPr>
+    </w:p>
+    <w:p>
+      <w:pPr>
         <w:pStyle w:val="Heading1"/>
         <w:numPr>
           <w:ilvl w:val="1"/>
@@ -3854,7 +3865,31 @@
         <w:rPr>
           <w:lang w:val="en-GB"/>
         </w:rPr>
-        <w:t>Elasticsearch is not a general-purpose database and is not designed to replace relational systems in all scenarios. It is best suited for specific use cases where search speed, analytical flexibility or the ability to handle large volumes of unstructured data are the primary requirements.</w:t>
+        <w:t xml:space="preserve">Elasticsearch is not a </w:t>
+      </w:r>
+      <w:r>
+        <w:rPr>
+          <w:lang w:val="en-GB"/>
+        </w:rPr>
+        <w:t>“</w:t>
+      </w:r>
+      <w:r>
+        <w:rPr>
+          <w:lang w:val="en-GB"/>
+        </w:rPr>
+        <w:t>general-purpose</w:t>
+      </w:r>
+      <w:r>
+        <w:rPr>
+          <w:lang w:val="en-GB"/>
+        </w:rPr>
+        <w:t>”</w:t>
+      </w:r>
+      <w:r>
+        <w:rPr>
+          <w:lang w:val="en-GB"/>
+        </w:rPr>
+        <w:t xml:space="preserve"> database and is not designed to replace relational systems in all scenarios. It is best suited for specific use cases where search speed, analytical flexibility or the ability to handle large volumes of unstructured data are the primary requirements.</w:t>
       </w:r>
     </w:p>
     <w:p>
@@ -4003,7 +4038,21 @@
         <w:rPr>
           <w:lang w:val="en-GB"/>
         </w:rPr>
-        <w:t xml:space="preserve"> is supported by Elasticsearch. The geo_point type stores latitude and longitude coordinates. This enables proximity queries, radius-based filtering, and map visualizations, making Elasticsearch suitable for applications such as delivery tracking and travel booking platforms</w:t>
+        <w:t xml:space="preserve"> is supported by Elasticsearch. The </w:t>
+      </w:r>
+      <w:proofErr w:type="spellStart"/>
+      <w:r>
+        <w:rPr>
+          <w:lang w:val="en-GB"/>
+        </w:rPr>
+        <w:t>geo_point</w:t>
+      </w:r>
+      <w:proofErr w:type="spellEnd"/>
+      <w:r>
+        <w:rPr>
+          <w:lang w:val="en-GB"/>
+        </w:rPr>
+        <w:t xml:space="preserve"> type stores latitude and longitude coordinates. This enables proximity queries, radius-based filtering, and map visualizations, making Elasticsearch suitable for applications such as delivery tracking and travel booking platforms</w:t>
       </w:r>
     </w:p>
     <w:p>
@@ -5726,7 +5775,21 @@
         <w:rPr>
           <w:lang w:val="en-GB"/>
         </w:rPr>
-        <w:t>Elasticsearch does not store one inverted index per document instead it maintains one inverted index per shard. This inverted index then covers all documents stored in the shard. When a new document is indexed, its tokens are added to the existing shared inverted index.</w:t>
+        <w:t xml:space="preserve">Elasticsearch does not store one inverted index per document instead it maintains one inverted index per </w:t>
+      </w:r>
+      <w:proofErr w:type="spellStart"/>
+      <w:r>
+        <w:rPr>
+          <w:lang w:val="en-GB"/>
+        </w:rPr>
+        <w:t>shard</w:t>
+      </w:r>
+      <w:proofErr w:type="spellEnd"/>
+      <w:r>
+        <w:rPr>
+          <w:lang w:val="en-GB"/>
+        </w:rPr>
+        <w:t>. This inverted index then covers all documents stored in the shard. When a new document is indexed, its tokens are added to the existing shared inverted index.</w:t>
       </w:r>
     </w:p>
     <w:p>
@@ -5764,6 +5827,7 @@
         </w:rPr>
         <w:t xml:space="preserve"> are indexed, new segments are created and </w:t>
       </w:r>
+      <w:proofErr w:type="gramStart"/>
       <w:r>
         <w:rPr>
           <w:lang w:val="en-GB"/>
@@ -5780,7 +5844,14 @@
         <w:rPr>
           <w:lang w:val="en-GB"/>
         </w:rPr>
-        <w:t xml:space="preserve">together </w:t>
+        <w:t>together</w:t>
+      </w:r>
+      <w:proofErr w:type="gramEnd"/>
+      <w:r>
+        <w:rPr>
+          <w:lang w:val="en-GB"/>
+        </w:rPr>
+        <w:t xml:space="preserve"> </w:t>
       </w:r>
       <w:r>
         <w:rPr>
@@ -6268,27 +6339,14 @@
                             <w:r>
                               <w:t xml:space="preserve">Figure </w:t>
                             </w:r>
-                            <w:r>
-                              <w:fldChar w:fldCharType="begin"/>
-                            </w:r>
-                            <w:r>
-                              <w:instrText xml:space="preserve"> SEQ Figure \* ARABIC </w:instrText>
-                            </w:r>
-                            <w:r>
-                              <w:fldChar w:fldCharType="separate"/>
-                            </w:r>
-                            <w:r>
-                              <w:rPr>
-                                <w:noProof/>
-                              </w:rPr>
-                              <w:t>2</w:t>
-                            </w:r>
-                            <w:r>
-                              <w:rPr>
-                                <w:noProof/>
-                              </w:rPr>
-                              <w:fldChar w:fldCharType="end"/>
-                            </w:r>
+                            <w:fldSimple w:instr=" SEQ Figure \* ARABIC ">
+                              <w:r>
+                                <w:rPr>
+                                  <w:noProof/>
+                                </w:rPr>
+                                <w:t>2</w:t>
+                              </w:r>
+                            </w:fldSimple>
                             <w:r>
                               <w:t>:</w:t>
                             </w:r>
@@ -6541,7 +6599,19 @@
         <w:rPr>
           <w:lang w:val="en-GB"/>
         </w:rPr>
-        <w:t>Elasticsearch supports near real-time data indexing, meaning that documents become searchable approximately one second after they are written This one-second delay results from the internal refresh cycle, during which buffered documents are committed to the index and made available for search. For the vast majority of applications this delay is imperceptible, and it allows Elasticsearch to handle continuous data streams such as server logs or sensor data</w:t>
+        <w:t xml:space="preserve">Elasticsearch supports near real-time data indexing, meaning that documents become searchable approximately one second after they are written This one-second delay results from the internal refresh cycle, during which buffered documents are committed to the index and made available for search. For </w:t>
+      </w:r>
+      <w:r>
+        <w:rPr>
+          <w:lang w:val="en-GB"/>
+        </w:rPr>
+        <w:t>most</w:t>
+      </w:r>
+      <w:r>
+        <w:rPr>
+          <w:lang w:val="en-GB"/>
+        </w:rPr>
+        <w:t xml:space="preserve"> applications this delay is imperceptible, and it allows Elasticsearch to handle continuous data streams such as server logs or sensor data</w:t>
       </w:r>
       <w:r>
         <w:rPr>
@@ -7363,46 +7433,6 @@
           <w:lang w:val="en-GB"/>
         </w:rPr>
       </w:pPr>
-    </w:p>
-    <w:p>
-      <w:pPr>
-        <w:jc w:val="both"/>
-        <w:rPr>
-          <w:lang w:val="en-GB"/>
-        </w:rPr>
-      </w:pPr>
-    </w:p>
-    <w:p>
-      <w:pPr>
-        <w:jc w:val="both"/>
-        <w:rPr>
-          <w:lang w:val="en-GB"/>
-        </w:rPr>
-      </w:pPr>
-    </w:p>
-    <w:p>
-      <w:pPr>
-        <w:jc w:val="both"/>
-        <w:rPr>
-          <w:lang w:val="en-GB"/>
-        </w:rPr>
-      </w:pPr>
-    </w:p>
-    <w:p>
-      <w:pPr>
-        <w:jc w:val="both"/>
-        <w:rPr>
-          <w:lang w:val="en-GB"/>
-        </w:rPr>
-      </w:pPr>
-    </w:p>
-    <w:p>
-      <w:pPr>
-        <w:jc w:val="both"/>
-        <w:rPr>
-          <w:lang w:val="en-GB"/>
-        </w:rPr>
-      </w:pPr>
       <w:r>
         <w:rPr>
           <w:b/>
@@ -7582,6 +7612,24 @@
           <w:lang w:val="en-GB"/>
         </w:rPr>
       </w:pPr>
+    </w:p>
+    <w:p>
+      <w:pPr>
+        <w:spacing w:after="160" w:line="278" w:lineRule="auto"/>
+        <w:jc w:val="both"/>
+        <w:rPr>
+          <w:lang w:val="en-GB"/>
+        </w:rPr>
+      </w:pPr>
+    </w:p>
+    <w:p>
+      <w:pPr>
+        <w:spacing w:after="160" w:line="278" w:lineRule="auto"/>
+        <w:jc w:val="both"/>
+        <w:rPr>
+          <w:lang w:val="en-GB"/>
+        </w:rPr>
+      </w:pPr>
       <w:r>
         <w:rPr>
           <w:b/>
@@ -7731,7 +7779,21 @@
         <w:rPr>
           <w:lang w:val="en-GB"/>
         </w:rPr>
-        <w:t xml:space="preserve"> as COUNT, SUM and AVG. Aggregations are defined inside the aggs key of a request body and can be nested to produce multi-level grouping.</w:t>
+        <w:t xml:space="preserve"> as COUNT, SUM and AVG. Aggregations are defined inside the </w:t>
+      </w:r>
+      <w:proofErr w:type="spellStart"/>
+      <w:r>
+        <w:rPr>
+          <w:lang w:val="en-GB"/>
+        </w:rPr>
+        <w:t>aggs</w:t>
+      </w:r>
+      <w:proofErr w:type="spellEnd"/>
+      <w:r>
+        <w:rPr>
+          <w:lang w:val="en-GB"/>
+        </w:rPr>
+        <w:t xml:space="preserve"> key of a request body and can be nested to produce multi-level grouping.</w:t>
       </w:r>
     </w:p>
     <w:p>
@@ -7913,21 +7975,7 @@
             <w:rStyle w:val="Hyperlink"/>
             <w:lang w:val="en-GB"/>
           </w:rPr>
-          <w:t>F1 World Championship dataset fo</w:t>
-        </w:r>
-        <w:r>
-          <w:rPr>
-            <w:rStyle w:val="Hyperlink"/>
-            <w:lang w:val="en-GB"/>
-          </w:rPr>
-          <w:t>r</w:t>
-        </w:r>
-        <w:r>
-          <w:rPr>
-            <w:rStyle w:val="Hyperlink"/>
-            <w:lang w:val="en-GB"/>
-          </w:rPr>
-          <w:t>m Kaggle</w:t>
+          <w:t>F1 World Championship dataset form Kaggle</w:t>
         </w:r>
       </w:hyperlink>
       <w:r>
@@ -8213,7 +8261,21 @@
         <w:rPr>
           <w:lang w:val="en-GB"/>
         </w:rPr>
-        <w:t>The first step is to load all csv files into pandas dataframes. Each file is read independently and stored.</w:t>
+        <w:t xml:space="preserve">The first step is to load all csv files into pandas </w:t>
+      </w:r>
+      <w:proofErr w:type="spellStart"/>
+      <w:r>
+        <w:rPr>
+          <w:lang w:val="en-GB"/>
+        </w:rPr>
+        <w:t>dataframes</w:t>
+      </w:r>
+      <w:proofErr w:type="spellEnd"/>
+      <w:r>
+        <w:rPr>
+          <w:lang w:val="en-GB"/>
+        </w:rPr>
+        <w:t>. Each file is read independently and stored.</w:t>
       </w:r>
       <w:r>
         <w:rPr>
@@ -8279,6 +8341,7 @@
         </w:rPr>
         <w:t xml:space="preserve">The most important step is the </w:t>
       </w:r>
+      <w:proofErr w:type="spellStart"/>
       <w:r>
         <w:rPr>
           <w:rFonts w:ascii="Courier New" w:hAnsi="Courier New" w:cs="Courier New"/>
@@ -8286,11 +8349,26 @@
         </w:rPr>
         <w:t>build_document</w:t>
       </w:r>
-      <w:r>
-        <w:rPr>
-          <w:lang w:val="en-GB"/>
-        </w:rPr>
-        <w:t xml:space="preserve"> function, which merges all six dataframes into a single flat structure. With this step the relational aspect of the data is </w:t>
+      <w:proofErr w:type="spellEnd"/>
+      <w:r>
+        <w:rPr>
+          <w:lang w:val="en-GB"/>
+        </w:rPr>
+        <w:t xml:space="preserve"> function, which merges all six </w:t>
+      </w:r>
+      <w:proofErr w:type="spellStart"/>
+      <w:r>
+        <w:rPr>
+          <w:lang w:val="en-GB"/>
+        </w:rPr>
+        <w:t>dataframes</w:t>
+      </w:r>
+      <w:proofErr w:type="spellEnd"/>
+      <w:r>
+        <w:rPr>
+          <w:lang w:val="en-GB"/>
+        </w:rPr>
+        <w:t xml:space="preserve"> into a single flat structure. With this step the relational aspect of the data is </w:t>
       </w:r>
       <w:r>
         <w:rPr>
@@ -8402,6 +8480,7 @@
         </w:rPr>
         <w:t xml:space="preserve">Before documents can be indexed, the </w:t>
       </w:r>
+      <w:proofErr w:type="spellStart"/>
       <w:r>
         <w:rPr>
           <w:rFonts w:ascii="Courier New" w:hAnsi="Courier New" w:cs="Courier New"/>
@@ -8409,6 +8488,7 @@
         </w:rPr>
         <w:t>create_index</w:t>
       </w:r>
+      <w:proofErr w:type="spellEnd"/>
       <w:r>
         <w:rPr>
           <w:lang w:val="en-GB"/>
@@ -9036,11 +9116,35 @@
           <w:lang w:val="en-GB"/>
         </w:rPr>
       </w:pPr>
-      <w:r>
-        <w:rPr>
-          <w:lang w:val="en-GB"/>
-        </w:rPr>
-        <w:t>discovery.type=single-node:</w:t>
+      <w:proofErr w:type="spellStart"/>
+      <w:proofErr w:type="gramStart"/>
+      <w:r>
+        <w:rPr>
+          <w:lang w:val="en-GB"/>
+        </w:rPr>
+        <w:t>discovery.type</w:t>
+      </w:r>
+      <w:proofErr w:type="spellEnd"/>
+      <w:proofErr w:type="gramEnd"/>
+      <w:r>
+        <w:rPr>
+          <w:lang w:val="en-GB"/>
+        </w:rPr>
+        <w:t>=</w:t>
+      </w:r>
+      <w:proofErr w:type="gramStart"/>
+      <w:r>
+        <w:rPr>
+          <w:lang w:val="en-GB"/>
+        </w:rPr>
+        <w:t>single-node</w:t>
+      </w:r>
+      <w:proofErr w:type="gramEnd"/>
+      <w:r>
+        <w:rPr>
+          <w:lang w:val="en-GB"/>
+        </w:rPr>
+        <w:t>:</w:t>
       </w:r>
       <w:r>
         <w:rPr>
@@ -9095,11 +9199,27 @@
           <w:lang w:val="en-GB"/>
         </w:rPr>
       </w:pPr>
-      <w:r>
-        <w:rPr>
-          <w:lang w:val="en-GB"/>
-        </w:rPr>
-        <w:t>xpack.security.enabled=false:</w:t>
+      <w:proofErr w:type="spellStart"/>
+      <w:proofErr w:type="gramStart"/>
+      <w:r>
+        <w:rPr>
+          <w:lang w:val="en-GB"/>
+        </w:rPr>
+        <w:t>xpack.security</w:t>
+      </w:r>
+      <w:proofErr w:type="gramEnd"/>
+      <w:r>
+        <w:rPr>
+          <w:lang w:val="en-GB"/>
+        </w:rPr>
+        <w:t>.enabled</w:t>
+      </w:r>
+      <w:proofErr w:type="spellEnd"/>
+      <w:r>
+        <w:rPr>
+          <w:lang w:val="en-GB"/>
+        </w:rPr>
+        <w:t>=false:</w:t>
       </w:r>
       <w:r>
         <w:rPr>
@@ -9669,7 +9789,21 @@
         <w:rPr>
           <w:lang w:val="en-GB"/>
         </w:rPr>
-        <w:t xml:space="preserve"> Kibana, you just have to type in the URL: </w:t>
+        <w:t xml:space="preserve"> Kibana, you just </w:t>
+      </w:r>
+      <w:proofErr w:type="gramStart"/>
+      <w:r>
+        <w:rPr>
+          <w:lang w:val="en-GB"/>
+        </w:rPr>
+        <w:t>have to</w:t>
+      </w:r>
+      <w:proofErr w:type="gramEnd"/>
+      <w:r>
+        <w:rPr>
+          <w:lang w:val="en-GB"/>
+        </w:rPr>
+        <w:t xml:space="preserve"> type in the URL: </w:t>
       </w:r>
       <w:hyperlink r:id="rId32" w:history="1">
         <w:r>
@@ -9769,7 +9903,21 @@
         <w:rPr>
           <w:lang w:val="en-GB"/>
         </w:rPr>
-        <w:t xml:space="preserve">Before visualizations can be created, a data view must be configured in Kibana that points to the ‘f1’ index and designates ‘race_date’ as the time field. </w:t>
+        <w:t>Before visualizations can be created, a data view must be configured in Kibana that points to the ‘f1’ index and designates ‘</w:t>
+      </w:r>
+      <w:proofErr w:type="spellStart"/>
+      <w:r>
+        <w:rPr>
+          <w:lang w:val="en-GB"/>
+        </w:rPr>
+        <w:t>race_date</w:t>
+      </w:r>
+      <w:proofErr w:type="spellEnd"/>
+      <w:r>
+        <w:rPr>
+          <w:lang w:val="en-GB"/>
+        </w:rPr>
+        <w:t xml:space="preserve">’ as the time field. </w:t>
       </w:r>
     </w:p>
     <w:p>
@@ -10106,12 +10254,21 @@
         </w:rPr>
         <w:t xml:space="preserve"> by applying a KGL filter of </w:t>
       </w:r>
+      <w:proofErr w:type="spellStart"/>
       <w:r>
         <w:rPr>
           <w:rFonts w:ascii="Courier New" w:hAnsi="Courier New" w:cs="Courier New"/>
           <w:lang w:val="en-GB"/>
         </w:rPr>
-        <w:t>finish_position: 1</w:t>
+        <w:t>finish_position</w:t>
+      </w:r>
+      <w:proofErr w:type="spellEnd"/>
+      <w:r>
+        <w:rPr>
+          <w:rFonts w:ascii="Courier New" w:hAnsi="Courier New" w:cs="Courier New"/>
+          <w:lang w:val="en-GB"/>
+        </w:rPr>
+        <w:t>: 1</w:t>
       </w:r>
       <w:r>
         <w:rPr>
@@ -10119,12 +10276,21 @@
         </w:rPr>
         <w:t xml:space="preserve"> to restrict the dataset to race wins only, then using a unique count of </w:t>
       </w:r>
+      <w:proofErr w:type="spellStart"/>
       <w:r>
         <w:rPr>
           <w:rFonts w:ascii="Courier New" w:hAnsi="Courier New" w:cs="Courier New"/>
           <w:lang w:val="en-GB"/>
         </w:rPr>
-        <w:t xml:space="preserve">race_id </w:t>
+        <w:t>race_id</w:t>
+      </w:r>
+      <w:proofErr w:type="spellEnd"/>
+      <w:r>
+        <w:rPr>
+          <w:rFonts w:ascii="Courier New" w:hAnsi="Courier New" w:cs="Courier New"/>
+          <w:lang w:val="en-GB"/>
+        </w:rPr>
+        <w:t xml:space="preserve"> </w:t>
       </w:r>
       <w:r>
         <w:rPr>
@@ -10132,26 +10298,48 @@
         </w:rPr>
         <w:t xml:space="preserve">per </w:t>
       </w:r>
+      <w:proofErr w:type="spellStart"/>
       <w:r>
         <w:rPr>
           <w:rFonts w:ascii="Courier New" w:hAnsi="Courier New" w:cs="Courier New"/>
           <w:lang w:val="en-GB"/>
         </w:rPr>
-        <w:t>driver_forename.keyword</w:t>
-      </w:r>
+        <w:t>driver_</w:t>
+      </w:r>
+      <w:proofErr w:type="gramStart"/>
+      <w:r>
+        <w:rPr>
+          <w:rFonts w:ascii="Courier New" w:hAnsi="Courier New" w:cs="Courier New"/>
+          <w:lang w:val="en-GB"/>
+        </w:rPr>
+        <w:t>forename.keyword</w:t>
+      </w:r>
+      <w:proofErr w:type="spellEnd"/>
+      <w:proofErr w:type="gramEnd"/>
       <w:r>
         <w:rPr>
           <w:lang w:val="en-GB"/>
         </w:rPr>
         <w:t xml:space="preserve">  and </w:t>
       </w:r>
+      <w:proofErr w:type="spellStart"/>
       <w:r>
         <w:rPr>
           <w:rFonts w:ascii="Courier New" w:hAnsi="Courier New" w:cs="Courier New"/>
           <w:lang w:val="en-GB"/>
         </w:rPr>
-        <w:t>driver_surename.keyword</w:t>
-      </w:r>
+        <w:t>driver_</w:t>
+      </w:r>
+      <w:proofErr w:type="gramStart"/>
+      <w:r>
+        <w:rPr>
+          <w:rFonts w:ascii="Courier New" w:hAnsi="Courier New" w:cs="Courier New"/>
+          <w:lang w:val="en-GB"/>
+        </w:rPr>
+        <w:t>surename.keyword</w:t>
+      </w:r>
+      <w:proofErr w:type="spellEnd"/>
+      <w:proofErr w:type="gramEnd"/>
       <w:r>
         <w:rPr>
           <w:lang w:val="en-GB"/>
@@ -10283,6 +10471,7 @@
         </w:rPr>
         <w:t xml:space="preserve"> field combined with a cardinality aggregation on </w:t>
       </w:r>
+      <w:proofErr w:type="spellStart"/>
       <w:r>
         <w:rPr>
           <w:rFonts w:ascii="Courier New" w:hAnsi="Courier New" w:cs="Courier New"/>
@@ -10290,6 +10479,7 @@
         </w:rPr>
         <w:t>race_id</w:t>
       </w:r>
+      <w:proofErr w:type="spellEnd"/>
       <w:r>
         <w:rPr>
           <w:lang w:val="en-GB"/>
@@ -10388,6 +10578,7 @@
         </w:rPr>
         <w:t xml:space="preserve">Is a pie chart showing the distribution of all Formula 1 drivers by nationality. It uses a term aggregation on the </w:t>
       </w:r>
+      <w:proofErr w:type="spellStart"/>
       <w:r>
         <w:rPr>
           <w:rFonts w:ascii="Courier New" w:hAnsi="Courier New" w:cs="Courier New"/>
@@ -10395,6 +10586,7 @@
         </w:rPr>
         <w:t>driver_nationality</w:t>
       </w:r>
+      <w:proofErr w:type="spellEnd"/>
       <w:r>
         <w:rPr>
           <w:lang w:val="en-GB"/>
@@ -10507,12 +10699,30 @@
         </w:rPr>
         <w:t xml:space="preserve">s a bar chart showing the total championship points accumulated by each constructor across all seasons. It uses a nested aggregation, a terms aggregation on </w:t>
       </w:r>
+      <w:proofErr w:type="spellStart"/>
       <w:r>
         <w:rPr>
           <w:rFonts w:ascii="Courier New" w:hAnsi="Courier New" w:cs="Courier New"/>
           <w:lang w:val="en-GB"/>
         </w:rPr>
-        <w:t xml:space="preserve">constructor_name.keyword </w:t>
+        <w:t>constructor_</w:t>
+      </w:r>
+      <w:proofErr w:type="gramStart"/>
+      <w:r>
+        <w:rPr>
+          <w:rFonts w:ascii="Courier New" w:hAnsi="Courier New" w:cs="Courier New"/>
+          <w:lang w:val="en-GB"/>
+        </w:rPr>
+        <w:t>name.keyword</w:t>
+      </w:r>
+      <w:proofErr w:type="spellEnd"/>
+      <w:proofErr w:type="gramEnd"/>
+      <w:r>
+        <w:rPr>
+          <w:rFonts w:ascii="Courier New" w:hAnsi="Courier New" w:cs="Courier New"/>
+          <w:lang w:val="en-GB"/>
+        </w:rPr>
+        <w:t xml:space="preserve"> </w:t>
       </w:r>
       <w:r>
         <w:rPr>
@@ -10697,6 +10907,7 @@
         </w:rPr>
         <w:t xml:space="preserve">Is a map visualization that plots every F1 track on an interactive world map. This visualization is made possible entirely by the </w:t>
       </w:r>
+      <w:proofErr w:type="spellStart"/>
       <w:r>
         <w:rPr>
           <w:rFonts w:ascii="Courier New" w:hAnsi="Courier New" w:cs="Courier New"/>
@@ -10704,12 +10915,14 @@
         </w:rPr>
         <w:t>geo_point</w:t>
       </w:r>
+      <w:proofErr w:type="spellEnd"/>
       <w:r>
         <w:rPr>
           <w:lang w:val="en-GB"/>
         </w:rPr>
         <w:t xml:space="preserve"> field type defined in the index mapping. Kibana automatically recognizes </w:t>
       </w:r>
+      <w:proofErr w:type="spellStart"/>
       <w:r>
         <w:rPr>
           <w:rFonts w:ascii="Courier New" w:hAnsi="Courier New" w:cs="Courier New"/>
@@ -10717,6 +10930,7 @@
         </w:rPr>
         <w:t>circuit_coords</w:t>
       </w:r>
+      <w:proofErr w:type="spellEnd"/>
       <w:r>
         <w:rPr>
           <w:lang w:val="en-GB"/>

</xml_diff>